<commit_message>
update word document, title project, detail project, now i fix everything with teacher advice
</commit_message>
<xml_diff>
--- a/Document/22130016_TieuLuanTN_KCNTT_NLU.docx
+++ b/Document/22130016_TieuLuanTN_KCNTT_NLU.docx
@@ -8,7 +8,7 @@
           <w:ilvl w:val="1"/>
           <w:numId w:val="7"/>
         </w:numPr>
-        <w:spacing w:after="0" w:line="240" w:lineRule="auto"/>
+        <w:spacing w:after="0" w:line="360" w:lineRule="auto"/>
         <w:jc w:val="both"/>
         <w:rPr>
           <w:rFonts w:cs="VNI-Times"/>
@@ -26,7 +26,7 @@
           <w:ilvl w:val="1"/>
           <w:numId w:val="7"/>
         </w:numPr>
-        <w:spacing w:after="0" w:line="240" w:lineRule="auto"/>
+        <w:spacing w:after="0" w:line="360" w:lineRule="auto"/>
         <w:jc w:val="both"/>
       </w:pPr>
     </w:p>
@@ -586,15 +586,9 @@
                               <w:rPr>
                                 <w:sz w:val="30"/>
                                 <w:szCs w:val="30"/>
-                              </w:rPr>
-                              <w:t>TP.</w:t>
-                            </w:r>
-                            <w:r>
-                              <w:rPr>
-                                <w:sz w:val="30"/>
-                                <w:szCs w:val="30"/>
-                              </w:rPr>
-                              <w:t>HỒ CHÍ MINH, tháng   năm</w:t>
+                                <w:lang w:val="vi-VN"/>
+                              </w:rPr>
+                              <w:t>TP.HỒ CHÍ MINH, tháng   năm</w:t>
                             </w:r>
                           </w:p>
                           <w:p>
@@ -1277,7 +1271,7 @@
                 <v:stroke joinstyle="miter"/>
                 <v:path gradientshapeok="t" o:connecttype="rect"/>
               </v:shapetype>
-              <v:shape id="Text Box 2509" o:spid="_x0000_s1026" type="#_x0000_t202" style="position:absolute;left:0;text-align:left;margin-left:-10.95pt;margin-top:-34.75pt;width:447.7pt;height:720.9pt;z-index:252000256;visibility:visible;mso-wrap-style:square;mso-width-percent:0;mso-height-percent:0;mso-wrap-distance-left:9pt;mso-wrap-distance-top:0;mso-wrap-distance-right:9pt;mso-wrap-distance-bottom:0;mso-position-horizontal:absolute;mso-position-horizontal-relative:text;mso-position-vertical:absolute;mso-position-vertical-relative:text;mso-width-percent:0;mso-height-percent:0;mso-width-relative:page;mso-height-relative:page;v-text-anchor:top" o:gfxdata="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" strokeweight="3pt">
+              <v:shape id="Text Box 2509" o:spid="_x0000_s1026" type="#_x0000_t202" style="position:absolute;left:0;text-align:left;margin-left:-10.95pt;margin-top:-34.75pt;width:447.7pt;height:720.9pt;z-index:252000256;visibility:visible;mso-wrap-style:square;mso-width-percent:0;mso-height-percent:0;mso-wrap-distance-left:9pt;mso-wrap-distance-top:0;mso-wrap-distance-right:9pt;mso-wrap-distance-bottom:0;mso-position-horizontal:absolute;mso-position-horizontal-relative:text;mso-position-vertical:absolute;mso-position-vertical-relative:text;mso-width-percent:0;mso-height-percent:0;mso-width-relative:page;mso-height-relative:page;v-text-anchor:top" o:gfxdata="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" strokeweight="3pt">
                 <v:stroke linestyle="thinThin"/>
                 <v:textbox>
                   <w:txbxContent>
@@ -1410,7 +1404,7 @@
                                     <pic:cNvPicPr/>
                                   </pic:nvPicPr>
                                   <pic:blipFill>
-                                    <a:blip r:embed="rId8">
+                                    <a:blip r:embed="rId9">
                                       <a:extLst>
                                         <a:ext uri="{28A0092B-C50C-407E-A947-70E740481C1C}">
                                           <a14:useLocalDpi xmlns:a14="http://schemas.microsoft.com/office/drawing/2010/main" val="0"/>
@@ -1770,15 +1764,9 @@
                         <w:rPr>
                           <w:sz w:val="30"/>
                           <w:szCs w:val="30"/>
-                        </w:rPr>
-                        <w:t>TP.</w:t>
-                      </w:r>
-                      <w:r>
-                        <w:rPr>
-                          <w:sz w:val="30"/>
-                          <w:szCs w:val="30"/>
-                        </w:rPr>
-                        <w:t>HỒ CHÍ MINH, tháng   năm</w:t>
+                          <w:lang w:val="vi-VN"/>
+                        </w:rPr>
+                        <w:t>TP.HỒ CHÍ MINH, tháng   năm</w:t>
                       </w:r>
                     </w:p>
                     <w:p>
@@ -2451,6 +2439,7 @@
         <w:tabs>
           <w:tab w:val="left" w:pos="2132"/>
         </w:tabs>
+        <w:spacing w:line="360" w:lineRule="auto"/>
         <w:jc w:val="both"/>
         <w:rPr>
           <w:rFonts w:eastAsiaTheme="majorEastAsia" w:cs="Times New Roman"/>
@@ -2473,6 +2462,7 @@
     <w:bookmarkEnd w:id="3"/>
     <w:p>
       <w:pPr>
+        <w:spacing w:line="360" w:lineRule="auto"/>
         <w:rPr>
           <w:rFonts w:cs="Times New Roman"/>
           <w:b/>
@@ -2488,6 +2478,7 @@
     </w:p>
     <w:p>
       <w:pPr>
+        <w:spacing w:line="360" w:lineRule="auto"/>
         <w:rPr>
           <w:rFonts w:cs="Times New Roman"/>
           <w:b/>
@@ -2675,7 +2666,7 @@
                                           <pic:cNvPicPr/>
                                         </pic:nvPicPr>
                                         <pic:blipFill>
-                                          <a:blip r:embed="rId8">
+                                          <a:blip r:embed="rId9">
                                             <a:extLst>
                                               <a:ext uri="{28A0092B-C50C-407E-A947-70E740481C1C}">
                                                 <a14:useLocalDpi xmlns:a14="http://schemas.microsoft.com/office/drawing/2010/main" val="0"/>
@@ -2753,9 +2744,6 @@
                               <w:jc w:val="center"/>
                               <w:rPr>
                                 <w:b/>
-                                <w:bCs/>
-                                <w:sz w:val="48"/>
-                                <w:szCs w:val="48"/>
                               </w:rPr>
                             </w:pPr>
                             <w:r>
@@ -2765,27 +2753,7 @@
                                 <w:sz w:val="48"/>
                                 <w:szCs w:val="48"/>
                               </w:rPr>
-                              <w:t xml:space="preserve">XÂY DỰNG ỨNG DỤNG </w:t>
-                            </w:r>
-                          </w:p>
-                          <w:p>
-                            <w:pPr>
-                              <w:jc w:val="center"/>
-                              <w:rPr>
-                                <w:b/>
-                                <w:bCs/>
-                                <w:sz w:val="48"/>
-                                <w:szCs w:val="48"/>
-                              </w:rPr>
-                            </w:pPr>
-                            <w:r>
-                              <w:rPr>
-                                <w:b/>
-                                <w:bCs/>
-                                <w:sz w:val="48"/>
-                                <w:szCs w:val="48"/>
-                              </w:rPr>
-                              <w:t>HỌC TIẾNG ANH TRÊN ĐIỆN THOẠI</w:t>
+                              <w:t>NGHIÊN CỨU VÀ ỨNG DỤNG MÔ HÌNH YOLO TRONG NHẬN DIỆN VẬT THỂ HỖ TRỢ HỌC TỪ VỰNG TIẾNG ANH TRÊN THIẾT BỊ DI ĐỘNG</w:t>
                             </w:r>
                           </w:p>
                           <w:p>
@@ -2908,6 +2876,7 @@
                                 <w:bCs/>
                                 <w:sz w:val="28"/>
                                 <w:szCs w:val="28"/>
+                                <w:lang w:val="vi-VN"/>
                               </w:rPr>
                               <w:t xml:space="preserve"> Đức Công Song</w:t>
                             </w:r>
@@ -2938,6 +2907,7 @@
                                 <w:bCs/>
                                 <w:sz w:val="28"/>
                                 <w:szCs w:val="28"/>
+                                <w:lang w:val="vi-VN"/>
                               </w:rPr>
                               <w:t>Trần Tiến Anh (</w:t>
                             </w:r>
@@ -2957,6 +2927,7 @@
                                 <w:bCs/>
                                 <w:sz w:val="28"/>
                                 <w:szCs w:val="28"/>
+                                <w:lang w:val="vi-VN"/>
                               </w:rPr>
                               <w:t>: 22130016</w:t>
                             </w:r>
@@ -3027,6 +2998,7 @@
                                 <w:rFonts w:cs="Times New Roman"/>
                                 <w:sz w:val="30"/>
                                 <w:szCs w:val="30"/>
+                                <w:lang w:val="vi-VN"/>
                               </w:rPr>
                               <w:t>TP.HỒ CHÍ MINH, tháng   năm</w:t>
                             </w:r>
@@ -3038,6 +3010,7 @@
                                 <w:rFonts w:cs="Times New Roman"/>
                                 <w:sz w:val="32"/>
                                 <w:szCs w:val="32"/>
+                                <w:lang w:val="vi-VN"/>
                               </w:rPr>
                             </w:pPr>
                           </w:p>
@@ -3698,6 +3671,7 @@
                                 <w:rFonts w:cs="Times New Roman"/>
                                 <w:sz w:val="32"/>
                                 <w:szCs w:val="32"/>
+                                <w:lang w:val="vi-VN"/>
                               </w:rPr>
                             </w:pPr>
                             <w:r>
@@ -3705,6 +3679,7 @@
                                 <w:rFonts w:cs="Times New Roman"/>
                                 <w:sz w:val="32"/>
                                 <w:szCs w:val="32"/>
+                                <w:lang w:val="vi-VN"/>
                               </w:rPr>
                               <w:t>Ư/2014</w:t>
                             </w:r>
@@ -3713,6 +3688,7 @@
                             <w:pPr>
                               <w:rPr>
                                 <w:rFonts w:cs="Times New Roman"/>
+                                <w:lang w:val="vi-VN"/>
                               </w:rPr>
                             </w:pPr>
                           </w:p>
@@ -3725,6 +3701,7 @@
                                 <w:b/>
                                 <w:sz w:val="40"/>
                                 <w:szCs w:val="40"/>
+                                <w:lang w:val="vi-VN"/>
                               </w:rPr>
                             </w:pPr>
                             <w:r>
@@ -3743,6 +3720,7 @@
                                 <w:b/>
                                 <w:sz w:val="40"/>
                                 <w:szCs w:val="40"/>
+                                <w:lang w:val="vi-VN"/>
                               </w:rPr>
                               <w:t>Ộ GIÁO DỤC VÀ ĐÀO TẠO</w:t>
                             </w:r>
@@ -3756,6 +3734,7 @@
                                 <w:b/>
                                 <w:sz w:val="44"/>
                                 <w:szCs w:val="44"/>
+                                <w:lang w:val="vi-VN"/>
                               </w:rPr>
                             </w:pPr>
                             <w:r>
@@ -3764,6 +3743,7 @@
                                 <w:b/>
                                 <w:sz w:val="44"/>
                                 <w:szCs w:val="44"/>
+                                <w:lang w:val="vi-VN"/>
                               </w:rPr>
                               <w:t>TRƯỜNG ĐẠI HỌC NÔNG LÂM TP HCM</w:t>
                             </w:r>
@@ -3834,7 +3814,7 @@
                                           <pic:cNvPicPr/>
                                         </pic:nvPicPr>
                                         <pic:blipFill>
-                                          <a:blip r:embed="rId8">
+                                          <a:blip r:embed="rId9">
                                             <a:extLst>
                                               <a:ext uri="{28A0092B-C50C-407E-A947-70E740481C1C}">
                                                 <a14:useLocalDpi xmlns:a14="http://schemas.microsoft.com/office/drawing/2010/main" val="0"/>
@@ -4219,6 +4199,7 @@
                                 <w:rFonts w:cs="Times New Roman"/>
                                 <w:sz w:val="30"/>
                                 <w:szCs w:val="30"/>
+                                <w:lang w:val="vi-VN"/>
                               </w:rPr>
                               <w:t>TP.HỒ CHÍ MINH, tháng   năm</w:t>
                             </w:r>
@@ -4230,6 +4211,7 @@
                                 <w:rFonts w:cs="Times New Roman"/>
                                 <w:sz w:val="32"/>
                                 <w:szCs w:val="32"/>
+                                <w:lang w:val="vi-VN"/>
                               </w:rPr>
                             </w:pPr>
                           </w:p>
@@ -4920,7 +4902,7 @@
           </mc:Choice>
           <mc:Fallback>
             <w:pict>
-              <v:shape w14:anchorId="4DA7A2A6" id="_x0000_s1027" type="#_x0000_t202" style="position:absolute;margin-left:-6pt;margin-top:1.5pt;width:460.4pt;height:749.35pt;z-index:252002304;visibility:visible;mso-wrap-style:square;mso-width-percent:0;mso-height-percent:0;mso-wrap-distance-left:9pt;mso-wrap-distance-top:0;mso-wrap-distance-right:9pt;mso-wrap-distance-bottom:0;mso-position-horizontal:absolute;mso-position-horizontal-relative:margin;mso-position-vertical:absolute;mso-position-vertical-relative:text;mso-width-percent:0;mso-height-percent:0;mso-width-relative:page;mso-height-relative:page;v-text-anchor:top" o:gfxdata="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" strokeweight="3pt">
+              <v:shape w14:anchorId="4DA7A2A6" id="_x0000_s1027" type="#_x0000_t202" style="position:absolute;margin-left:-6pt;margin-top:1.5pt;width:460.4pt;height:749.35pt;z-index:252002304;visibility:visible;mso-wrap-style:square;mso-width-percent:0;mso-height-percent:0;mso-wrap-distance-left:9pt;mso-wrap-distance-top:0;mso-wrap-distance-right:9pt;mso-wrap-distance-bottom:0;mso-position-horizontal:absolute;mso-position-horizontal-relative:margin;mso-position-vertical:absolute;mso-position-vertical-relative:text;mso-width-percent:0;mso-height-percent:0;mso-width-relative:page;mso-height-relative:page;v-text-anchor:top" o:gfxdata="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" strokeweight="3pt">
                 <v:stroke linestyle="thinThin"/>
                 <v:textbox>
                   <w:txbxContent>
@@ -5052,7 +5034,7 @@
                                     <pic:cNvPicPr/>
                                   </pic:nvPicPr>
                                   <pic:blipFill>
-                                    <a:blip r:embed="rId8">
+                                    <a:blip r:embed="rId9">
                                       <a:extLst>
                                         <a:ext uri="{28A0092B-C50C-407E-A947-70E740481C1C}">
                                           <a14:useLocalDpi xmlns:a14="http://schemas.microsoft.com/office/drawing/2010/main" val="0"/>
@@ -5130,9 +5112,6 @@
                         <w:jc w:val="center"/>
                         <w:rPr>
                           <w:b/>
-                          <w:bCs/>
-                          <w:sz w:val="48"/>
-                          <w:szCs w:val="48"/>
                         </w:rPr>
                       </w:pPr>
                       <w:r>
@@ -5142,27 +5121,7 @@
                           <w:sz w:val="48"/>
                           <w:szCs w:val="48"/>
                         </w:rPr>
-                        <w:t xml:space="preserve">XÂY DỰNG ỨNG DỤNG </w:t>
-                      </w:r>
-                    </w:p>
-                    <w:p>
-                      <w:pPr>
-                        <w:jc w:val="center"/>
-                        <w:rPr>
-                          <w:b/>
-                          <w:bCs/>
-                          <w:sz w:val="48"/>
-                          <w:szCs w:val="48"/>
-                        </w:rPr>
-                      </w:pPr>
-                      <w:r>
-                        <w:rPr>
-                          <w:b/>
-                          <w:bCs/>
-                          <w:sz w:val="48"/>
-                          <w:szCs w:val="48"/>
-                        </w:rPr>
-                        <w:t>HỌC TIẾNG ANH TRÊN ĐIỆN THOẠI</w:t>
+                        <w:t>NGHIÊN CỨU VÀ ỨNG DỤNG MÔ HÌNH YOLO TRONG NHẬN DIỆN VẬT THỂ HỖ TRỢ HỌC TỪ VỰNG TIẾNG ANH TRÊN THIẾT BỊ DI ĐỘNG</w:t>
                       </w:r>
                     </w:p>
                     <w:p>
@@ -5285,6 +5244,7 @@
                           <w:bCs/>
                           <w:sz w:val="28"/>
                           <w:szCs w:val="28"/>
+                          <w:lang w:val="vi-VN"/>
                         </w:rPr>
                         <w:t xml:space="preserve"> Đức Công Song</w:t>
                       </w:r>
@@ -5315,6 +5275,7 @@
                           <w:bCs/>
                           <w:sz w:val="28"/>
                           <w:szCs w:val="28"/>
+                          <w:lang w:val="vi-VN"/>
                         </w:rPr>
                         <w:t>Trần Tiến Anh (</w:t>
                       </w:r>
@@ -5334,6 +5295,7 @@
                           <w:bCs/>
                           <w:sz w:val="28"/>
                           <w:szCs w:val="28"/>
+                          <w:lang w:val="vi-VN"/>
                         </w:rPr>
                         <w:t>: 22130016</w:t>
                       </w:r>
@@ -5404,6 +5366,7 @@
                           <w:rFonts w:cs="Times New Roman"/>
                           <w:sz w:val="30"/>
                           <w:szCs w:val="30"/>
+                          <w:lang w:val="vi-VN"/>
                         </w:rPr>
                         <w:t>TP.HỒ CHÍ MINH, tháng   năm</w:t>
                       </w:r>
@@ -5415,6 +5378,7 @@
                           <w:rFonts w:cs="Times New Roman"/>
                           <w:sz w:val="32"/>
                           <w:szCs w:val="32"/>
+                          <w:lang w:val="vi-VN"/>
                         </w:rPr>
                       </w:pPr>
                     </w:p>
@@ -6075,6 +6039,7 @@
                           <w:rFonts w:cs="Times New Roman"/>
                           <w:sz w:val="32"/>
                           <w:szCs w:val="32"/>
+                          <w:lang w:val="vi-VN"/>
                         </w:rPr>
                       </w:pPr>
                       <w:r>
@@ -6082,6 +6047,7 @@
                           <w:rFonts w:cs="Times New Roman"/>
                           <w:sz w:val="32"/>
                           <w:szCs w:val="32"/>
+                          <w:lang w:val="vi-VN"/>
                         </w:rPr>
                         <w:t>Ư/2014</w:t>
                       </w:r>
@@ -6090,6 +6056,7 @@
                       <w:pPr>
                         <w:rPr>
                           <w:rFonts w:cs="Times New Roman"/>
+                          <w:lang w:val="vi-VN"/>
                         </w:rPr>
                       </w:pPr>
                     </w:p>
@@ -6102,6 +6069,7 @@
                           <w:b/>
                           <w:sz w:val="40"/>
                           <w:szCs w:val="40"/>
+                          <w:lang w:val="vi-VN"/>
                         </w:rPr>
                       </w:pPr>
                       <w:r>
@@ -6120,6 +6088,7 @@
                           <w:b/>
                           <w:sz w:val="40"/>
                           <w:szCs w:val="40"/>
+                          <w:lang w:val="vi-VN"/>
                         </w:rPr>
                         <w:t>Ộ GIÁO DỤC VÀ ĐÀO TẠO</w:t>
                       </w:r>
@@ -6133,6 +6102,7 @@
                           <w:b/>
                           <w:sz w:val="44"/>
                           <w:szCs w:val="44"/>
+                          <w:lang w:val="vi-VN"/>
                         </w:rPr>
                       </w:pPr>
                       <w:r>
@@ -6141,6 +6111,7 @@
                           <w:b/>
                           <w:sz w:val="44"/>
                           <w:szCs w:val="44"/>
+                          <w:lang w:val="vi-VN"/>
                         </w:rPr>
                         <w:t>TRƯỜNG ĐẠI HỌC NÔNG LÂM TP HCM</w:t>
                       </w:r>
@@ -6211,7 +6182,7 @@
                                     <pic:cNvPicPr/>
                                   </pic:nvPicPr>
                                   <pic:blipFill>
-                                    <a:blip r:embed="rId8">
+                                    <a:blip r:embed="rId9">
                                       <a:extLst>
                                         <a:ext uri="{28A0092B-C50C-407E-A947-70E740481C1C}">
                                           <a14:useLocalDpi xmlns:a14="http://schemas.microsoft.com/office/drawing/2010/main" val="0"/>
@@ -6596,6 +6567,7 @@
                           <w:rFonts w:cs="Times New Roman"/>
                           <w:sz w:val="30"/>
                           <w:szCs w:val="30"/>
+                          <w:lang w:val="vi-VN"/>
                         </w:rPr>
                         <w:t>TP.HỒ CHÍ MINH, tháng   năm</w:t>
                       </w:r>
@@ -6607,6 +6579,7 @@
                           <w:rFonts w:cs="Times New Roman"/>
                           <w:sz w:val="32"/>
                           <w:szCs w:val="32"/>
+                          <w:lang w:val="vi-VN"/>
                         </w:rPr>
                       </w:pPr>
                     </w:p>
@@ -7291,6 +7264,7 @@
     <w:p>
       <w:pPr>
         <w:pStyle w:val="H0"/>
+        <w:spacing w:line="360" w:lineRule="auto"/>
         <w:outlineLvl w:val="0"/>
       </w:pPr>
       <w:r>
@@ -7301,61 +7275,64 @@
         <w:lastRenderedPageBreak/>
         <w:tab/>
       </w:r>
-      <w:bookmarkStart w:id="17" w:name="_Toc164957113"/>
-      <w:bookmarkStart w:id="18" w:name="_Toc164957255"/>
-      <w:bookmarkStart w:id="19" w:name="_Toc164957334"/>
-      <w:bookmarkStart w:id="20" w:name="_Toc164957606"/>
-      <w:bookmarkStart w:id="21" w:name="_Toc164966931"/>
+      <w:bookmarkStart w:id="11" w:name="_Toc164957113"/>
+      <w:bookmarkStart w:id="12" w:name="_Toc164957255"/>
+      <w:bookmarkStart w:id="13" w:name="_Toc164957334"/>
+      <w:bookmarkStart w:id="14" w:name="_Toc164957606"/>
+      <w:bookmarkStart w:id="15" w:name="_Toc164966931"/>
       <w:r>
         <w:t>DANH SÁCH CHỮ VIẾT TẮT</w:t>
       </w:r>
+      <w:bookmarkEnd w:id="11"/>
+      <w:bookmarkEnd w:id="12"/>
+      <w:bookmarkEnd w:id="13"/>
+      <w:bookmarkEnd w:id="14"/>
+      <w:bookmarkEnd w:id="15"/>
+    </w:p>
+    <w:p>
+      <w:pPr>
+        <w:spacing w:line="360" w:lineRule="auto"/>
+        <w:jc w:val="both"/>
+        <w:rPr>
+          <w:rFonts w:cs="Times New Roman"/>
+          <w:color w:val="000000" w:themeColor="text1"/>
+          <w:szCs w:val="26"/>
+        </w:rPr>
+      </w:pPr>
+      <w:r>
+        <w:rPr>
+          <w:rFonts w:cs="Times New Roman"/>
+          <w:color w:val="000000" w:themeColor="text1"/>
+          <w:szCs w:val="26"/>
+        </w:rPr>
+        <w:br w:type="page"/>
+      </w:r>
+    </w:p>
+    <w:p>
+      <w:pPr>
+        <w:pStyle w:val="H0"/>
+        <w:spacing w:line="360" w:lineRule="auto"/>
+        <w:outlineLvl w:val="0"/>
+      </w:pPr>
+      <w:bookmarkStart w:id="16" w:name="_Toc164957114"/>
+      <w:bookmarkStart w:id="17" w:name="_Toc164957256"/>
+      <w:bookmarkStart w:id="18" w:name="_Toc164957335"/>
+      <w:bookmarkStart w:id="19" w:name="_Toc164957607"/>
+      <w:bookmarkStart w:id="20" w:name="_Toc164966932"/>
+      <w:r>
+        <w:lastRenderedPageBreak/>
+        <w:t>DANH MỤC HÌNH ẢNH</w:t>
+      </w:r>
+      <w:bookmarkEnd w:id="16"/>
       <w:bookmarkEnd w:id="17"/>
       <w:bookmarkEnd w:id="18"/>
       <w:bookmarkEnd w:id="19"/>
       <w:bookmarkEnd w:id="20"/>
-      <w:bookmarkEnd w:id="21"/>
     </w:p>
     <w:p>
       <w:pPr>
-        <w:jc w:val="both"/>
-        <w:rPr>
-          <w:rFonts w:cs="Times New Roman"/>
-          <w:color w:val="000000" w:themeColor="text1"/>
-          <w:szCs w:val="26"/>
-        </w:rPr>
-      </w:pPr>
-      <w:r>
-        <w:rPr>
-          <w:rFonts w:cs="Times New Roman"/>
-          <w:color w:val="000000" w:themeColor="text1"/>
-          <w:szCs w:val="26"/>
-        </w:rPr>
-        <w:br w:type="page"/>
-      </w:r>
-    </w:p>
-    <w:p>
-      <w:pPr>
         <w:pStyle w:val="H0"/>
-        <w:outlineLvl w:val="0"/>
-      </w:pPr>
-      <w:bookmarkStart w:id="22" w:name="_Toc164957114"/>
-      <w:bookmarkStart w:id="23" w:name="_Toc164957256"/>
-      <w:bookmarkStart w:id="24" w:name="_Toc164957335"/>
-      <w:bookmarkStart w:id="25" w:name="_Toc164957607"/>
-      <w:bookmarkStart w:id="26" w:name="_Toc164966932"/>
-      <w:r>
-        <w:lastRenderedPageBreak/>
-        <w:t>DANH MỤC HÌNH ẢNH</w:t>
-      </w:r>
-      <w:bookmarkEnd w:id="22"/>
-      <w:bookmarkEnd w:id="23"/>
-      <w:bookmarkEnd w:id="24"/>
-      <w:bookmarkEnd w:id="25"/>
-      <w:bookmarkEnd w:id="26"/>
-    </w:p>
-    <w:p>
-      <w:pPr>
-        <w:pStyle w:val="H0"/>
+        <w:spacing w:line="360" w:lineRule="auto"/>
       </w:pPr>
       <w:r>
         <w:rPr>
@@ -7379,6 +7356,7 @@
         <w:tabs>
           <w:tab w:val="right" w:leader="dot" w:pos="8777"/>
         </w:tabs>
+        <w:spacing w:line="360" w:lineRule="auto"/>
         <w:jc w:val="both"/>
         <w:rPr>
           <w:rFonts w:asciiTheme="minorHAnsi" w:eastAsiaTheme="minorEastAsia" w:hAnsiTheme="minorHAnsi"/>
@@ -7485,11 +7463,11 @@
         </w:rPr>
         <w:br w:type="page"/>
       </w:r>
-      <w:bookmarkStart w:id="27" w:name="_Toc164957115"/>
-      <w:bookmarkStart w:id="28" w:name="_Toc164957257"/>
-      <w:bookmarkStart w:id="29" w:name="_Toc164957336"/>
-      <w:bookmarkStart w:id="30" w:name="_Toc164957608"/>
-      <w:bookmarkStart w:id="31" w:name="_Toc164966933"/>
+      <w:bookmarkStart w:id="21" w:name="_Toc164957115"/>
+      <w:bookmarkStart w:id="22" w:name="_Toc164957257"/>
+      <w:bookmarkStart w:id="23" w:name="_Toc164957336"/>
+      <w:bookmarkStart w:id="24" w:name="_Toc164957608"/>
+      <w:bookmarkStart w:id="25" w:name="_Toc164966933"/>
       <w:r>
         <w:rPr>
           <w:bCs/>
@@ -7498,14 +7476,15 @@
         <w:lastRenderedPageBreak/>
         <w:t>DANH MỤC BẢNG</w:t>
       </w:r>
-      <w:bookmarkEnd w:id="27"/>
-      <w:bookmarkEnd w:id="28"/>
-      <w:bookmarkEnd w:id="29"/>
-      <w:bookmarkEnd w:id="30"/>
-      <w:bookmarkEnd w:id="31"/>
+      <w:bookmarkEnd w:id="21"/>
+      <w:bookmarkEnd w:id="22"/>
+      <w:bookmarkEnd w:id="23"/>
+      <w:bookmarkEnd w:id="24"/>
+      <w:bookmarkEnd w:id="25"/>
     </w:p>
     <w:p>
       <w:pPr>
+        <w:spacing w:line="360" w:lineRule="auto"/>
         <w:rPr>
           <w:b/>
           <w:bCs/>
@@ -7544,6 +7523,7 @@
         <w:tabs>
           <w:tab w:val="right" w:leader="dot" w:pos="8364"/>
         </w:tabs>
+        <w:spacing w:line="360" w:lineRule="auto"/>
         <w:rPr>
           <w:iCs/>
           <w:szCs w:val="26"/>
@@ -7690,11 +7670,11 @@
           <w:szCs w:val="26"/>
         </w:rPr>
       </w:pPr>
-      <w:bookmarkStart w:id="32" w:name="_Toc164957116"/>
-      <w:bookmarkStart w:id="33" w:name="_Toc164957258"/>
-      <w:bookmarkStart w:id="34" w:name="_Toc164957337"/>
-      <w:bookmarkStart w:id="35" w:name="_Toc164957609"/>
-      <w:bookmarkStart w:id="36" w:name="_Toc164966934"/>
+      <w:bookmarkStart w:id="26" w:name="_Toc164957116"/>
+      <w:bookmarkStart w:id="27" w:name="_Toc164957258"/>
+      <w:bookmarkStart w:id="28" w:name="_Toc164957337"/>
+      <w:bookmarkStart w:id="29" w:name="_Toc164957609"/>
+      <w:bookmarkStart w:id="30" w:name="_Toc164966934"/>
       <w:r>
         <w:rPr>
           <w:iCs/>
@@ -7737,14 +7717,15 @@
         </w:rPr>
         <w:t>T</w:t>
       </w:r>
-      <w:bookmarkEnd w:id="32"/>
-      <w:bookmarkEnd w:id="33"/>
-      <w:bookmarkEnd w:id="34"/>
-      <w:bookmarkEnd w:id="35"/>
-      <w:bookmarkEnd w:id="36"/>
+      <w:bookmarkEnd w:id="26"/>
+      <w:bookmarkEnd w:id="27"/>
+      <w:bookmarkEnd w:id="28"/>
+      <w:bookmarkEnd w:id="29"/>
+      <w:bookmarkEnd w:id="30"/>
     </w:p>
     <w:p>
       <w:pPr>
+        <w:spacing w:line="360" w:lineRule="auto"/>
         <w:rPr>
           <w:b/>
           <w:bCs/>
@@ -7760,6 +7741,7 @@
     </w:p>
     <w:p>
       <w:pPr>
+        <w:spacing w:line="360" w:lineRule="auto"/>
         <w:ind w:firstLine="720"/>
         <w:jc w:val="both"/>
       </w:pPr>
@@ -7769,6 +7751,7 @@
     </w:p>
     <w:p>
       <w:pPr>
+        <w:spacing w:line="360" w:lineRule="auto"/>
         <w:ind w:firstLine="720"/>
         <w:jc w:val="both"/>
       </w:pPr>
@@ -7778,6 +7761,7 @@
     </w:p>
     <w:p>
       <w:pPr>
+        <w:spacing w:line="360" w:lineRule="auto"/>
         <w:ind w:firstLine="720"/>
         <w:jc w:val="both"/>
       </w:pPr>
@@ -7787,6 +7771,7 @@
     </w:p>
     <w:p>
       <w:pPr>
+        <w:spacing w:line="360" w:lineRule="auto"/>
         <w:jc w:val="both"/>
         <w:rPr>
           <w:rFonts w:eastAsiaTheme="majorEastAsia" w:cs="Times New Roman"/>
@@ -7830,6 +7815,7 @@
     </w:p>
     <w:p>
       <w:pPr>
+        <w:spacing w:line="360" w:lineRule="auto"/>
         <w:jc w:val="center"/>
         <w:rPr>
           <w:b/>
@@ -7848,6 +7834,7 @@
     <w:p>
       <w:pPr>
         <w:pStyle w:val="TOC1"/>
+        <w:spacing w:line="360" w:lineRule="auto"/>
         <w:rPr>
           <w:rFonts w:asciiTheme="minorHAnsi" w:eastAsiaTheme="minorEastAsia" w:hAnsiTheme="minorHAnsi"/>
           <w:noProof/>
@@ -7939,6 +7926,7 @@
     <w:p>
       <w:pPr>
         <w:pStyle w:val="TOC1"/>
+        <w:spacing w:line="360" w:lineRule="auto"/>
         <w:rPr>
           <w:rFonts w:asciiTheme="minorHAnsi" w:eastAsiaTheme="minorEastAsia" w:hAnsiTheme="minorHAnsi"/>
           <w:noProof/>
@@ -8006,6 +7994,7 @@
     <w:p>
       <w:pPr>
         <w:pStyle w:val="TOC1"/>
+        <w:spacing w:line="360" w:lineRule="auto"/>
         <w:rPr>
           <w:rFonts w:asciiTheme="minorHAnsi" w:eastAsiaTheme="minorEastAsia" w:hAnsiTheme="minorHAnsi"/>
           <w:noProof/>
@@ -8074,6 +8063,7 @@
     <w:p>
       <w:pPr>
         <w:pStyle w:val="TOC1"/>
+        <w:spacing w:line="360" w:lineRule="auto"/>
         <w:rPr>
           <w:rFonts w:asciiTheme="minorHAnsi" w:eastAsiaTheme="minorEastAsia" w:hAnsiTheme="minorHAnsi"/>
           <w:noProof/>
@@ -8142,6 +8132,7 @@
     <w:p>
       <w:pPr>
         <w:pStyle w:val="TOC1"/>
+        <w:spacing w:line="360" w:lineRule="auto"/>
         <w:rPr>
           <w:rFonts w:asciiTheme="minorHAnsi" w:eastAsiaTheme="minorEastAsia" w:hAnsiTheme="minorHAnsi"/>
           <w:noProof/>
@@ -8213,6 +8204,7 @@
           <w:tab w:val="left" w:pos="660"/>
           <w:tab w:val="right" w:leader="dot" w:pos="8777"/>
         </w:tabs>
+        <w:spacing w:line="360" w:lineRule="auto"/>
         <w:rPr>
           <w:rFonts w:asciiTheme="minorHAnsi" w:eastAsiaTheme="minorEastAsia" w:hAnsiTheme="minorHAnsi"/>
           <w:noProof/>
@@ -8299,6 +8291,7 @@
           <w:tab w:val="left" w:pos="660"/>
           <w:tab w:val="right" w:leader="dot" w:pos="8777"/>
         </w:tabs>
+        <w:spacing w:line="360" w:lineRule="auto"/>
         <w:rPr>
           <w:rFonts w:asciiTheme="minorHAnsi" w:eastAsiaTheme="minorEastAsia" w:hAnsiTheme="minorHAnsi"/>
           <w:noProof/>
@@ -8385,6 +8378,7 @@
           <w:tab w:val="left" w:pos="660"/>
           <w:tab w:val="right" w:leader="dot" w:pos="8777"/>
         </w:tabs>
+        <w:spacing w:line="360" w:lineRule="auto"/>
         <w:rPr>
           <w:rFonts w:asciiTheme="minorHAnsi" w:eastAsiaTheme="minorEastAsia" w:hAnsiTheme="minorHAnsi"/>
           <w:noProof/>
@@ -8467,6 +8461,7 @@
     <w:p>
       <w:pPr>
         <w:pStyle w:val="TOC1"/>
+        <w:spacing w:line="360" w:lineRule="auto"/>
         <w:rPr>
           <w:rFonts w:asciiTheme="minorHAnsi" w:eastAsiaTheme="minorEastAsia" w:hAnsiTheme="minorHAnsi"/>
           <w:noProof/>
@@ -8537,6 +8532,7 @@
         <w:tabs>
           <w:tab w:val="right" w:leader="dot" w:pos="8777"/>
         </w:tabs>
+        <w:spacing w:line="360" w:lineRule="auto"/>
         <w:rPr>
           <w:rFonts w:asciiTheme="minorHAnsi" w:eastAsiaTheme="minorEastAsia" w:hAnsiTheme="minorHAnsi"/>
           <w:noProof/>
@@ -8607,6 +8603,7 @@
         <w:tabs>
           <w:tab w:val="right" w:leader="dot" w:pos="8777"/>
         </w:tabs>
+        <w:spacing w:line="360" w:lineRule="auto"/>
         <w:rPr>
           <w:rFonts w:asciiTheme="minorHAnsi" w:eastAsiaTheme="minorEastAsia" w:hAnsiTheme="minorHAnsi"/>
           <w:noProof/>
@@ -8677,6 +8674,7 @@
         <w:tabs>
           <w:tab w:val="right" w:leader="dot" w:pos="8777"/>
         </w:tabs>
+        <w:spacing w:line="360" w:lineRule="auto"/>
         <w:rPr>
           <w:rFonts w:asciiTheme="minorHAnsi" w:eastAsiaTheme="minorEastAsia" w:hAnsiTheme="minorHAnsi"/>
           <w:noProof/>
@@ -8759,6 +8757,7 @@
     <w:p>
       <w:pPr>
         <w:pStyle w:val="TOC1"/>
+        <w:spacing w:line="360" w:lineRule="auto"/>
         <w:rPr>
           <w:rFonts w:asciiTheme="minorHAnsi" w:eastAsiaTheme="minorEastAsia" w:hAnsiTheme="minorHAnsi"/>
           <w:noProof/>
@@ -8869,6 +8868,7 @@
         <w:tabs>
           <w:tab w:val="right" w:leader="dot" w:pos="8777"/>
         </w:tabs>
+        <w:spacing w:line="360" w:lineRule="auto"/>
         <w:rPr>
           <w:rFonts w:asciiTheme="minorHAnsi" w:eastAsiaTheme="minorEastAsia" w:hAnsiTheme="minorHAnsi"/>
           <w:noProof/>
@@ -8939,6 +8939,7 @@
         <w:tabs>
           <w:tab w:val="right" w:leader="dot" w:pos="8777"/>
         </w:tabs>
+        <w:spacing w:line="360" w:lineRule="auto"/>
         <w:rPr>
           <w:rFonts w:asciiTheme="minorHAnsi" w:eastAsiaTheme="minorEastAsia" w:hAnsiTheme="minorHAnsi"/>
           <w:noProof/>
@@ -9053,6 +9054,7 @@
     <w:p>
       <w:pPr>
         <w:pStyle w:val="TOC1"/>
+        <w:spacing w:line="360" w:lineRule="auto"/>
         <w:rPr>
           <w:rFonts w:asciiTheme="minorHAnsi" w:eastAsiaTheme="minorEastAsia" w:hAnsiTheme="minorHAnsi"/>
           <w:noProof/>
@@ -9158,6 +9160,7 @@
         <w:tabs>
           <w:tab w:val="right" w:leader="dot" w:pos="8777"/>
         </w:tabs>
+        <w:spacing w:line="360" w:lineRule="auto"/>
         <w:rPr>
           <w:rFonts w:asciiTheme="minorHAnsi" w:eastAsiaTheme="minorEastAsia" w:hAnsiTheme="minorHAnsi"/>
           <w:noProof/>
@@ -9228,6 +9231,7 @@
         <w:tabs>
           <w:tab w:val="right" w:leader="dot" w:pos="8777"/>
         </w:tabs>
+        <w:spacing w:line="360" w:lineRule="auto"/>
         <w:rPr>
           <w:rFonts w:asciiTheme="minorHAnsi" w:eastAsiaTheme="minorEastAsia" w:hAnsiTheme="minorHAnsi"/>
           <w:noProof/>
@@ -9320,6 +9324,7 @@
     <w:p>
       <w:pPr>
         <w:pStyle w:val="TOC1"/>
+        <w:spacing w:line="360" w:lineRule="auto"/>
         <w:rPr>
           <w:rFonts w:asciiTheme="minorHAnsi" w:eastAsiaTheme="minorEastAsia" w:hAnsiTheme="minorHAnsi"/>
           <w:noProof/>
@@ -9412,6 +9417,7 @@
     <w:p>
       <w:pPr>
         <w:pStyle w:val="TOC1"/>
+        <w:spacing w:line="360" w:lineRule="auto"/>
         <w:rPr>
           <w:rFonts w:asciiTheme="minorHAnsi" w:eastAsiaTheme="minorEastAsia" w:hAnsiTheme="minorHAnsi"/>
           <w:noProof/>
@@ -9499,6 +9505,7 @@
         <w:tabs>
           <w:tab w:val="right" w:leader="dot" w:pos="8777"/>
         </w:tabs>
+        <w:spacing w:line="360" w:lineRule="auto"/>
         <w:rPr>
           <w:rFonts w:asciiTheme="minorHAnsi" w:eastAsiaTheme="minorEastAsia" w:hAnsiTheme="minorHAnsi"/>
           <w:noProof/>
@@ -9569,6 +9576,7 @@
         <w:tabs>
           <w:tab w:val="right" w:leader="dot" w:pos="8777"/>
         </w:tabs>
+        <w:spacing w:line="360" w:lineRule="auto"/>
         <w:rPr>
           <w:rFonts w:asciiTheme="minorHAnsi" w:eastAsiaTheme="minorEastAsia" w:hAnsiTheme="minorHAnsi"/>
           <w:noProof/>
@@ -9641,6 +9649,7 @@
         <w:tabs>
           <w:tab w:val="right" w:leader="dot" w:pos="8777"/>
         </w:tabs>
+        <w:spacing w:line="360" w:lineRule="auto"/>
         <w:rPr>
           <w:rFonts w:asciiTheme="minorHAnsi" w:eastAsiaTheme="minorEastAsia" w:hAnsiTheme="minorHAnsi"/>
           <w:noProof/>
@@ -9708,6 +9717,7 @@
     <w:p>
       <w:pPr>
         <w:pStyle w:val="TOC1"/>
+        <w:spacing w:line="360" w:lineRule="auto"/>
         <w:rPr>
           <w:rFonts w:asciiTheme="minorHAnsi" w:eastAsiaTheme="minorEastAsia" w:hAnsiTheme="minorHAnsi"/>
           <w:noProof/>
@@ -9799,9 +9809,10 @@
     <w:p>
       <w:pPr>
         <w:pStyle w:val="H0"/>
+        <w:spacing w:line="360" w:lineRule="auto"/>
         <w:outlineLvl w:val="0"/>
         <w:sectPr>
-          <w:headerReference w:type="default" r:id="rId9"/>
+          <w:headerReference w:type="default" r:id="rId10"/>
           <w:pgSz w:w="11906" w:h="16838" w:code="9"/>
           <w:pgMar w:top="1090" w:right="1134" w:bottom="1701" w:left="1985" w:header="709" w:footer="709" w:gutter="0"/>
           <w:pgNumType w:start="1"/>
@@ -9809,32 +9820,33 @@
           <w:docGrid w:linePitch="360"/>
         </w:sectPr>
       </w:pPr>
-      <w:bookmarkStart w:id="37" w:name="_Toc164957117"/>
+      <w:bookmarkStart w:id="31" w:name="_Toc164957117"/>
     </w:p>
     <w:p>
       <w:pPr>
         <w:pStyle w:val="H0"/>
+        <w:spacing w:line="360" w:lineRule="auto"/>
         <w:outlineLvl w:val="0"/>
       </w:pPr>
-      <w:bookmarkStart w:id="38" w:name="_Toc164957259"/>
-      <w:bookmarkStart w:id="39" w:name="_Toc164957338"/>
-      <w:bookmarkStart w:id="40" w:name="_Toc164957610"/>
-      <w:bookmarkStart w:id="41" w:name="_Toc164966935"/>
-      <w:bookmarkStart w:id="42" w:name="_Toc164954905"/>
-      <w:bookmarkStart w:id="43" w:name="_Toc164955388"/>
-      <w:bookmarkStart w:id="44" w:name="_Toc164957121"/>
-      <w:bookmarkStart w:id="45" w:name="_Toc164957263"/>
-      <w:bookmarkStart w:id="46" w:name="_Toc164957342"/>
-      <w:bookmarkStart w:id="47" w:name="_Toc164957614"/>
-      <w:bookmarkEnd w:id="37"/>
+      <w:bookmarkStart w:id="32" w:name="_Toc164957259"/>
+      <w:bookmarkStart w:id="33" w:name="_Toc164957338"/>
+      <w:bookmarkStart w:id="34" w:name="_Toc164957610"/>
+      <w:bookmarkStart w:id="35" w:name="_Toc164966935"/>
+      <w:bookmarkStart w:id="36" w:name="_Toc164954905"/>
+      <w:bookmarkStart w:id="37" w:name="_Toc164955388"/>
+      <w:bookmarkStart w:id="38" w:name="_Toc164957121"/>
+      <w:bookmarkStart w:id="39" w:name="_Toc164957263"/>
+      <w:bookmarkStart w:id="40" w:name="_Toc164957342"/>
+      <w:bookmarkStart w:id="41" w:name="_Toc164957614"/>
+      <w:bookmarkEnd w:id="31"/>
       <w:r>
         <w:lastRenderedPageBreak/>
         <w:t>MỞ ĐẦU</w:t>
       </w:r>
-      <w:bookmarkEnd w:id="38"/>
-      <w:bookmarkEnd w:id="39"/>
-      <w:bookmarkEnd w:id="40"/>
-      <w:bookmarkEnd w:id="41"/>
+      <w:bookmarkEnd w:id="32"/>
+      <w:bookmarkEnd w:id="33"/>
+      <w:bookmarkEnd w:id="34"/>
+      <w:bookmarkEnd w:id="35"/>
     </w:p>
     <w:p>
       <w:pPr>
@@ -9843,86 +9855,351 @@
           <w:ilvl w:val="1"/>
           <w:numId w:val="18"/>
         </w:numPr>
-      </w:pPr>
-      <w:bookmarkStart w:id="48" w:name="_Toc164954902"/>
+        <w:spacing w:line="360" w:lineRule="auto"/>
+      </w:pPr>
+      <w:bookmarkStart w:id="42" w:name="_Toc164954902"/>
       <w:r>
         <w:rPr>
           <w:lang w:val="vi-VN"/>
         </w:rPr>
         <w:t xml:space="preserve"> </w:t>
       </w:r>
-      <w:bookmarkStart w:id="49" w:name="_Toc164955385"/>
-      <w:bookmarkStart w:id="50" w:name="_Toc164957118"/>
-      <w:bookmarkStart w:id="51" w:name="_Toc164957260"/>
-      <w:bookmarkStart w:id="52" w:name="_Toc164957339"/>
-      <w:bookmarkStart w:id="53" w:name="_Toc164957611"/>
-      <w:bookmarkStart w:id="54" w:name="_Toc164966936"/>
+      <w:bookmarkStart w:id="43" w:name="_Toc164955385"/>
+      <w:bookmarkStart w:id="44" w:name="_Toc164957118"/>
+      <w:bookmarkStart w:id="45" w:name="_Toc164957260"/>
+      <w:bookmarkStart w:id="46" w:name="_Toc164957339"/>
+      <w:bookmarkStart w:id="47" w:name="_Toc164957611"/>
+      <w:bookmarkStart w:id="48" w:name="_Toc164966936"/>
       <w:r>
         <w:t>LÝ DO CHỌN ĐỀ TÀI</w:t>
       </w:r>
+      <w:bookmarkEnd w:id="42"/>
+      <w:bookmarkEnd w:id="43"/>
+      <w:bookmarkEnd w:id="44"/>
+      <w:bookmarkEnd w:id="45"/>
+      <w:bookmarkEnd w:id="46"/>
+      <w:bookmarkEnd w:id="47"/>
       <w:bookmarkEnd w:id="48"/>
+    </w:p>
+    <w:p>
+      <w:pPr>
+        <w:pStyle w:val="NormalWeb"/>
+        <w:spacing w:line="360" w:lineRule="auto"/>
+        <w:ind w:firstLine="360"/>
+        <w:jc w:val="both"/>
+        <w:rPr>
+          <w:sz w:val="26"/>
+          <w:szCs w:val="26"/>
+        </w:rPr>
+      </w:pPr>
+      <w:bookmarkStart w:id="49" w:name="_Toc164954903"/>
+      <w:r>
+        <w:rPr>
+          <w:sz w:val="26"/>
+          <w:szCs w:val="26"/>
+        </w:rPr>
+        <w:t>Trong bối cảnh hội nhập quốc tế, việc học ngoại ngữ, đặc biệt là tiếng Anh, đã trở thành một nhu cầu thiết yếu đối với mỗi cá nhân. Tuy nhiên, sau khi xác định được mục tiêu học tập, vấn đề đặt ra là lựa chọn phương pháp học như thế nào để đạt hiệu quả cao nhất. Trên thực tế, phương pháp học truyền thống chủ yếu dựa vào sách vở thường mang tính thụ động, dễ gây nhàm chán và khiến nhiều người gặp khó khăn trong quá trình tiếp thu kiến thức.</w:t>
+      </w:r>
+    </w:p>
+    <w:p>
+      <w:pPr>
+        <w:spacing w:after="120" w:line="360" w:lineRule="auto"/>
+        <w:ind w:firstLine="360"/>
+        <w:jc w:val="both"/>
+      </w:pPr>
+      <w:r>
+        <w:rPr>
+          <w:szCs w:val="26"/>
+        </w:rPr>
+        <w:t xml:space="preserve">Tuy nhiên, </w:t>
+      </w:r>
+      <w:r>
+        <w:rPr>
+          <w:rFonts w:eastAsia="Times New Roman" w:cs="Times New Roman"/>
+          <w:color w:val="000000"/>
+          <w:szCs w:val="26"/>
+        </w:rPr>
+        <w:t>các ứng dụng học tiếng Anh hiện có trên thị trường (Duolingo, Memrise</w:t>
+      </w:r>
+      <w:r>
+        <w:rPr>
+          <w:rFonts w:eastAsia="Times New Roman" w:cs="Times New Roman"/>
+          <w:color w:val="000000"/>
+          <w:szCs w:val="26"/>
+        </w:rPr>
+        <w:t>, v.v.</w:t>
+      </w:r>
+      <w:r>
+        <w:rPr>
+          <w:rFonts w:eastAsia="Times New Roman" w:cs="Times New Roman"/>
+          <w:color w:val="000000"/>
+          <w:szCs w:val="26"/>
+        </w:rPr>
+        <w:t>) chủ yếu cung cấp từ vựng theo chủ đề cố định, thiếu tính liên kết với ngữ cảnh thực tế mà người dùng đang sống và làm việc. Người học vẫn phải trải qua quá trình học thuộc lòng thụ động, không gắn từ ngữ với hình ảnh vật thể thực tế, dẫn đến hiệu quả ghi nhớ lâu dài bị hạn chế.</w:t>
+      </w:r>
+    </w:p>
+    <w:p>
+      <w:pPr>
+        <w:pStyle w:val="NormalWeb"/>
+        <w:spacing w:line="360" w:lineRule="auto"/>
+        <w:ind w:firstLine="360"/>
+        <w:jc w:val="both"/>
+        <w:rPr>
+          <w:color w:val="000000"/>
+          <w:sz w:val="26"/>
+          <w:szCs w:val="26"/>
+        </w:rPr>
+      </w:pPr>
+      <w:r>
+        <w:rPr>
+          <w:color w:val="000000"/>
+          <w:sz w:val="26"/>
+          <w:szCs w:val="26"/>
+        </w:rPr>
+        <w:t>Cùng với s</w:t>
+      </w:r>
+      <w:r>
+        <w:rPr>
+          <w:color w:val="000000"/>
+          <w:sz w:val="26"/>
+          <w:szCs w:val="26"/>
+        </w:rPr>
+        <w:t>ự phát triển mạnh mẽ của trí tuệ nhân tạo, cụ thể là các mô hình nhận diện vật thể mở ra hướng tiếp cận hoàn toàn mới cho bài toán này. Kết hợp với khả năng xử lý ngay trên thiết bị di động thay vì gửi lên máy chủ – có thể tạo ra trải nghiệm nhận diện tức thì, không phụ thuộc kết nối mạng.</w:t>
+      </w:r>
+    </w:p>
+    <w:p>
+      <w:pPr>
+        <w:pStyle w:val="NormalWeb"/>
+        <w:spacing w:line="360" w:lineRule="auto"/>
+        <w:ind w:firstLine="360"/>
+        <w:jc w:val="both"/>
+        <w:rPr>
+          <w:sz w:val="26"/>
+          <w:szCs w:val="26"/>
+        </w:rPr>
+      </w:pPr>
+      <w:r>
+        <w:rPr>
+          <w:color w:val="000000"/>
+          <w:sz w:val="26"/>
+          <w:szCs w:val="26"/>
+        </w:rPr>
+        <w:t>Xuất phát từ những hạn chế đó, đề tài "Nghiên cứu và ứng dụng mô hình YOLO trong nhận diện vật thể hỗ trợ học từ vựng tiếng Anh trên thiết bị di động" được lựa chọn nhằm xây dựng một giải pháp học từ vựng trực quan, tương tác và cá nhân hoá dựa trên môi trường sống của chính người dùng.</w:t>
+      </w:r>
+    </w:p>
+    <w:p>
+      <w:pPr>
+        <w:pStyle w:val="Heading2"/>
+        <w:numPr>
+          <w:ilvl w:val="1"/>
+          <w:numId w:val="18"/>
+        </w:numPr>
+        <w:spacing w:line="360" w:lineRule="auto"/>
+        <w:rPr>
+          <w:lang w:val="vi-VN"/>
+        </w:rPr>
+      </w:pPr>
+      <w:r>
+        <w:rPr>
+          <w:lang w:val="vi-VN"/>
+        </w:rPr>
+        <w:t xml:space="preserve"> </w:t>
+      </w:r>
+      <w:bookmarkStart w:id="50" w:name="_Toc164955386"/>
+      <w:bookmarkStart w:id="51" w:name="_Toc164957119"/>
+      <w:bookmarkStart w:id="52" w:name="_Toc164957261"/>
+      <w:bookmarkStart w:id="53" w:name="_Toc164957340"/>
+      <w:bookmarkStart w:id="54" w:name="_Toc164957612"/>
+      <w:bookmarkStart w:id="55" w:name="_Toc164966937"/>
+      <w:r>
+        <w:rPr>
+          <w:lang w:val="vi-VN"/>
+        </w:rPr>
+        <w:t>MỤC TIÊU VÀ PHẠM VI NGHIÊN CỨU</w:t>
+      </w:r>
       <w:bookmarkEnd w:id="49"/>
       <w:bookmarkEnd w:id="50"/>
       <w:bookmarkEnd w:id="51"/>
       <w:bookmarkEnd w:id="52"/>
       <w:bookmarkEnd w:id="53"/>
       <w:bookmarkEnd w:id="54"/>
+      <w:bookmarkEnd w:id="55"/>
+      <w:r>
+        <w:rPr>
+          <w:lang w:val="vi-VN"/>
+        </w:rPr>
+        <w:t xml:space="preserve"> </w:t>
+      </w:r>
     </w:p>
     <w:p>
       <w:pPr>
+        <w:pStyle w:val="ListParagraph"/>
+        <w:numPr>
+          <w:ilvl w:val="0"/>
+          <w:numId w:val="21"/>
+        </w:numPr>
+        <w:spacing w:line="360" w:lineRule="auto"/>
+        <w:rPr>
+          <w:b/>
+          <w:bCs/>
+          <w:lang w:val="vi-VN"/>
+        </w:rPr>
+      </w:pPr>
+      <w:r>
+        <w:rPr>
+          <w:b/>
+          <w:bCs/>
+          <w:lang w:val="vi-VN"/>
+        </w:rPr>
+        <w:t xml:space="preserve"> </w:t>
+      </w:r>
+      <w:r>
+        <w:rPr>
+          <w:b/>
+          <w:bCs/>
+          <w:lang w:val="vi-VN"/>
+        </w:rPr>
+        <w:t>Mục tiêu của đề tài</w:t>
+      </w:r>
+      <w:r>
+        <w:rPr>
+          <w:b/>
+          <w:bCs/>
+          <w:lang w:val="vi-VN"/>
+        </w:rPr>
+        <w:t>:</w:t>
+      </w:r>
+    </w:p>
+    <w:p>
+      <w:pPr>
         <w:pStyle w:val="NormalWeb"/>
+        <w:spacing w:line="360" w:lineRule="auto"/>
         <w:ind w:firstLine="360"/>
         <w:jc w:val="both"/>
         <w:rPr>
           <w:sz w:val="26"/>
           <w:szCs w:val="26"/>
-        </w:rPr>
-      </w:pPr>
-      <w:bookmarkStart w:id="55" w:name="_Toc164954903"/>
+          <w:lang w:val="vi-VN"/>
+        </w:rPr>
+      </w:pPr>
       <w:r>
         <w:rPr>
           <w:sz w:val="26"/>
           <w:szCs w:val="26"/>
-        </w:rPr>
-        <w:t>Trong bối cảnh hội nhập quốc tế, việc học ngoại ngữ, đặc biệt là tiếng Anh, đã trở thành một nhu cầu thiết yếu đối với mỗi cá nhân. Tuy nhiên, sau khi xác định được mục tiêu học tập, vấn đề đặt ra là lựa chọn phương pháp học như thế nào để đạt hiệu quả cao nhất. Trên thực tế, phương pháp học truyền thống chủ yếu dựa vào sách vở thường mang tính thụ động, dễ gây nhàm chán và khiến nhiều người gặp khó khăn trong quá trình tiếp thu kiến thức.</w:t>
+          <w:lang w:val="vi-VN"/>
+        </w:rPr>
+        <w:t xml:space="preserve">Xây dựng một ứng dụng học tiếng Anh trên thiết bị di động theo hướng cá nhân hóa, giúp người học tiếp cận nội dung phù hợp với trình độ và tiến độ của từng cá </w:t>
+      </w:r>
+      <w:r>
+        <w:rPr>
+          <w:sz w:val="26"/>
+          <w:szCs w:val="26"/>
+          <w:lang w:val="vi-VN"/>
+        </w:rPr>
+        <w:lastRenderedPageBreak/>
+        <w:t>nhân.</w:t>
+      </w:r>
+      <w:r>
+        <w:rPr>
+          <w:sz w:val="26"/>
+          <w:szCs w:val="26"/>
+          <w:lang w:val="vi-VN"/>
+        </w:rPr>
+        <w:t xml:space="preserve"> </w:t>
+      </w:r>
+      <w:r>
+        <w:rPr>
+          <w:sz w:val="26"/>
+          <w:szCs w:val="26"/>
+          <w:lang w:val="vi-VN"/>
+        </w:rPr>
+        <w:t xml:space="preserve">Bên cạnh đó, đề tài tập trung nghiên cứu và tích hợp công nghệ nhận diện </w:t>
+      </w:r>
+      <w:r>
+        <w:rPr>
+          <w:sz w:val="26"/>
+          <w:szCs w:val="26"/>
+          <w:lang w:val="vi-VN"/>
+        </w:rPr>
+        <w:t xml:space="preserve">hình ảnh </w:t>
+      </w:r>
+      <w:r>
+        <w:rPr>
+          <w:sz w:val="26"/>
+          <w:szCs w:val="26"/>
+          <w:lang w:val="vi-VN"/>
+        </w:rPr>
+        <w:t>nhằm hỗ trợ người học tra cứu và ghi nhớ từ vựng thông qua các vật thể trong thực tế, góp phần nâng cao khả năng liên kết giữa ngôn ngữ và ngữ cảnh sử dụng.</w:t>
       </w:r>
     </w:p>
     <w:p>
       <w:pPr>
         <w:pStyle w:val="NormalWeb"/>
+        <w:spacing w:line="360" w:lineRule="auto"/>
         <w:ind w:firstLine="360"/>
         <w:jc w:val="both"/>
         <w:rPr>
           <w:sz w:val="26"/>
           <w:szCs w:val="26"/>
+          <w:lang w:val="vi-VN"/>
         </w:rPr>
       </w:pPr>
       <w:r>
         <w:rPr>
           <w:sz w:val="26"/>
           <w:szCs w:val="26"/>
-        </w:rPr>
-        <w:t>Cùng với sự phát triển nhanh chóng của công nghệ, đặc biệt là sự phổ biến của điện thoại thông minh trong những năm gần đây, việc học tập trên nền tảng di động ngày càng nhận được nhiều sự quan tâm. Tuy nhiên, các ứng dụng học tiếng Anh trên điện thoại hiện nay vẫn chưa thực sự đáp ứng đầy đủ nhu cầu đa dạng của người học.</w:t>
-      </w:r>
-      <w:r>
-        <w:rPr>
-          <w:rFonts w:eastAsiaTheme="minorHAnsi" w:cstheme="minorBidi"/>
-          <w:sz w:val="26"/>
-          <w:szCs w:val="26"/>
-        </w:rPr>
-        <w:t xml:space="preserve"> </w:t>
-      </w:r>
-      <w:r>
-        <w:rPr>
-          <w:sz w:val="26"/>
-          <w:szCs w:val="26"/>
-        </w:rPr>
-        <w:t>So với học trên máy tính, mobile learning linh hoạt hơn, cho phép học trong thời gian ngắn, hỗ trợ nhắc nhở và cá nhân hóa nội dung, từ đó nâng cao hiệu quả ghi nhớ, đặc biệt trong học từ vựng.</w:t>
+          <w:lang w:val="vi-VN"/>
+        </w:rPr>
+        <w:t>Nghiên cứu và tích hợp công nghệ nhận diện vật thể vào ứng dụng. Tính năng này hỗ trợ người dùng tra cứu và ghi nhớ từ vựng trực quan thông qua các vật thể thực tế, góp phần nâng cao khả năng liên kết giữa ngôn ngữ và ngữ cảnh sử dụng.</w:t>
       </w:r>
     </w:p>
     <w:p>
       <w:pPr>
+        <w:pStyle w:val="ListParagraph"/>
+        <w:numPr>
+          <w:ilvl w:val="0"/>
+          <w:numId w:val="21"/>
+        </w:numPr>
+        <w:spacing w:line="360" w:lineRule="auto"/>
+        <w:rPr>
+          <w:b/>
+          <w:bCs/>
+        </w:rPr>
+      </w:pPr>
+      <w:r>
+        <w:rPr>
+          <w:b/>
+          <w:bCs/>
+          <w:lang w:val="vi-VN"/>
+        </w:rPr>
+        <w:t xml:space="preserve"> </w:t>
+      </w:r>
+      <w:r>
+        <w:rPr>
+          <w:b/>
+          <w:bCs/>
+        </w:rPr>
+        <w:t>Phạm vi nghiên cứu</w:t>
+      </w:r>
+      <w:r>
+        <w:rPr>
+          <w:b/>
+          <w:bCs/>
+        </w:rPr>
+        <w:t>:</w:t>
+      </w:r>
+      <w:r>
+        <w:rPr>
+          <w:b/>
+          <w:bCs/>
+        </w:rPr>
+        <w:t xml:space="preserve"> </w:t>
+      </w:r>
+    </w:p>
+    <w:p>
+      <w:pPr>
         <w:pStyle w:val="NormalWeb"/>
+        <w:spacing w:line="360" w:lineRule="auto"/>
         <w:ind w:firstLine="360"/>
         <w:jc w:val="both"/>
         <w:rPr>
@@ -9935,31 +10212,45 @@
           <w:sz w:val="26"/>
           <w:szCs w:val="26"/>
         </w:rPr>
-        <w:t xml:space="preserve">Tuy nhiên, các ứng dụng di động hiện nay đa phần vẫn còn rập khuôn, nội dung thiếu gắn kết với ngữ cảnh thực tế. </w:t>
-      </w:r>
-      <w:r>
+        <w:t>Đề tài tập trung nghiên cứu việc học tiếng Anh trên nền tảng thiết bị di động, hướng đến đối tượng là học sinh, sinh viên và những người có nhu cầu học tiếng Anh tại Việt Nam.</w:t>
+      </w:r>
+    </w:p>
+    <w:p>
+      <w:pPr>
+        <w:pStyle w:val="NormalWeb"/>
+        <w:spacing w:line="360" w:lineRule="auto"/>
+        <w:ind w:firstLine="720"/>
+        <w:jc w:val="both"/>
         <w:rPr>
           <w:sz w:val="26"/>
           <w:szCs w:val="26"/>
         </w:rPr>
-        <w:t xml:space="preserve">Xuất phát từ những hạn chế đó, đề tài </w:t>
-      </w:r>
-      <w:r>
-        <w:rPr>
-          <w:rStyle w:val="Strong"/>
-          <w:b w:val="0"/>
-          <w:bCs w:val="0"/>
+      </w:pPr>
+      <w:r>
+        <w:rPr>
           <w:sz w:val="26"/>
           <w:szCs w:val="26"/>
         </w:rPr>
-        <w:t>“Ứng dụng học tiếng Anh trên điện thoại di động”</w:t>
-      </w:r>
-      <w:r>
+        <w:t>Nội dung nghiên cứu bao gồm: các phương pháp học tiếng Anh hiện nay; ứng dụng mobile learning trong việc hỗ trợ học tập; và việc xây dựng các chức năng chính của hệ thống như học từ vựng, ngữ pháp, luyện nghe – nói và nhận diện vật thể để hỗ trợ học từ vựng theo ngữ cảnh.</w:t>
+      </w:r>
+    </w:p>
+    <w:p>
+      <w:pPr>
+        <w:pStyle w:val="NormalWeb"/>
+        <w:spacing w:line="360" w:lineRule="auto"/>
+        <w:ind w:firstLine="360"/>
+        <w:jc w:val="both"/>
         <w:rPr>
           <w:sz w:val="26"/>
           <w:szCs w:val="26"/>
         </w:rPr>
-        <w:t xml:space="preserve"> được lựa chọn nhằm nghiên cứu và đề xuất giải pháp nâng cao hiệu quả học tập thông qua việc tận dụng công nghệ hiện đại.</w:t>
+      </w:pPr>
+      <w:r>
+        <w:rPr>
+          <w:sz w:val="26"/>
+          <w:szCs w:val="26"/>
+        </w:rPr>
+        <w:t>Đề tài giới hạn trong phạm vi thiết kế và xây dựng các chức năng cốt lõi của ứng dụng, chưa đi sâu vào các vấn đề nâng cao như xử lý ngôn ngữ tự nhiên phức tạp hoặc triển khai hệ thống ở quy mô lớn.</w:t>
       </w:r>
     </w:p>
     <w:p>
@@ -9969,40 +10260,34 @@
           <w:ilvl w:val="1"/>
           <w:numId w:val="18"/>
         </w:numPr>
-      </w:pPr>
-      <w:r>
-        <w:rPr>
-          <w:lang w:val="vi-VN"/>
-        </w:rPr>
-        <w:t xml:space="preserve"> </w:t>
-      </w:r>
-      <w:bookmarkStart w:id="56" w:name="_Toc164955386"/>
-      <w:bookmarkStart w:id="57" w:name="_Toc164957119"/>
-      <w:bookmarkStart w:id="58" w:name="_Toc164957261"/>
-      <w:bookmarkStart w:id="59" w:name="_Toc164957340"/>
-      <w:bookmarkStart w:id="60" w:name="_Toc164957612"/>
-      <w:bookmarkStart w:id="61" w:name="_Toc164966937"/>
-      <w:r>
-        <w:t>MỤC TIÊU VÀ PHẠM VI NGHIÊN CỨU</w:t>
-      </w:r>
-      <w:bookmarkEnd w:id="55"/>
+        <w:spacing w:line="360" w:lineRule="auto"/>
+      </w:pPr>
+      <w:bookmarkStart w:id="56" w:name="_Toc164954904"/>
+      <w:bookmarkStart w:id="57" w:name="_Toc164955387"/>
+      <w:bookmarkStart w:id="58" w:name="_Toc164957120"/>
+      <w:bookmarkStart w:id="59" w:name="_Toc164957262"/>
+      <w:bookmarkStart w:id="60" w:name="_Toc164957341"/>
+      <w:bookmarkStart w:id="61" w:name="_Toc164957613"/>
+      <w:bookmarkStart w:id="62" w:name="_Toc164966938"/>
+      <w:r>
+        <w:t>Ý NGHĨA KHOA HỌC VÀ THỰC TIỄN CỦA ĐỀ TÀI</w:t>
+      </w:r>
       <w:bookmarkEnd w:id="56"/>
       <w:bookmarkEnd w:id="57"/>
       <w:bookmarkEnd w:id="58"/>
       <w:bookmarkEnd w:id="59"/>
       <w:bookmarkEnd w:id="60"/>
       <w:bookmarkEnd w:id="61"/>
-      <w:r>
-        <w:t xml:space="preserve"> </w:t>
-      </w:r>
+      <w:bookmarkEnd w:id="62"/>
     </w:p>
     <w:p>
       <w:pPr>
         <w:pStyle w:val="ListParagraph"/>
         <w:numPr>
           <w:ilvl w:val="0"/>
-          <w:numId w:val="21"/>
+          <w:numId w:val="22"/>
         </w:numPr>
+        <w:spacing w:line="360" w:lineRule="auto"/>
         <w:rPr>
           <w:b/>
           <w:bCs/>
@@ -10020,7 +10305,7 @@
           <w:b/>
           <w:bCs/>
         </w:rPr>
-        <w:t>Mục tiêu của đề tài</w:t>
+        <w:t>Ý nghĩa khoa học</w:t>
       </w:r>
       <w:r>
         <w:rPr>
@@ -10033,6 +10318,7 @@
     <w:p>
       <w:pPr>
         <w:pStyle w:val="NormalWeb"/>
+        <w:spacing w:line="360" w:lineRule="auto"/>
         <w:ind w:firstLine="360"/>
         <w:jc w:val="both"/>
         <w:rPr>
@@ -10045,33 +10331,35 @@
           <w:sz w:val="26"/>
           <w:szCs w:val="26"/>
         </w:rPr>
-        <w:t>Xây dựng một ứng dụng học tiếng Anh trên thiết bị di động theo hướng cá nhân hóa, giúp người học tiếp cận nội dung phù hợp với trình độ và tiến độ của từng cá nhân.</w:t>
-      </w:r>
-      <w:r>
-        <w:rPr>
+        <w:t>Đề tài góp phần làm rõ cơ sở lý thuyết về phương pháp học ngoại ngữ trên nền tảng di động. Đặc biệt</w:t>
+      </w:r>
+      <w:r>
+        <w:rPr>
+          <w:rFonts w:eastAsiaTheme="minorHAnsi" w:cstheme="minorBidi"/>
           <w:sz w:val="26"/>
           <w:szCs w:val="26"/>
         </w:rPr>
-        <w:t xml:space="preserve">Bên cạnh đó, đề tài tập trung nghiên cứu và tích hợp công nghệ nhận diện </w:t>
+        <w:t xml:space="preserve"> </w:t>
       </w:r>
       <w:r>
         <w:rPr>
           <w:sz w:val="26"/>
           <w:szCs w:val="26"/>
         </w:rPr>
-        <w:t xml:space="preserve">hình ảnh </w:t>
+        <w:t>việc tích hợp công nghệ nhận diện vật thể minh chứng hiệu quả của phương pháp học tập theo ngữ cảnh, từ đó</w:t>
       </w:r>
       <w:r>
         <w:rPr>
           <w:sz w:val="26"/>
           <w:szCs w:val="26"/>
         </w:rPr>
-        <w:t>nhằm hỗ trợ người học tra cứu và ghi nhớ từ vựng thông qua các vật thể trong thực tế, góp phần nâng cao khả năng liên kết giữa ngôn ngữ và ngữ cảnh sử dụng.</w:t>
+        <w:t xml:space="preserve"> tăng khả năng liên kết giữa ngôn ngữ và môi trường thực tế.</w:t>
       </w:r>
     </w:p>
     <w:p>
       <w:pPr>
         <w:pStyle w:val="NormalWeb"/>
+        <w:spacing w:line="360" w:lineRule="auto"/>
         <w:ind w:firstLine="360"/>
         <w:jc w:val="both"/>
         <w:rPr>
@@ -10084,7 +10372,36 @@
           <w:sz w:val="26"/>
           <w:szCs w:val="26"/>
         </w:rPr>
-        <w:t>Nghiên cứu và tích hợp công nghệ nhận diện vật thể vào ứng dụng. Tính năng này hỗ trợ người dùng tra cứu và ghi nhớ từ vựng trực quan thông qua các vật thể thực tế, góp phần nâng cao khả năng liên kết giữa ngôn ngữ và ngữ cảnh sử dụng.</w:t>
+        <w:lastRenderedPageBreak/>
+        <w:t>Ngoài ra, đề</w:t>
+      </w:r>
+      <w:r>
+        <w:rPr>
+          <w:sz w:val="26"/>
+          <w:szCs w:val="26"/>
+        </w:rPr>
+        <w:t xml:space="preserve"> </w:t>
+      </w:r>
+      <w:r>
+        <w:rPr>
+          <w:sz w:val="26"/>
+          <w:szCs w:val="26"/>
+        </w:rPr>
+        <w:t xml:space="preserve">tài còn góp phần nghiên cứu và đề xuất mô hình học tập cá nhân hóa, phù hợp với xu hướng ứng dụng công nghệ và </w:t>
+      </w:r>
+      <w:r>
+        <w:rPr>
+          <w:sz w:val="26"/>
+          <w:szCs w:val="26"/>
+        </w:rPr>
+        <w:t>t</w:t>
+      </w:r>
+      <w:r>
+        <w:rPr>
+          <w:sz w:val="26"/>
+          <w:szCs w:val="26"/>
+        </w:rPr>
+        <w:t>rí tuệ nhân tạo trong lĩnh vực giáo dục hiện nay.</w:t>
       </w:r>
     </w:p>
     <w:p>
@@ -10092,410 +10409,122 @@
         <w:pStyle w:val="ListParagraph"/>
         <w:numPr>
           <w:ilvl w:val="0"/>
-          <w:numId w:val="21"/>
+          <w:numId w:val="22"/>
         </w:numPr>
+        <w:spacing w:line="360" w:lineRule="auto"/>
         <w:rPr>
           <w:b/>
           <w:bCs/>
+          <w:szCs w:val="26"/>
         </w:rPr>
       </w:pPr>
       <w:r>
         <w:rPr>
           <w:b/>
           <w:bCs/>
-        </w:rPr>
-        <w:t xml:space="preserve"> </w:t>
+          <w:szCs w:val="26"/>
+        </w:rPr>
+        <w:t xml:space="preserve"> Ý nghĩa t</w:t>
       </w:r>
       <w:r>
         <w:rPr>
           <w:b/>
           <w:bCs/>
-        </w:rPr>
-        <w:t>Phạm vi nghiên cứu</w:t>
+          <w:szCs w:val="26"/>
+        </w:rPr>
+        <w:t>hực tiễn của đề tài</w:t>
       </w:r>
       <w:r>
         <w:rPr>
           <w:b/>
           <w:bCs/>
+          <w:szCs w:val="26"/>
         </w:rPr>
         <w:t>:</w:t>
-      </w:r>
-      <w:r>
-        <w:rPr>
-          <w:b/>
-          <w:bCs/>
-        </w:rPr>
-        <w:t xml:space="preserve"> </w:t>
       </w:r>
     </w:p>
     <w:p>
       <w:pPr>
-        <w:pStyle w:val="NormalWeb"/>
-        <w:ind w:firstLine="360"/>
+        <w:spacing w:after="120" w:line="360" w:lineRule="auto"/>
+        <w:ind w:left="360" w:firstLine="360"/>
         <w:jc w:val="both"/>
-        <w:rPr>
-          <w:sz w:val="26"/>
-          <w:szCs w:val="26"/>
-        </w:rPr>
-      </w:pPr>
-      <w:r>
-        <w:rPr>
-          <w:sz w:val="26"/>
-          <w:szCs w:val="26"/>
-        </w:rPr>
-        <w:t>Đề tài tập trung nghiên cứu việc học tiếng Anh trên nền tảng thiết bị di động, hướng đến đối tượng là học sinh, sinh viên và những người có nhu cầu học tiếng Anh tại Việt Nam.</w:t>
+      </w:pPr>
+      <w:r>
+        <w:rPr>
+          <w:rFonts w:eastAsia="Times New Roman" w:cs="Times New Roman"/>
+          <w:color w:val="000000"/>
+          <w:szCs w:val="26"/>
+        </w:rPr>
+        <w:t>Ứng dụng cung cấp công cụ học từ vựng tiếng Anh trực quan, tương tác và cá nhân hoá, giúp người học tiếp thu từ vựng tự nhiên thông qua chính môi trường sống hằng ngày. Khác với các ứng dụng hiện có, người dùng không cần ghi nhớ theo danh sách từ cố định mà có thể học từ bất kỳ vật thể nào họ nhìn thấy, tạo ra sự liên kết mạnh mẽ giữa từ ngữ và thực tế. Hệ thống ôn tập thông minh đảm bảo từ vựng được củng cố đúng thời điểm trước khi bị quên, tối ưu hoá thời gian học tập.</w:t>
       </w:r>
     </w:p>
     <w:p>
       <w:pPr>
-        <w:pStyle w:val="NormalWeb"/>
-        <w:ind w:firstLine="360"/>
-        <w:jc w:val="both"/>
-        <w:rPr>
-          <w:sz w:val="26"/>
-          <w:szCs w:val="26"/>
-        </w:rPr>
-      </w:pPr>
+        <w:pStyle w:val="Heading1"/>
+        <w:numPr>
+          <w:ilvl w:val="0"/>
+          <w:numId w:val="19"/>
+        </w:numPr>
+      </w:pPr>
+      <w:r>
+        <w:br w:type="page"/>
+      </w:r>
     </w:p>
     <w:p>
       <w:pPr>
-        <w:pStyle w:val="NormalWeb"/>
-        <w:ind w:firstLine="720"/>
-        <w:jc w:val="both"/>
-        <w:rPr>
-          <w:sz w:val="26"/>
-          <w:szCs w:val="26"/>
-        </w:rPr>
-      </w:pPr>
-      <w:r>
-        <w:rPr>
-          <w:sz w:val="26"/>
-          <w:szCs w:val="26"/>
-        </w:rPr>
+        <w:pStyle w:val="Heading1"/>
+        <w:numPr>
+          <w:ilvl w:val="0"/>
+          <w:numId w:val="20"/>
+        </w:numPr>
+      </w:pPr>
+      <w:bookmarkStart w:id="63" w:name="_Toc164966939"/>
+      <w:r>
         <w:lastRenderedPageBreak/>
-        <w:t>Nội dung nghiên cứu bao gồm: các phương pháp học tiếng Anh hiện nay; ứng dụng mobile learning trong việc hỗ trợ học tập; và việc xây dựng các chức năng chính của hệ thống như học từ vựng, ngữ pháp, luyện nghe – nói và nhận diện vật thể để hỗ trợ học từ vựng theo ngữ cảnh.</w:t>
-      </w:r>
+        <w:t>TỔNG QUAN ĐỀ TÀI</w:t>
+      </w:r>
+      <w:bookmarkEnd w:id="36"/>
+      <w:bookmarkEnd w:id="37"/>
+      <w:bookmarkEnd w:id="38"/>
+      <w:bookmarkEnd w:id="39"/>
+      <w:bookmarkEnd w:id="40"/>
+      <w:bookmarkEnd w:id="41"/>
+      <w:bookmarkEnd w:id="63"/>
     </w:p>
     <w:p>
       <w:pPr>
-        <w:pStyle w:val="NormalWeb"/>
-        <w:ind w:firstLine="360"/>
-        <w:jc w:val="both"/>
-        <w:rPr>
-          <w:sz w:val="26"/>
-          <w:szCs w:val="26"/>
-        </w:rPr>
-      </w:pPr>
-      <w:r>
-        <w:rPr>
-          <w:sz w:val="26"/>
-          <w:szCs w:val="26"/>
-        </w:rPr>
-        <w:t>Đề tài giới hạn trong phạm vi thiết kế và xây dựng các chức năng cốt lõi của ứng dụng, chưa đi sâu vào các vấn đề nâng cao như xử lý ngôn ngữ tự nhiên phức tạp hoặc triển khai hệ thống ở quy mô lớn.</w:t>
-      </w:r>
-    </w:p>
-    <w:p>
-      <w:pPr>
         <w:pStyle w:val="Heading2"/>
-        <w:numPr>
-          <w:ilvl w:val="1"/>
-          <w:numId w:val="18"/>
-        </w:numPr>
-      </w:pPr>
-      <w:bookmarkStart w:id="62" w:name="_Toc164954904"/>
-      <w:bookmarkStart w:id="63" w:name="_Toc164955387"/>
-      <w:bookmarkStart w:id="64" w:name="_Toc164957120"/>
-      <w:bookmarkStart w:id="65" w:name="_Toc164957262"/>
-      <w:bookmarkStart w:id="66" w:name="_Toc164957341"/>
-      <w:bookmarkStart w:id="67" w:name="_Toc164957613"/>
-      <w:bookmarkStart w:id="68" w:name="_Toc164966938"/>
-      <w:r>
-        <w:t>Ý NGHĨA KHOA HỌC VÀ THỰC TIỄN CỦA ĐỀ TÀI</w:t>
-      </w:r>
-      <w:bookmarkEnd w:id="62"/>
-      <w:bookmarkEnd w:id="63"/>
+        <w:spacing w:line="360" w:lineRule="auto"/>
+      </w:pPr>
+      <w:bookmarkStart w:id="64" w:name="_Toc164955389"/>
+      <w:bookmarkStart w:id="65" w:name="_Toc164957122"/>
+      <w:bookmarkStart w:id="66" w:name="_Toc164957264"/>
+      <w:bookmarkStart w:id="67" w:name="_Toc164957343"/>
+      <w:bookmarkStart w:id="68" w:name="_Toc164957615"/>
+      <w:bookmarkStart w:id="69" w:name="_Toc164966940"/>
+      <w:r>
+        <w:t>Phân tích, đánh giá các công trình nghiên cứu đã có liên quan đến đề tài nghiên cứu</w:t>
+      </w:r>
       <w:bookmarkEnd w:id="64"/>
       <w:bookmarkEnd w:id="65"/>
       <w:bookmarkEnd w:id="66"/>
       <w:bookmarkEnd w:id="67"/>
       <w:bookmarkEnd w:id="68"/>
-    </w:p>
-    <w:p>
-      <w:pPr>
-        <w:pStyle w:val="ListParagraph"/>
-        <w:numPr>
-          <w:ilvl w:val="0"/>
-          <w:numId w:val="22"/>
-        </w:numPr>
-        <w:rPr>
-          <w:b/>
-          <w:bCs/>
-        </w:rPr>
-      </w:pPr>
-      <w:r>
-        <w:rPr>
-          <w:b/>
-          <w:bCs/>
-        </w:rPr>
-        <w:t xml:space="preserve"> </w:t>
-      </w:r>
-      <w:r>
-        <w:rPr>
-          <w:b/>
-          <w:bCs/>
-        </w:rPr>
-        <w:t>Ý nghĩa khoa học</w:t>
-      </w:r>
-      <w:r>
-        <w:rPr>
-          <w:b/>
-          <w:bCs/>
-        </w:rPr>
-        <w:t>:</w:t>
-      </w:r>
-    </w:p>
-    <w:p>
-      <w:pPr>
-        <w:pStyle w:val="NormalWeb"/>
-        <w:ind w:firstLine="360"/>
-        <w:jc w:val="both"/>
-        <w:rPr>
-          <w:sz w:val="26"/>
-          <w:szCs w:val="26"/>
-        </w:rPr>
-      </w:pPr>
-      <w:r>
-        <w:rPr>
-          <w:sz w:val="26"/>
-          <w:szCs w:val="26"/>
-        </w:rPr>
-        <w:t>Đề tài góp phần làm rõ cơ sở lý thuyết về phương pháp học ngoại ngữ trên nền tảng di động. Đặc biệt</w:t>
-      </w:r>
-      <w:r>
-        <w:rPr>
-          <w:rFonts w:eastAsiaTheme="minorHAnsi" w:cstheme="minorBidi"/>
-          <w:sz w:val="26"/>
-          <w:szCs w:val="26"/>
-        </w:rPr>
-        <w:t xml:space="preserve"> </w:t>
-      </w:r>
-      <w:r>
-        <w:rPr>
-          <w:sz w:val="26"/>
-          <w:szCs w:val="26"/>
-        </w:rPr>
-        <w:t>việc tích hợp công nghệ nhận diện vật thể minh chứng hiệu quả của phương pháp học tập theo ngữ cảnh, từ đó</w:t>
-      </w:r>
-      <w:r>
-        <w:rPr>
-          <w:sz w:val="26"/>
-          <w:szCs w:val="26"/>
-        </w:rPr>
-        <w:t xml:space="preserve"> tăng khả năng liên kết giữa ngôn ngữ và môi trường thực tế.</w:t>
-      </w:r>
-    </w:p>
-    <w:p>
-      <w:pPr>
-        <w:pStyle w:val="NormalWeb"/>
-        <w:ind w:firstLine="360"/>
-        <w:jc w:val="both"/>
-        <w:rPr>
-          <w:sz w:val="26"/>
-          <w:szCs w:val="26"/>
-        </w:rPr>
-      </w:pPr>
-      <w:r>
-        <w:rPr>
-          <w:sz w:val="26"/>
-          <w:szCs w:val="26"/>
-        </w:rPr>
-        <w:t>Ngoài ra, đề</w:t>
-      </w:r>
-      <w:r>
-        <w:rPr>
-          <w:sz w:val="26"/>
-          <w:szCs w:val="26"/>
-        </w:rPr>
-        <w:t xml:space="preserve"> </w:t>
-      </w:r>
-      <w:r>
-        <w:rPr>
-          <w:sz w:val="26"/>
-          <w:szCs w:val="26"/>
-        </w:rPr>
-        <w:t xml:space="preserve">tài còn góp phần nghiên cứu và đề xuất mô hình học tập cá nhân hóa, phù hợp với xu hướng ứng dụng công nghệ và </w:t>
-      </w:r>
-      <w:r>
-        <w:rPr>
-          <w:sz w:val="26"/>
-          <w:szCs w:val="26"/>
-        </w:rPr>
-        <w:t>t</w:t>
-      </w:r>
-      <w:r>
-        <w:rPr>
-          <w:sz w:val="26"/>
-          <w:szCs w:val="26"/>
-        </w:rPr>
-        <w:t>rí tuệ nhân tạo trong lĩnh vực giáo dục hiện nay.</w:t>
-      </w:r>
-    </w:p>
-    <w:p>
-      <w:pPr>
-        <w:pStyle w:val="ListParagraph"/>
-        <w:numPr>
-          <w:ilvl w:val="0"/>
-          <w:numId w:val="22"/>
-        </w:numPr>
-        <w:rPr>
-          <w:b/>
-          <w:bCs/>
-          <w:szCs w:val="26"/>
-        </w:rPr>
-      </w:pPr>
-      <w:r>
-        <w:rPr>
-          <w:b/>
-          <w:bCs/>
-          <w:szCs w:val="26"/>
-        </w:rPr>
-        <w:t xml:space="preserve"> Ý nghĩa t</w:t>
-      </w:r>
-      <w:r>
-        <w:rPr>
-          <w:b/>
-          <w:bCs/>
-          <w:szCs w:val="26"/>
-        </w:rPr>
-        <w:t>hực tiễn của đề tài</w:t>
-      </w:r>
-      <w:r>
-        <w:rPr>
-          <w:b/>
-          <w:bCs/>
-          <w:szCs w:val="26"/>
-        </w:rPr>
-        <w:t>:</w:t>
-      </w:r>
-    </w:p>
-    <w:p>
-      <w:pPr>
-        <w:pStyle w:val="NormalWeb"/>
-        <w:ind w:firstLine="360"/>
-        <w:jc w:val="both"/>
-        <w:rPr>
-          <w:sz w:val="26"/>
-          <w:szCs w:val="26"/>
-        </w:rPr>
-      </w:pPr>
-      <w:r>
-        <w:rPr>
-          <w:sz w:val="26"/>
-          <w:szCs w:val="26"/>
-        </w:rPr>
-        <w:t xml:space="preserve">Về mặt thực tiễn, đề tài mang tính ứng dụng cao khi xây dựng thành công </w:t>
-      </w:r>
-      <w:r>
-        <w:rPr>
-          <w:sz w:val="26"/>
-          <w:szCs w:val="26"/>
-        </w:rPr>
-        <w:t>một công cụ hỗ trợ học tiếng Anh</w:t>
-      </w:r>
-      <w:r>
-        <w:rPr>
-          <w:sz w:val="26"/>
-          <w:szCs w:val="26"/>
-        </w:rPr>
-        <w:t xml:space="preserve"> hiệu quả trên thiết bị di động, giúp người học chủ động tra cứu và tiếp thu kiến thức mọi lúc, mọi nơi.</w:t>
-      </w:r>
-    </w:p>
-    <w:p>
-      <w:pPr>
-        <w:pStyle w:val="NormalWeb"/>
-        <w:ind w:firstLine="360"/>
-        <w:jc w:val="both"/>
-        <w:rPr>
-          <w:b/>
-          <w:bCs/>
-          <w:sz w:val="26"/>
-          <w:szCs w:val="26"/>
-        </w:rPr>
-      </w:pPr>
-      <w:r>
-        <w:rPr>
-          <w:sz w:val="26"/>
-          <w:szCs w:val="26"/>
-        </w:rPr>
-        <w:t xml:space="preserve">Ứng dụng giúp </w:t>
-      </w:r>
-      <w:r>
-        <w:rPr>
-          <w:sz w:val="26"/>
-          <w:szCs w:val="26"/>
-        </w:rPr>
-        <w:t>khắc phục hạn chế của phương pháp học thuộc lòng truyền thống</w:t>
-      </w:r>
-      <w:r>
-        <w:rPr>
-          <w:sz w:val="26"/>
-          <w:szCs w:val="26"/>
-        </w:rPr>
-        <w:t xml:space="preserve">, hỗ trợ người dùng ghi nhớ từ vựng sâu sắc hơn thông qua việc trực tiếp dùng camera quét và nhận diện các vật thể trong môi trường xung quanh, </w:t>
-      </w:r>
-      <w:r>
-        <w:rPr>
-          <w:sz w:val="26"/>
-          <w:szCs w:val="26"/>
-        </w:rPr>
-        <w:t>từ đó nâng cao khả năng áp dụng ngôn ngữ vào thực tế. Đồng thời, việc cá nhân hóa lộ trình học giúp cải thiện trải nghiệm người dùng và nâng cao hiệu quả ghi nhớ.</w:t>
-      </w:r>
-    </w:p>
-    <w:p>
-      <w:pPr>
-        <w:pStyle w:val="Heading1"/>
-        <w:numPr>
-          <w:ilvl w:val="0"/>
-          <w:numId w:val="19"/>
-        </w:numPr>
-      </w:pPr>
-      <w:r>
-        <w:br w:type="page"/>
-      </w:r>
-    </w:p>
-    <w:p>
-      <w:pPr>
-        <w:pStyle w:val="Heading1"/>
-        <w:numPr>
-          <w:ilvl w:val="0"/>
-          <w:numId w:val="20"/>
-        </w:numPr>
-      </w:pPr>
-      <w:bookmarkStart w:id="69" w:name="_Toc164966939"/>
-      <w:r>
-        <w:lastRenderedPageBreak/>
-        <w:t>TỔNG QUAN ĐỀ TÀI</w:t>
-      </w:r>
-      <w:bookmarkEnd w:id="42"/>
-      <w:bookmarkEnd w:id="43"/>
-      <w:bookmarkEnd w:id="44"/>
-      <w:bookmarkEnd w:id="45"/>
-      <w:bookmarkEnd w:id="46"/>
-      <w:bookmarkEnd w:id="47"/>
       <w:bookmarkEnd w:id="69"/>
     </w:p>
     <w:p>
       <w:pPr>
         <w:pStyle w:val="Heading2"/>
-      </w:pPr>
-      <w:bookmarkStart w:id="70" w:name="_Toc164955389"/>
-      <w:bookmarkStart w:id="71" w:name="_Toc164957122"/>
-      <w:bookmarkStart w:id="72" w:name="_Toc164957264"/>
-      <w:bookmarkStart w:id="73" w:name="_Toc164957343"/>
-      <w:bookmarkStart w:id="74" w:name="_Toc164957615"/>
-      <w:bookmarkStart w:id="75" w:name="_Toc164966940"/>
-      <w:r>
-        <w:t>Phân tích, đánh giá các công trình nghiên cứu đã có liên quan đến đề tài nghiên cứu</w:t>
+        <w:spacing w:line="360" w:lineRule="auto"/>
+      </w:pPr>
+      <w:bookmarkStart w:id="70" w:name="_Toc164955390"/>
+      <w:bookmarkStart w:id="71" w:name="_Toc164957123"/>
+      <w:bookmarkStart w:id="72" w:name="_Toc164957265"/>
+      <w:bookmarkStart w:id="73" w:name="_Toc164957344"/>
+      <w:bookmarkStart w:id="74" w:name="_Toc164957616"/>
+      <w:bookmarkStart w:id="75" w:name="_Toc164966941"/>
+      <w:r>
+        <w:t>Nêu những vấn đề còn tồn tại</w:t>
       </w:r>
       <w:bookmarkEnd w:id="70"/>
       <w:bookmarkEnd w:id="71"/>
@@ -10507,15 +10536,25 @@
     <w:p>
       <w:pPr>
         <w:pStyle w:val="Heading2"/>
-      </w:pPr>
-      <w:bookmarkStart w:id="76" w:name="_Toc164955390"/>
-      <w:bookmarkStart w:id="77" w:name="_Toc164957123"/>
-      <w:bookmarkStart w:id="78" w:name="_Toc164957265"/>
-      <w:bookmarkStart w:id="79" w:name="_Toc164957344"/>
-      <w:bookmarkStart w:id="80" w:name="_Toc164957616"/>
-      <w:bookmarkStart w:id="81" w:name="_Toc164966941"/>
-      <w:r>
-        <w:t>Nêu những vấn đề còn tồn tại</w:t>
+        <w:spacing w:line="360" w:lineRule="auto"/>
+      </w:pPr>
+      <w:bookmarkStart w:id="76" w:name="_Toc164955391"/>
+      <w:bookmarkStart w:id="77" w:name="_Toc164957124"/>
+      <w:bookmarkStart w:id="78" w:name="_Toc164957266"/>
+      <w:bookmarkStart w:id="79" w:name="_Toc164957345"/>
+      <w:bookmarkStart w:id="80" w:name="_Toc164957617"/>
+      <w:bookmarkStart w:id="81" w:name="_Toc164966942"/>
+      <w:r>
+        <w:t xml:space="preserve">Chỉ ra những vấn đề mà </w:t>
+      </w:r>
+      <w:r>
+        <w:rPr>
+          <w:lang w:val="vi-VN"/>
+        </w:rPr>
+        <w:t>tiểu luận</w:t>
+      </w:r>
+      <w:r>
+        <w:t xml:space="preserve"> cần tập trung nghiên cứu, giải quyết</w:t>
       </w:r>
       <w:bookmarkEnd w:id="76"/>
       <w:bookmarkEnd w:id="77"/>
@@ -10526,25 +10565,73 @@
     </w:p>
     <w:p>
       <w:pPr>
-        <w:pStyle w:val="Heading2"/>
-      </w:pPr>
-      <w:bookmarkStart w:id="82" w:name="_Toc164955391"/>
-      <w:bookmarkStart w:id="83" w:name="_Toc164957124"/>
-      <w:bookmarkStart w:id="84" w:name="_Toc164957266"/>
-      <w:bookmarkStart w:id="85" w:name="_Toc164957345"/>
-      <w:bookmarkStart w:id="86" w:name="_Toc164957617"/>
-      <w:bookmarkStart w:id="87" w:name="_Toc164966942"/>
-      <w:r>
-        <w:t xml:space="preserve">Chỉ ra những vấn đề mà </w:t>
+        <w:spacing w:after="120" w:line="360" w:lineRule="auto"/>
+        <w:jc w:val="both"/>
+        <w:rPr>
+          <w:rFonts w:eastAsiaTheme="majorEastAsia" w:cs="Times New Roman"/>
+          <w:color w:val="000000" w:themeColor="text1"/>
+          <w:szCs w:val="26"/>
+        </w:rPr>
+        <w:sectPr>
+          <w:headerReference w:type="default" r:id="rId11"/>
+          <w:pgSz w:w="11906" w:h="16838" w:code="9"/>
+          <w:pgMar w:top="1701" w:right="1134" w:bottom="1701" w:left="1985" w:header="709" w:footer="709" w:gutter="0"/>
+          <w:cols w:space="708"/>
+          <w:docGrid w:linePitch="360"/>
+        </w:sectPr>
+      </w:pPr>
+    </w:p>
+    <w:p>
+      <w:pPr>
+        <w:pStyle w:val="Heading1"/>
+      </w:pPr>
+      <w:bookmarkStart w:id="82" w:name="_Toc164954906"/>
+      <w:bookmarkStart w:id="83" w:name="_Toc164955392"/>
+      <w:bookmarkStart w:id="84" w:name="_Toc164957125"/>
+      <w:bookmarkStart w:id="85" w:name="_Toc164957267"/>
+      <w:bookmarkStart w:id="86" w:name="_Toc164957346"/>
+      <w:bookmarkStart w:id="87" w:name="_Toc164957618"/>
+      <w:bookmarkStart w:id="88" w:name="_Toc164966943"/>
+      <w:r>
+        <w:lastRenderedPageBreak/>
+        <w:t xml:space="preserve">PHƯƠNG PHÁP </w:t>
+      </w:r>
+      <w:r>
+        <w:t>VÀ</w:t>
       </w:r>
       <w:r>
         <w:rPr>
           <w:lang w:val="vi-VN"/>
         </w:rPr>
-        <w:t>tiểu luận</w:t>
-      </w:r>
-      <w:r>
-        <w:t xml:space="preserve"> cần tập trung nghiên cứu, giải quyết</w:t>
+        <w:t xml:space="preserve"> </w:t>
+      </w:r>
+      <w:r>
+        <w:rPr>
+          <w:rFonts w:cs="Times New Roman"/>
+          <w:color w:val="000000" w:themeColor="text1"/>
+        </w:rPr>
+        <w:t>NỘI</w:t>
+      </w:r>
+      <w:r>
+        <w:rPr>
+          <w:rFonts w:cs="Times New Roman"/>
+          <w:color w:val="000000" w:themeColor="text1"/>
+          <w:lang w:val="vi-VN"/>
+        </w:rPr>
+        <w:t xml:space="preserve"> DUNG</w:t>
+      </w:r>
+      <w:r>
+        <w:rPr>
+          <w:rFonts w:cs="Times New Roman"/>
+          <w:color w:val="000000" w:themeColor="text1"/>
+        </w:rPr>
+        <w:t xml:space="preserve"> </w:t>
+      </w:r>
+      <w:r>
+        <w:t xml:space="preserve">NGHIÊN </w:t>
+      </w:r>
+      <w:r>
+        <w:t>CỨU</w:t>
       </w:r>
       <w:bookmarkEnd w:id="82"/>
       <w:bookmarkEnd w:id="83"/>
@@ -10552,119 +10639,46 @@
       <w:bookmarkEnd w:id="85"/>
       <w:bookmarkEnd w:id="86"/>
       <w:bookmarkEnd w:id="87"/>
+      <w:bookmarkEnd w:id="88"/>
     </w:p>
     <w:p>
       <w:pPr>
-        <w:spacing w:after="120" w:line="360" w:lineRule="auto"/>
+        <w:pStyle w:val="Heading2"/>
+        <w:spacing w:before="0" w:line="360" w:lineRule="auto"/>
         <w:jc w:val="both"/>
-        <w:rPr>
-          <w:rFonts w:eastAsiaTheme="majorEastAsia" w:cs="Times New Roman"/>
-          <w:color w:val="000000" w:themeColor="text1"/>
-          <w:szCs w:val="26"/>
-        </w:rPr>
-        <w:sectPr>
-          <w:headerReference w:type="default" r:id="rId10"/>
-          <w:pgSz w:w="11906" w:h="16838" w:code="9"/>
-          <w:pgMar w:top="1701" w:right="1134" w:bottom="1701" w:left="1985" w:header="709" w:footer="709" w:gutter="0"/>
-          <w:cols w:space="708"/>
-          <w:docGrid w:linePitch="360"/>
-        </w:sectPr>
-      </w:pPr>
-    </w:p>
-    <w:p>
-      <w:pPr>
-        <w:pStyle w:val="Heading1"/>
-      </w:pPr>
-      <w:bookmarkStart w:id="88" w:name="_Toc164954906"/>
-      <w:bookmarkStart w:id="89" w:name="_Toc164955392"/>
-      <w:bookmarkStart w:id="90" w:name="_Toc164957125"/>
-      <w:bookmarkStart w:id="91" w:name="_Toc164957267"/>
-      <w:bookmarkStart w:id="92" w:name="_Toc164957346"/>
-      <w:bookmarkStart w:id="93" w:name="_Toc164957618"/>
-      <w:bookmarkStart w:id="94" w:name="_Toc164966943"/>
-      <w:r>
-        <w:lastRenderedPageBreak/>
-        <w:t xml:space="preserve">PHƯƠNG PHÁP </w:t>
-      </w:r>
-      <w:r>
-        <w:t>VÀ</w:t>
-      </w:r>
-      <w:r>
-        <w:rPr>
-          <w:lang w:val="vi-VN"/>
-        </w:rPr>
-        <w:t xml:space="preserve"> </w:t>
-      </w:r>
-      <w:r>
-        <w:rPr>
-          <w:rFonts w:cs="Times New Roman"/>
-          <w:color w:val="000000" w:themeColor="text1"/>
-        </w:rPr>
-        <w:t>NỘI</w:t>
-      </w:r>
-      <w:r>
-        <w:rPr>
-          <w:rFonts w:cs="Times New Roman"/>
-          <w:color w:val="000000" w:themeColor="text1"/>
-          <w:lang w:val="vi-VN"/>
-        </w:rPr>
-        <w:t xml:space="preserve"> DUNG</w:t>
-      </w:r>
-      <w:r>
-        <w:rPr>
-          <w:rFonts w:cs="Times New Roman"/>
-          <w:color w:val="000000" w:themeColor="text1"/>
-        </w:rPr>
-        <w:t xml:space="preserve"> </w:t>
-      </w:r>
-      <w:r>
-        <w:t xml:space="preserve">NGHIÊN </w:t>
-      </w:r>
-      <w:r>
-        <w:t>CỨU</w:t>
-      </w:r>
-      <w:bookmarkEnd w:id="88"/>
+      </w:pPr>
+      <w:bookmarkStart w:id="89" w:name="_Toc164954907"/>
+      <w:bookmarkStart w:id="90" w:name="_Toc164955393"/>
+      <w:bookmarkStart w:id="91" w:name="_Toc164957126"/>
+      <w:bookmarkStart w:id="92" w:name="_Toc164957268"/>
+      <w:bookmarkStart w:id="93" w:name="_Toc164957347"/>
+      <w:bookmarkStart w:id="94" w:name="_Toc164957619"/>
+      <w:bookmarkStart w:id="95" w:name="_Toc164966944"/>
+      <w:r>
+        <w:t>Trình bày c</w:t>
+      </w:r>
+      <w:r>
+        <w:rPr>
+          <w:rFonts w:hint="eastAsia"/>
+        </w:rPr>
+        <w:t>ơ</w:t>
+      </w:r>
+      <w:r>
+        <w:t xml:space="preserve"> sở lí thuyết, lí luận, giả thiết khoa học</w:t>
+      </w:r>
       <w:bookmarkEnd w:id="89"/>
       <w:bookmarkEnd w:id="90"/>
       <w:bookmarkEnd w:id="91"/>
       <w:bookmarkEnd w:id="92"/>
       <w:bookmarkEnd w:id="93"/>
       <w:bookmarkEnd w:id="94"/>
+      <w:bookmarkEnd w:id="95"/>
     </w:p>
     <w:p>
       <w:pPr>
-        <w:pStyle w:val="Heading2"/>
-        <w:spacing w:before="0" w:line="360" w:lineRule="auto"/>
-        <w:jc w:val="both"/>
-      </w:pPr>
-      <w:bookmarkStart w:id="95" w:name="_Toc164954907"/>
-      <w:bookmarkStart w:id="96" w:name="_Toc164955393"/>
-      <w:bookmarkStart w:id="97" w:name="_Toc164957126"/>
-      <w:bookmarkStart w:id="98" w:name="_Toc164957268"/>
-      <w:bookmarkStart w:id="99" w:name="_Toc164957347"/>
-      <w:bookmarkStart w:id="100" w:name="_Toc164957619"/>
-      <w:bookmarkStart w:id="101" w:name="_Toc164966944"/>
-      <w:r>
-        <w:t>Trình bày c</w:t>
-      </w:r>
-      <w:r>
-        <w:rPr>
-          <w:rFonts w:hint="eastAsia"/>
-        </w:rPr>
-        <w:t>ơ</w:t>
-      </w:r>
-      <w:r>
-        <w:t xml:space="preserve"> sở lí thuyết, lí luận, giả thiết khoa học</w:t>
-      </w:r>
-      <w:bookmarkEnd w:id="95"/>
-      <w:bookmarkEnd w:id="96"/>
-      <w:bookmarkEnd w:id="97"/>
-      <w:bookmarkEnd w:id="98"/>
-      <w:bookmarkEnd w:id="99"/>
-      <w:bookmarkEnd w:id="100"/>
-      <w:bookmarkEnd w:id="101"/>
+        <w:spacing w:line="360" w:lineRule="auto"/>
+      </w:pPr>
     </w:p>
-    <w:p/>
     <w:p>
       <w:pPr>
         <w:pStyle w:val="Heading3"/>
@@ -10817,7 +10831,7 @@
                     <pic:cNvPicPr/>
                   </pic:nvPicPr>
                   <pic:blipFill>
-                    <a:blip r:embed="rId11" cstate="print">
+                    <a:blip r:embed="rId12" cstate="print">
                       <a:extLst>
                         <a:ext uri="{28A0092B-C50C-407E-A947-70E740481C1C}">
                           <a14:useLocalDpi xmlns:a14="http://schemas.microsoft.com/office/drawing/2010/main" val="0"/>
@@ -10856,7 +10870,7 @@
           <w:szCs w:val="26"/>
         </w:rPr>
       </w:pPr>
-      <w:bookmarkStart w:id="102" w:name="_Toc98229800"/>
+      <w:bookmarkStart w:id="96" w:name="_Toc98229800"/>
       <w:r>
         <w:rPr>
           <w:rFonts w:cs="Times New Roman"/>
@@ -10921,7 +10935,7 @@
         </w:rPr>
         <w:t xml:space="preserve"> </w:t>
       </w:r>
-      <w:bookmarkEnd w:id="102"/>
+      <w:bookmarkEnd w:id="96"/>
       <w:r>
         <w:rPr>
           <w:rFonts w:ascii="Calibri" w:hAnsi="Calibri" w:cs="Calibri"/>
@@ -10990,12 +11004,13 @@
     <w:p>
       <w:pPr>
         <w:pStyle w:val="Heading2"/>
+        <w:spacing w:line="360" w:lineRule="auto"/>
         <w:rPr>
           <w:rFonts w:cs="Times New Roman"/>
           <w:lang w:val="en-GB"/>
         </w:rPr>
       </w:pPr>
-      <w:bookmarkStart w:id="103" w:name="_Toc164954908"/>
+      <w:bookmarkStart w:id="97" w:name="_Toc164954908"/>
       <w:r>
         <w:rPr>
           <w:rFonts w:cs="Times New Roman"/>
@@ -11003,12 +11018,12 @@
         </w:rPr>
         <w:t xml:space="preserve"> </w:t>
       </w:r>
-      <w:bookmarkStart w:id="104" w:name="_Toc164955394"/>
-      <w:bookmarkStart w:id="105" w:name="_Toc164957127"/>
-      <w:bookmarkStart w:id="106" w:name="_Toc164957269"/>
-      <w:bookmarkStart w:id="107" w:name="_Toc164957348"/>
-      <w:bookmarkStart w:id="108" w:name="_Toc164957620"/>
-      <w:bookmarkStart w:id="109" w:name="_Toc164966945"/>
+      <w:bookmarkStart w:id="98" w:name="_Toc164955394"/>
+      <w:bookmarkStart w:id="99" w:name="_Toc164957127"/>
+      <w:bookmarkStart w:id="100" w:name="_Toc164957269"/>
+      <w:bookmarkStart w:id="101" w:name="_Toc164957348"/>
+      <w:bookmarkStart w:id="102" w:name="_Toc164957620"/>
+      <w:bookmarkStart w:id="103" w:name="_Toc164966945"/>
       <w:r>
         <w:t>Trình bày</w:t>
       </w:r>
@@ -11036,68 +11051,95 @@
         </w:rPr>
         <w:t xml:space="preserve"> luận</w:t>
       </w:r>
+      <w:bookmarkEnd w:id="97"/>
+      <w:bookmarkEnd w:id="98"/>
+      <w:bookmarkEnd w:id="99"/>
+      <w:bookmarkEnd w:id="100"/>
+      <w:bookmarkEnd w:id="101"/>
+      <w:bookmarkEnd w:id="102"/>
       <w:bookmarkEnd w:id="103"/>
+      <w:r>
+        <w:rPr>
+          <w:lang w:val="en-GB"/>
+        </w:rPr>
+        <w:br w:type="page"/>
+      </w:r>
+    </w:p>
+    <w:p>
+      <w:pPr>
+        <w:pStyle w:val="Heading1"/>
+        <w:rPr>
+          <w:lang w:val="en-GB"/>
+        </w:rPr>
+      </w:pPr>
+      <w:bookmarkStart w:id="104" w:name="_Toc164954909"/>
+      <w:bookmarkStart w:id="105" w:name="_Toc164955395"/>
+      <w:bookmarkStart w:id="106" w:name="_Toc164957128"/>
+      <w:bookmarkStart w:id="107" w:name="_Toc164957270"/>
+      <w:bookmarkStart w:id="108" w:name="_Toc164957349"/>
+      <w:bookmarkStart w:id="109" w:name="_Toc164957621"/>
+      <w:bookmarkStart w:id="110" w:name="_Toc164966946"/>
+      <w:r>
+        <w:rPr>
+          <w:rFonts w:cs="Times New Roman"/>
+        </w:rPr>
+        <w:lastRenderedPageBreak/>
+        <w:t>G</w:t>
+      </w:r>
+      <w:r>
+        <w:rPr>
+          <w:rFonts w:cs="Times New Roman"/>
+          <w:lang w:val="vi-VN"/>
+        </w:rPr>
+        <w:t xml:space="preserve">IẢI </w:t>
+      </w:r>
+      <w:r>
+        <w:rPr>
+          <w:rFonts w:cs="Times New Roman"/>
+        </w:rPr>
+        <w:t>PHÁP CHO</w:t>
+      </w:r>
+      <w:r>
+        <w:rPr>
+          <w:rFonts w:cs="Times New Roman"/>
+          <w:lang w:val="vi-VN"/>
+        </w:rPr>
+        <w:t xml:space="preserve"> BÀI TOÁN/VẤN ĐỀ/MÔ HÌNH</w:t>
+      </w:r>
       <w:bookmarkEnd w:id="104"/>
       <w:bookmarkEnd w:id="105"/>
       <w:bookmarkEnd w:id="106"/>
       <w:bookmarkEnd w:id="107"/>
       <w:bookmarkEnd w:id="108"/>
       <w:bookmarkEnd w:id="109"/>
-      <w:r>
-        <w:rPr>
-          <w:lang w:val="en-GB"/>
-        </w:rPr>
-        <w:br w:type="page"/>
-      </w:r>
+      <w:bookmarkEnd w:id="110"/>
     </w:p>
     <w:p>
       <w:pPr>
-        <w:pStyle w:val="Heading1"/>
-        <w:rPr>
-          <w:lang w:val="en-GB"/>
-        </w:rPr>
-      </w:pPr>
-      <w:bookmarkStart w:id="110" w:name="_Toc164954909"/>
-      <w:bookmarkStart w:id="111" w:name="_Toc164955395"/>
-      <w:bookmarkStart w:id="112" w:name="_Toc164957128"/>
-      <w:bookmarkStart w:id="113" w:name="_Toc164957270"/>
-      <w:bookmarkStart w:id="114" w:name="_Toc164957349"/>
-      <w:bookmarkStart w:id="115" w:name="_Toc164957621"/>
-      <w:bookmarkStart w:id="116" w:name="_Toc164966946"/>
-      <w:r>
-        <w:rPr>
-          <w:rFonts w:cs="Times New Roman"/>
-        </w:rPr>
-        <w:lastRenderedPageBreak/>
-        <w:t>G</w:t>
-      </w:r>
-      <w:r>
-        <w:rPr>
-          <w:rFonts w:cs="Times New Roman"/>
-          <w:lang w:val="vi-VN"/>
-        </w:rPr>
-        <w:t xml:space="preserve">IẢI </w:t>
-      </w:r>
-      <w:r>
-        <w:rPr>
-          <w:rFonts w:cs="Times New Roman"/>
-        </w:rPr>
-        <w:t>PHÁP CHO</w:t>
-      </w:r>
-      <w:r>
-        <w:rPr>
-          <w:rFonts w:cs="Times New Roman"/>
-          <w:lang w:val="vi-VN"/>
-        </w:rPr>
-        <w:t xml:space="preserve"> BÀI TOÁN/VẤN ĐỀ/MÔ HÌNH</w:t>
-      </w:r>
-      <w:bookmarkEnd w:id="110"/>
+        <w:pStyle w:val="Heading2"/>
+        <w:numPr>
+          <w:ilvl w:val="1"/>
+          <w:numId w:val="14"/>
+        </w:numPr>
+        <w:spacing w:line="360" w:lineRule="auto"/>
+      </w:pPr>
+      <w:bookmarkStart w:id="111" w:name="_Toc164954910"/>
+      <w:bookmarkStart w:id="112" w:name="_Toc164955396"/>
+      <w:bookmarkStart w:id="113" w:name="_Toc164957129"/>
+      <w:bookmarkStart w:id="114" w:name="_Toc164957271"/>
+      <w:bookmarkStart w:id="115" w:name="_Toc164957350"/>
+      <w:bookmarkStart w:id="116" w:name="_Toc164957622"/>
+      <w:bookmarkStart w:id="117" w:name="_Toc164966947"/>
+      <w:r>
+        <w:t>Phát biểu mô hình/bài toán trong đề tài: cụ thể, rõ ràng, có thể phát biểu bằng ngôn ngữ tự nhiên, hay mô hình toán học, …</w:t>
+      </w:r>
       <w:bookmarkEnd w:id="111"/>
       <w:bookmarkEnd w:id="112"/>
       <w:bookmarkEnd w:id="113"/>
       <w:bookmarkEnd w:id="114"/>
       <w:bookmarkEnd w:id="115"/>
       <w:bookmarkEnd w:id="116"/>
+      <w:bookmarkEnd w:id="117"/>
     </w:p>
     <w:p>
       <w:pPr>
@@ -11106,69 +11148,44 @@
           <w:ilvl w:val="1"/>
           <w:numId w:val="14"/>
         </w:numPr>
-      </w:pPr>
-      <w:bookmarkStart w:id="117" w:name="_Toc164954910"/>
-      <w:bookmarkStart w:id="118" w:name="_Toc164955396"/>
-      <w:bookmarkStart w:id="119" w:name="_Toc164957129"/>
-      <w:bookmarkStart w:id="120" w:name="_Toc164957271"/>
-      <w:bookmarkStart w:id="121" w:name="_Toc164957350"/>
-      <w:bookmarkStart w:id="122" w:name="_Toc164957622"/>
-      <w:bookmarkStart w:id="123" w:name="_Toc164966947"/>
-      <w:r>
-        <w:t>Phát biểu mô hình/bài toán trong đề tài: cụ thể, rõ ràng, có thể phát biểu bằng ngôn ngữ tự nhiên, hay mô hình toán học, …</w:t>
-      </w:r>
-      <w:bookmarkEnd w:id="117"/>
+        <w:spacing w:line="360" w:lineRule="auto"/>
+      </w:pPr>
+      <w:bookmarkStart w:id="118" w:name="_Toc164954911"/>
+      <w:bookmarkStart w:id="119" w:name="_Toc164955397"/>
+      <w:bookmarkStart w:id="120" w:name="_Toc164957130"/>
+      <w:bookmarkStart w:id="121" w:name="_Toc164957272"/>
+      <w:bookmarkStart w:id="122" w:name="_Toc164957351"/>
+      <w:bookmarkStart w:id="123" w:name="_Toc164957623"/>
+      <w:bookmarkStart w:id="124" w:name="_Toc164966948"/>
+      <w:r>
+        <w:t>G</w:t>
+      </w:r>
+      <w:r>
+        <w:rPr>
+          <w:lang w:val="vi-VN"/>
+        </w:rPr>
+        <w:t xml:space="preserve">iải pháp cụ thể để giải quyết </w:t>
+      </w:r>
+      <w:r>
+        <w:rPr>
+          <w:bCs/>
+          <w:lang w:val="vi-VN"/>
+        </w:rPr>
+        <w:t>mô hình/bài toán</w:t>
+      </w:r>
+      <w:r>
+        <w:rPr>
+          <w:lang w:val="vi-VN"/>
+        </w:rPr>
+        <w:t>:</w:t>
+      </w:r>
       <w:bookmarkEnd w:id="118"/>
       <w:bookmarkEnd w:id="119"/>
       <w:bookmarkEnd w:id="120"/>
       <w:bookmarkEnd w:id="121"/>
       <w:bookmarkEnd w:id="122"/>
       <w:bookmarkEnd w:id="123"/>
-    </w:p>
-    <w:p>
-      <w:pPr>
-        <w:pStyle w:val="Heading2"/>
-        <w:numPr>
-          <w:ilvl w:val="1"/>
-          <w:numId w:val="14"/>
-        </w:numPr>
-      </w:pPr>
-      <w:bookmarkStart w:id="124" w:name="_Toc164954911"/>
-      <w:bookmarkStart w:id="125" w:name="_Toc164955397"/>
-      <w:bookmarkStart w:id="126" w:name="_Toc164957130"/>
-      <w:bookmarkStart w:id="127" w:name="_Toc164957272"/>
-      <w:bookmarkStart w:id="128" w:name="_Toc164957351"/>
-      <w:bookmarkStart w:id="129" w:name="_Toc164957623"/>
-      <w:bookmarkStart w:id="130" w:name="_Toc164966948"/>
-      <w:r>
-        <w:t>G</w:t>
-      </w:r>
-      <w:r>
-        <w:rPr>
-          <w:lang w:val="vi-VN"/>
-        </w:rPr>
-        <w:t xml:space="preserve">iải pháp cụ thể để giải quyết </w:t>
-      </w:r>
-      <w:r>
-        <w:rPr>
-          <w:bCs/>
-          <w:lang w:val="vi-VN"/>
-        </w:rPr>
-        <w:t>mô hình/bài toán</w:t>
-      </w:r>
-      <w:r>
-        <w:rPr>
-          <w:lang w:val="vi-VN"/>
-        </w:rPr>
-        <w:t>:</w:t>
-      </w:r>
       <w:bookmarkEnd w:id="124"/>
-      <w:bookmarkEnd w:id="125"/>
-      <w:bookmarkEnd w:id="126"/>
-      <w:bookmarkEnd w:id="127"/>
-      <w:bookmarkEnd w:id="128"/>
-      <w:bookmarkEnd w:id="129"/>
-      <w:bookmarkEnd w:id="130"/>
       <w:r>
         <w:rPr>
           <w:lang w:val="vi-VN"/>
@@ -11313,7 +11330,7 @@
     <w:p>
       <w:pPr>
         <w:pStyle w:val="ListParagraph"/>
-        <w:spacing w:after="0" w:line="240" w:lineRule="auto"/>
+        <w:spacing w:after="0" w:line="360" w:lineRule="auto"/>
         <w:ind w:left="924"/>
         <w:jc w:val="both"/>
         <w:rPr>
@@ -11347,7 +11364,7 @@
                     <pic:cNvPicPr/>
                   </pic:nvPicPr>
                   <pic:blipFill>
-                    <a:blip r:embed="rId12" cstate="print">
+                    <a:blip r:embed="rId13" cstate="print">
                       <a:extLst>
                         <a:ext uri="{28A0092B-C50C-407E-A947-70E740481C1C}">
                           <a14:useLocalDpi xmlns:a14="http://schemas.microsoft.com/office/drawing/2010/main" val="0"/>
@@ -11377,7 +11394,7 @@
     <w:p>
       <w:pPr>
         <w:pStyle w:val="ListParagraph"/>
-        <w:spacing w:after="0" w:line="240" w:lineRule="auto"/>
+        <w:spacing w:after="0" w:line="360" w:lineRule="auto"/>
         <w:ind w:left="924"/>
         <w:jc w:val="center"/>
         <w:rPr>
@@ -11422,7 +11439,7 @@
     <w:p>
       <w:pPr>
         <w:pStyle w:val="ListParagraph"/>
-        <w:spacing w:after="0" w:line="240" w:lineRule="auto"/>
+        <w:spacing w:after="0" w:line="360" w:lineRule="auto"/>
         <w:ind w:left="924"/>
         <w:rPr>
           <w:rFonts w:eastAsia="Times New Roman" w:cs="Times New Roman"/>
@@ -11447,6 +11464,7 @@
           <w:color w:val="000000"/>
           <w:sz w:val="24"/>
           <w:szCs w:val="24"/>
+          <w:lang w:val="vi-VN"/>
         </w:rPr>
       </w:pPr>
       <w:r>
@@ -11464,6 +11482,7 @@
           <w:rFonts w:cs="Times New Roman"/>
           <w:sz w:val="24"/>
           <w:szCs w:val="24"/>
+          <w:lang w:val="vi-VN"/>
         </w:rPr>
         <w:t xml:space="preserve">theo hướng </w:t>
       </w:r>
@@ -11482,6 +11501,7 @@
           <w:rFonts w:cs="Times New Roman"/>
           <w:sz w:val="24"/>
           <w:szCs w:val="24"/>
+          <w:lang w:val="vi-VN"/>
         </w:rPr>
         <w:t xml:space="preserve">hân tích </w:t>
       </w:r>
@@ -11517,7 +11537,7 @@
     <w:p>
       <w:pPr>
         <w:pStyle w:val="ListParagraph"/>
-        <w:spacing w:after="0" w:line="240" w:lineRule="auto"/>
+        <w:spacing w:after="0" w:line="360" w:lineRule="auto"/>
         <w:ind w:left="924"/>
         <w:jc w:val="both"/>
         <w:rPr>
@@ -11535,6 +11555,7 @@
           <w:sz w:val="24"/>
           <w:szCs w:val="24"/>
         </w:rPr>
+        <w:lastRenderedPageBreak/>
         <w:drawing>
           <wp:inline distT="0" distB="0" distL="0" distR="0" wp14:anchorId="59C5DB50" wp14:editId="16D8E267">
             <wp:extent cx="4445000" cy="2654300"/>
@@ -11551,7 +11572,7 @@
                     <pic:cNvPicPr/>
                   </pic:nvPicPr>
                   <pic:blipFill>
-                    <a:blip r:embed="rId13">
+                    <a:blip r:embed="rId14">
                       <a:extLst>
                         <a:ext uri="{28A0092B-C50C-407E-A947-70E740481C1C}">
                           <a14:useLocalDpi xmlns:a14="http://schemas.microsoft.com/office/drawing/2010/main" val="0"/>
@@ -11581,7 +11602,7 @@
     <w:p>
       <w:pPr>
         <w:pStyle w:val="ListParagraph"/>
-        <w:spacing w:after="0" w:line="240" w:lineRule="auto"/>
+        <w:spacing w:after="0" w:line="360" w:lineRule="auto"/>
         <w:ind w:left="924"/>
         <w:jc w:val="center"/>
         <w:rPr>
@@ -11597,7 +11618,6 @@
           <w:szCs w:val="26"/>
           <w:lang w:val="vi-VN"/>
         </w:rPr>
-        <w:lastRenderedPageBreak/>
         <w:t>Hình 3.2. S</w:t>
       </w:r>
       <w:r>
@@ -11612,7 +11632,7 @@
     <w:p>
       <w:pPr>
         <w:pStyle w:val="ListParagraph"/>
-        <w:spacing w:after="0" w:line="240" w:lineRule="auto"/>
+        <w:spacing w:after="0" w:line="360" w:lineRule="auto"/>
         <w:ind w:left="924"/>
         <w:rPr>
           <w:rFonts w:eastAsia="Times New Roman" w:cs="Times New Roman"/>
@@ -11637,6 +11657,7 @@
           <w:color w:val="000000"/>
           <w:sz w:val="24"/>
           <w:szCs w:val="24"/>
+          <w:lang w:val="vi-VN"/>
         </w:rPr>
       </w:pPr>
       <w:r>
@@ -11654,6 +11675,7 @@
           <w:rFonts w:cs="Times New Roman"/>
           <w:sz w:val="24"/>
           <w:szCs w:val="24"/>
+          <w:lang w:val="vi-VN"/>
         </w:rPr>
         <w:t xml:space="preserve">theo hướng </w:t>
       </w:r>
@@ -11672,6 +11694,7 @@
           <w:rFonts w:cs="Times New Roman"/>
           <w:sz w:val="24"/>
           <w:szCs w:val="24"/>
+          <w:lang w:val="vi-VN"/>
         </w:rPr>
         <w:t>hân tích</w:t>
       </w:r>
@@ -11689,6 +11712,7 @@
           <w:rFonts w:cs="Times New Roman"/>
           <w:sz w:val="24"/>
           <w:szCs w:val="24"/>
+          <w:lang w:val="vi-VN"/>
         </w:rPr>
         <w:t>hiết kế giải pháp</w:t>
       </w:r>
@@ -11741,13 +11765,13 @@
           <w:szCs w:val="24"/>
         </w:rPr>
       </w:pPr>
-      <w:bookmarkStart w:id="131" w:name="_Toc164954912"/>
-      <w:bookmarkStart w:id="132" w:name="_Toc164955398"/>
-      <w:bookmarkStart w:id="133" w:name="_Toc164957131"/>
-      <w:bookmarkStart w:id="134" w:name="_Toc164957273"/>
-      <w:bookmarkStart w:id="135" w:name="_Toc164957352"/>
-      <w:bookmarkStart w:id="136" w:name="_Toc164957624"/>
-      <w:bookmarkStart w:id="137" w:name="_Toc164966949"/>
+      <w:bookmarkStart w:id="125" w:name="_Toc164954912"/>
+      <w:bookmarkStart w:id="126" w:name="_Toc164955398"/>
+      <w:bookmarkStart w:id="127" w:name="_Toc164957131"/>
+      <w:bookmarkStart w:id="128" w:name="_Toc164957273"/>
+      <w:bookmarkStart w:id="129" w:name="_Toc164957352"/>
+      <w:bookmarkStart w:id="130" w:name="_Toc164957624"/>
+      <w:bookmarkStart w:id="131" w:name="_Toc164966949"/>
       <w:r>
         <w:rPr>
           <w:rFonts w:eastAsia="Times New Roman" w:cs="Times New Roman"/>
@@ -11782,13 +11806,13 @@
         </w:rPr>
         <w:t>HIỆN THỰC GIẢI PHÁP</w:t>
       </w:r>
+      <w:bookmarkEnd w:id="125"/>
+      <w:bookmarkEnd w:id="126"/>
+      <w:bookmarkEnd w:id="127"/>
+      <w:bookmarkEnd w:id="128"/>
+      <w:bookmarkEnd w:id="129"/>
+      <w:bookmarkEnd w:id="130"/>
       <w:bookmarkEnd w:id="131"/>
-      <w:bookmarkEnd w:id="132"/>
-      <w:bookmarkEnd w:id="133"/>
-      <w:bookmarkEnd w:id="134"/>
-      <w:bookmarkEnd w:id="135"/>
-      <w:bookmarkEnd w:id="136"/>
-      <w:bookmarkEnd w:id="137"/>
     </w:p>
     <w:p>
       <w:pPr>
@@ -11993,7 +12017,7 @@
                     <pic:cNvPicPr/>
                   </pic:nvPicPr>
                   <pic:blipFill>
-                    <a:blip r:embed="rId14">
+                    <a:blip r:embed="rId15">
                       <a:extLst>
                         <a:ext uri="{28A0092B-C50C-407E-A947-70E740481C1C}">
                           <a14:useLocalDpi xmlns:a14="http://schemas.microsoft.com/office/drawing/2010/main" val="0"/>
@@ -12028,6 +12052,7 @@
         <w:rPr>
           <w:lang w:val="vi-VN"/>
         </w:rPr>
+        <w:lastRenderedPageBreak/>
         <w:t>Dựa vào k</w:t>
       </w:r>
       <w:r>
@@ -12260,7 +12285,6 @@
         <w:rPr>
           <w:lang w:val="vi-VN"/>
         </w:rPr>
-        <w:lastRenderedPageBreak/>
         <w:t>X</w:t>
       </w:r>
       <w:r>
@@ -12325,13 +12349,13 @@
           <w:lang w:val="vi-VN"/>
         </w:rPr>
       </w:pPr>
-      <w:bookmarkStart w:id="138" w:name="_Toc164954913"/>
-      <w:bookmarkStart w:id="139" w:name="_Toc164955399"/>
-      <w:bookmarkStart w:id="140" w:name="_Toc164957132"/>
-      <w:bookmarkStart w:id="141" w:name="_Toc164957274"/>
-      <w:bookmarkStart w:id="142" w:name="_Toc164957353"/>
-      <w:bookmarkStart w:id="143" w:name="_Toc164957625"/>
-      <w:bookmarkStart w:id="144" w:name="_Toc164966950"/>
+      <w:bookmarkStart w:id="132" w:name="_Toc164954913"/>
+      <w:bookmarkStart w:id="133" w:name="_Toc164955399"/>
+      <w:bookmarkStart w:id="134" w:name="_Toc164957132"/>
+      <w:bookmarkStart w:id="135" w:name="_Toc164957274"/>
+      <w:bookmarkStart w:id="136" w:name="_Toc164957353"/>
+      <w:bookmarkStart w:id="137" w:name="_Toc164957625"/>
+      <w:bookmarkStart w:id="138" w:name="_Toc164966950"/>
       <w:r>
         <w:rPr>
           <w:lang w:val="en-GB"/>
@@ -12345,39 +12369,40 @@
         </w:rPr>
         <w:t>, KẾT LUẬN VÀ KIẾN NGHỊ</w:t>
       </w:r>
+      <w:bookmarkEnd w:id="132"/>
+      <w:bookmarkEnd w:id="133"/>
+      <w:bookmarkEnd w:id="134"/>
+      <w:bookmarkEnd w:id="135"/>
+      <w:bookmarkEnd w:id="136"/>
+      <w:bookmarkEnd w:id="137"/>
       <w:bookmarkEnd w:id="138"/>
+    </w:p>
+    <w:p>
+      <w:pPr>
+        <w:pStyle w:val="Heading2"/>
+        <w:numPr>
+          <w:ilvl w:val="1"/>
+          <w:numId w:val="12"/>
+        </w:numPr>
+        <w:spacing w:line="360" w:lineRule="auto"/>
+      </w:pPr>
+      <w:bookmarkStart w:id="139" w:name="_Toc164954914"/>
+      <w:bookmarkStart w:id="140" w:name="_Toc164955400"/>
+      <w:bookmarkStart w:id="141" w:name="_Toc164957133"/>
+      <w:bookmarkStart w:id="142" w:name="_Toc164957275"/>
+      <w:bookmarkStart w:id="143" w:name="_Toc164957354"/>
+      <w:bookmarkStart w:id="144" w:name="_Toc164957626"/>
+      <w:bookmarkStart w:id="145" w:name="_Toc164966951"/>
+      <w:r>
+        <w:t>KẾT QUẢ</w:t>
+      </w:r>
       <w:bookmarkEnd w:id="139"/>
       <w:bookmarkEnd w:id="140"/>
       <w:bookmarkEnd w:id="141"/>
       <w:bookmarkEnd w:id="142"/>
       <w:bookmarkEnd w:id="143"/>
       <w:bookmarkEnd w:id="144"/>
-    </w:p>
-    <w:p>
-      <w:pPr>
-        <w:pStyle w:val="Heading2"/>
-        <w:numPr>
-          <w:ilvl w:val="1"/>
-          <w:numId w:val="12"/>
-        </w:numPr>
-      </w:pPr>
-      <w:bookmarkStart w:id="145" w:name="_Toc164954914"/>
-      <w:bookmarkStart w:id="146" w:name="_Toc164955400"/>
-      <w:bookmarkStart w:id="147" w:name="_Toc164957133"/>
-      <w:bookmarkStart w:id="148" w:name="_Toc164957275"/>
-      <w:bookmarkStart w:id="149" w:name="_Toc164957354"/>
-      <w:bookmarkStart w:id="150" w:name="_Toc164957626"/>
-      <w:bookmarkStart w:id="151" w:name="_Toc164966951"/>
-      <w:r>
-        <w:t>KẾT QUẢ</w:t>
-      </w:r>
       <w:bookmarkEnd w:id="145"/>
-      <w:bookmarkEnd w:id="146"/>
-      <w:bookmarkEnd w:id="147"/>
-      <w:bookmarkEnd w:id="148"/>
-      <w:bookmarkEnd w:id="149"/>
-      <w:bookmarkEnd w:id="150"/>
-      <w:bookmarkEnd w:id="151"/>
       <w:r>
         <w:t xml:space="preserve"> </w:t>
       </w:r>
@@ -12563,9 +12588,9 @@
           <w:lang w:val="vi-VN"/>
         </w:rPr>
       </w:pPr>
-      <w:bookmarkStart w:id="152" w:name="_Toc164954915"/>
-      <w:bookmarkStart w:id="153" w:name="_Toc164955401"/>
-      <w:bookmarkStart w:id="154" w:name="_Toc164957134"/>
+      <w:bookmarkStart w:id="146" w:name="_Toc164954915"/>
+      <w:bookmarkStart w:id="147" w:name="_Toc164955401"/>
+      <w:bookmarkStart w:id="148" w:name="_Toc164957134"/>
       <w:r>
         <w:rPr>
           <w:rFonts w:cs="Times New Roman"/>
@@ -12573,10 +12598,10 @@
         </w:rPr>
         <w:t xml:space="preserve"> </w:t>
       </w:r>
-      <w:bookmarkStart w:id="155" w:name="_Toc164957276"/>
-      <w:bookmarkStart w:id="156" w:name="_Toc164957355"/>
-      <w:bookmarkStart w:id="157" w:name="_Toc164957627"/>
-      <w:bookmarkStart w:id="158" w:name="_Toc164966952"/>
+      <w:bookmarkStart w:id="149" w:name="_Toc164957276"/>
+      <w:bookmarkStart w:id="150" w:name="_Toc164957355"/>
+      <w:bookmarkStart w:id="151" w:name="_Toc164957627"/>
+      <w:bookmarkStart w:id="152" w:name="_Toc164966952"/>
       <w:r>
         <w:rPr>
           <w:rFonts w:cs="Times New Roman"/>
@@ -12591,13 +12616,13 @@
         </w:rPr>
         <w:t xml:space="preserve"> LUẬN</w:t>
       </w:r>
+      <w:bookmarkEnd w:id="146"/>
+      <w:bookmarkEnd w:id="147"/>
+      <w:bookmarkEnd w:id="148"/>
+      <w:bookmarkEnd w:id="149"/>
+      <w:bookmarkEnd w:id="150"/>
+      <w:bookmarkEnd w:id="151"/>
       <w:bookmarkEnd w:id="152"/>
-      <w:bookmarkEnd w:id="153"/>
-      <w:bookmarkEnd w:id="154"/>
-      <w:bookmarkEnd w:id="155"/>
-      <w:bookmarkEnd w:id="156"/>
-      <w:bookmarkEnd w:id="157"/>
-      <w:bookmarkEnd w:id="158"/>
     </w:p>
     <w:p>
       <w:pPr>
@@ -12613,6 +12638,7 @@
           <w:bCs/>
           <w:color w:val="000000" w:themeColor="text1"/>
           <w:szCs w:val="26"/>
+          <w:lang w:val="vi-VN"/>
         </w:rPr>
       </w:pPr>
       <w:r>
@@ -12621,6 +12647,7 @@
           <w:bCs/>
           <w:color w:val="000000" w:themeColor="text1"/>
           <w:szCs w:val="26"/>
+          <w:lang w:val="vi-VN"/>
         </w:rPr>
         <w:t xml:space="preserve">Phần này phải căn cứ vào các dẫn liệu khoa học thu được trong quá trình nghiên cứu của </w:t>
       </w:r>
@@ -12640,6 +12667,7 @@
           <w:bCs/>
           <w:color w:val="000000" w:themeColor="text1"/>
           <w:szCs w:val="26"/>
+          <w:lang w:val="vi-VN"/>
         </w:rPr>
         <w:t xml:space="preserve"> hoặc đối chiếu với kết quả nghiên cứu của các tác giả khác thông qua các tài liệu tham khảo.</w:t>
       </w:r>
@@ -12656,12 +12684,14 @@
         <w:rPr>
           <w:rFonts w:cs="Times New Roman"/>
           <w:szCs w:val="26"/>
+          <w:lang w:val="vi-VN"/>
         </w:rPr>
       </w:pPr>
       <w:r>
         <w:rPr>
           <w:rFonts w:cs="Times New Roman"/>
           <w:szCs w:val="26"/>
+          <w:lang w:val="vi-VN"/>
         </w:rPr>
         <w:t>Trình bày những kết quả đạt đ</w:t>
       </w:r>
@@ -12669,6 +12699,7 @@
         <w:rPr>
           <w:rFonts w:cs="Times New Roman" w:hint="eastAsia"/>
           <w:szCs w:val="26"/>
+          <w:lang w:val="vi-VN"/>
         </w:rPr>
         <w:t>ư</w:t>
       </w:r>
@@ -12676,6 +12707,7 @@
         <w:rPr>
           <w:rFonts w:cs="Times New Roman"/>
           <w:szCs w:val="26"/>
+          <w:lang w:val="vi-VN"/>
         </w:rPr>
         <w:t xml:space="preserve">ợc, những đóng góp mới và những đề xuất mới. </w:t>
       </w:r>
@@ -12701,6 +12733,7 @@
         <w:rPr>
           <w:rFonts w:cs="Times New Roman"/>
           <w:szCs w:val="26"/>
+          <w:lang w:val="vi-VN"/>
         </w:rPr>
         <w:t>Phần kết luận cần ngắn gọn, không có lời bàn và bình luận thêm</w:t>
       </w:r>
@@ -12716,6 +12749,7 @@
     <w:p>
       <w:pPr>
         <w:pStyle w:val="Heading2"/>
+        <w:spacing w:line="360" w:lineRule="auto"/>
         <w:rPr>
           <w:rStyle w:val="Heading2Char"/>
           <w:b/>
@@ -12727,9 +12761,9 @@
         </w:rPr>
         <w:t xml:space="preserve"> </w:t>
       </w:r>
-      <w:bookmarkStart w:id="159" w:name="_Toc164957356"/>
-      <w:bookmarkStart w:id="160" w:name="_Toc164957628"/>
-      <w:bookmarkStart w:id="161" w:name="_Toc164966953"/>
+      <w:bookmarkStart w:id="153" w:name="_Toc164957356"/>
+      <w:bookmarkStart w:id="154" w:name="_Toc164957628"/>
+      <w:bookmarkStart w:id="155" w:name="_Toc164966953"/>
       <w:r>
         <w:rPr>
           <w:rStyle w:val="Heading2Char"/>
@@ -12737,9 +12771,9 @@
         </w:rPr>
         <w:t>KIẾN NGHỊ</w:t>
       </w:r>
-      <w:bookmarkEnd w:id="159"/>
-      <w:bookmarkEnd w:id="160"/>
-      <w:bookmarkEnd w:id="161"/>
+      <w:bookmarkEnd w:id="153"/>
+      <w:bookmarkEnd w:id="154"/>
+      <w:bookmarkEnd w:id="155"/>
     </w:p>
     <w:p>
       <w:pPr>
@@ -12748,6 +12782,7 @@
           <w:ilvl w:val="0"/>
           <w:numId w:val="13"/>
         </w:numPr>
+        <w:spacing w:line="360" w:lineRule="auto"/>
         <w:rPr>
           <w:bCs/>
           <w:color w:val="000000" w:themeColor="text1"/>
@@ -12786,6 +12821,7 @@
     </w:p>
     <w:p>
       <w:pPr>
+        <w:spacing w:line="360" w:lineRule="auto"/>
         <w:rPr>
           <w:lang w:val="vi-VN"/>
         </w:rPr>
@@ -12798,7 +12834,7 @@
           <w:lang w:val="en-GB"/>
         </w:rPr>
         <w:sectPr>
-          <w:headerReference w:type="default" r:id="rId15"/>
+          <w:headerReference w:type="default" r:id="rId16"/>
           <w:pgSz w:w="11906" w:h="16838" w:code="9"/>
           <w:pgMar w:top="1701" w:right="1134" w:bottom="1701" w:left="1985" w:header="709" w:footer="709" w:gutter="0"/>
           <w:cols w:space="708"/>
@@ -12808,6 +12844,7 @@
     </w:p>
     <w:p>
       <w:pPr>
+        <w:spacing w:line="360" w:lineRule="auto"/>
         <w:jc w:val="center"/>
         <w:rPr>
           <w:b/>
@@ -12895,7 +12932,7 @@
         </w:rPr>
         <w:t xml:space="preserve">Trang web </w:t>
       </w:r>
-      <w:hyperlink r:id="rId16" w:history="1">
+      <w:hyperlink r:id="rId17" w:history="1">
         <w:r>
           <w:rPr>
             <w:rStyle w:val="Hyperlink"/>
@@ -12921,7 +12958,7 @@
           <w:ilvl w:val="0"/>
           <w:numId w:val="1"/>
         </w:numPr>
-        <w:spacing w:after="120" w:line="240" w:lineRule="auto"/>
+        <w:spacing w:after="120" w:line="360" w:lineRule="auto"/>
         <w:jc w:val="both"/>
         <w:rPr>
           <w:szCs w:val="26"/>
@@ -12994,7 +13031,7 @@
           <w:lang w:val="en-GB"/>
         </w:rPr>
         <w:sectPr>
-          <w:headerReference w:type="default" r:id="rId17"/>
+          <w:headerReference w:type="default" r:id="rId18"/>
           <w:pgSz w:w="11906" w:h="16838" w:code="9"/>
           <w:pgMar w:top="1701" w:right="1134" w:bottom="1701" w:left="1985" w:header="709" w:footer="709" w:gutter="0"/>
           <w:cols w:space="708"/>
@@ -13018,20 +13055,20 @@
           <w:numId w:val="0"/>
         </w:numPr>
       </w:pPr>
-      <w:bookmarkStart w:id="162" w:name="_Toc164954916"/>
-      <w:bookmarkStart w:id="163" w:name="_Toc164955402"/>
-      <w:bookmarkStart w:id="164" w:name="_Toc164957135"/>
-      <w:bookmarkStart w:id="165" w:name="_Toc164957629"/>
-      <w:bookmarkStart w:id="166" w:name="_Toc164966954"/>
+      <w:bookmarkStart w:id="156" w:name="_Toc164954916"/>
+      <w:bookmarkStart w:id="157" w:name="_Toc164955402"/>
+      <w:bookmarkStart w:id="158" w:name="_Toc164957135"/>
+      <w:bookmarkStart w:id="159" w:name="_Toc164957629"/>
+      <w:bookmarkStart w:id="160" w:name="_Toc164966954"/>
       <w:r>
         <w:lastRenderedPageBreak/>
         <w:t>PHỤ LỤC (nếu có)</w:t>
       </w:r>
-      <w:bookmarkEnd w:id="162"/>
-      <w:bookmarkEnd w:id="163"/>
-      <w:bookmarkEnd w:id="164"/>
-      <w:bookmarkEnd w:id="165"/>
-      <w:bookmarkEnd w:id="166"/>
+      <w:bookmarkEnd w:id="156"/>
+      <w:bookmarkEnd w:id="157"/>
+      <w:bookmarkEnd w:id="158"/>
+      <w:bookmarkEnd w:id="159"/>
+      <w:bookmarkEnd w:id="160"/>
     </w:p>
     <w:p>
       <w:pPr>
@@ -13107,7 +13144,7 @@
       </w:pPr>
     </w:p>
     <w:sectPr>
-      <w:headerReference w:type="default" r:id="rId18"/>
+      <w:headerReference w:type="default" r:id="rId19"/>
       <w:pgSz w:w="11906" w:h="16838" w:code="9"/>
       <w:pgMar w:top="1701" w:right="1134" w:bottom="1701" w:left="1985" w:header="709" w:footer="709" w:gutter="0"/>
       <w:cols w:space="708"/>
@@ -16517,6 +16554,7 @@
   <w:style w:type="character" w:default="1" w:styleId="DefaultParagraphFont">
     <w:name w:val="Default Paragraph Font"/>
     <w:uiPriority w:val="1"/>
+    <w:semiHidden/>
     <w:unhideWhenUsed/>
   </w:style>
   <w:style w:type="table" w:default="1" w:styleId="TableNormal">

</xml_diff>

<commit_message>
feat: implement application design system including color palette and core UI components with project documentation
</commit_message>
<xml_diff>
--- a/Document/22130016_TieuLuanTN_KCNTT_NLU.docx
+++ b/Document/22130016_TieuLuanTN_KCNTT_NLU.docx
@@ -104,8 +104,8 @@
                                 <w:bCs/>
                               </w:rPr>
                             </w:pPr>
-                            <w:bookmarkStart w:id="158" w:name="_Toc164954895"/>
-                            <w:bookmarkStart w:id="159" w:name="_Toc164954528"/>
+                            <w:bookmarkStart w:id="168" w:name="_Toc164954895"/>
+                            <w:bookmarkStart w:id="169" w:name="_Toc164954528"/>
                             <w:r>
                               <w:rPr>
                                 <w:b/>
@@ -121,8 +121,8 @@
                               </w:rPr>
                               <w:t>Ộ GIÁO DỤC VÀ ĐÀO TẠO</w:t>
                             </w:r>
-                            <w:bookmarkEnd w:id="158"/>
-                            <w:bookmarkEnd w:id="159"/>
+                            <w:bookmarkEnd w:id="168"/>
+                            <w:bookmarkEnd w:id="169"/>
                           </w:p>
                           <w:p>
                             <w:pPr>
@@ -134,8 +134,8 @@
                                 <w:szCs w:val="44"/>
                               </w:rPr>
                             </w:pPr>
-                            <w:bookmarkStart w:id="160" w:name="_Toc164954529"/>
-                            <w:bookmarkStart w:id="161" w:name="_Toc164954896"/>
+                            <w:bookmarkStart w:id="170" w:name="_Toc164954529"/>
+                            <w:bookmarkStart w:id="171" w:name="_Toc164954896"/>
                             <w:r>
                               <w:rPr>
                                 <w:b/>
@@ -145,8 +145,8 @@
                               </w:rPr>
                               <w:t>TRƯỜNG ĐẠI HỌC NÔNG LÂM TP HCM</w:t>
                             </w:r>
-                            <w:bookmarkEnd w:id="160"/>
-                            <w:bookmarkEnd w:id="161"/>
+                            <w:bookmarkEnd w:id="170"/>
+                            <w:bookmarkEnd w:id="171"/>
                           </w:p>
                           <w:p>
                             <w:pPr>
@@ -158,8 +158,8 @@
                                 <w:szCs w:val="44"/>
                               </w:rPr>
                             </w:pPr>
-                            <w:bookmarkStart w:id="162" w:name="_Toc164954897"/>
-                            <w:bookmarkStart w:id="163" w:name="_Toc164954530"/>
+                            <w:bookmarkStart w:id="172" w:name="_Toc164954897"/>
+                            <w:bookmarkStart w:id="173" w:name="_Toc164954530"/>
                             <w:r>
                               <w:rPr>
                                 <w:b/>
@@ -167,8 +167,8 @@
                               </w:rPr>
                               <w:t>KHOA CÔNG NGHỆ THÔNG TIN</w:t>
                             </w:r>
-                            <w:bookmarkEnd w:id="162"/>
-                            <w:bookmarkEnd w:id="163"/>
+                            <w:bookmarkEnd w:id="172"/>
+                            <w:bookmarkEnd w:id="173"/>
                           </w:p>
                           <w:p>
                             <w:pPr>
@@ -1200,8 +1200,8 @@
                           <w:bCs/>
                         </w:rPr>
                       </w:pPr>
-                      <w:bookmarkStart w:id="158" w:name="_Toc164954895"/>
-                      <w:bookmarkStart w:id="159" w:name="_Toc164954528"/>
+                      <w:bookmarkStart w:id="168" w:name="_Toc164954895"/>
+                      <w:bookmarkStart w:id="169" w:name="_Toc164954528"/>
                       <w:r>
                         <w:rPr>
                           <w:b/>
@@ -1217,8 +1217,8 @@
                         </w:rPr>
                         <w:t>Ộ GIÁO DỤC VÀ ĐÀO TẠO</w:t>
                       </w:r>
-                      <w:bookmarkEnd w:id="158"/>
-                      <w:bookmarkEnd w:id="159"/>
+                      <w:bookmarkEnd w:id="168"/>
+                      <w:bookmarkEnd w:id="169"/>
                     </w:p>
                     <w:p>
                       <w:pPr>
@@ -1230,8 +1230,8 @@
                           <w:szCs w:val="44"/>
                         </w:rPr>
                       </w:pPr>
-                      <w:bookmarkStart w:id="160" w:name="_Toc164954529"/>
-                      <w:bookmarkStart w:id="161" w:name="_Toc164954896"/>
+                      <w:bookmarkStart w:id="170" w:name="_Toc164954529"/>
+                      <w:bookmarkStart w:id="171" w:name="_Toc164954896"/>
                       <w:r>
                         <w:rPr>
                           <w:b/>
@@ -1241,8 +1241,8 @@
                         </w:rPr>
                         <w:t>TRƯỜNG ĐẠI HỌC NÔNG LÂM TP HCM</w:t>
                       </w:r>
-                      <w:bookmarkEnd w:id="160"/>
-                      <w:bookmarkEnd w:id="161"/>
+                      <w:bookmarkEnd w:id="170"/>
+                      <w:bookmarkEnd w:id="171"/>
                     </w:p>
                     <w:p>
                       <w:pPr>
@@ -1254,8 +1254,8 @@
                           <w:szCs w:val="44"/>
                         </w:rPr>
                       </w:pPr>
-                      <w:bookmarkStart w:id="162" w:name="_Toc164954897"/>
-                      <w:bookmarkStart w:id="163" w:name="_Toc164954530"/>
+                      <w:bookmarkStart w:id="172" w:name="_Toc164954897"/>
+                      <w:bookmarkStart w:id="173" w:name="_Toc164954530"/>
                       <w:r>
                         <w:rPr>
                           <w:b/>
@@ -1263,8 +1263,8 @@
                         </w:rPr>
                         <w:t>KHOA CÔNG NGHỆ THÔNG TIN</w:t>
                       </w:r>
-                      <w:bookmarkEnd w:id="162"/>
-                      <w:bookmarkEnd w:id="163"/>
+                      <w:bookmarkEnd w:id="172"/>
+                      <w:bookmarkEnd w:id="173"/>
                     </w:p>
                     <w:p>
                       <w:pPr>
@@ -6665,7 +6665,7 @@
       <w:bookmarkStart w:id="6" w:name="_Toc164957113"/>
       <w:bookmarkStart w:id="7" w:name="_Toc164957334"/>
       <w:bookmarkStart w:id="8" w:name="_Toc164957255"/>
-      <w:bookmarkStart w:id="9" w:name="_Toc23719"/>
+      <w:bookmarkStart w:id="9" w:name="_Toc29548"/>
       <w:r>
         <w:t>DANH SÁCH CHỮ VIẾT TẮT</w:t>
       </w:r>
@@ -6712,7 +6712,7 @@
       <w:bookmarkStart w:id="11" w:name="_Toc164957607"/>
       <w:bookmarkStart w:id="12" w:name="_Toc164957256"/>
       <w:bookmarkStart w:id="13" w:name="_Toc164957114"/>
-      <w:bookmarkStart w:id="14" w:name="_Toc5400"/>
+      <w:bookmarkStart w:id="14" w:name="_Toc32357"/>
       <w:r>
         <w:t>DANH MỤC HÌNH ẢNH</w:t>
       </w:r>
@@ -6761,7 +6761,7 @@
       <w:bookmarkStart w:id="16" w:name="_Toc164957336"/>
       <w:bookmarkStart w:id="17" w:name="_Toc164957115"/>
       <w:bookmarkStart w:id="18" w:name="_Toc164957608"/>
-      <w:bookmarkStart w:id="19" w:name="_Toc4987"/>
+      <w:bookmarkStart w:id="19" w:name="_Toc12089"/>
       <w:r>
         <w:rPr>
           <w:bCs/>
@@ -6869,7 +6869,7 @@
       <w:bookmarkStart w:id="21" w:name="_Toc164957609"/>
       <w:bookmarkStart w:id="22" w:name="_Toc164957116"/>
       <w:bookmarkStart w:id="23" w:name="_Toc164957337"/>
-      <w:bookmarkStart w:id="24" w:name="_Toc14302"/>
+      <w:bookmarkStart w:id="24" w:name="_Toc15414"/>
       <w:r>
         <w:rPr>
           <w:iCs/>
@@ -7090,7 +7090,7 @@
         <w:rPr>
           <w:szCs w:val="26"/>
         </w:rPr>
-        <w:instrText xml:space="preserve"> HYPERLINK \l _Toc23719 </w:instrText>
+        <w:instrText xml:space="preserve"> HYPERLINK \l _Toc29548 </w:instrText>
       </w:r>
       <w:r>
         <w:rPr>
@@ -7108,7 +7108,7 @@
         <w:fldChar w:fldCharType="begin"/>
       </w:r>
       <w:r>
-        <w:instrText xml:space="preserve"> PAGEREF _Toc23719 \h </w:instrText>
+        <w:instrText xml:space="preserve"> PAGEREF _Toc29548 \h </w:instrText>
       </w:r>
       <w:r>
         <w:fldChar w:fldCharType="separate"/>
@@ -7156,7 +7156,7 @@
         <w:rPr>
           <w:szCs w:val="26"/>
         </w:rPr>
-        <w:instrText xml:space="preserve"> HYPERLINK \l _Toc5400 </w:instrText>
+        <w:instrText xml:space="preserve"> HYPERLINK \l _Toc32357 </w:instrText>
       </w:r>
       <w:r>
         <w:rPr>
@@ -7174,7 +7174,7 @@
         <w:fldChar w:fldCharType="begin"/>
       </w:r>
       <w:r>
-        <w:instrText xml:space="preserve"> PAGEREF _Toc5400 \h </w:instrText>
+        <w:instrText xml:space="preserve"> PAGEREF _Toc32357 \h </w:instrText>
       </w:r>
       <w:r>
         <w:fldChar w:fldCharType="separate"/>
@@ -7222,7 +7222,7 @@
         <w:rPr>
           <w:szCs w:val="26"/>
         </w:rPr>
-        <w:instrText xml:space="preserve"> HYPERLINK \l _Toc4987 </w:instrText>
+        <w:instrText xml:space="preserve"> HYPERLINK \l _Toc12089 </w:instrText>
       </w:r>
       <w:r>
         <w:rPr>
@@ -7244,7 +7244,7 @@
         <w:fldChar w:fldCharType="begin"/>
       </w:r>
       <w:r>
-        <w:instrText xml:space="preserve"> PAGEREF _Toc4987 \h </w:instrText>
+        <w:instrText xml:space="preserve"> PAGEREF _Toc12089 \h </w:instrText>
       </w:r>
       <w:r>
         <w:fldChar w:fldCharType="separate"/>
@@ -7292,7 +7292,7 @@
         <w:rPr>
           <w:szCs w:val="26"/>
         </w:rPr>
-        <w:instrText xml:space="preserve"> HYPERLINK \l _Toc14302 </w:instrText>
+        <w:instrText xml:space="preserve"> HYPERLINK \l _Toc15414 </w:instrText>
       </w:r>
       <w:r>
         <w:rPr>
@@ -7329,7 +7329,7 @@
         <w:fldChar w:fldCharType="begin"/>
       </w:r>
       <w:r>
-        <w:instrText xml:space="preserve"> PAGEREF _Toc14302 \h </w:instrText>
+        <w:instrText xml:space="preserve"> PAGEREF _Toc15414 \h </w:instrText>
       </w:r>
       <w:r>
         <w:fldChar w:fldCharType="separate"/>
@@ -7377,7 +7377,7 @@
         <w:rPr>
           <w:szCs w:val="26"/>
         </w:rPr>
-        <w:instrText xml:space="preserve"> HYPERLINK \l _Toc26618 </w:instrText>
+        <w:instrText xml:space="preserve"> HYPERLINK \l _Toc14536 </w:instrText>
       </w:r>
       <w:r>
         <w:rPr>
@@ -7395,7 +7395,7 @@
         <w:fldChar w:fldCharType="begin"/>
       </w:r>
       <w:r>
-        <w:instrText xml:space="preserve"> PAGEREF _Toc26618 \h </w:instrText>
+        <w:instrText xml:space="preserve"> PAGEREF _Toc14536 \h </w:instrText>
       </w:r>
       <w:r>
         <w:fldChar w:fldCharType="separate"/>
@@ -7442,7 +7442,7 @@
         <w:rPr>
           <w:szCs w:val="26"/>
         </w:rPr>
-        <w:instrText xml:space="preserve"> HYPERLINK \l _Toc19463 </w:instrText>
+        <w:instrText xml:space="preserve"> HYPERLINK \l _Toc4775 </w:instrText>
       </w:r>
       <w:r>
         <w:rPr>
@@ -7460,7 +7460,7 @@
         <w:fldChar w:fldCharType="begin"/>
       </w:r>
       <w:r>
-        <w:instrText xml:space="preserve"> PAGEREF _Toc19463 \h </w:instrText>
+        <w:instrText xml:space="preserve"> PAGEREF _Toc4775 \h </w:instrText>
       </w:r>
       <w:r>
         <w:fldChar w:fldCharType="separate"/>
@@ -7507,7 +7507,7 @@
         <w:rPr>
           <w:szCs w:val="26"/>
         </w:rPr>
-        <w:instrText xml:space="preserve"> HYPERLINK \l _Toc7730 </w:instrText>
+        <w:instrText xml:space="preserve"> HYPERLINK \l _Toc10170 </w:instrText>
       </w:r>
       <w:r>
         <w:rPr>
@@ -7528,7 +7528,7 @@
         <w:fldChar w:fldCharType="begin"/>
       </w:r>
       <w:r>
-        <w:instrText xml:space="preserve"> PAGEREF _Toc7730 \h </w:instrText>
+        <w:instrText xml:space="preserve"> PAGEREF _Toc10170 \h </w:instrText>
       </w:r>
       <w:r>
         <w:fldChar w:fldCharType="separate"/>
@@ -7575,7 +7575,7 @@
         <w:rPr>
           <w:szCs w:val="26"/>
         </w:rPr>
-        <w:instrText xml:space="preserve"> HYPERLINK \l _Toc23153 </w:instrText>
+        <w:instrText xml:space="preserve"> HYPERLINK \l _Toc3107 </w:instrText>
       </w:r>
       <w:r>
         <w:rPr>
@@ -7593,7 +7593,7 @@
         <w:fldChar w:fldCharType="begin"/>
       </w:r>
       <w:r>
-        <w:instrText xml:space="preserve"> PAGEREF _Toc23153 \h </w:instrText>
+        <w:instrText xml:space="preserve"> PAGEREF _Toc3107 \h </w:instrText>
       </w:r>
       <w:r>
         <w:fldChar w:fldCharType="separate"/>
@@ -7641,7 +7641,7 @@
         <w:rPr>
           <w:szCs w:val="26"/>
         </w:rPr>
-        <w:instrText xml:space="preserve"> HYPERLINK \l _Toc17505 </w:instrText>
+        <w:instrText xml:space="preserve"> HYPERLINK \l _Toc4336 </w:instrText>
       </w:r>
       <w:r>
         <w:rPr>
@@ -7665,7 +7665,7 @@
         <w:fldChar w:fldCharType="begin"/>
       </w:r>
       <w:r>
-        <w:instrText xml:space="preserve"> PAGEREF _Toc17505 \h </w:instrText>
+        <w:instrText xml:space="preserve"> PAGEREF _Toc4336 \h </w:instrText>
       </w:r>
       <w:r>
         <w:fldChar w:fldCharType="separate"/>
@@ -7712,7 +7712,7 @@
         <w:rPr>
           <w:szCs w:val="26"/>
         </w:rPr>
-        <w:instrText xml:space="preserve"> HYPERLINK \l _Toc17848 </w:instrText>
+        <w:instrText xml:space="preserve"> HYPERLINK \l _Toc21918 </w:instrText>
       </w:r>
       <w:r>
         <w:rPr>
@@ -7736,7 +7736,7 @@
         <w:fldChar w:fldCharType="begin"/>
       </w:r>
       <w:r>
-        <w:instrText xml:space="preserve"> PAGEREF _Toc17848 \h </w:instrText>
+        <w:instrText xml:space="preserve"> PAGEREF _Toc21918 \h </w:instrText>
       </w:r>
       <w:r>
         <w:fldChar w:fldCharType="separate"/>
@@ -7783,7 +7783,7 @@
         <w:rPr>
           <w:szCs w:val="26"/>
         </w:rPr>
-        <w:instrText xml:space="preserve"> HYPERLINK \l _Toc29353 </w:instrText>
+        <w:instrText xml:space="preserve"> HYPERLINK \l _Toc4803 </w:instrText>
       </w:r>
       <w:r>
         <w:rPr>
@@ -7807,7 +7807,7 @@
         <w:fldChar w:fldCharType="begin"/>
       </w:r>
       <w:r>
-        <w:instrText xml:space="preserve"> PAGEREF _Toc29353 \h </w:instrText>
+        <w:instrText xml:space="preserve"> PAGEREF _Toc4803 \h </w:instrText>
       </w:r>
       <w:r>
         <w:fldChar w:fldCharType="separate"/>
@@ -7854,7 +7854,7 @@
         <w:rPr>
           <w:szCs w:val="26"/>
         </w:rPr>
-        <w:instrText xml:space="preserve"> HYPERLINK \l _Toc19879 </w:instrText>
+        <w:instrText xml:space="preserve"> HYPERLINK \l _Toc27772 </w:instrText>
       </w:r>
       <w:r>
         <w:rPr>
@@ -7887,7 +7887,7 @@
         <w:fldChar w:fldCharType="begin"/>
       </w:r>
       <w:r>
-        <w:instrText xml:space="preserve"> PAGEREF _Toc19879 \h </w:instrText>
+        <w:instrText xml:space="preserve"> PAGEREF _Toc27772 \h </w:instrText>
       </w:r>
       <w:r>
         <w:fldChar w:fldCharType="separate"/>
@@ -7935,7 +7935,7 @@
         <w:rPr>
           <w:szCs w:val="26"/>
         </w:rPr>
-        <w:instrText xml:space="preserve"> HYPERLINK \l _Toc31020 </w:instrText>
+        <w:instrText xml:space="preserve"> HYPERLINK \l _Toc21445 </w:instrText>
       </w:r>
       <w:r>
         <w:rPr>
@@ -7987,7 +7987,7 @@
         <w:fldChar w:fldCharType="begin"/>
       </w:r>
       <w:r>
-        <w:instrText xml:space="preserve"> PAGEREF _Toc31020 \h </w:instrText>
+        <w:instrText xml:space="preserve"> PAGEREF _Toc21445 \h </w:instrText>
       </w:r>
       <w:r>
         <w:fldChar w:fldCharType="separate"/>
@@ -8034,7 +8034,7 @@
         <w:rPr>
           <w:szCs w:val="26"/>
         </w:rPr>
-        <w:instrText xml:space="preserve"> HYPERLINK \l _Toc23372 </w:instrText>
+        <w:instrText xml:space="preserve"> HYPERLINK \l _Toc2237 </w:instrText>
       </w:r>
       <w:r>
         <w:rPr>
@@ -8067,7 +8067,7 @@
         <w:fldChar w:fldCharType="begin"/>
       </w:r>
       <w:r>
-        <w:instrText xml:space="preserve"> PAGEREF _Toc23372 \h </w:instrText>
+        <w:instrText xml:space="preserve"> PAGEREF _Toc2237 \h </w:instrText>
       </w:r>
       <w:r>
         <w:fldChar w:fldCharType="separate"/>
@@ -8114,7 +8114,7 @@
         <w:rPr>
           <w:szCs w:val="26"/>
         </w:rPr>
-        <w:instrText xml:space="preserve"> HYPERLINK \l _Toc30804 </w:instrText>
+        <w:instrText xml:space="preserve"> HYPERLINK \l _Toc4300 </w:instrText>
       </w:r>
       <w:r>
         <w:rPr>
@@ -8162,7 +8162,7 @@
         <w:fldChar w:fldCharType="begin"/>
       </w:r>
       <w:r>
-        <w:instrText xml:space="preserve"> PAGEREF _Toc30804 \h </w:instrText>
+        <w:instrText xml:space="preserve"> PAGEREF _Toc4300 \h </w:instrText>
       </w:r>
       <w:r>
         <w:fldChar w:fldCharType="separate"/>
@@ -8210,7 +8210,7 @@
         <w:rPr>
           <w:szCs w:val="26"/>
         </w:rPr>
-        <w:instrText xml:space="preserve"> HYPERLINK \l _Toc17077 </w:instrText>
+        <w:instrText xml:space="preserve"> HYPERLINK \l _Toc3436 </w:instrText>
       </w:r>
       <w:r>
         <w:rPr>
@@ -8257,7 +8257,7 @@
         <w:fldChar w:fldCharType="begin"/>
       </w:r>
       <w:r>
-        <w:instrText xml:space="preserve"> PAGEREF _Toc17077 \h </w:instrText>
+        <w:instrText xml:space="preserve"> PAGEREF _Toc3436 \h </w:instrText>
       </w:r>
       <w:r>
         <w:fldChar w:fldCharType="separate"/>
@@ -8304,7 +8304,7 @@
         <w:rPr>
           <w:szCs w:val="26"/>
         </w:rPr>
-        <w:instrText xml:space="preserve"> HYPERLINK \l _Toc31765 </w:instrText>
+        <w:instrText xml:space="preserve"> HYPERLINK \l _Toc31766 </w:instrText>
       </w:r>
       <w:r>
         <w:rPr>
@@ -8333,7 +8333,7 @@
         <w:fldChar w:fldCharType="begin"/>
       </w:r>
       <w:r>
-        <w:instrText xml:space="preserve"> PAGEREF _Toc31765 \h </w:instrText>
+        <w:instrText xml:space="preserve"> PAGEREF _Toc31766 \h </w:instrText>
       </w:r>
       <w:r>
         <w:fldChar w:fldCharType="separate"/>
@@ -8380,7 +8380,7 @@
         <w:rPr>
           <w:szCs w:val="26"/>
         </w:rPr>
-        <w:instrText xml:space="preserve"> HYPERLINK \l _Toc20387 </w:instrText>
+        <w:instrText xml:space="preserve"> HYPERLINK \l _Toc22948 </w:instrText>
       </w:r>
       <w:r>
         <w:rPr>
@@ -8435,7 +8435,7 @@
         <w:fldChar w:fldCharType="begin"/>
       </w:r>
       <w:r>
-        <w:instrText xml:space="preserve"> PAGEREF _Toc20387 \h </w:instrText>
+        <w:instrText xml:space="preserve"> PAGEREF _Toc22948 \h </w:instrText>
       </w:r>
       <w:r>
         <w:fldChar w:fldCharType="separate"/>
@@ -8482,7 +8482,7 @@
         <w:rPr>
           <w:szCs w:val="26"/>
         </w:rPr>
-        <w:instrText xml:space="preserve"> HYPERLINK \l _Toc14941 </w:instrText>
+        <w:instrText xml:space="preserve"> HYPERLINK \l _Toc32454 </w:instrText>
       </w:r>
       <w:r>
         <w:rPr>
@@ -8512,7 +8512,7 @@
         <w:fldChar w:fldCharType="begin"/>
       </w:r>
       <w:r>
-        <w:instrText xml:space="preserve"> PAGEREF _Toc14941 \h </w:instrText>
+        <w:instrText xml:space="preserve"> PAGEREF _Toc32454 \h </w:instrText>
       </w:r>
       <w:r>
         <w:fldChar w:fldCharType="separate"/>
@@ -8559,7 +8559,7 @@
         <w:rPr>
           <w:szCs w:val="26"/>
         </w:rPr>
-        <w:instrText xml:space="preserve"> HYPERLINK \l _Toc23728 </w:instrText>
+        <w:instrText xml:space="preserve"> HYPERLINK \l _Toc26284 </w:instrText>
       </w:r>
       <w:r>
         <w:rPr>
@@ -8589,7 +8589,7 @@
         <w:fldChar w:fldCharType="begin"/>
       </w:r>
       <w:r>
-        <w:instrText xml:space="preserve"> PAGEREF _Toc23728 \h </w:instrText>
+        <w:instrText xml:space="preserve"> PAGEREF _Toc26284 \h </w:instrText>
       </w:r>
       <w:r>
         <w:fldChar w:fldCharType="separate"/>
@@ -8636,7 +8636,7 @@
         <w:rPr>
           <w:szCs w:val="26"/>
         </w:rPr>
-        <w:instrText xml:space="preserve"> HYPERLINK \l _Toc22050 </w:instrText>
+        <w:instrText xml:space="preserve"> HYPERLINK \l _Toc14089 </w:instrText>
       </w:r>
       <w:r>
         <w:rPr>
@@ -8666,7 +8666,7 @@
         <w:fldChar w:fldCharType="begin"/>
       </w:r>
       <w:r>
-        <w:instrText xml:space="preserve"> PAGEREF _Toc22050 \h </w:instrText>
+        <w:instrText xml:space="preserve"> PAGEREF _Toc14089 \h </w:instrText>
       </w:r>
       <w:r>
         <w:fldChar w:fldCharType="separate"/>
@@ -8713,7 +8713,7 @@
         <w:rPr>
           <w:szCs w:val="26"/>
         </w:rPr>
-        <w:instrText xml:space="preserve"> HYPERLINK \l _Toc28857 </w:instrText>
+        <w:instrText xml:space="preserve"> HYPERLINK \l _Toc17395 </w:instrText>
       </w:r>
       <w:r>
         <w:rPr>
@@ -8743,7 +8743,7 @@
         <w:fldChar w:fldCharType="begin"/>
       </w:r>
       <w:r>
-        <w:instrText xml:space="preserve"> PAGEREF _Toc28857 \h </w:instrText>
+        <w:instrText xml:space="preserve"> PAGEREF _Toc17395 \h </w:instrText>
       </w:r>
       <w:r>
         <w:fldChar w:fldCharType="separate"/>
@@ -8791,7 +8791,7 @@
         <w:rPr>
           <w:szCs w:val="26"/>
         </w:rPr>
-        <w:instrText xml:space="preserve"> HYPERLINK \l _Toc21409 </w:instrText>
+        <w:instrText xml:space="preserve"> HYPERLINK \l _Toc8356 </w:instrText>
       </w:r>
       <w:r>
         <w:rPr>
@@ -8815,7 +8815,7 @@
         <w:fldChar w:fldCharType="begin"/>
       </w:r>
       <w:r>
-        <w:instrText xml:space="preserve"> PAGEREF _Toc21409 \h </w:instrText>
+        <w:instrText xml:space="preserve"> PAGEREF _Toc8356 \h </w:instrText>
       </w:r>
       <w:r>
         <w:fldChar w:fldCharType="separate"/>
@@ -8841,6 +8841,772 @@
     </w:p>
     <w:p>
       <w:pPr>
+        <w:pStyle w:val="31"/>
+        <w:tabs>
+          <w:tab w:val="right" w:leader="dot" w:pos="8787"/>
+        </w:tabs>
+      </w:pPr>
+      <w:r>
+        <w:rPr>
+          <w:color w:val="000000" w:themeColor="text1"/>
+          <w:szCs w:val="26"/>
+          <w14:textFill>
+            <w14:solidFill>
+              <w14:schemeClr w14:val="tx1"/>
+            </w14:solidFill>
+          </w14:textFill>
+        </w:rPr>
+        <w:fldChar w:fldCharType="begin"/>
+      </w:r>
+      <w:r>
+        <w:rPr>
+          <w:szCs w:val="26"/>
+        </w:rPr>
+        <w:instrText xml:space="preserve"> HYPERLINK \l _Toc18423 </w:instrText>
+      </w:r>
+      <w:r>
+        <w:rPr>
+          <w:szCs w:val="26"/>
+        </w:rPr>
+        <w:fldChar w:fldCharType="separate"/>
+      </w:r>
+      <w:r>
+        <w:rPr>
+          <w:rFonts w:hint="default"/>
+          <w:szCs w:val="26"/>
+        </w:rPr>
+        <w:t xml:space="preserve">4. 1. </w:t>
+      </w:r>
+      <w:r>
+        <w:rPr>
+          <w:rFonts w:hint="default"/>
+          <w:szCs w:val="26"/>
+        </w:rPr>
+        <w:t>Kiến trúc tổng thể hệ thống</w:t>
+      </w:r>
+      <w:r>
+        <w:tab/>
+      </w:r>
+      <w:r>
+        <w:fldChar w:fldCharType="begin"/>
+      </w:r>
+      <w:r>
+        <w:instrText xml:space="preserve"> PAGEREF _Toc18423 \h </w:instrText>
+      </w:r>
+      <w:r>
+        <w:fldChar w:fldCharType="separate"/>
+      </w:r>
+      <w:r>
+        <w:t>26</w:t>
+      </w:r>
+      <w:r>
+        <w:fldChar w:fldCharType="end"/>
+      </w:r>
+      <w:r>
+        <w:rPr>
+          <w:color w:val="000000" w:themeColor="text1"/>
+          <w:szCs w:val="26"/>
+          <w14:textFill>
+            <w14:solidFill>
+              <w14:schemeClr w14:val="tx1"/>
+            </w14:solidFill>
+          </w14:textFill>
+        </w:rPr>
+        <w:fldChar w:fldCharType="end"/>
+      </w:r>
+    </w:p>
+    <w:p>
+      <w:pPr>
+        <w:pStyle w:val="31"/>
+        <w:tabs>
+          <w:tab w:val="right" w:leader="dot" w:pos="8787"/>
+        </w:tabs>
+      </w:pPr>
+      <w:r>
+        <w:rPr>
+          <w:color w:val="000000" w:themeColor="text1"/>
+          <w:szCs w:val="26"/>
+          <w14:textFill>
+            <w14:solidFill>
+              <w14:schemeClr w14:val="tx1"/>
+            </w14:solidFill>
+          </w14:textFill>
+        </w:rPr>
+        <w:fldChar w:fldCharType="begin"/>
+      </w:r>
+      <w:r>
+        <w:rPr>
+          <w:szCs w:val="26"/>
+        </w:rPr>
+        <w:instrText xml:space="preserve"> HYPERLINK \l _Toc701 </w:instrText>
+      </w:r>
+      <w:r>
+        <w:rPr>
+          <w:szCs w:val="26"/>
+        </w:rPr>
+        <w:fldChar w:fldCharType="separate"/>
+      </w:r>
+      <w:r>
+        <w:rPr>
+          <w:rFonts w:hint="default"/>
+          <w:szCs w:val="26"/>
+        </w:rPr>
+        <w:t xml:space="preserve">4. 2. </w:t>
+      </w:r>
+      <w:r>
+        <w:rPr>
+          <w:rFonts w:hint="default"/>
+          <w:szCs w:val="26"/>
+        </w:rPr>
+        <w:t>Kiến trúc phần mềm</w:t>
+      </w:r>
+      <w:r>
+        <w:tab/>
+      </w:r>
+      <w:r>
+        <w:fldChar w:fldCharType="begin"/>
+      </w:r>
+      <w:r>
+        <w:instrText xml:space="preserve"> PAGEREF _Toc701 \h </w:instrText>
+      </w:r>
+      <w:r>
+        <w:fldChar w:fldCharType="separate"/>
+      </w:r>
+      <w:r>
+        <w:t>27</w:t>
+      </w:r>
+      <w:r>
+        <w:fldChar w:fldCharType="end"/>
+      </w:r>
+      <w:r>
+        <w:rPr>
+          <w:color w:val="000000" w:themeColor="text1"/>
+          <w:szCs w:val="26"/>
+          <w14:textFill>
+            <w14:solidFill>
+              <w14:schemeClr w14:val="tx1"/>
+            </w14:solidFill>
+          </w14:textFill>
+        </w:rPr>
+        <w:fldChar w:fldCharType="end"/>
+      </w:r>
+    </w:p>
+    <w:p>
+      <w:pPr>
+        <w:pStyle w:val="31"/>
+        <w:tabs>
+          <w:tab w:val="right" w:leader="dot" w:pos="8787"/>
+        </w:tabs>
+      </w:pPr>
+      <w:r>
+        <w:rPr>
+          <w:color w:val="000000" w:themeColor="text1"/>
+          <w:szCs w:val="26"/>
+          <w14:textFill>
+            <w14:solidFill>
+              <w14:schemeClr w14:val="tx1"/>
+            </w14:solidFill>
+          </w14:textFill>
+        </w:rPr>
+        <w:fldChar w:fldCharType="begin"/>
+      </w:r>
+      <w:r>
+        <w:rPr>
+          <w:szCs w:val="26"/>
+        </w:rPr>
+        <w:instrText xml:space="preserve"> HYPERLINK \l _Toc17756 </w:instrText>
+      </w:r>
+      <w:r>
+        <w:rPr>
+          <w:szCs w:val="26"/>
+        </w:rPr>
+        <w:fldChar w:fldCharType="separate"/>
+      </w:r>
+      <w:r>
+        <w:rPr>
+          <w:rFonts w:hint="default"/>
+          <w:szCs w:val="26"/>
+        </w:rPr>
+        <w:t xml:space="preserve">4. 3. </w:t>
+      </w:r>
+      <w:r>
+        <w:rPr>
+          <w:rFonts w:hint="default"/>
+          <w:szCs w:val="26"/>
+        </w:rPr>
+        <w:t>Thiết kế chức năng</w:t>
+      </w:r>
+      <w:r>
+        <w:tab/>
+      </w:r>
+      <w:r>
+        <w:fldChar w:fldCharType="begin"/>
+      </w:r>
+      <w:r>
+        <w:instrText xml:space="preserve"> PAGEREF _Toc17756 \h </w:instrText>
+      </w:r>
+      <w:r>
+        <w:fldChar w:fldCharType="separate"/>
+      </w:r>
+      <w:r>
+        <w:t>27</w:t>
+      </w:r>
+      <w:r>
+        <w:fldChar w:fldCharType="end"/>
+      </w:r>
+      <w:r>
+        <w:rPr>
+          <w:color w:val="000000" w:themeColor="text1"/>
+          <w:szCs w:val="26"/>
+          <w14:textFill>
+            <w14:solidFill>
+              <w14:schemeClr w14:val="tx1"/>
+            </w14:solidFill>
+          </w14:textFill>
+        </w:rPr>
+        <w:fldChar w:fldCharType="end"/>
+      </w:r>
+    </w:p>
+    <w:p>
+      <w:pPr>
+        <w:pStyle w:val="31"/>
+        <w:tabs>
+          <w:tab w:val="right" w:leader="dot" w:pos="8787"/>
+        </w:tabs>
+      </w:pPr>
+      <w:r>
+        <w:rPr>
+          <w:color w:val="000000" w:themeColor="text1"/>
+          <w:szCs w:val="26"/>
+          <w14:textFill>
+            <w14:solidFill>
+              <w14:schemeClr w14:val="tx1"/>
+            </w14:solidFill>
+          </w14:textFill>
+        </w:rPr>
+        <w:fldChar w:fldCharType="begin"/>
+      </w:r>
+      <w:r>
+        <w:rPr>
+          <w:szCs w:val="26"/>
+        </w:rPr>
+        <w:instrText xml:space="preserve"> HYPERLINK \l _Toc21786 </w:instrText>
+      </w:r>
+      <w:r>
+        <w:rPr>
+          <w:szCs w:val="26"/>
+        </w:rPr>
+        <w:fldChar w:fldCharType="separate"/>
+      </w:r>
+      <w:r>
+        <w:rPr>
+          <w:rFonts w:hint="default"/>
+          <w:szCs w:val="26"/>
+        </w:rPr>
+        <w:t xml:space="preserve">4. 4. </w:t>
+      </w:r>
+      <w:r>
+        <w:rPr>
+          <w:rFonts w:hint="default"/>
+          <w:szCs w:val="26"/>
+        </w:rPr>
+        <w:t>Thiết kế dữ liệu</w:t>
+      </w:r>
+      <w:r>
+        <w:tab/>
+      </w:r>
+      <w:r>
+        <w:fldChar w:fldCharType="begin"/>
+      </w:r>
+      <w:r>
+        <w:instrText xml:space="preserve"> PAGEREF _Toc21786 \h </w:instrText>
+      </w:r>
+      <w:r>
+        <w:fldChar w:fldCharType="separate"/>
+      </w:r>
+      <w:r>
+        <w:t>27</w:t>
+      </w:r>
+      <w:r>
+        <w:fldChar w:fldCharType="end"/>
+      </w:r>
+      <w:r>
+        <w:rPr>
+          <w:color w:val="000000" w:themeColor="text1"/>
+          <w:szCs w:val="26"/>
+          <w14:textFill>
+            <w14:solidFill>
+              <w14:schemeClr w14:val="tx1"/>
+            </w14:solidFill>
+          </w14:textFill>
+        </w:rPr>
+        <w:fldChar w:fldCharType="end"/>
+      </w:r>
+    </w:p>
+    <w:p>
+      <w:pPr>
+        <w:pStyle w:val="31"/>
+        <w:tabs>
+          <w:tab w:val="right" w:leader="dot" w:pos="8787"/>
+        </w:tabs>
+      </w:pPr>
+      <w:r>
+        <w:rPr>
+          <w:color w:val="000000" w:themeColor="text1"/>
+          <w:szCs w:val="26"/>
+          <w14:textFill>
+            <w14:solidFill>
+              <w14:schemeClr w14:val="tx1"/>
+            </w14:solidFill>
+          </w14:textFill>
+        </w:rPr>
+        <w:fldChar w:fldCharType="begin"/>
+      </w:r>
+      <w:r>
+        <w:rPr>
+          <w:szCs w:val="26"/>
+        </w:rPr>
+        <w:instrText xml:space="preserve"> HYPERLINK \l _Toc19902 </w:instrText>
+      </w:r>
+      <w:r>
+        <w:rPr>
+          <w:szCs w:val="26"/>
+        </w:rPr>
+        <w:fldChar w:fldCharType="separate"/>
+      </w:r>
+      <w:r>
+        <w:rPr>
+          <w:rFonts w:hint="default"/>
+          <w:szCs w:val="26"/>
+        </w:rPr>
+        <w:t xml:space="preserve">4. 5. </w:t>
+      </w:r>
+      <w:r>
+        <w:rPr>
+          <w:rFonts w:hint="default"/>
+          <w:szCs w:val="26"/>
+        </w:rPr>
+        <w:t>Hiện thực các module</w:t>
+      </w:r>
+      <w:r>
+        <w:tab/>
+      </w:r>
+      <w:r>
+        <w:fldChar w:fldCharType="begin"/>
+      </w:r>
+      <w:r>
+        <w:instrText xml:space="preserve"> PAGEREF _Toc19902 \h </w:instrText>
+      </w:r>
+      <w:r>
+        <w:fldChar w:fldCharType="separate"/>
+      </w:r>
+      <w:r>
+        <w:t>27</w:t>
+      </w:r>
+      <w:r>
+        <w:fldChar w:fldCharType="end"/>
+      </w:r>
+      <w:r>
+        <w:rPr>
+          <w:color w:val="000000" w:themeColor="text1"/>
+          <w:szCs w:val="26"/>
+          <w14:textFill>
+            <w14:solidFill>
+              <w14:schemeClr w14:val="tx1"/>
+            </w14:solidFill>
+          </w14:textFill>
+        </w:rPr>
+        <w:fldChar w:fldCharType="end"/>
+      </w:r>
+    </w:p>
+    <w:p>
+      <w:pPr>
+        <w:pStyle w:val="31"/>
+        <w:tabs>
+          <w:tab w:val="right" w:leader="dot" w:pos="8787"/>
+        </w:tabs>
+      </w:pPr>
+      <w:r>
+        <w:rPr>
+          <w:color w:val="000000" w:themeColor="text1"/>
+          <w:szCs w:val="26"/>
+          <w14:textFill>
+            <w14:solidFill>
+              <w14:schemeClr w14:val="tx1"/>
+            </w14:solidFill>
+          </w14:textFill>
+        </w:rPr>
+        <w:fldChar w:fldCharType="begin"/>
+      </w:r>
+      <w:r>
+        <w:rPr>
+          <w:szCs w:val="26"/>
+        </w:rPr>
+        <w:instrText xml:space="preserve"> HYPERLINK \l _Toc8237 </w:instrText>
+      </w:r>
+      <w:r>
+        <w:rPr>
+          <w:szCs w:val="26"/>
+        </w:rPr>
+        <w:fldChar w:fldCharType="separate"/>
+      </w:r>
+      <w:r>
+        <w:rPr>
+          <w:rFonts w:hint="default"/>
+          <w:szCs w:val="26"/>
+        </w:rPr>
+        <w:t xml:space="preserve">4. 6. </w:t>
+      </w:r>
+      <w:r>
+        <w:rPr>
+          <w:rFonts w:hint="default"/>
+          <w:szCs w:val="26"/>
+        </w:rPr>
+        <w:t>Công nghệ và môi trường phát triển</w:t>
+      </w:r>
+      <w:r>
+        <w:tab/>
+      </w:r>
+      <w:r>
+        <w:fldChar w:fldCharType="begin"/>
+      </w:r>
+      <w:r>
+        <w:instrText xml:space="preserve"> PAGEREF _Toc8237 \h </w:instrText>
+      </w:r>
+      <w:r>
+        <w:fldChar w:fldCharType="separate"/>
+      </w:r>
+      <w:r>
+        <w:t>27</w:t>
+      </w:r>
+      <w:r>
+        <w:fldChar w:fldCharType="end"/>
+      </w:r>
+      <w:r>
+        <w:rPr>
+          <w:color w:val="000000" w:themeColor="text1"/>
+          <w:szCs w:val="26"/>
+          <w14:textFill>
+            <w14:solidFill>
+              <w14:schemeClr w14:val="tx1"/>
+            </w14:solidFill>
+          </w14:textFill>
+        </w:rPr>
+        <w:fldChar w:fldCharType="end"/>
+      </w:r>
+    </w:p>
+    <w:p>
+      <w:pPr>
+        <w:pStyle w:val="31"/>
+        <w:tabs>
+          <w:tab w:val="right" w:leader="dot" w:pos="8787"/>
+        </w:tabs>
+      </w:pPr>
+      <w:r>
+        <w:rPr>
+          <w:color w:val="000000" w:themeColor="text1"/>
+          <w:szCs w:val="26"/>
+          <w14:textFill>
+            <w14:solidFill>
+              <w14:schemeClr w14:val="tx1"/>
+            </w14:solidFill>
+          </w14:textFill>
+        </w:rPr>
+        <w:fldChar w:fldCharType="begin"/>
+      </w:r>
+      <w:r>
+        <w:rPr>
+          <w:szCs w:val="26"/>
+        </w:rPr>
+        <w:instrText xml:space="preserve"> HYPERLINK \l _Toc6141 </w:instrText>
+      </w:r>
+      <w:r>
+        <w:rPr>
+          <w:szCs w:val="26"/>
+        </w:rPr>
+        <w:fldChar w:fldCharType="separate"/>
+      </w:r>
+      <w:r>
+        <w:rPr>
+          <w:rFonts w:hint="default"/>
+          <w:szCs w:val="26"/>
+        </w:rPr>
+        <w:t xml:space="preserve">4. 7. </w:t>
+      </w:r>
+      <w:r>
+        <w:rPr>
+          <w:rFonts w:hint="default"/>
+          <w:szCs w:val="26"/>
+        </w:rPr>
+        <w:t>Giao diện người dùng</w:t>
+      </w:r>
+      <w:r>
+        <w:tab/>
+      </w:r>
+      <w:r>
+        <w:fldChar w:fldCharType="begin"/>
+      </w:r>
+      <w:r>
+        <w:instrText xml:space="preserve"> PAGEREF _Toc6141 \h </w:instrText>
+      </w:r>
+      <w:r>
+        <w:fldChar w:fldCharType="separate"/>
+      </w:r>
+      <w:r>
+        <w:t>27</w:t>
+      </w:r>
+      <w:r>
+        <w:fldChar w:fldCharType="end"/>
+      </w:r>
+      <w:r>
+        <w:rPr>
+          <w:color w:val="000000" w:themeColor="text1"/>
+          <w:szCs w:val="26"/>
+          <w14:textFill>
+            <w14:solidFill>
+              <w14:schemeClr w14:val="tx1"/>
+            </w14:solidFill>
+          </w14:textFill>
+        </w:rPr>
+        <w:fldChar w:fldCharType="end"/>
+      </w:r>
+    </w:p>
+    <w:p>
+      <w:pPr>
+        <w:pStyle w:val="31"/>
+        <w:tabs>
+          <w:tab w:val="right" w:leader="dot" w:pos="8787"/>
+        </w:tabs>
+      </w:pPr>
+      <w:r>
+        <w:rPr>
+          <w:color w:val="000000" w:themeColor="text1"/>
+          <w:szCs w:val="26"/>
+          <w14:textFill>
+            <w14:solidFill>
+              <w14:schemeClr w14:val="tx1"/>
+            </w14:solidFill>
+          </w14:textFill>
+        </w:rPr>
+        <w:fldChar w:fldCharType="begin"/>
+      </w:r>
+      <w:r>
+        <w:rPr>
+          <w:szCs w:val="26"/>
+        </w:rPr>
+        <w:instrText xml:space="preserve"> HYPERLINK \l _Toc13988 </w:instrText>
+      </w:r>
+      <w:r>
+        <w:rPr>
+          <w:szCs w:val="26"/>
+        </w:rPr>
+        <w:fldChar w:fldCharType="separate"/>
+      </w:r>
+      <w:r>
+        <w:rPr>
+          <w:rFonts w:hint="default"/>
+          <w:szCs w:val="26"/>
+        </w:rPr>
+        <w:t xml:space="preserve">4. 8. </w:t>
+      </w:r>
+      <w:r>
+        <w:rPr>
+          <w:rFonts w:hint="default"/>
+          <w:szCs w:val="26"/>
+        </w:rPr>
+        <w:t>Các vấn đề gặp phải và giải pháp</w:t>
+      </w:r>
+      <w:r>
+        <w:tab/>
+      </w:r>
+      <w:r>
+        <w:fldChar w:fldCharType="begin"/>
+      </w:r>
+      <w:r>
+        <w:instrText xml:space="preserve"> PAGEREF _Toc13988 \h </w:instrText>
+      </w:r>
+      <w:r>
+        <w:fldChar w:fldCharType="separate"/>
+      </w:r>
+      <w:r>
+        <w:t>27</w:t>
+      </w:r>
+      <w:r>
+        <w:fldChar w:fldCharType="end"/>
+      </w:r>
+      <w:r>
+        <w:rPr>
+          <w:color w:val="000000" w:themeColor="text1"/>
+          <w:szCs w:val="26"/>
+          <w14:textFill>
+            <w14:solidFill>
+              <w14:schemeClr w14:val="tx1"/>
+            </w14:solidFill>
+          </w14:textFill>
+        </w:rPr>
+        <w:fldChar w:fldCharType="end"/>
+      </w:r>
+    </w:p>
+    <w:p>
+      <w:pPr>
+        <w:pStyle w:val="31"/>
+        <w:tabs>
+          <w:tab w:val="right" w:leader="dot" w:pos="8787"/>
+        </w:tabs>
+      </w:pPr>
+      <w:r>
+        <w:rPr>
+          <w:color w:val="000000" w:themeColor="text1"/>
+          <w:szCs w:val="26"/>
+          <w14:textFill>
+            <w14:solidFill>
+              <w14:schemeClr w14:val="tx1"/>
+            </w14:solidFill>
+          </w14:textFill>
+        </w:rPr>
+        <w:fldChar w:fldCharType="begin"/>
+      </w:r>
+      <w:r>
+        <w:rPr>
+          <w:szCs w:val="26"/>
+        </w:rPr>
+        <w:instrText xml:space="preserve"> HYPERLINK \l _Toc3612 </w:instrText>
+      </w:r>
+      <w:r>
+        <w:rPr>
+          <w:szCs w:val="26"/>
+        </w:rPr>
+        <w:fldChar w:fldCharType="separate"/>
+      </w:r>
+      <w:r>
+        <w:rPr>
+          <w:rFonts w:hint="default"/>
+          <w:szCs w:val="26"/>
+        </w:rPr>
+        <w:t xml:space="preserve">4. 9. </w:t>
+      </w:r>
+      <w:r>
+        <w:rPr>
+          <w:rFonts w:hint="default"/>
+          <w:szCs w:val="26"/>
+        </w:rPr>
+        <w:t>Đánh giá và kiểm thử hệ thống</w:t>
+      </w:r>
+      <w:r>
+        <w:tab/>
+      </w:r>
+      <w:r>
+        <w:fldChar w:fldCharType="begin"/>
+      </w:r>
+      <w:r>
+        <w:instrText xml:space="preserve"> PAGEREF _Toc3612 \h </w:instrText>
+      </w:r>
+      <w:r>
+        <w:fldChar w:fldCharType="separate"/>
+      </w:r>
+      <w:r>
+        <w:t>27</w:t>
+      </w:r>
+      <w:r>
+        <w:fldChar w:fldCharType="end"/>
+      </w:r>
+      <w:r>
+        <w:rPr>
+          <w:color w:val="000000" w:themeColor="text1"/>
+          <w:szCs w:val="26"/>
+          <w14:textFill>
+            <w14:solidFill>
+              <w14:schemeClr w14:val="tx1"/>
+            </w14:solidFill>
+          </w14:textFill>
+        </w:rPr>
+        <w:fldChar w:fldCharType="end"/>
+      </w:r>
+    </w:p>
+    <w:p>
+      <w:pPr>
+        <w:pStyle w:val="31"/>
+        <w:tabs>
+          <w:tab w:val="right" w:leader="dot" w:pos="8787"/>
+        </w:tabs>
+      </w:pPr>
+      <w:r>
+        <w:rPr>
+          <w:color w:val="000000" w:themeColor="text1"/>
+          <w:szCs w:val="26"/>
+          <w14:textFill>
+            <w14:solidFill>
+              <w14:schemeClr w14:val="tx1"/>
+            </w14:solidFill>
+          </w14:textFill>
+        </w:rPr>
+        <w:fldChar w:fldCharType="begin"/>
+      </w:r>
+      <w:r>
+        <w:rPr>
+          <w:szCs w:val="26"/>
+        </w:rPr>
+        <w:instrText xml:space="preserve"> HYPERLINK \l _Toc23640 </w:instrText>
+      </w:r>
+      <w:r>
+        <w:rPr>
+          <w:szCs w:val="26"/>
+        </w:rPr>
+        <w:fldChar w:fldCharType="separate"/>
+      </w:r>
+      <w:r>
+        <w:rPr>
+          <w:rFonts w:hint="default"/>
+          <w:lang w:val="vi-VN"/>
+        </w:rPr>
+        <w:t xml:space="preserve">4. 10. </w:t>
+      </w:r>
+      <w:r>
+        <w:rPr>
+          <w:rFonts w:hint="default"/>
+          <w:szCs w:val="26"/>
+        </w:rPr>
+        <w:t>Kết luận chươn</w:t>
+      </w:r>
+      <w:r>
+        <w:rPr>
+          <w:rFonts w:hint="default"/>
+        </w:rPr>
+        <w:t>g</w:t>
+      </w:r>
+      <w:r>
+        <w:tab/>
+      </w:r>
+      <w:r>
+        <w:fldChar w:fldCharType="begin"/>
+      </w:r>
+      <w:r>
+        <w:instrText xml:space="preserve"> PAGEREF _Toc23640 \h </w:instrText>
+      </w:r>
+      <w:r>
+        <w:fldChar w:fldCharType="separate"/>
+      </w:r>
+      <w:r>
+        <w:t>27</w:t>
+      </w:r>
+      <w:r>
+        <w:fldChar w:fldCharType="end"/>
+      </w:r>
+      <w:r>
+        <w:rPr>
+          <w:color w:val="000000" w:themeColor="text1"/>
+          <w:szCs w:val="26"/>
+          <w14:textFill>
+            <w14:solidFill>
+              <w14:schemeClr w14:val="tx1"/>
+            </w14:solidFill>
+          </w14:textFill>
+        </w:rPr>
+        <w:fldChar w:fldCharType="end"/>
+      </w:r>
+    </w:p>
+    <w:p>
+      <w:pPr>
         <w:pStyle w:val="30"/>
         <w:tabs>
           <w:tab w:val="right" w:leader="dot" w:pos="8787"/>
@@ -8863,7 +9629,7 @@
         <w:rPr>
           <w:szCs w:val="26"/>
         </w:rPr>
-        <w:instrText xml:space="preserve"> HYPERLINK \l _Toc31886 </w:instrText>
+        <w:instrText xml:space="preserve"> HYPERLINK \l _Toc26348 </w:instrText>
       </w:r>
       <w:r>
         <w:rPr>
@@ -8894,13 +9660,13 @@
         <w:fldChar w:fldCharType="begin"/>
       </w:r>
       <w:r>
-        <w:instrText xml:space="preserve"> PAGEREF _Toc31886 \h </w:instrText>
+        <w:instrText xml:space="preserve"> PAGEREF _Toc26348 \h </w:instrText>
       </w:r>
       <w:r>
         <w:fldChar w:fldCharType="separate"/>
       </w:r>
       <w:r>
-        <w:t>27</w:t>
+        <w:t>28</w:t>
       </w:r>
       <w:r>
         <w:fldChar w:fldCharType="end"/>
@@ -8941,7 +9707,7 @@
         <w:rPr>
           <w:szCs w:val="26"/>
         </w:rPr>
-        <w:instrText xml:space="preserve"> HYPERLINK \l _Toc4044 </w:instrText>
+        <w:instrText xml:space="preserve"> HYPERLINK \l _Toc19915 </w:instrText>
       </w:r>
       <w:r>
         <w:rPr>
@@ -8965,13 +9731,13 @@
         <w:fldChar w:fldCharType="begin"/>
       </w:r>
       <w:r>
-        <w:instrText xml:space="preserve"> PAGEREF _Toc4044 \h </w:instrText>
+        <w:instrText xml:space="preserve"> PAGEREF _Toc19915 \h </w:instrText>
       </w:r>
       <w:r>
         <w:fldChar w:fldCharType="separate"/>
       </w:r>
       <w:r>
-        <w:t>27</w:t>
+        <w:t>28</w:t>
       </w:r>
       <w:r>
         <w:fldChar w:fldCharType="end"/>
@@ -9012,7 +9778,7 @@
         <w:rPr>
           <w:szCs w:val="26"/>
         </w:rPr>
-        <w:instrText xml:space="preserve"> HYPERLINK \l _Toc25398 </w:instrText>
+        <w:instrText xml:space="preserve"> HYPERLINK \l _Toc4620 </w:instrText>
       </w:r>
       <w:r>
         <w:rPr>
@@ -9034,6 +9800,8 @@
         </w:rPr>
         <w:t>KẾT LUẬN</w:t>
       </w:r>
+      <w:bookmarkStart w:id="174" w:name="_GoBack"/>
+      <w:bookmarkEnd w:id="174"/>
       <w:r>
         <w:tab/>
       </w:r>
@@ -9041,13 +9809,13 @@
         <w:fldChar w:fldCharType="begin"/>
       </w:r>
       <w:r>
-        <w:instrText xml:space="preserve"> PAGEREF _Toc25398 \h </w:instrText>
+        <w:instrText xml:space="preserve"> PAGEREF _Toc4620 \h </w:instrText>
       </w:r>
       <w:r>
         <w:fldChar w:fldCharType="separate"/>
       </w:r>
       <w:r>
-        <w:t>27</w:t>
+        <w:t>28</w:t>
       </w:r>
       <w:r>
         <w:fldChar w:fldCharType="end"/>
@@ -9088,7 +9856,7 @@
         <w:rPr>
           <w:szCs w:val="26"/>
         </w:rPr>
-        <w:instrText xml:space="preserve"> HYPERLINK \l _Toc23548 </w:instrText>
+        <w:instrText xml:space="preserve"> HYPERLINK \l _Toc29855 </w:instrText>
       </w:r>
       <w:r>
         <w:rPr>
@@ -9112,13 +9880,13 @@
         <w:fldChar w:fldCharType="begin"/>
       </w:r>
       <w:r>
-        <w:instrText xml:space="preserve"> PAGEREF _Toc23548 \h </w:instrText>
+        <w:instrText xml:space="preserve"> PAGEREF _Toc29855 \h </w:instrText>
       </w:r>
       <w:r>
         <w:fldChar w:fldCharType="separate"/>
       </w:r>
       <w:r>
-        <w:t>27</w:t>
+        <w:t>28</w:t>
       </w:r>
       <w:r>
         <w:fldChar w:fldCharType="end"/>
@@ -9160,7 +9928,7 @@
         <w:rPr>
           <w:szCs w:val="26"/>
         </w:rPr>
-        <w:instrText xml:space="preserve"> HYPERLINK \l _Toc2381 </w:instrText>
+        <w:instrText xml:space="preserve"> HYPERLINK \l _Toc12563 </w:instrText>
       </w:r>
       <w:r>
         <w:rPr>
@@ -9178,13 +9946,13 @@
         <w:fldChar w:fldCharType="begin"/>
       </w:r>
       <w:r>
-        <w:instrText xml:space="preserve"> PAGEREF _Toc2381 \h </w:instrText>
+        <w:instrText xml:space="preserve"> PAGEREF _Toc12563 \h </w:instrText>
       </w:r>
       <w:r>
         <w:fldChar w:fldCharType="separate"/>
       </w:r>
       <w:r>
-        <w:t>30</w:t>
+        <w:t>31</w:t>
       </w:r>
       <w:r>
         <w:fldChar w:fldCharType="end"/>
@@ -9262,7 +10030,7 @@
       <w:bookmarkStart w:id="26" w:name="_Toc164957610"/>
       <w:bookmarkStart w:id="27" w:name="_Toc164957338"/>
       <w:bookmarkStart w:id="28" w:name="_Toc164957259"/>
-      <w:bookmarkStart w:id="29" w:name="_Toc26618"/>
+      <w:bookmarkStart w:id="29" w:name="_Toc14536"/>
       <w:bookmarkStart w:id="30" w:name="_Toc164955388"/>
       <w:bookmarkStart w:id="31" w:name="_Toc164957263"/>
       <w:bookmarkStart w:id="32" w:name="_Toc164957121"/>
@@ -9299,7 +10067,7 @@
       <w:bookmarkStart w:id="39" w:name="_Toc164957260"/>
       <w:bookmarkStart w:id="40" w:name="_Toc164957339"/>
       <w:bookmarkStart w:id="41" w:name="_Toc164957611"/>
-      <w:bookmarkStart w:id="42" w:name="_Toc19463"/>
+      <w:bookmarkStart w:id="42" w:name="_Toc4775"/>
       <w:r>
         <w:t>LÝ DO CHỌN ĐỀ TÀI</w:t>
       </w:r>
@@ -9433,7 +10201,7 @@
           <w:lang w:val="vi-VN"/>
         </w:rPr>
       </w:pPr>
-      <w:bookmarkStart w:id="49" w:name="_Toc7730"/>
+      <w:bookmarkStart w:id="49" w:name="_Toc10170"/>
       <w:r>
         <w:rPr>
           <w:sz w:val="26"/>
@@ -9689,7 +10457,7 @@
           <w:sz w:val="26"/>
         </w:rPr>
       </w:pPr>
-      <w:bookmarkStart w:id="56" w:name="_Toc23153"/>
+      <w:bookmarkStart w:id="56" w:name="_Toc3107"/>
       <w:r>
         <w:rPr>
           <w:sz w:val="26"/>
@@ -9800,7 +10568,7 @@
           <w:numId w:val="8"/>
         </w:numPr>
       </w:pPr>
-      <w:bookmarkStart w:id="57" w:name="_Toc17505"/>
+      <w:bookmarkStart w:id="57" w:name="_Toc4336"/>
       <w:r>
         <w:t>TỔNG QUAN ĐỀ TÀI</w:t>
       </w:r>
@@ -9826,7 +10594,7 @@
       <w:bookmarkStart w:id="60" w:name="_Toc164957343"/>
       <w:bookmarkStart w:id="61" w:name="_Toc164957122"/>
       <w:bookmarkStart w:id="62" w:name="_Toc164957264"/>
-      <w:bookmarkStart w:id="63" w:name="_Toc17848"/>
+      <w:bookmarkStart w:id="63" w:name="_Toc21918"/>
       <w:r>
         <w:rPr>
           <w:sz w:val="26"/>
@@ -10977,7 +11745,7 @@
           <w:sz w:val="26"/>
         </w:rPr>
       </w:pPr>
-      <w:bookmarkStart w:id="69" w:name="_Toc29353"/>
+      <w:bookmarkStart w:id="69" w:name="_Toc4803"/>
       <w:r>
         <w:rPr>
           <w:sz w:val="26"/>
@@ -11085,7 +11853,7 @@
           <w:sz w:val="26"/>
         </w:rPr>
       </w:pPr>
-      <w:bookmarkStart w:id="75" w:name="_Toc19879"/>
+      <w:bookmarkStart w:id="75" w:name="_Toc27772"/>
       <w:r>
         <w:rPr>
           <w:sz w:val="26"/>
@@ -11304,7 +12072,7 @@
       <w:pPr>
         <w:pStyle w:val="2"/>
       </w:pPr>
-      <w:bookmarkStart w:id="82" w:name="_Toc31020"/>
+      <w:bookmarkStart w:id="82" w:name="_Toc21445"/>
       <w:r>
         <w:t>PHƯƠNG PHÁP VÀ</w:t>
       </w:r>
@@ -11377,7 +12145,7 @@
       <w:bookmarkStart w:id="86" w:name="_Toc164957126"/>
       <w:bookmarkStart w:id="87" w:name="_Toc164955393"/>
       <w:bookmarkStart w:id="88" w:name="_Toc164957619"/>
-      <w:bookmarkStart w:id="89" w:name="_Toc23372"/>
+      <w:bookmarkStart w:id="89" w:name="_Toc2237"/>
       <w:r>
         <w:rPr>
           <w:sz w:val="26"/>
@@ -11770,7 +12538,7 @@
       <w:bookmarkStart w:id="93" w:name="_Toc164957127"/>
       <w:bookmarkStart w:id="94" w:name="_Toc164957348"/>
       <w:bookmarkStart w:id="95" w:name="_Toc164957269"/>
-      <w:bookmarkStart w:id="96" w:name="_Toc30804"/>
+      <w:bookmarkStart w:id="96" w:name="_Toc4300"/>
       <w:r>
         <w:rPr>
           <w:sz w:val="26"/>
@@ -11938,7 +12706,7 @@
       <w:pPr>
         <w:pStyle w:val="2"/>
       </w:pPr>
-      <w:bookmarkStart w:id="103" w:name="_Toc17077"/>
+      <w:bookmarkStart w:id="103" w:name="_Toc3436"/>
       <w:r>
         <w:rPr>
           <w:rFonts w:cs="Times New Roman"/>
@@ -11994,7 +12762,7 @@
       <w:bookmarkStart w:id="107" w:name="_Toc164955396"/>
       <w:bookmarkStart w:id="108" w:name="_Toc164957129"/>
       <w:bookmarkStart w:id="109" w:name="_Toc164957271"/>
-      <w:bookmarkStart w:id="110" w:name="_Toc31765"/>
+      <w:bookmarkStart w:id="110" w:name="_Toc31766"/>
       <w:r>
         <w:rPr>
           <w:rFonts w:hint="default" w:ascii="Times New Roman" w:hAnsi="Times New Roman" w:cs="Times New Roman"/>
@@ -13471,7 +14239,7 @@
       <w:bookmarkStart w:id="114" w:name="_Toc164957272"/>
       <w:bookmarkStart w:id="115" w:name="_Toc164955397"/>
       <w:bookmarkStart w:id="116" w:name="_Toc164957130"/>
-      <w:bookmarkStart w:id="117" w:name="_Toc20387"/>
+      <w:bookmarkStart w:id="117" w:name="_Toc22948"/>
       <w:r>
         <w:rPr>
           <w:rFonts w:hint="default" w:ascii="Times New Roman" w:hAnsi="Times New Roman" w:cs="Times New Roman"/>
@@ -14480,6 +15248,10 @@
             <w:insideH w:val="single" w:color="auto" w:sz="4" w:space="0"/>
             <w:insideV w:val="single" w:color="auto" w:sz="4" w:space="0"/>
           </w:tblBorders>
+          <w:tblCellMar>
+            <w:left w:w="108" w:type="dxa"/>
+            <w:right w:w="108" w:type="dxa"/>
+          </w:tblCellMar>
         </w:tblPrEx>
         <w:tc>
           <w:tcPr>
@@ -15634,10 +16406,6 @@
             <w:insideH w:val="single" w:color="auto" w:sz="4" w:space="0"/>
             <w:insideV w:val="single" w:color="auto" w:sz="4" w:space="0"/>
           </w:tblBorders>
-          <w:tblCellMar>
-            <w:left w:w="108" w:type="dxa"/>
-            <w:right w:w="108" w:type="dxa"/>
-          </w:tblCellMar>
         </w:tblPrEx>
         <w:tc>
           <w:tcPr>
@@ -15754,10 +16522,6 @@
             <w:insideH w:val="single" w:color="auto" w:sz="4" w:space="0"/>
             <w:insideV w:val="single" w:color="auto" w:sz="4" w:space="0"/>
           </w:tblBorders>
-          <w:tblCellMar>
-            <w:left w:w="108" w:type="dxa"/>
-            <w:right w:w="108" w:type="dxa"/>
-          </w:tblCellMar>
         </w:tblPrEx>
         <w:tc>
           <w:tcPr>
@@ -16368,7 +17132,7 @@
           <w:szCs w:val="26"/>
         </w:rPr>
       </w:pPr>
-      <w:bookmarkStart w:id="118" w:name="_Toc14941"/>
+      <w:bookmarkStart w:id="118" w:name="_Toc32454"/>
       <w:r>
         <w:rPr>
           <w:rFonts w:hint="default" w:ascii="Times New Roman" w:hAnsi="Times New Roman" w:cs="Times New Roman"/>
@@ -16749,6 +17513,10 @@
             <w:insideH w:val="single" w:color="auto" w:sz="4" w:space="0"/>
             <w:insideV w:val="single" w:color="auto" w:sz="4" w:space="0"/>
           </w:tblBorders>
+          <w:tblCellMar>
+            <w:left w:w="108" w:type="dxa"/>
+            <w:right w:w="108" w:type="dxa"/>
+          </w:tblCellMar>
         </w:tblPrEx>
         <w:tc>
           <w:tcPr>
@@ -17037,6 +17805,10 @@
             <w:insideH w:val="single" w:color="auto" w:sz="4" w:space="0"/>
             <w:insideV w:val="single" w:color="auto" w:sz="4" w:space="0"/>
           </w:tblBorders>
+          <w:tblCellMar>
+            <w:left w:w="108" w:type="dxa"/>
+            <w:right w:w="108" w:type="dxa"/>
+          </w:tblCellMar>
         </w:tblPrEx>
         <w:tc>
           <w:tcPr>
@@ -17862,7 +18634,7 @@
           <w:szCs w:val="26"/>
         </w:rPr>
       </w:pPr>
-      <w:bookmarkStart w:id="119" w:name="_Toc23728"/>
+      <w:bookmarkStart w:id="119" w:name="_Toc26284"/>
       <w:r>
         <w:rPr>
           <w:rFonts w:hint="default" w:ascii="Times New Roman" w:hAnsi="Times New Roman" w:cs="Times New Roman"/>
@@ -18910,7 +19682,7 @@
           <w:szCs w:val="26"/>
         </w:rPr>
       </w:pPr>
-      <w:bookmarkStart w:id="120" w:name="_Toc22050"/>
+      <w:bookmarkStart w:id="120" w:name="_Toc14089"/>
       <w:r>
         <w:rPr>
           <w:rFonts w:hint="default" w:ascii="Times New Roman" w:hAnsi="Times New Roman" w:cs="Times New Roman"/>
@@ -19343,7 +20115,7 @@
           <w:szCs w:val="26"/>
         </w:rPr>
       </w:pPr>
-      <w:bookmarkStart w:id="121" w:name="_Toc28857"/>
+      <w:bookmarkStart w:id="121" w:name="_Toc17395"/>
       <w:r>
         <w:rPr>
           <w:rFonts w:hint="default" w:ascii="Times New Roman" w:hAnsi="Times New Roman" w:cs="Times New Roman"/>
@@ -19438,7 +20210,7 @@
         <w:pStyle w:val="2"/>
         <w:bidi w:val="0"/>
       </w:pPr>
-      <w:bookmarkStart w:id="128" w:name="_Toc21409"/>
+      <w:bookmarkStart w:id="128" w:name="_Toc8356"/>
       <w:r>
         <w:t>HIỆN THỰC GIẢI PHÁP</w:t>
       </w:r>
@@ -19461,6 +20233,7 @@
           <w:szCs w:val="26"/>
         </w:rPr>
       </w:pPr>
+      <w:bookmarkStart w:id="129" w:name="_Toc18423"/>
       <w:r>
         <w:rPr>
           <w:rFonts w:hint="default"/>
@@ -19468,6 +20241,58 @@
           <w:szCs w:val="26"/>
         </w:rPr>
         <w:t>Kiến trúc tổng thể hệ thống</w:t>
+      </w:r>
+      <w:bookmarkEnd w:id="129"/>
+    </w:p>
+    <w:p>
+      <w:pPr>
+        <w:rPr>
+          <w:rFonts w:hint="default"/>
+          <w:lang w:val="en-US"/>
+        </w:rPr>
+      </w:pPr>
+      <w:r>
+        <w:rPr>
+          <w:rFonts w:hint="default"/>
+          <w:lang w:val="en-US"/>
+        </w:rPr>
+        <w:drawing>
+          <wp:inline distT="0" distB="0" distL="114300" distR="114300">
+            <wp:extent cx="5220970" cy="7516495"/>
+            <wp:effectExtent l="0" t="0" r="17780" b="8255"/>
+            <wp:docPr id="2" name="Picture 2" descr="TLTN_EnglishApp_Structure"/>
+            <wp:cNvGraphicFramePr>
+              <a:graphicFrameLocks xmlns:a="http://schemas.openxmlformats.org/drawingml/2006/main" noChangeAspect="1"/>
+            </wp:cNvGraphicFramePr>
+            <a:graphic xmlns:a="http://schemas.openxmlformats.org/drawingml/2006/main">
+              <a:graphicData uri="http://schemas.openxmlformats.org/drawingml/2006/picture">
+                <pic:pic xmlns:pic="http://schemas.openxmlformats.org/drawingml/2006/picture">
+                  <pic:nvPicPr>
+                    <pic:cNvPr id="2" name="Picture 2" descr="TLTN_EnglishApp_Structure"/>
+                    <pic:cNvPicPr>
+                      <a:picLocks noChangeAspect="1"/>
+                    </pic:cNvPicPr>
+                  </pic:nvPicPr>
+                  <pic:blipFill>
+                    <a:blip r:embed="rId11"/>
+                    <a:stretch>
+                      <a:fillRect/>
+                    </a:stretch>
+                  </pic:blipFill>
+                  <pic:spPr>
+                    <a:xfrm>
+                      <a:off x="0" y="0"/>
+                      <a:ext cx="5220970" cy="7516495"/>
+                    </a:xfrm>
+                    <a:prstGeom prst="rect">
+                      <a:avLst/>
+                    </a:prstGeom>
+                  </pic:spPr>
+                </pic:pic>
+              </a:graphicData>
+            </a:graphic>
+          </wp:inline>
+        </w:drawing>
       </w:r>
     </w:p>
     <w:p>
@@ -19481,6 +20306,7 @@
           <w:szCs w:val="26"/>
         </w:rPr>
       </w:pPr>
+      <w:bookmarkStart w:id="130" w:name="_Toc701"/>
       <w:r>
         <w:rPr>
           <w:rFonts w:hint="default"/>
@@ -19489,6 +20315,7 @@
         </w:rPr>
         <w:t>Kiến trúc phần mềm</w:t>
       </w:r>
+      <w:bookmarkEnd w:id="130"/>
     </w:p>
     <w:p>
       <w:pPr>
@@ -19501,6 +20328,7 @@
           <w:szCs w:val="26"/>
         </w:rPr>
       </w:pPr>
+      <w:bookmarkStart w:id="131" w:name="_Toc17756"/>
       <w:r>
         <w:rPr>
           <w:rFonts w:hint="default"/>
@@ -19509,6 +20337,7 @@
         </w:rPr>
         <w:t>Thiết kế chức năng</w:t>
       </w:r>
+      <w:bookmarkEnd w:id="131"/>
     </w:p>
     <w:p>
       <w:pPr>
@@ -19529,8 +20358,6 @@
         </w:rPr>
         <w:t>Use Case Diagram</w:t>
       </w:r>
-      <w:bookmarkStart w:id="164" w:name="_GoBack"/>
-      <w:bookmarkEnd w:id="164"/>
     </w:p>
     <w:p>
       <w:pPr>
@@ -19603,6 +20430,7 @@
           <w:szCs w:val="26"/>
         </w:rPr>
       </w:pPr>
+      <w:bookmarkStart w:id="132" w:name="_Toc21786"/>
       <w:r>
         <w:rPr>
           <w:rFonts w:hint="default"/>
@@ -19611,6 +20439,7 @@
         </w:rPr>
         <w:t>Thiết kế dữ liệu</w:t>
       </w:r>
+      <w:bookmarkEnd w:id="132"/>
     </w:p>
     <w:p>
       <w:pPr>
@@ -19663,6 +20492,7 @@
           <w:szCs w:val="26"/>
         </w:rPr>
       </w:pPr>
+      <w:bookmarkStart w:id="133" w:name="_Toc19902"/>
       <w:r>
         <w:rPr>
           <w:rFonts w:hint="default"/>
@@ -19671,6 +20501,7 @@
         </w:rPr>
         <w:t>Hiện thực các module</w:t>
       </w:r>
+      <w:bookmarkEnd w:id="133"/>
     </w:p>
     <w:p>
       <w:pPr>
@@ -19683,6 +20514,7 @@
           <w:szCs w:val="26"/>
         </w:rPr>
       </w:pPr>
+      <w:bookmarkStart w:id="134" w:name="_Toc8237"/>
       <w:r>
         <w:rPr>
           <w:rFonts w:hint="default"/>
@@ -19691,6 +20523,7 @@
         </w:rPr>
         <w:t>Công nghệ và môi trường phát triển</w:t>
       </w:r>
+      <w:bookmarkEnd w:id="134"/>
     </w:p>
     <w:p>
       <w:pPr>
@@ -19703,6 +20536,7 @@
           <w:szCs w:val="26"/>
         </w:rPr>
       </w:pPr>
+      <w:bookmarkStart w:id="135" w:name="_Toc6141"/>
       <w:r>
         <w:rPr>
           <w:rFonts w:hint="default"/>
@@ -19711,6 +20545,7 @@
         </w:rPr>
         <w:t>Giao diện người dùng</w:t>
       </w:r>
+      <w:bookmarkEnd w:id="135"/>
     </w:p>
     <w:p>
       <w:pPr>
@@ -19723,6 +20558,7 @@
           <w:szCs w:val="26"/>
         </w:rPr>
       </w:pPr>
+      <w:bookmarkStart w:id="136" w:name="_Toc13988"/>
       <w:r>
         <w:rPr>
           <w:rFonts w:hint="default"/>
@@ -19731,6 +20567,7 @@
         </w:rPr>
         <w:t>Các vấn đề gặp phải và giải pháp</w:t>
       </w:r>
+      <w:bookmarkEnd w:id="136"/>
     </w:p>
     <w:p>
       <w:pPr>
@@ -19743,6 +20580,7 @@
           <w:szCs w:val="26"/>
         </w:rPr>
       </w:pPr>
+      <w:bookmarkStart w:id="137" w:name="_Toc3612"/>
       <w:r>
         <w:rPr>
           <w:rFonts w:hint="default"/>
@@ -19751,6 +20589,7 @@
         </w:rPr>
         <w:t>Đánh giá và kiểm thử hệ thống</w:t>
       </w:r>
+      <w:bookmarkEnd w:id="137"/>
     </w:p>
     <w:p>
       <w:pPr>
@@ -19841,6 +20680,7 @@
           <w:lang w:val="vi-VN"/>
         </w:rPr>
       </w:pPr>
+      <w:bookmarkStart w:id="138" w:name="_Toc23640"/>
       <w:r>
         <w:rPr>
           <w:rFonts w:hint="default"/>
@@ -19855,16 +20695,38 @@
         </w:rPr>
         <w:t>g</w:t>
       </w:r>
-      <w:r>
-        <w:br w:type="page"/>
-      </w:r>
-      <w:bookmarkStart w:id="129" w:name="_Toc164955399"/>
-      <w:bookmarkStart w:id="130" w:name="_Toc164957274"/>
-      <w:bookmarkStart w:id="131" w:name="_Toc164957353"/>
-      <w:bookmarkStart w:id="132" w:name="_Toc164957132"/>
-      <w:bookmarkStart w:id="133" w:name="_Toc164957625"/>
-      <w:bookmarkStart w:id="134" w:name="_Toc164954913"/>
-      <w:bookmarkStart w:id="135" w:name="_Toc31886"/>
+      <w:bookmarkEnd w:id="138"/>
+      <w:bookmarkStart w:id="139" w:name="_Toc164955399"/>
+      <w:bookmarkStart w:id="140" w:name="_Toc164957274"/>
+      <w:bookmarkStart w:id="141" w:name="_Toc164957353"/>
+      <w:bookmarkStart w:id="142" w:name="_Toc164957132"/>
+      <w:bookmarkStart w:id="143" w:name="_Toc164957625"/>
+      <w:bookmarkStart w:id="144" w:name="_Toc164954913"/>
+    </w:p>
+    <w:p>
+      <w:pPr>
+        <w:rPr>
+          <w:rFonts w:hint="default"/>
+        </w:rPr>
+      </w:pPr>
+    </w:p>
+    <w:p>
+      <w:pPr>
+        <w:rPr>
+          <w:rFonts w:hint="default"/>
+          <w:lang w:val="vi-VN"/>
+        </w:rPr>
+      </w:pPr>
+    </w:p>
+    <w:p>
+      <w:pPr>
+        <w:pStyle w:val="2"/>
+        <w:bidi w:val="0"/>
+        <w:rPr>
+          <w:lang w:val="vi-VN"/>
+        </w:rPr>
+      </w:pPr>
+      <w:bookmarkStart w:id="145" w:name="_Toc26348"/>
       <w:r>
         <w:t>KẾT QUẢ</w:t>
       </w:r>
@@ -19874,13 +20736,13 @@
         </w:rPr>
         <w:t>, KẾT LUẬN VÀ KIẾN NGHỊ</w:t>
       </w:r>
-      <w:bookmarkEnd w:id="129"/>
-      <w:bookmarkEnd w:id="130"/>
-      <w:bookmarkEnd w:id="131"/>
-      <w:bookmarkEnd w:id="132"/>
-      <w:bookmarkEnd w:id="133"/>
-      <w:bookmarkEnd w:id="134"/>
-      <w:bookmarkEnd w:id="135"/>
+      <w:bookmarkEnd w:id="139"/>
+      <w:bookmarkEnd w:id="140"/>
+      <w:bookmarkEnd w:id="141"/>
+      <w:bookmarkEnd w:id="142"/>
+      <w:bookmarkEnd w:id="143"/>
+      <w:bookmarkEnd w:id="144"/>
+      <w:bookmarkEnd w:id="145"/>
     </w:p>
     <w:p>
       <w:pPr>
@@ -19892,23 +20754,23 @@
         <w:spacing w:line="360" w:lineRule="auto"/>
         <w:jc w:val="both"/>
       </w:pPr>
-      <w:bookmarkStart w:id="136" w:name="_Toc164957133"/>
-      <w:bookmarkStart w:id="137" w:name="_Toc164957626"/>
-      <w:bookmarkStart w:id="138" w:name="_Toc164955400"/>
-      <w:bookmarkStart w:id="139" w:name="_Toc164957275"/>
-      <w:bookmarkStart w:id="140" w:name="_Toc164954914"/>
-      <w:bookmarkStart w:id="141" w:name="_Toc164957354"/>
-      <w:bookmarkStart w:id="142" w:name="_Toc4044"/>
+      <w:bookmarkStart w:id="146" w:name="_Toc164957133"/>
+      <w:bookmarkStart w:id="147" w:name="_Toc164957626"/>
+      <w:bookmarkStart w:id="148" w:name="_Toc164955400"/>
+      <w:bookmarkStart w:id="149" w:name="_Toc164957275"/>
+      <w:bookmarkStart w:id="150" w:name="_Toc164954914"/>
+      <w:bookmarkStart w:id="151" w:name="_Toc164957354"/>
+      <w:bookmarkStart w:id="152" w:name="_Toc19915"/>
       <w:r>
         <w:t>KẾT QUẢ</w:t>
       </w:r>
-      <w:bookmarkEnd w:id="136"/>
-      <w:bookmarkEnd w:id="137"/>
-      <w:bookmarkEnd w:id="138"/>
-      <w:bookmarkEnd w:id="139"/>
-      <w:bookmarkEnd w:id="140"/>
-      <w:bookmarkEnd w:id="141"/>
-      <w:bookmarkEnd w:id="142"/>
+      <w:bookmarkEnd w:id="146"/>
+      <w:bookmarkEnd w:id="147"/>
+      <w:bookmarkEnd w:id="148"/>
+      <w:bookmarkEnd w:id="149"/>
+      <w:bookmarkEnd w:id="150"/>
+      <w:bookmarkEnd w:id="151"/>
+      <w:bookmarkEnd w:id="152"/>
       <w:r>
         <w:t xml:space="preserve"> </w:t>
       </w:r>
@@ -20096,9 +20958,9 @@
           <w:lang w:val="vi-VN"/>
         </w:rPr>
       </w:pPr>
-      <w:bookmarkStart w:id="143" w:name="_Toc164954915"/>
-      <w:bookmarkStart w:id="144" w:name="_Toc164955401"/>
-      <w:bookmarkStart w:id="145" w:name="_Toc164957134"/>
+      <w:bookmarkStart w:id="153" w:name="_Toc164954915"/>
+      <w:bookmarkStart w:id="154" w:name="_Toc164955401"/>
+      <w:bookmarkStart w:id="155" w:name="_Toc164957134"/>
       <w:r>
         <w:rPr>
           <w:rFonts w:cs="Times New Roman"/>
@@ -20106,10 +20968,10 @@
         </w:rPr>
         <w:t xml:space="preserve"> </w:t>
       </w:r>
-      <w:bookmarkStart w:id="146" w:name="_Toc164957355"/>
-      <w:bookmarkStart w:id="147" w:name="_Toc164957627"/>
-      <w:bookmarkStart w:id="148" w:name="_Toc164957276"/>
-      <w:bookmarkStart w:id="149" w:name="_Toc25398"/>
+      <w:bookmarkStart w:id="156" w:name="_Toc164957355"/>
+      <w:bookmarkStart w:id="157" w:name="_Toc164957627"/>
+      <w:bookmarkStart w:id="158" w:name="_Toc164957276"/>
+      <w:bookmarkStart w:id="159" w:name="_Toc4620"/>
       <w:r>
         <w:rPr>
           <w:rFonts w:cs="Times New Roman"/>
@@ -20117,13 +20979,13 @@
         </w:rPr>
         <w:t>KẾT LUẬN</w:t>
       </w:r>
-      <w:bookmarkEnd w:id="143"/>
-      <w:bookmarkEnd w:id="144"/>
-      <w:bookmarkEnd w:id="145"/>
-      <w:bookmarkEnd w:id="146"/>
-      <w:bookmarkEnd w:id="147"/>
-      <w:bookmarkEnd w:id="148"/>
-      <w:bookmarkEnd w:id="149"/>
+      <w:bookmarkEnd w:id="153"/>
+      <w:bookmarkEnd w:id="154"/>
+      <w:bookmarkEnd w:id="155"/>
+      <w:bookmarkEnd w:id="156"/>
+      <w:bookmarkEnd w:id="157"/>
+      <w:bookmarkEnd w:id="158"/>
+      <w:bookmarkEnd w:id="159"/>
     </w:p>
     <w:p>
       <w:pPr>
@@ -20243,9 +21105,9 @@
         </w:rPr>
         <w:t xml:space="preserve"> </w:t>
       </w:r>
-      <w:bookmarkStart w:id="150" w:name="_Toc164957356"/>
-      <w:bookmarkStart w:id="151" w:name="_Toc164957628"/>
-      <w:bookmarkStart w:id="152" w:name="_Toc23548"/>
+      <w:bookmarkStart w:id="160" w:name="_Toc164957356"/>
+      <w:bookmarkStart w:id="161" w:name="_Toc164957628"/>
+      <w:bookmarkStart w:id="162" w:name="_Toc29855"/>
       <w:r>
         <w:rPr>
           <w:rStyle w:val="38"/>
@@ -20253,9 +21115,9 @@
         </w:rPr>
         <w:t>KIẾN NGHỊ</w:t>
       </w:r>
-      <w:bookmarkEnd w:id="150"/>
-      <w:bookmarkEnd w:id="151"/>
-      <w:bookmarkEnd w:id="152"/>
+      <w:bookmarkEnd w:id="160"/>
+      <w:bookmarkEnd w:id="161"/>
+      <w:bookmarkEnd w:id="162"/>
     </w:p>
     <w:p>
       <w:pPr>
@@ -21314,19 +22176,19 @@
         </w:numPr>
         <w:jc w:val="both"/>
       </w:pPr>
-      <w:bookmarkStart w:id="153" w:name="_Toc164957629"/>
-      <w:bookmarkStart w:id="154" w:name="_Toc164955402"/>
-      <w:bookmarkStart w:id="155" w:name="_Toc164954916"/>
-      <w:bookmarkStart w:id="156" w:name="_Toc164957135"/>
-      <w:bookmarkStart w:id="157" w:name="_Toc2381"/>
+      <w:bookmarkStart w:id="163" w:name="_Toc164957629"/>
+      <w:bookmarkStart w:id="164" w:name="_Toc164955402"/>
+      <w:bookmarkStart w:id="165" w:name="_Toc164954916"/>
+      <w:bookmarkStart w:id="166" w:name="_Toc164957135"/>
+      <w:bookmarkStart w:id="167" w:name="_Toc12563"/>
       <w:r>
         <w:t>PHỤ LỤC (nếu có)</w:t>
       </w:r>
-      <w:bookmarkEnd w:id="153"/>
-      <w:bookmarkEnd w:id="154"/>
-      <w:bookmarkEnd w:id="155"/>
-      <w:bookmarkEnd w:id="156"/>
-      <w:bookmarkEnd w:id="157"/>
+      <w:bookmarkEnd w:id="163"/>
+      <w:bookmarkEnd w:id="164"/>
+      <w:bookmarkEnd w:id="165"/>
+      <w:bookmarkEnd w:id="166"/>
+      <w:bookmarkEnd w:id="167"/>
     </w:p>
     <w:p>
       <w:pPr>

</xml_diff>

<commit_message>
docs: add project summary markdown and update thesis document
</commit_message>
<xml_diff>
--- a/Document/22130016_TieuLuanTN_KCNTT_NLU.docx
+++ b/Document/22130016_TieuLuanTN_KCNTT_NLU.docx
@@ -11,10 +11,10 @@
           <w:rFonts w:cs="VNI-Times"/>
         </w:rPr>
       </w:pPr>
-      <w:bookmarkStart w:id="0" w:name="_Toc70412708"/>
-      <w:bookmarkStart w:id="1" w:name="_Toc70428308"/>
-      <w:bookmarkStart w:id="2" w:name="_Toc70428247"/>
-      <w:bookmarkStart w:id="3" w:name="_Toc70411976"/>
+      <w:bookmarkStart w:id="0" w:name="_Toc70428308"/>
+      <w:bookmarkStart w:id="1" w:name="_Toc70428247"/>
+      <w:bookmarkStart w:id="2" w:name="_Toc70411976"/>
+      <w:bookmarkStart w:id="3" w:name="_Toc70412708"/>
       <w:bookmarkStart w:id="4" w:name="_Toc7878438"/>
     </w:p>
     <w:p>
@@ -134,8 +134,8 @@
                                 <w:szCs w:val="44"/>
                               </w:rPr>
                             </w:pPr>
-                            <w:bookmarkStart w:id="157" w:name="_Toc164954896"/>
-                            <w:bookmarkStart w:id="158" w:name="_Toc164954529"/>
+                            <w:bookmarkStart w:id="157" w:name="_Toc164954529"/>
+                            <w:bookmarkStart w:id="158" w:name="_Toc164954896"/>
                             <w:r>
                               <w:rPr>
                                 <w:b/>
@@ -1230,8 +1230,8 @@
                           <w:szCs w:val="44"/>
                         </w:rPr>
                       </w:pPr>
-                      <w:bookmarkStart w:id="157" w:name="_Toc164954896"/>
-                      <w:bookmarkStart w:id="158" w:name="_Toc164954529"/>
+                      <w:bookmarkStart w:id="157" w:name="_Toc164954529"/>
+                      <w:bookmarkStart w:id="158" w:name="_Toc164954896"/>
                       <w:r>
                         <w:rPr>
                           <w:b/>
@@ -6708,11 +6708,11 @@
         <w:spacing w:line="360" w:lineRule="auto"/>
         <w:outlineLvl w:val="0"/>
       </w:pPr>
-      <w:bookmarkStart w:id="10" w:name="_Toc29811"/>
-      <w:bookmarkStart w:id="11" w:name="_Toc164957607"/>
-      <w:bookmarkStart w:id="12" w:name="_Toc164957335"/>
-      <w:bookmarkStart w:id="13" w:name="_Toc164957114"/>
-      <w:bookmarkStart w:id="14" w:name="_Toc164957256"/>
+      <w:bookmarkStart w:id="10" w:name="_Toc164957114"/>
+      <w:bookmarkStart w:id="11" w:name="_Toc29811"/>
+      <w:bookmarkStart w:id="12" w:name="_Toc164957256"/>
+      <w:bookmarkStart w:id="13" w:name="_Toc164957607"/>
+      <w:bookmarkStart w:id="14" w:name="_Toc164957335"/>
       <w:r>
         <w:t>DANH MỤC HÌNH ẢNH</w:t>
       </w:r>
@@ -6757,11 +6757,11 @@
         </w:rPr>
         <w:br w:type="page"/>
       </w:r>
-      <w:bookmarkStart w:id="15" w:name="_Toc164957115"/>
-      <w:bookmarkStart w:id="16" w:name="_Toc5553"/>
-      <w:bookmarkStart w:id="17" w:name="_Toc164957336"/>
-      <w:bookmarkStart w:id="18" w:name="_Toc164957257"/>
-      <w:bookmarkStart w:id="19" w:name="_Toc164957608"/>
+      <w:bookmarkStart w:id="15" w:name="_Toc164957336"/>
+      <w:bookmarkStart w:id="16" w:name="_Toc164957257"/>
+      <w:bookmarkStart w:id="17" w:name="_Toc164957608"/>
+      <w:bookmarkStart w:id="18" w:name="_Toc164957115"/>
+      <w:bookmarkStart w:id="19" w:name="_Toc5553"/>
       <w:r>
         <w:rPr>
           <w:bCs/>
@@ -6865,11 +6865,11 @@
           <w:bCs/>
         </w:rPr>
       </w:pPr>
-      <w:bookmarkStart w:id="20" w:name="_Toc164957116"/>
-      <w:bookmarkStart w:id="21" w:name="_Toc164957609"/>
-      <w:bookmarkStart w:id="22" w:name="_Toc164957258"/>
+      <w:bookmarkStart w:id="20" w:name="_Toc164957258"/>
+      <w:bookmarkStart w:id="21" w:name="_Toc20728"/>
+      <w:bookmarkStart w:id="22" w:name="_Toc164957609"/>
       <w:bookmarkStart w:id="23" w:name="_Toc164957337"/>
-      <w:bookmarkStart w:id="24" w:name="_Toc20728"/>
+      <w:bookmarkStart w:id="24" w:name="_Toc164957116"/>
       <w:r>
         <w:rPr>
           <w:iCs/>
@@ -6915,7 +6915,7 @@
           <w:sz w:val="26"/>
           <w:szCs w:val="26"/>
         </w:rPr>
-        <w:t>Vốn từ là nền tảng quan trọng trong quá trình học ngoại ngữ. Tuy nhiên, việc học từ mới thông qua danh sách hoặc nội dung tách rời khỏi bối cảnh thực tế có thể khiến người học gặp khó khăn khi cần nhận biết và sử dụng từ. Sự phát triển của thiết bị di động và công nghệ thị giác máy tính tạo điều kiện để người học tiếp cận từ vựng trực tiếp từ các vật thể xuất hiện trong môi trường sống.</w:t>
+        <w:t>Vốn từ vựng giữ vai trò nền tảng trong quá trình tiếp nhận và sử dụng ngoại ngữ. Mặc dù có nhiều ứng dụng hỗ trợ học từ vựng trên thiết bị di động, phần lớn nội dung vẫn được tổ chức theo danh sách hoặc bài học được xây dựng trước. Cách tiếp cận này chưa khai thác đầy đủ những vật thể xuất hiện trong môi trường sống làm nguồn cung cấp ngữ cảnh học tập cho người học.</w:t>
       </w:r>
     </w:p>
     <w:p>
@@ -6927,13 +6927,6 @@
           <w:szCs w:val="26"/>
         </w:rPr>
       </w:pPr>
-      <w:r>
-        <w:rPr>
-          <w:sz w:val="26"/>
-          <w:szCs w:val="26"/>
-        </w:rPr>
-        <w:t>Đề tài nghiên cứu và xây dựng ứng dụng Vocam nhằm hỗ trợ học từ vựng tiếng Anh thông qua nhận diện vật thể trên thiết bị di động. Ứng dụng cho phép người học sử dụng hình ảnh làm đầu vào, nhận kết quả phát hiện vật thể và xem các thông tin liên quan như từ tiếng Anh, phiên âm, từ loại, nghĩa tiếng Việt, định nghĩa và câu ví dụ. Từ vựng sau khi được xác nhận có thể được lưu thành thẻ ghi nhớ để tiếp tục học và ôn tập.</w:t>
-      </w:r>
     </w:p>
     <w:p>
       <w:pPr>
@@ -6949,7 +6942,7 @@
           <w:sz w:val="26"/>
           <w:szCs w:val="26"/>
         </w:rPr>
-        <w:t>Giải pháp sử dụng mô hình YOLO-World v2 kết hợp với danh sách 365 nhãn vật thể tiếng Anh được xây dựng dựa trên Objects365. Khả năng phát hiện vật thể theo tập từ vựng mở giúp hệ thống nhận diện nhiều nhóm vật thể xuất hiện trong đời sống. Kết quả nhận diện được liên kết với dữ liệu từ vựng để người học xem từ tiếng Anh, phiên âm, từ loại, nghĩa tiếng Việt, định nghĩa và câu ví dụ. Bên cạnh chức năng nhận diện, ứng dụng còn cung cấp bài học theo chủ đề, bài tập củng cố, phát âm từ vựng, tìm kiếm, theo dõi tiến độ và các cơ chế tạo động lực như điểm kinh nghiệm, cấp độ, chuỗi ngày học liên tục, huy hiệu và bảng xếp hạng.</w:t>
+        <w:t>Đề tài nghiên cứu và xây dựng ứng dụng Vocam nhằm hỗ trợ học từ vựng tiếng Anh thông qua nhận diện vật thể trên thiết bị di động. Người học sử dụng hình ảnh chứa vật thể làm đầu vào cho hệ thống. Dịch vụ trí tuệ nhân tạo thực hiện nhận diện và trả về các đối tượng được phát hiện cùng độ tin cậy và vị trí tương ứng. Kết quả nhận diện được liên kết với dữ liệu từ vựng gồm từ tiếng Anh, phiên âm, từ loại, nghĩa tiếng Việt, định nghĩa và câu ví dụ. Người học có thể lựa chọn kết quả phù hợp, lưu vào sổ từ và sử dụng trong các phiên ôn tập sau đó.</w:t>
       </w:r>
     </w:p>
     <w:p>
@@ -6961,13 +6954,87 @@
           <w:szCs w:val="26"/>
         </w:rPr>
       </w:pPr>
-      <w:r>
-        <w:rPr>
-          <w:sz w:val="26"/>
-          <w:szCs w:val="26"/>
-        </w:rPr>
-        <w:t>Hoạt động ôn tập được tổ chức bằng thuật toán ôn tập ngắt quãng SuperMemo 2 (SM-2). Lịch ôn của từng thẻ ghi nhớ được điều chỉnh dựa trên mức độ ghi nhớ do người học tự đánh giá. Các từ chưa nhớ được đưa trở lại sớm hơn, trong khi những từ đã được ghi nhớ tốt có khoảng thời gian ôn tiếp theo dài hơn.</w:t>
-      </w:r>
+    </w:p>
+    <w:p>
+      <w:pPr>
+        <w:spacing w:line="360" w:lineRule="auto"/>
+        <w:jc w:val="both"/>
+        <w:rPr>
+          <w:sz w:val="26"/>
+          <w:szCs w:val="26"/>
+        </w:rPr>
+      </w:pPr>
+      <w:r>
+        <w:rPr>
+          <w:sz w:val="26"/>
+          <w:szCs w:val="26"/>
+        </w:rPr>
+        <w:t>Phạm vi nhận diện của hệ thống gồm 365 nhóm vật thể tham chiếu Objects365. Mô hình YOLO-World v2 được sử dụng để hỗ trợ phát hiện vật thể theo tập từ vựng mở, qua đó mở rộng khả năng nhận diện các đối tượng thường gặp trong đời sống. Dịch vụ nhận diện được xây dựng bằng FastAPI, máy chủ nghiệp vụ sử dụng Spring Boot để cung cấp dữ liệu từ vựng, tiếp nhận tiến độ học tập và tạo bảng xếp hạng. Dữ liệu tập trung được quản lý bằng PostgreSQL triển khai trên nền tảng Neon.</w:t>
+      </w:r>
+    </w:p>
+    <w:p>
+      <w:pPr>
+        <w:spacing w:line="360" w:lineRule="auto"/>
+        <w:jc w:val="both"/>
+        <w:rPr>
+          <w:sz w:val="26"/>
+          <w:szCs w:val="26"/>
+        </w:rPr>
+      </w:pPr>
+    </w:p>
+    <w:p>
+      <w:pPr>
+        <w:spacing w:line="360" w:lineRule="auto"/>
+        <w:jc w:val="both"/>
+        <w:rPr>
+          <w:sz w:val="26"/>
+          <w:szCs w:val="26"/>
+        </w:rPr>
+      </w:pPr>
+      <w:r>
+        <w:rPr>
+          <w:sz w:val="26"/>
+          <w:szCs w:val="26"/>
+        </w:rPr>
+        <w:t>Hoạt động ôn tập được tổ chức dựa trên thuật toán SuperMemo 2, được điều chỉnh thành ba mức phản hồi gồm Chưa thuộc, Tạm nhớ và Rất thuộc. Trạng thái của từng thẻ ghi nhớ được cập nhật dựa trên phản hồi của người học nhằm xác định khoảng thời gian trước lần ôn tiếp theo. Ứng dụng còn cung cấp bài học theo chủ đề, bài tập trắc nghiệm và điền từ, phát âm từ vựng, tìm kiếm nội dung, điểm kinh nghiệm, cấp độ, chuỗi ngày học liên tục, huy hiệu và bảng xếp hạng.</w:t>
+      </w:r>
+    </w:p>
+    <w:p>
+      <w:pPr>
+        <w:spacing w:line="360" w:lineRule="auto"/>
+        <w:jc w:val="both"/>
+        <w:rPr>
+          <w:sz w:val="26"/>
+          <w:szCs w:val="26"/>
+        </w:rPr>
+      </w:pPr>
+    </w:p>
+    <w:p>
+      <w:pPr>
+        <w:spacing w:line="360" w:lineRule="auto"/>
+        <w:jc w:val="both"/>
+        <w:rPr>
+          <w:sz w:val="26"/>
+          <w:szCs w:val="26"/>
+        </w:rPr>
+      </w:pPr>
+      <w:r>
+        <w:rPr>
+          <w:sz w:val="26"/>
+          <w:szCs w:val="26"/>
+        </w:rPr>
+        <w:t>Kết quả của đề tài gồm ứng dụng di động được phát triển bằng React Native và Expo, dịch vụ nhận diện vật thể, máy chủ nghiệp vụ và cơ sở dữ liệu tập trung. Sản phẩm đã hiện thực các thành phần cốt lõi của chu trình học gồm khám phá từ qua hình ảnh, xem thông tin từ vựng, tạo thẻ ghi nhớ, ôn tập, làm bài tập và theo dõi tiến độ. Kết quả cho thấy khả năng kết hợp thị giác máy tính, dữ liệu ngôn ngữ và ôn tập ngắt quãng trong một ứng dụng học từ vựng trên thiết bị di động.</w:t>
+      </w:r>
+    </w:p>
+    <w:p>
+      <w:pPr>
+        <w:spacing w:line="360" w:lineRule="auto"/>
+        <w:jc w:val="both"/>
+        <w:rPr>
+          <w:sz w:val="26"/>
+          <w:szCs w:val="26"/>
+        </w:rPr>
+      </w:pPr>
     </w:p>
     <w:p>
       <w:pPr>
@@ -6987,27 +7054,6 @@
           </w14:textFill>
         </w:rPr>
       </w:pPr>
-      <w:r>
-        <w:rPr>
-          <w:sz w:val="26"/>
-          <w:szCs w:val="26"/>
-        </w:rPr>
-        <w:t>Đề tài đồng thời đề xuất Chu trình ghi nhớ bằng hình ảnh để mô tả quá trình từ khi người học quan sát vật thể, nhận kết quả phát hiện, liên kết với nội dung từ vựng, tạo thẻ ghi nhớ, thực hiện ôn tập đến khi trạng thái ghi nhớ được cập nhật. Sản phẩm đã hiện thực các thành phần gồm ứng dụng di động, dịch vụ nhận diện vật thể, máy chủ cung cấp dữ liệu và cơ sở dữ liệu tập trung. Phiên bản hiện tại đã xây dựng được giao diện học tập, thẻ ghi nhớ, bài tập, cơ chế tính điểm và bảng xếp hạng; tuy nhiên, dữ liệu thẻ ghi nhớ mới được lưu trong bộ nhớ của phiên làm việc và luồng gửi ảnh trực tiếp từ màn hình quét đến dịch vụ nhận diện vẫn cần tiếp tục hoàn thiện.</w:t>
-      </w:r>
-      <w:r>
-        <w:rPr>
-          <w:b/>
-          <w:color w:val="000000" w:themeColor="text1"/>
-          <w:sz w:val="26"/>
-          <w:szCs w:val="26"/>
-          <w14:textFill>
-            <w14:solidFill>
-              <w14:schemeClr w14:val="tx1"/>
-            </w14:solidFill>
-          </w14:textFill>
-        </w:rPr>
-        <w:br w:type="textWrapping"/>
-      </w:r>
       <w:r>
         <w:rPr>
           <w:color w:val="000000" w:themeColor="text1"/>
@@ -9456,16 +9502,16 @@
         <w:jc w:val="center"/>
         <w:outlineLvl w:val="0"/>
       </w:pPr>
-      <w:bookmarkStart w:id="26" w:name="_Toc164957338"/>
+      <w:bookmarkStart w:id="26" w:name="_Toc164957610"/>
       <w:bookmarkStart w:id="27" w:name="_Toc31692"/>
-      <w:bookmarkStart w:id="28" w:name="_Toc164957610"/>
+      <w:bookmarkStart w:id="28" w:name="_Toc164957338"/>
       <w:bookmarkStart w:id="29" w:name="_Toc164957259"/>
-      <w:bookmarkStart w:id="30" w:name="_Toc164957614"/>
-      <w:bookmarkStart w:id="31" w:name="_Toc164957121"/>
-      <w:bookmarkStart w:id="32" w:name="_Toc164955388"/>
-      <w:bookmarkStart w:id="33" w:name="_Toc164957263"/>
+      <w:bookmarkStart w:id="30" w:name="_Toc164957263"/>
+      <w:bookmarkStart w:id="31" w:name="_Toc164957342"/>
+      <w:bookmarkStart w:id="32" w:name="_Toc164957121"/>
+      <w:bookmarkStart w:id="33" w:name="_Toc164957614"/>
       <w:bookmarkStart w:id="34" w:name="_Toc164954905"/>
-      <w:bookmarkStart w:id="35" w:name="_Toc164957342"/>
+      <w:bookmarkStart w:id="35" w:name="_Toc164955388"/>
       <w:r>
         <w:t>MỞ ĐẦU</w:t>
       </w:r>
@@ -9491,12 +9537,12 @@
         </w:rPr>
         <w:t xml:space="preserve"> </w:t>
       </w:r>
-      <w:bookmarkStart w:id="37" w:name="_Toc164957611"/>
-      <w:bookmarkStart w:id="38" w:name="_Toc164957339"/>
-      <w:bookmarkStart w:id="39" w:name="_Toc30792"/>
-      <w:bookmarkStart w:id="40" w:name="_Toc164957118"/>
-      <w:bookmarkStart w:id="41" w:name="_Toc164955385"/>
-      <w:bookmarkStart w:id="42" w:name="_Toc164957260"/>
+      <w:bookmarkStart w:id="37" w:name="_Toc164955385"/>
+      <w:bookmarkStart w:id="38" w:name="_Toc164957118"/>
+      <w:bookmarkStart w:id="39" w:name="_Toc164957260"/>
+      <w:bookmarkStart w:id="40" w:name="_Toc30792"/>
+      <w:bookmarkStart w:id="41" w:name="_Toc164957339"/>
+      <w:bookmarkStart w:id="42" w:name="_Toc164957611"/>
       <w:r>
         <w:t>LÝ DO CHỌN ĐỀ TÀI</w:t>
       </w:r>
@@ -9510,68 +9556,53 @@
     </w:p>
     <w:p>
       <w:pPr>
-        <w:bidi w:val="0"/>
         <w:spacing w:line="360" w:lineRule="auto"/>
         <w:jc w:val="both"/>
         <w:rPr>
-          <w:rFonts w:hint="default"/>
-          <w:sz w:val="26"/>
-          <w:szCs w:val="26"/>
-        </w:rPr>
-      </w:pPr>
-      <w:bookmarkStart w:id="43" w:name="_Toc164957612"/>
-      <w:bookmarkStart w:id="44" w:name="_Toc164957119"/>
-      <w:bookmarkStart w:id="45" w:name="_Toc164954903"/>
-      <w:bookmarkStart w:id="46" w:name="_Toc164957261"/>
-      <w:bookmarkStart w:id="47" w:name="_Toc164955386"/>
+          <w:sz w:val="26"/>
+          <w:szCs w:val="26"/>
+        </w:rPr>
+      </w:pPr>
+      <w:bookmarkStart w:id="43" w:name="_Toc164954903"/>
+      <w:bookmarkStart w:id="44" w:name="_Toc164957612"/>
+      <w:bookmarkStart w:id="45" w:name="_Toc164957261"/>
+      <w:bookmarkStart w:id="46" w:name="_Toc164955386"/>
+      <w:bookmarkStart w:id="47" w:name="_Toc164957119"/>
       <w:bookmarkStart w:id="48" w:name="_Toc164957340"/>
-      <w:r>
-        <w:rPr>
-          <w:rFonts w:hint="default"/>
-          <w:sz w:val="26"/>
-          <w:szCs w:val="26"/>
-        </w:rPr>
-        <w:t>Tiếng Anh giữ vai trò quan trọng trong học tập, tiếp cận tri thức và tham gia thị trường lao động. Theo EF English Proficiency Index 2025, Việt Nam đạt 500 điểm và đứng thứ 64 trong số 123 quốc gia và vùng lãnh thổ được xếp hạng [1]. Chỉ số này phản ánh năng lực tiếng Anh của người trưởng thành ở cấp độ quốc gia, không trực tiếp đo vốn từ vựng, nhưng cho thấy nhu cầu duy trì những giải pháp học tập linh hoạt và phù hợp với điều kiện sử dụng thực tế.</w:t>
-      </w:r>
-    </w:p>
-    <w:p>
-      <w:pPr>
-        <w:bidi w:val="0"/>
+      <w:bookmarkStart w:id="49" w:name="_Toc4891"/>
+      <w:r>
+        <w:rPr>
+          <w:sz w:val="26"/>
+          <w:szCs w:val="26"/>
+        </w:rPr>
+        <w:t>Tiếng Anh giữ vai trò quan trọng trong học tập, tiếp cận tri thức, giao tiếp quốc tế và tham gia thị trường lao động. Theo EF English Proficiency Index năm 2025, Việt Nam đạt 500 điểm và đứng thứ 64 trong số 123 quốc gia và vùng lãnh thổ được khảo sát [1]. Chỉ số này không trực tiếp phản ánh quy mô vốn từ của từng cá nhân, nhưng cho thấy nhu cầu tiếp tục xây dựng những phương pháp học tiếng Anh linh hoạt, dễ tiếp cận và phù hợp với điều kiện sử dụng thực tế.</w:t>
+      </w:r>
+    </w:p>
+    <w:p>
+      <w:pPr>
         <w:spacing w:line="360" w:lineRule="auto"/>
         <w:jc w:val="both"/>
         <w:rPr>
-          <w:rFonts w:hint="default"/>
-          <w:sz w:val="26"/>
-          <w:szCs w:val="26"/>
-        </w:rPr>
-      </w:pPr>
-      <w:r>
-        <w:rPr>
-          <w:rFonts w:hint="default"/>
-          <w:sz w:val="26"/>
-          <w:szCs w:val="26"/>
-        </w:rPr>
-        <w:t>Vốn từ tạo nền tảng cho quá trình tiếp nhận và sản sinh ngôn ngữ. Khi từ mới chỉ xuất hiện trong danh sách tách rời khỏi tình huống sử dụng, người học có thể nhận biết từ ở thời điểm học nhưng gặp khó khăn khi cần truy hồi trong giao tiếp. Nghiên cứu về trí nhớ của Ebbinghaus cho thấy mức lưu giữ thay đổi theo thời gian và chịu ảnh hưởng của việc học lại, song các tỷ lệ phổ biến như quên 58 phần trăm sau 20 phút hoặc 70 phần trăm sau một ngày không nên được xem là quy luật cố định cho mọi người học và mọi loại tài liệu [4]. Cách diễn giải phù hợp hơn là kiến thức cần được củng cố bằng những lần truy hồi được phân bố theo thời gian.</w:t>
-      </w:r>
-    </w:p>
-    <w:p>
-      <w:pPr>
-        <w:bidi w:val="0"/>
+          <w:sz w:val="26"/>
+          <w:szCs w:val="26"/>
+        </w:rPr>
+      </w:pPr>
+    </w:p>
+    <w:p>
+      <w:pPr>
         <w:spacing w:line="360" w:lineRule="auto"/>
         <w:jc w:val="both"/>
         <w:rPr>
-          <w:rFonts w:hint="default"/>
-          <w:sz w:val="26"/>
-          <w:szCs w:val="26"/>
-        </w:rPr>
-      </w:pPr>
-      <w:r>
-        <w:rPr>
-          <w:rFonts w:hint="default"/>
-          <w:sz w:val="26"/>
-          <w:szCs w:val="26"/>
-        </w:rPr>
-        <w:t>Thiết bị di động tạo điều kiện để hoạt động học diễn ra gần với bối cảnh sử dụng. Tổng quan 36 nghiên cứu công bố trong giai đoạn 2019 đến 2025 ghi nhận các ứng dụng học từ vựng trên thiết bị di động thường khai thác đầu vào đa phương thức, trò chơi hóa và ôn tập ngắt quãng, đồng thời chỉ ra rằng kiến thức về kết hợp từ và cách dùng từ theo ngữ cảnh vẫn chưa được nghiên cứu đầy đủ [2]. Một nghiên cứu thực nghiệm với 70 sinh viên cũng cho thấy nhóm sử dụng ứng dụng di động đạt kết quả cao hơn nhóm học bằng danh sách từ, dù khác biệt chưa đạt ý nghĩa thống kê; trải nghiệm học còn phụ thuộc vào mức độ cá nhân hóa, chất lượng nội dung và sự hợp tác giữa người học [3]. Những kết quả này cho thấy công nghệ di động có tiềm năng hỗ trợ việc học, nhưng không tự động bảo đảm hiệu quả nếu thiếu thiết kế sư phạm và quy trình đánh giá phù hợp.</w:t>
+          <w:sz w:val="26"/>
+          <w:szCs w:val="26"/>
+        </w:rPr>
+      </w:pPr>
+      <w:r>
+        <w:rPr>
+          <w:sz w:val="26"/>
+          <w:szCs w:val="26"/>
+        </w:rPr>
+        <w:t>Vốn từ là thành phần nền tảng của năng lực ngôn ngữ. Khi không có đủ vốn từ, người học gặp khó khăn trong việc hiểu nội dung nghe, đọc, diễn đạt ý tưởng và tham gia giao tiếp. Việc học từ mới bằng danh sách tách rời khỏi bối cảnh có thể giúp ghi nhớ trong thời gian ngắn nhưng gây khó khăn khi người học cần nhận biết hoặc sử dụng từ trong tình huống thực tế. Nghiên cứu của Ebbinghaus về trí nhớ cho thấy lượng thông tin được lưu giữ thay đổi theo thời gian và chịu ảnh hưởng của hoạt động học lại [2]. Điều này cho thấy từ vựng cần được gắn với những dấu hiệu dễ truy hồi và được ôn lại theo khoảng thời gian phù hợp.</w:t>
       </w:r>
     </w:p>
     <w:p>
@@ -9583,13 +9614,6 @@
           <w:szCs w:val="26"/>
         </w:rPr>
       </w:pPr>
-      <w:r>
-        <w:rPr>
-          <w:sz w:val="26"/>
-          <w:szCs w:val="26"/>
-        </w:rPr>
-        <w:t>Khả năng nhận diện hình ảnh mở ra một hướng tiếp cận khác đối với hoạt động học từ vựng. Google Lens cho phép người dùng sử dụng camera hoặc ảnh có sẵn để tìm kiếm thông tin về vật thể và nội dung trong ảnh [5]. Trong khi đó, các nền tảng học ngôn ngữ như Duolingo và Memrise tập trung vào bài học, luyện tập và theo dõi tiến độ [6], [7]. Mỗi nhóm sản phẩm giải quyết một phần của nhu cầu, nhưng việc kết nối vật thể trong đời sống với dữ liệu từ vựng, thẻ ghi nhớ và lịch ôn vẫn cần được tổ chức thành một quy trình thống nhất.</w:t>
-      </w:r>
     </w:p>
     <w:p>
       <w:pPr>
@@ -9605,7 +9629,78 @@
           <w:sz w:val="26"/>
           <w:szCs w:val="26"/>
         </w:rPr>
-        <w:t>YOLO là nhóm mô hình phát hiện vật thể một giai đoạn, có khả năng dự đoán đồng thời vị trí và lớp của nhiều vật thể trong ảnh [13]. YOLO-World mở rộng cách tiếp cận này bằng việc kết hợp đặc trưng hình ảnh với đặc trưng ngôn ngữ, qua đó hỗ trợ phát hiện vật thể theo tập từ vựng mở [14]. Trong đề tài, danh sách nhận diện được xây dựng dựa trên 365 nhóm vật thể của Objects365, một bộ dữ liệu phát hiện vật thể quy mô lớn với nhiều nhóm đối tượng xuất hiện trong đời sống [22]. Từ những cơ sở trên, đề tài xây dựng Vocam nhằm kết nối nhận diện vật thể với dữ liệu từ vựng, thẻ ghi nhớ, hoạt động ôn tập và theo dõi tiến độ trên thiết bị di động.</w:t>
+        <w:t>Sự phổ biến của thiết bị di động tạo điều kiện để hoạt động học tập diễn ra tại nhiều thời điểm và địa điểm khác nhau. Tổng quan các nghiên cứu về học từ vựng có hỗ trợ thiết bị di động cho thấy các ứng dụng thường khai thác nội dung đa phương thức, trò chơi hóa, cá nhân hóa và ôn tập ngắt quãng [3]. Nghiên cứu của Xu và cộng sự cũng cho thấy ứng dụng từ vựng trên thiết bị di động có tiềm năng hỗ trợ quá trình tiếp thu từ, dù kết quả còn phụ thuộc vào nội dung, thiết kế hoạt động và cách sử dụng của người học [4].</w:t>
+      </w:r>
+    </w:p>
+    <w:p>
+      <w:pPr>
+        <w:spacing w:line="360" w:lineRule="auto"/>
+        <w:jc w:val="both"/>
+        <w:rPr>
+          <w:sz w:val="26"/>
+          <w:szCs w:val="26"/>
+        </w:rPr>
+      </w:pPr>
+    </w:p>
+    <w:p>
+      <w:pPr>
+        <w:spacing w:line="360" w:lineRule="auto"/>
+        <w:jc w:val="both"/>
+        <w:rPr>
+          <w:sz w:val="26"/>
+          <w:szCs w:val="26"/>
+        </w:rPr>
+      </w:pPr>
+      <w:r>
+        <w:rPr>
+          <w:sz w:val="26"/>
+          <w:szCs w:val="26"/>
+        </w:rPr>
+        <w:t>Các công cụ nhận diện hình ảnh như Google Lens cho phép người dùng tìm kiếm thông tin từ ảnh hoặc camera [5]. Trong khi đó, những nền tảng học ngôn ngữ như Duolingo và Memrise tập trung vào bài học, hoạt động luyện tập và theo dõi tiến độ [6], [7]. Mỗi nhóm sản phẩm giải quyết một nhu cầu khác nhau, nhưng việc kết nối vật thể trong đời sống với nội dung từ vựng, thẻ ghi nhớ và lịch ôn tập vẫn cần được tổ chức thành một quy trình thống nhất.</w:t>
+      </w:r>
+    </w:p>
+    <w:p>
+      <w:pPr>
+        <w:spacing w:line="360" w:lineRule="auto"/>
+        <w:jc w:val="both"/>
+        <w:rPr>
+          <w:sz w:val="26"/>
+          <w:szCs w:val="26"/>
+        </w:rPr>
+      </w:pPr>
+      <w:r>
+        <w:rPr>
+          <w:sz w:val="26"/>
+          <w:szCs w:val="26"/>
+        </w:rPr>
+        <w:t>YOLO-World hỗ trợ phát hiện vật thể theo tập từ vựng mở bằng cách kết hợp đặc trưng thị giác với đặc trưng ngôn ngữ [13]. Khả năng này phù hợp với ứng dụng học từ vựng vì phạm vi đối tượng có thể được xác định bằng danh sách nhãn ngôn ngữ. Objects365 cung cấp 365 nhóm vật thể thuộc nhiều bối cảnh trong đời sống [14]. Việc kết hợp YOLO-World v2 với phạm vi nhãn tham chiếu Objects365 tạo điều kiện để ứng dụng nhận diện nhiều loại vật thể và chuyển kết quả thành nội dung học tiếng Anh.</w:t>
+      </w:r>
+    </w:p>
+    <w:p>
+      <w:pPr>
+        <w:spacing w:line="360" w:lineRule="auto"/>
+        <w:jc w:val="both"/>
+        <w:rPr>
+          <w:sz w:val="26"/>
+          <w:szCs w:val="26"/>
+        </w:rPr>
+      </w:pPr>
+    </w:p>
+    <w:p>
+      <w:pPr>
+        <w:spacing w:line="360" w:lineRule="auto"/>
+        <w:jc w:val="both"/>
+        <w:rPr>
+          <w:sz w:val="26"/>
+          <w:szCs w:val="26"/>
+        </w:rPr>
+      </w:pPr>
+      <w:r>
+        <w:rPr>
+          <w:sz w:val="26"/>
+          <w:szCs w:val="26"/>
+        </w:rPr>
+        <w:t>Từ những cơ sở trên, đề tài “Nghiên cứu và xây dựng ứng dụng hỗ trợ học từ vựng tiếng Anh qua nhận diện vật thể trên thiết bị di động” được thực hiện. Sản phẩm được đặt tên là Vocam, thể hiện sự kết hợp giữa từ vựng và camera. Ứng dụng hướng đến việc rút ngắn khoảng cách giữa thời điểm người học quan sát một vật thể và thời điểm tiếp cận, lưu trữ, luyện tập từ tiếng Anh tương ứng.</w:t>
       </w:r>
     </w:p>
     <w:p>
@@ -9622,7 +9717,6 @@
           <w:lang w:val="vi-VN"/>
         </w:rPr>
       </w:pPr>
-      <w:bookmarkStart w:id="49" w:name="_Toc4891"/>
       <w:r>
         <w:rPr>
           <w:sz w:val="26"/>
@@ -9654,6 +9748,8 @@
         </w:numPr>
         <w:spacing w:line="360" w:lineRule="auto"/>
         <w:jc w:val="both"/>
+      </w:pPr>
+      <w:r>
         <w:rPr>
           <w:b/>
           <w:bCs/>
@@ -9661,15 +9757,6 @@
           <w:szCs w:val="26"/>
           <w:lang w:val="vi-VN"/>
         </w:rPr>
-      </w:pPr>
-      <w:r>
-        <w:rPr>
-          <w:b/>
-          <w:bCs/>
-          <w:sz w:val="26"/>
-          <w:szCs w:val="26"/>
-          <w:lang w:val="vi-VN"/>
-        </w:rPr>
         <w:t xml:space="preserve"> Mục tiêu của đề tài:</w:t>
       </w:r>
     </w:p>
@@ -9687,7 +9774,7 @@
           <w:sz w:val="26"/>
           <w:szCs w:val="26"/>
         </w:rPr>
-        <w:t>Mục tiêu tổng quát của đề tài là nghiên cứu và xây dựng ứng dụng di động hỗ trợ người học tiếp cận từ vựng tiếng Anh từ các vật thể trong môi trường sống. Hình ảnh được sử dụng làm đầu vào cho quá trình nhận diện; kết quả phát hiện được liên kết với từ tiếng Anh, phiên âm, từ loại, định nghĩa, nghĩa tiếng Việt và câu ví dụ.</w:t>
+        <w:t>Mục tiêu tổng quát của đề tài là nghiên cứu và xây dựng ứng dụng di động hỗ trợ học từ vựng tiếng Anh thông qua nhận diện vật thể trong hình ảnh. Hệ thống tiếp nhận hình ảnh, phát hiện các đối tượng xuất hiện, liên kết nhãn nhận diện với dữ liệu ngôn ngữ và cung cấp nội dung học tập phù hợp.</w:t>
       </w:r>
     </w:p>
     <w:p>
@@ -9699,13 +9786,6 @@
           <w:szCs w:val="26"/>
         </w:rPr>
       </w:pPr>
-      <w:r>
-        <w:rPr>
-          <w:sz w:val="26"/>
-          <w:szCs w:val="26"/>
-        </w:rPr>
-        <w:t>Đề tài hướng đến xây dựng quy trình học tập gồm thu nhận hình ảnh, phát hiện vật thể, tra cứu thông tin từ vựng, xác nhận kết quả, tạo thẻ ghi nhớ và tổ chức ôn tập. Người học có thể xem chi tiết từ, nghe phát âm, tìm kiếm, học theo chủ đề và thực hiện bài tập củng cố.</w:t>
-      </w:r>
     </w:p>
     <w:p>
       <w:pPr>
@@ -9721,7 +9801,7 @@
           <w:sz w:val="26"/>
           <w:szCs w:val="26"/>
         </w:rPr>
-        <w:t>Thành phần nhận diện sử dụng YOLO-World v2, một mô hình hỗ trợ phát hiện vật thể theo tập từ vựng mở [14]. Phạm vi nhận diện của hệ thống được thiết lập bằng danh sách 365 nhãn tiếng Anh tham chiếu Objects365 [22]. Mỗi nhãn nhận diện được đối chiếu với dữ liệu từ vựng trong hệ thống trước khi kết quả được hiển thị hoặc lưu thành thẻ ghi nhớ.</w:t>
+        <w:t>Ứng dụng cần hỗ trợ người học xem từ tiếng Anh, phiên âm, từ loại, định nghĩa, nghĩa tiếng Việt và câu ví dụ của vật thể được nhận diện. Người học có thể lựa chọn kết quả phù hợp và lưu thành thẻ ghi nhớ. Các thẻ được tổ chức thành sổ từ cá nhân để phục vụ hoạt động xem lại và ôn tập.</w:t>
       </w:r>
     </w:p>
     <w:p>
@@ -9733,25 +9813,22 @@
           <w:szCs w:val="26"/>
         </w:rPr>
       </w:pPr>
-      <w:r>
-        <w:rPr>
-          <w:sz w:val="26"/>
-          <w:szCs w:val="26"/>
-        </w:rPr>
-        <w:t>Hoạt động ôn tập sử dụng thuật toán ôn tập ngắt quãng SM-2. Mỗi thẻ ghi nhớ có trạng thái riêng và được điều chỉnh lịch ôn dựa trên mức độ ghi nhớ do người học đánh giá. Ứng dụng còn tích hợp điểm kinh nghiệm, cấp độ, chuỗi ngày học liên tục, huy hiệu và bảng xếp hạng nhằm hỗ trợ theo dõi tiến độ.</w:t>
-      </w:r>
     </w:p>
     <w:p>
       <w:pPr>
         <w:spacing w:line="360" w:lineRule="auto"/>
         <w:jc w:val="both"/>
-      </w:pPr>
-      <w:r>
-        <w:rPr>
-          <w:sz w:val="26"/>
-          <w:szCs w:val="26"/>
-        </w:rPr>
-        <w:t>Mức độ hoàn thành của sản phẩm được đánh giá thông qua kiểm thử chức năng, khả năng trao đổi dữ liệu giữa các thành phần, kết quả nhận diện trên tập ảnh thử nghiệm và thời gian phản hồi. Mọi số liệu về độ chính xác, độ trễ và mức sử dụng tài nguyên chỉ được báo cáo sau khi thực hiện đo trên môi trường được mô tả cụ thể.</w:t>
+        <w:rPr>
+          <w:sz w:val="26"/>
+          <w:szCs w:val="26"/>
+        </w:rPr>
+      </w:pPr>
+      <w:r>
+        <w:rPr>
+          <w:sz w:val="26"/>
+          <w:szCs w:val="26"/>
+        </w:rPr>
+        <w:t>Hoạt động ôn tập được xây dựng dựa trên thuật toán SM-2 điều chỉnh. Người học phản hồi mức độ ghi nhớ theo ba mức, từ đó hệ thống cập nhật trạng thái và thời điểm ôn tiếp theo của từng thẻ. Ứng dụng còn cung cấp bài học theo chủ đề, bài tập củng cố, phát âm từ vựng, tìm kiếm và các yếu tố tạo động lực gồm điểm kinh nghiệm, cấp độ, chuỗi ngày học, huy hiệu và bảng xếp hạng.</w:t>
       </w:r>
     </w:p>
     <w:p>
@@ -9799,12 +9876,19 @@
           <w:szCs w:val="26"/>
         </w:rPr>
       </w:pPr>
-      <w:r>
-        <w:rPr>
-          <w:sz w:val="26"/>
-          <w:szCs w:val="26"/>
-        </w:rPr>
-        <w:t>Đề tài tập trung vào ứng dụng học từ vựng trên thiết bị di động, dịch vụ nhận diện vật thể và máy chủ cung cấp dữ liệu từ vựng, tiến độ học tập cùng bảng xếp hạng. Đối tượng sử dụng trực tiếp là người học tiếng Anh.</w:t>
+      <w:bookmarkStart w:id="50" w:name="_Toc164957341"/>
+      <w:bookmarkStart w:id="51" w:name="_Toc15419"/>
+      <w:bookmarkStart w:id="52" w:name="_Toc164957262"/>
+      <w:bookmarkStart w:id="53" w:name="_Toc164957613"/>
+      <w:bookmarkStart w:id="54" w:name="_Toc164955387"/>
+      <w:bookmarkStart w:id="55" w:name="_Toc164957120"/>
+      <w:bookmarkStart w:id="56" w:name="_Toc164954904"/>
+      <w:r>
+        <w:rPr>
+          <w:sz w:val="26"/>
+          <w:szCs w:val="26"/>
+        </w:rPr>
+        <w:t>Về phạm vi nhận diện, hệ thống sử dụng 365 nhóm vật thể tham chiếu Objects365. Con số 365 thể hiện phạm vi nhãn được cung cấp cho mô hình nhận diện. Một kết quả chỉ trở thành nội dung học hoàn chỉnh khi nhãn tương ứng có dữ liệu từ vựng phù hợp trong hệ thống. Đề tài không khẳng định chất lượng nhận diện giống nhau đối với tất cả nhóm vật thể.</w:t>
       </w:r>
     </w:p>
     <w:p>
@@ -9816,13 +9900,6 @@
           <w:szCs w:val="26"/>
         </w:rPr>
       </w:pPr>
-      <w:r>
-        <w:rPr>
-          <w:sz w:val="26"/>
-          <w:szCs w:val="26"/>
-        </w:rPr>
-        <w:t>Phạm vi nhận diện gồm danh sách 365 nhãn tiếng Anh tham chiếu Objects365. Con số 365 thể hiện phạm vi nhãn được cung cấp cho mô hình, không mặc nhiên đồng nghĩa toàn bộ nhãn đã có dữ liệu từ vựng đầy đủ hoặc đạt chất lượng nhận diện giống nhau. Một nhãn chỉ tạo thành nội dung học hoàn chỉnh khi có bản ghi từ vựng tương ứng trong cơ sở dữ liệu.</w:t>
-      </w:r>
     </w:p>
     <w:p>
       <w:pPr>
@@ -9838,7 +9915,34 @@
           <w:sz w:val="26"/>
           <w:szCs w:val="26"/>
         </w:rPr>
-        <w:t>Đề tài không mở rộng sang nhận dạng giọng nói, chấm điểm phát âm hoặc đánh giá kỹ năng hội thoại. Mức cải thiện khả năng ghi nhớ dài hạn không được kết luận nếu chưa có nghiên cứu người dùng với phương pháp và dữ liệu phù hợp.</w:t>
+        <w:t>Về phạm vi phần mềm, đề tài gồm ứng dụng di động, dịch vụ nhận diện vật thể, máy chủ nghiệp vụ và cơ sở dữ liệu. Ứng dụng được phát triển cho thiết bị Android và iOS. Dịch vụ nhận diện được xây dựng bằng Python và FastAPI. Máy chủ nghiệp vụ sử dụng Spring Boot, còn dữ liệu tập trung được quản lý bằng PostgreSQL trên Neon.</w:t>
+      </w:r>
+    </w:p>
+    <w:p>
+      <w:pPr>
+        <w:spacing w:line="360" w:lineRule="auto"/>
+        <w:jc w:val="both"/>
+        <w:rPr>
+          <w:sz w:val="26"/>
+          <w:szCs w:val="26"/>
+        </w:rPr>
+      </w:pPr>
+    </w:p>
+    <w:p>
+      <w:pPr>
+        <w:spacing w:line="360" w:lineRule="auto"/>
+        <w:jc w:val="both"/>
+        <w:rPr>
+          <w:sz w:val="26"/>
+          <w:szCs w:val="26"/>
+        </w:rPr>
+      </w:pPr>
+      <w:r>
+        <w:rPr>
+          <w:sz w:val="26"/>
+          <w:szCs w:val="26"/>
+        </w:rPr>
+        <w:t>Đề tài tập trung vào hoạt động học từ vựng, không mở rộng sang nhận dạng giọng nói, chấm điểm phát âm, phân tích hội thoại hoặc đánh giá đầy đủ bốn kỹ năng nghe, nói, đọc và viết. Hiệu quả ghi nhớ dài hạn chưa được kết luận nếu chưa có thực nghiệm giáo dục trên nhóm người học với phép đo trước và sau quá trình sử dụng.</w:t>
       </w:r>
     </w:p>
     <w:p>
@@ -9854,13 +9958,6 @@
           <w:sz w:val="26"/>
         </w:rPr>
       </w:pPr>
-      <w:bookmarkStart w:id="50" w:name="_Toc164957341"/>
-      <w:bookmarkStart w:id="51" w:name="_Toc15419"/>
-      <w:bookmarkStart w:id="52" w:name="_Toc164957262"/>
-      <w:bookmarkStart w:id="53" w:name="_Toc164957613"/>
-      <w:bookmarkStart w:id="54" w:name="_Toc164954904"/>
-      <w:bookmarkStart w:id="55" w:name="_Toc164957120"/>
-      <w:bookmarkStart w:id="56" w:name="_Toc164955387"/>
       <w:r>
         <w:rPr>
           <w:sz w:val="26"/>
@@ -9901,77 +9998,73 @@
     </w:p>
     <w:p>
       <w:pPr>
-        <w:bidi w:val="0"/>
         <w:spacing w:line="360" w:lineRule="auto"/>
         <w:jc w:val="both"/>
         <w:rPr>
-          <w:rFonts w:hint="default"/>
-          <w:sz w:val="26"/>
-          <w:szCs w:val="26"/>
-        </w:rPr>
-      </w:pPr>
-      <w:r>
-        <w:rPr>
-          <w:rFonts w:hint="default"/>
-          <w:sz w:val="26"/>
-          <w:szCs w:val="26"/>
-        </w:rPr>
-        <w:t>Về phương diện khoa học, nghiên cứu xây dựng một trường hợp ứng dụng kết nối phát hiện vật thể, dữ liệu từ vựng và lập lịch ôn tập trong môi trường di động. Giá trị của công trình nằm ở cách chuyển các khái niệm từ thị giác máy tính và khoa học nhận thức thành một chuỗi chức năng có thể triển khai, quan sát và kiểm thử. Công trình không đặt mục tiêu chứng minh một phương pháp học vượt trội nếu chưa có thiết kế thực nghiệm giáo dục với phép đo trước và sau can thiệp.</w:t>
-      </w:r>
-    </w:p>
-    <w:p>
-      <w:pPr>
-        <w:bidi w:val="0"/>
+          <w:sz w:val="26"/>
+          <w:szCs w:val="26"/>
+        </w:rPr>
+      </w:pPr>
+      <w:r>
+        <w:rPr>
+          <w:sz w:val="26"/>
+          <w:szCs w:val="26"/>
+        </w:rPr>
+        <w:t>Về phương diện khoa học, đề tài xây dựng một trường hợp ứng dụng kết hợp thị giác máy tính, dữ liệu ngôn ngữ và thuật toán ôn tập trong môi trường di động. Kết quả nhận diện không chỉ được sử dụng để cung cấp tên đối tượng mà còn được chuyển thành đơn vị học tập có thể lưu trữ, ôn lại và theo dõi trạng thái.</w:t>
+      </w:r>
+    </w:p>
+    <w:p>
+      <w:pPr>
         <w:spacing w:line="360" w:lineRule="auto"/>
         <w:jc w:val="both"/>
         <w:rPr>
-          <w:rFonts w:hint="default"/>
-          <w:sz w:val="26"/>
-          <w:szCs w:val="26"/>
-        </w:rPr>
-      </w:pPr>
-      <w:r>
-        <w:rPr>
-          <w:rFonts w:hint="default"/>
-          <w:sz w:val="26"/>
-          <w:szCs w:val="26"/>
-        </w:rPr>
-        <w:t xml:space="preserve">Lý thuyết mã hóa kép cho rằng thông tin được xử lý qua các hệ thống biểu trưng bằng lời và phi ngôn ngữ có quan hệ với nhau [8]. Trong thiết kế được đề xuất, ảnh do người học thu nhận cung cấp dấu hiệu thị giác, còn từ, phiên âm, nghĩa và câu ví dụ cung cấp dấu hiệu ngôn ngữ. Cách kết hợp này tạo cơ sở lý thuyết cho giao diện </w:t>
-      </w:r>
-      <w:r>
-        <w:rPr>
-          <w:rFonts w:hint="default"/>
-          <w:sz w:val="26"/>
-          <w:szCs w:val="26"/>
-          <w:lang w:val="en-US"/>
-        </w:rPr>
-        <w:t>thẻ ghi nhớ</w:t>
-      </w:r>
-      <w:r>
-        <w:rPr>
-          <w:rFonts w:hint="default"/>
-          <w:sz w:val="26"/>
-          <w:szCs w:val="26"/>
-        </w:rPr>
-        <w:t>, nhưng hiệu quả ghi nhớ vẫn cần được đánh giá bằng dữ liệu người dùng thay vì suy ra trực tiếp từ lý thuyết.</w:t>
-      </w:r>
+          <w:sz w:val="26"/>
+          <w:szCs w:val="26"/>
+        </w:rPr>
+      </w:pPr>
     </w:p>
     <w:p>
       <w:pPr>
         <w:spacing w:line="360" w:lineRule="auto"/>
         <w:jc w:val="both"/>
         <w:rPr>
-          <w:rFonts w:hint="default"/>
-          <w:sz w:val="26"/>
-          <w:szCs w:val="26"/>
-        </w:rPr>
-      </w:pPr>
-      <w:r>
-        <w:rPr>
-          <w:sz w:val="26"/>
-          <w:szCs w:val="26"/>
-        </w:rPr>
-        <w:t>Mô hình Chu trình ghi nhớ bằng hình ảnh được đề xuất để mô tả mối quan hệ giữa sáu hoạt động gồm quan sát, phát hiện, liên kết từ vựng, tạo thẻ ghi nhớ, ôn tập và cập nhật trạng thái. Mô hình đóng vai trò khung khái niệm để tổ chức các thành phần của giải pháp và xác định những điểm cần kiểm thử. Phạm vi đóng góp của đề tài là xây dựng và hiện thực hóa quy trình trong ứng dụng Vocam; tác động của quy trình đối với khả năng ghi nhớ cần được đánh giá bằng nghiên cứu người dùng.</w:t>
+          <w:sz w:val="26"/>
+          <w:szCs w:val="26"/>
+        </w:rPr>
+      </w:pPr>
+      <w:r>
+        <w:rPr>
+          <w:sz w:val="26"/>
+          <w:szCs w:val="26"/>
+        </w:rPr>
+        <w:t>Lý thuyết mã hóa kép cho rằng thông tin bằng lời và thông tin phi ngôn ngữ có thể tạo thành những hệ thống biểu trưng có quan hệ với nhau [8]. Trong Vocam, hình ảnh vật thể cung cấp dấu hiệu thị giác, còn từ tiếng Anh, phiên âm, nghĩa và câu ví dụ cung cấp dấu hiệu ngôn ngữ. Cách kết hợp này tạo cơ sở để thiết kế thẻ ghi nhớ gắn với ngữ cảnh quan sát của người học.</w:t>
+      </w:r>
+    </w:p>
+    <w:p>
+      <w:pPr>
+        <w:spacing w:line="360" w:lineRule="auto"/>
+        <w:jc w:val="both"/>
+        <w:rPr>
+          <w:sz w:val="26"/>
+          <w:szCs w:val="26"/>
+        </w:rPr>
+      </w:pPr>
+    </w:p>
+    <w:p>
+      <w:pPr>
+        <w:spacing w:line="360" w:lineRule="auto"/>
+        <w:jc w:val="both"/>
+        <w:rPr>
+          <w:sz w:val="26"/>
+          <w:szCs w:val="26"/>
+        </w:rPr>
+      </w:pPr>
+      <w:r>
+        <w:rPr>
+          <w:sz w:val="26"/>
+          <w:szCs w:val="26"/>
+        </w:rPr>
+        <w:t>Đề tài đề xuất Chu trình ghi nhớ bằng hình ảnh để mô tả mối quan hệ giữa hoạt động quan sát, nhận diện, liên kết dữ liệu từ vựng, tạo thẻ, ôn tập và cập nhật trạng thái. Chu trình đóng vai trò mô hình khái niệm cho việc tổ chức các chức năng và xác định các điểm cần kiểm thử trong hệ thống.</w:t>
       </w:r>
     </w:p>
     <w:p>
@@ -9999,37 +10092,46 @@
         <w:spacing w:line="360" w:lineRule="auto"/>
         <w:jc w:val="both"/>
         <w:rPr>
+          <w:sz w:val="26"/>
+          <w:szCs w:val="26"/>
+        </w:rPr>
+      </w:pPr>
+      <w:bookmarkStart w:id="57" w:name="_Toc5314"/>
+      <w:r>
+        <w:rPr>
+          <w:sz w:val="26"/>
+          <w:szCs w:val="26"/>
+        </w:rPr>
+        <w:t>Về phương diện thực tiễn, Vocam giúp người học khai thác những vật thể xuất hiện trong đời sống làm nguồn học từ vựng. Người học không cần bắt đầu bằng việc nhập từ khóa mà có thể sử dụng hình ảnh để khám phá từ mới. Nội dung sau khi nhận diện được tiếp tục sử dụng trong sổ từ, bài tập và hoạt động ôn tập.</w:t>
+      </w:r>
+    </w:p>
+    <w:p>
+      <w:pPr>
+        <w:spacing w:line="360" w:lineRule="auto"/>
+        <w:jc w:val="both"/>
+        <w:rPr>
           <w:rFonts w:hint="default"/>
           <w:sz w:val="26"/>
           <w:szCs w:val="26"/>
-        </w:rPr>
-      </w:pPr>
-      <w:r>
-        <w:rPr>
-          <w:sz w:val="26"/>
-          <w:szCs w:val="26"/>
-        </w:rPr>
-        <w:t>Về phương diện thực tiễn, giải pháp hướng đến việc rút ngắn khoảng cách giữa thời điểm người học bắt gặp một vật thể và thời điểm họ tiếp cận từ tiếng Anh tương ứng. Kết quả nhận diện được liên kết với nội dung từ vựng và các hoạt động học trong cùng một ứng dụng, giúp người học chuyển từ khám phá từ mới sang luyện tập và theo dõi tiến độ mà không phải sử dụng nhiều công cụ riêng biệt.</w:t>
-      </w:r>
-    </w:p>
-    <w:p>
-      <w:pPr>
-        <w:bidi w:val="0"/>
+          <w:lang w:val="en-US"/>
+        </w:rPr>
+      </w:pPr>
+    </w:p>
+    <w:p>
+      <w:pPr>
         <w:spacing w:line="360" w:lineRule="auto"/>
         <w:jc w:val="both"/>
         <w:rPr>
-          <w:rFonts w:hint="default"/>
-          <w:sz w:val="26"/>
-          <w:szCs w:val="26"/>
-        </w:rPr>
-      </w:pPr>
-      <w:r>
-        <w:rPr>
-          <w:rFonts w:hint="default"/>
-          <w:sz w:val="26"/>
-          <w:szCs w:val="26"/>
-        </w:rPr>
-        <w:t>Giá trị sử dụng của sản phẩm sẽ được xác định qua mức độ hoàn thành chức năng, độ chính xác trong các tình huống kiểm thử, thời gian phản hồi và khả năng duy trì dữ liệu. Những lợi ích như tăng động lực hoặc cải thiện ghi nhớ chỉ được nêu như kỳ vọng thiết kế cho đến khi có nghiên cứu người dùng đủ căn cứ.</w:t>
+          <w:sz w:val="26"/>
+          <w:szCs w:val="26"/>
+        </w:rPr>
+      </w:pPr>
+      <w:r>
+        <w:rPr>
+          <w:sz w:val="26"/>
+          <w:szCs w:val="26"/>
+        </w:rPr>
+        <w:t>Ứng dụng cũng thể hiện khả năng tích hợp nhiều thành phần công nghệ trong một sản phẩm gồm giao diện di động, dịch vụ trí tuệ nhân tạo, máy chủ nghiệp vụ và cơ sở dữ liệu. Kết quả đề tài có thể được sử dụng làm cơ sở để tiếp tục nghiên cứu về học từ vựng theo ngữ cảnh, cá nhân hóa lịch ôn tập và đánh giá hiệu quả học tập trên người dùng thực tế.</w:t>
       </w:r>
     </w:p>
     <w:p>
@@ -10039,8 +10141,23 @@
           <w:ilvl w:val="0"/>
           <w:numId w:val="7"/>
         </w:numPr>
-      </w:pPr>
-      <w:bookmarkStart w:id="57" w:name="_Toc5314"/>
+        <w:sectPr>
+          <w:headerReference r:id="rId6" w:type="default"/>
+          <w:pgSz w:w="11906" w:h="16838"/>
+          <w:pgMar w:top="1701" w:right="1138" w:bottom="1701" w:left="1985" w:header="709" w:footer="709" w:gutter="0"/>
+          <w:cols w:space="708" w:num="1"/>
+          <w:docGrid w:linePitch="360" w:charSpace="0"/>
+        </w:sectPr>
+      </w:pPr>
+    </w:p>
+    <w:p>
+      <w:pPr>
+        <w:pStyle w:val="2"/>
+        <w:numPr>
+          <w:ilvl w:val="0"/>
+          <w:numId w:val="7"/>
+        </w:numPr>
+      </w:pPr>
       <w:r>
         <w:t>TỔNG QUAN ĐỀ TÀI</w:t>
       </w:r>
@@ -10058,12 +10175,12 @@
         <w:spacing w:line="360" w:lineRule="auto"/>
         <w:jc w:val="both"/>
       </w:pPr>
-      <w:bookmarkStart w:id="58" w:name="_Toc164957615"/>
-      <w:bookmarkStart w:id="59" w:name="_Toc164957343"/>
-      <w:bookmarkStart w:id="60" w:name="_Toc164957264"/>
-      <w:bookmarkStart w:id="61" w:name="_Toc3433"/>
-      <w:bookmarkStart w:id="62" w:name="_Toc164957122"/>
-      <w:bookmarkStart w:id="63" w:name="_Toc164955389"/>
+      <w:bookmarkStart w:id="58" w:name="_Toc164957343"/>
+      <w:bookmarkStart w:id="59" w:name="_Toc3433"/>
+      <w:bookmarkStart w:id="60" w:name="_Toc164957122"/>
+      <w:bookmarkStart w:id="61" w:name="_Toc164955389"/>
+      <w:bookmarkStart w:id="62" w:name="_Toc164957264"/>
+      <w:bookmarkStart w:id="63" w:name="_Toc164957615"/>
       <w:r>
         <w:rPr>
           <w:sz w:val="26"/>
@@ -10084,43 +10201,252 @@
     </w:p>
     <w:p>
       <w:pPr>
+        <w:pStyle w:val="4"/>
         <w:bidi w:val="0"/>
+      </w:pPr>
+      <w:r>
+        <w:t>Học ngôn ngữ có hỗ trợ thiết bị di động</w:t>
+      </w:r>
+    </w:p>
+    <w:p>
+      <w:pPr>
         <w:spacing w:line="360" w:lineRule="auto"/>
         <w:jc w:val="both"/>
         <w:rPr>
-          <w:rFonts w:hint="default"/>
-          <w:sz w:val="26"/>
-          <w:szCs w:val="26"/>
-        </w:rPr>
-      </w:pPr>
-      <w:r>
-        <w:rPr>
-          <w:rFonts w:hint="default"/>
-          <w:sz w:val="26"/>
-          <w:szCs w:val="26"/>
-        </w:rPr>
-        <w:t>Học ngôn ngữ có hỗ trợ thiết bị di động đã phát triển từ việc phân phối nội dung đơn giản sang các môi trường học có tính tương tác, cá nhân hóa và gắn với hoạt động của người học. Các phân tích tổng hợp cho thấy công nghệ di động có thể hỗ trợ kết quả học ngôn ngữ, nhưng mức tác động phụ thuộc vào thiết kế nhiệm vụ, thời gian can thiệp và cách đo lường [2], [9]. Trong học từ vựng, khả năng kết hợp văn bản, âm thanh, hình ảnh và nhắc ôn tạo ra nhiều cơ hội tiếp xúc với từ, song kiến thức ngữ cảnh và khả năng sử dụng từ vẫn cần được chú ý thay vì chỉ tăng số lượng từ đã xem.</w:t>
-      </w:r>
-    </w:p>
-    <w:p>
-      <w:pPr>
+          <w:sz w:val="26"/>
+          <w:szCs w:val="26"/>
+        </w:rPr>
+      </w:pPr>
+      <w:r>
+        <w:rPr>
+          <w:sz w:val="26"/>
+          <w:szCs w:val="26"/>
+        </w:rPr>
+        <w:t>Học ngôn ngữ có hỗ trợ thiết bị di động là hướng tiếp cận sử dụng điện thoại thông minh, máy tính bảng và các thiết bị cá nhân để cung cấp nội dung và tổ chức hoạt động học. Đặc trưng của phương pháp này là khả năng tiếp cận linh hoạt, hỗ trợ nhiều loại dữ liệu và cho phép người học tương tác với nội dung trong nhiều bối cảnh.</w:t>
+      </w:r>
+    </w:p>
+    <w:p>
+      <w:pPr>
+        <w:spacing w:line="360" w:lineRule="auto"/>
+        <w:jc w:val="both"/>
+        <w:rPr>
+          <w:sz w:val="26"/>
+          <w:szCs w:val="26"/>
+        </w:rPr>
+      </w:pPr>
+    </w:p>
+    <w:p>
+      <w:pPr>
+        <w:spacing w:line="360" w:lineRule="auto"/>
+        <w:jc w:val="both"/>
+        <w:rPr>
+          <w:sz w:val="26"/>
+          <w:szCs w:val="26"/>
+        </w:rPr>
+      </w:pPr>
+      <w:r>
+        <w:rPr>
+          <w:sz w:val="26"/>
+          <w:szCs w:val="26"/>
+        </w:rPr>
+        <w:t>Phân tích của Burston và Giannakou cho thấy các nghiên cứu về học ngôn ngữ trên thiết bị di động nhìn chung ghi nhận kết quả tích cực, nhưng mức tác động có sự khác biệt lớn giữa các công trình và chịu ảnh hưởng của thiết kế thực nghiệm [9]. Kết quả này cho thấy thiết bị di động là phương tiện hỗ trợ tiềm năng, còn hiệu quả học tập phụ thuộc vào phương pháp tổ chức nội dung và hoạt động của người học.</w:t>
+      </w:r>
+    </w:p>
+    <w:p>
+      <w:pPr>
+        <w:spacing w:line="360" w:lineRule="auto"/>
+        <w:jc w:val="both"/>
+        <w:rPr>
+          <w:sz w:val="26"/>
+          <w:szCs w:val="26"/>
+        </w:rPr>
+      </w:pPr>
+    </w:p>
+    <w:p>
+      <w:pPr>
+        <w:spacing w:line="360" w:lineRule="auto"/>
+        <w:jc w:val="both"/>
+        <w:rPr>
+          <w:sz w:val="26"/>
+          <w:szCs w:val="26"/>
+        </w:rPr>
+      </w:pPr>
+      <w:r>
+        <w:rPr>
+          <w:sz w:val="26"/>
+          <w:szCs w:val="26"/>
+        </w:rPr>
+        <w:t>Trong học từ vựng, thiết bị di động hỗ trợ kết hợp văn bản, hình ảnh, âm thanh và hoạt động tương tác. Nghiên cứu của Uz Bilgin và Tokel cho thấy môi trường học có hỗ trợ ngữ cảnh có thể tạo điều kiện cho người học khám phá từ vựng trong những tình huống cụ thể [10]. Hệ thống từ vựng đa phương tiện của Vargo và cộng sự cũng khai thác nội dung gắn với ngữ cảnh nhằm giúp người học liên kết từ với thông tin thực tế [11].</w:t>
+      </w:r>
+    </w:p>
+    <w:p>
+      <w:pPr>
+        <w:spacing w:line="360" w:lineRule="auto"/>
+        <w:jc w:val="both"/>
+        <w:rPr>
+          <w:sz w:val="26"/>
+          <w:szCs w:val="26"/>
+        </w:rPr>
+      </w:pPr>
+    </w:p>
+    <w:p>
+      <w:pPr>
+        <w:spacing w:line="360" w:lineRule="auto"/>
+        <w:jc w:val="both"/>
+        <w:rPr>
+          <w:sz w:val="26"/>
+          <w:szCs w:val="26"/>
+        </w:rPr>
+      </w:pPr>
+      <w:r>
+        <w:rPr>
+          <w:sz w:val="26"/>
+          <w:szCs w:val="26"/>
+        </w:rPr>
+        <w:t>Các nghiên cứu trên tạo cơ sở cho việc sử dụng hình ảnh và môi trường sống như một phần của hoạt động học. Dù vậy, thiết bị di động chỉ là phương tiện triển khai. Nội dung cần được tổ chức thành một chu trình gồm tiếp nhận thông tin, luyện tập, truy hồi và cập nhật tiến độ.</w:t>
+      </w:r>
+    </w:p>
+    <w:p>
+      <w:pPr>
+        <w:spacing w:line="360" w:lineRule="auto"/>
+        <w:jc w:val="both"/>
+        <w:rPr>
+          <w:sz w:val="26"/>
+          <w:szCs w:val="26"/>
+        </w:rPr>
+      </w:pPr>
+    </w:p>
+    <w:p>
+      <w:pPr>
+        <w:pStyle w:val="4"/>
         <w:bidi w:val="0"/>
+      </w:pPr>
+      <w:r>
+        <w:t>Phát hiện vật thể và khả năng ứng dụng trong giáo dục</w:t>
+      </w:r>
+    </w:p>
+    <w:p>
+      <w:pPr>
         <w:spacing w:line="360" w:lineRule="auto"/>
         <w:jc w:val="both"/>
         <w:rPr>
-          <w:b w:val="0"/>
-          <w:bCs/>
-          <w:sz w:val="26"/>
-          <w:szCs w:val="26"/>
-        </w:rPr>
-      </w:pPr>
-      <w:r>
-        <w:rPr>
-          <w:rFonts w:hint="default"/>
-          <w:sz w:val="26"/>
-          <w:szCs w:val="26"/>
-        </w:rPr>
-        <w:t>Các nghiên cứu về học theo tình huống cho thấy thiết bị di động có thể đưa hoạt động từ vựng đến gần môi trường nơi từ được quan sát và sử dụng. Môi trường học có hỗ trợ ngữ cảnh đã được ghi nhận là có khả năng tăng cường sự tham gia và khả năng lưu giữ từ so với hoạt động tách rời bối cảnh, dù kết quả còn phụ thuộc vào nhiệm vụ và nhóm người học [10]. Hệ thống từ vựng đa phương tiện theo ngữ cảnh cũng tiếp tục được nghiên cứu như một hướng kết hợp dữ liệu vị trí, hình ảnh và nội dung học trên thiết bị di động [11]. Những công trình này cung cấp nền tảng để xem xét camera không chỉ như công cụ tra cứu mà còn như điểm khởi đầu của một chu trình học.</w:t>
+          <w:sz w:val="26"/>
+          <w:szCs w:val="26"/>
+        </w:rPr>
+      </w:pPr>
+      <w:r>
+        <w:rPr>
+          <w:sz w:val="26"/>
+          <w:szCs w:val="26"/>
+        </w:rPr>
+        <w:t>Phát hiện vật thể là bài toán xác định lớp và vị trí của một hoặc nhiều đối tượng trong hình ảnh. Đầu ra thường gồm nhãn, độ tin cậy và tọa độ khung bao của từng đối tượng. Khác với phân loại hình ảnh chỉ trả về một nhãn chung, phát hiện vật thể cho phép hệ thống phân biệt nhiều đối tượng xuất hiện đồng thời.</w:t>
+      </w:r>
+    </w:p>
+    <w:p>
+      <w:pPr>
+        <w:spacing w:line="360" w:lineRule="auto"/>
+        <w:jc w:val="both"/>
+        <w:rPr>
+          <w:sz w:val="26"/>
+          <w:szCs w:val="26"/>
+        </w:rPr>
+      </w:pPr>
+    </w:p>
+    <w:p>
+      <w:pPr>
+        <w:spacing w:line="360" w:lineRule="auto"/>
+        <w:jc w:val="both"/>
+        <w:rPr>
+          <w:sz w:val="26"/>
+          <w:szCs w:val="26"/>
+        </w:rPr>
+      </w:pPr>
+      <w:r>
+        <w:rPr>
+          <w:sz w:val="26"/>
+          <w:szCs w:val="26"/>
+        </w:rPr>
+        <w:t>YOLO-World là mô hình phát hiện vật thể theo tập từ vựng mở, kết hợp thông tin thị giác và ngôn ngữ để nhận diện những đối tượng được mô tả bằng văn bản [13]. Cách tiếp cận này tạo khả năng xác định phạm vi nhận diện theo danh sách khái niệm phù hợp với từng ứng dụng.</w:t>
+      </w:r>
+    </w:p>
+    <w:p>
+      <w:pPr>
+        <w:spacing w:line="360" w:lineRule="auto"/>
+        <w:jc w:val="both"/>
+        <w:rPr>
+          <w:sz w:val="26"/>
+          <w:szCs w:val="26"/>
+        </w:rPr>
+      </w:pPr>
+    </w:p>
+    <w:p>
+      <w:pPr>
+        <w:spacing w:line="360" w:lineRule="auto"/>
+        <w:jc w:val="both"/>
+        <w:rPr>
+          <w:sz w:val="26"/>
+          <w:szCs w:val="26"/>
+        </w:rPr>
+      </w:pPr>
+      <w:r>
+        <w:rPr>
+          <w:sz w:val="26"/>
+          <w:szCs w:val="26"/>
+        </w:rPr>
+        <w:t>Objects365 là bộ dữ liệu phát hiện vật thể quy mô lớn gồm 365 nhóm đối tượng thuộc nhiều môi trường và kích thước khác nhau [14]. Các nhóm vật thể bao gồm con người, phương tiện, động vật, đồ dùng gia đình, thiết bị, thực phẩm và nhiều đối tượng khác trong đời sống. Phạm vi này phù hợp với mục tiêu xây dựng ứng dụng học từ vựng từ các vật thể người học có thể quan sát hằng ngày.</w:t>
+      </w:r>
+    </w:p>
+    <w:p>
+      <w:pPr>
+        <w:spacing w:line="360" w:lineRule="auto"/>
+        <w:jc w:val="both"/>
+        <w:rPr>
+          <w:sz w:val="26"/>
+          <w:szCs w:val="26"/>
+        </w:rPr>
+      </w:pPr>
+    </w:p>
+    <w:p>
+      <w:pPr>
+        <w:spacing w:line="360" w:lineRule="auto"/>
+        <w:jc w:val="both"/>
+        <w:rPr>
+          <w:sz w:val="26"/>
+          <w:szCs w:val="26"/>
+        </w:rPr>
+      </w:pPr>
+      <w:r>
+        <w:rPr>
+          <w:sz w:val="26"/>
+          <w:szCs w:val="26"/>
+        </w:rPr>
+        <w:t>Trong giáo dục ngôn ngữ, kết quả phát hiện vật thể có thể được chuyển thành nội dung học bằng cách liên kết nhãn với dữ liệu từ vựng. Người học không chỉ nhận được tên đối tượng mà còn có thể xem phiên âm, nghĩa, câu ví dụ và lưu lại để ôn tập. Giá trị giáo dục vì vậy phụ thuộc cả vào chất lượng nhận diện và chất lượng dữ liệu ngôn ngữ đi kèm.</w:t>
+      </w:r>
+    </w:p>
+    <w:p>
+      <w:pPr>
+        <w:pStyle w:val="4"/>
+        <w:bidi w:val="0"/>
+      </w:pPr>
+      <w:r>
+        <w:t>Phân tích các ứng dụng hiện có</w:t>
+      </w:r>
+    </w:p>
+    <w:p>
+      <w:pPr>
+        <w:spacing w:line="360" w:lineRule="auto"/>
+        <w:jc w:val="both"/>
+        <w:rPr>
+          <w:sz w:val="26"/>
+          <w:szCs w:val="26"/>
+        </w:rPr>
+      </w:pPr>
+      <w:r>
+        <w:rPr>
+          <w:sz w:val="26"/>
+          <w:szCs w:val="26"/>
+        </w:rPr>
+        <w:t>Các ứng dụng học ngôn ngữ và công cụ nhận diện hình ảnh hiện nay giải quyết những nhóm nhu cầu khác nhau. Duolingo tập trung vào khóa học có cấu trúc và các bài luyện ngắn [6]. Memrise kết hợp từ vựng, cụm từ, nội dung đa phương tiện và hoạt động ôn tập [7]. ELSA Speak tập trung vào kỹ năng nói và phản hồi phát âm [12]. Google Lens hỗ trợ tìm kiếm thông tin từ hình ảnh và camera [5].</w:t>
       </w:r>
     </w:p>
     <w:p>
@@ -10134,55 +10460,6 @@
           <w:szCs w:val="26"/>
         </w:rPr>
       </w:pPr>
-      <w:r>
-        <w:rPr>
-          <w:b/>
-          <w:bCs/>
-          <w:sz w:val="26"/>
-          <w:szCs w:val="26"/>
-        </w:rPr>
-        <w:t xml:space="preserve">  Bảng 1.1:</w:t>
-      </w:r>
-      <w:r>
-        <w:rPr>
-          <w:rFonts w:hint="default"/>
-          <w:b/>
-          <w:bCs/>
-          <w:sz w:val="26"/>
-          <w:szCs w:val="26"/>
-          <w:lang w:val="en-US"/>
-        </w:rPr>
-        <w:t xml:space="preserve"> S</w:t>
-      </w:r>
-      <w:r>
-        <w:rPr>
-          <w:b/>
-          <w:bCs/>
-          <w:sz w:val="26"/>
-          <w:szCs w:val="26"/>
-        </w:rPr>
-        <w:t>o sánh các công trình và ứng dụng học tập</w:t>
-      </w:r>
-      <w:r>
-        <w:rPr>
-          <w:rFonts w:hint="default"/>
-          <w:b/>
-          <w:bCs/>
-          <w:sz w:val="26"/>
-          <w:szCs w:val="26"/>
-          <w:lang w:val="en-US"/>
-        </w:rPr>
-        <w:t xml:space="preserve"> có</w:t>
-      </w:r>
-      <w:r>
-        <w:rPr>
-          <w:b/>
-          <w:bCs/>
-          <w:sz w:val="26"/>
-          <w:szCs w:val="26"/>
-        </w:rPr>
-        <w:t xml:space="preserve"> liên quan</w:t>
-      </w:r>
     </w:p>
     <w:tbl>
       <w:tblPr>
@@ -10206,13 +10483,121 @@
         </w:tblCellMar>
       </w:tblPr>
       <w:tblGrid>
-        <w:gridCol w:w="1127"/>
+        <w:gridCol w:w="1126"/>
         <w:gridCol w:w="1586"/>
-        <w:gridCol w:w="1826"/>
-        <w:gridCol w:w="1347"/>
+        <w:gridCol w:w="1825"/>
+        <w:gridCol w:w="1346"/>
         <w:gridCol w:w="1487"/>
-        <w:gridCol w:w="1626"/>
+        <w:gridCol w:w="1629"/>
       </w:tblGrid>
+      <w:tr>
+        <w:tblPrEx>
+          <w:tblBorders>
+            <w:top w:val="single" w:color="auto" w:sz="4" w:space="0"/>
+            <w:left w:val="single" w:color="auto" w:sz="4" w:space="0"/>
+            <w:bottom w:val="single" w:color="auto" w:sz="4" w:space="0"/>
+            <w:right w:val="single" w:color="auto" w:sz="4" w:space="0"/>
+            <w:insideH w:val="single" w:color="auto" w:sz="4" w:space="0"/>
+            <w:insideV w:val="single" w:color="auto" w:sz="4" w:space="0"/>
+          </w:tblBorders>
+          <w:tblCellMar>
+            <w:top w:w="0" w:type="dxa"/>
+            <w:left w:w="108" w:type="dxa"/>
+            <w:bottom w:w="0" w:type="dxa"/>
+            <w:right w:w="108" w:type="dxa"/>
+          </w:tblCellMar>
+        </w:tblPrEx>
+        <w:trPr>
+          <w:trHeight w:val="489" w:hRule="atLeast"/>
+        </w:trPr>
+        <w:tc>
+          <w:tcPr>
+            <w:tcW w:w="5000" w:type="pct"/>
+            <w:gridSpan w:val="6"/>
+            <w:tcBorders>
+              <w:top w:val="nil"/>
+              <w:left w:val="nil"/>
+              <w:bottom w:val="single" w:color="auto" w:sz="4" w:space="0"/>
+              <w:right w:val="nil"/>
+            </w:tcBorders>
+            <w:vAlign w:val="center"/>
+          </w:tcPr>
+          <w:p>
+            <w:pPr>
+              <w:spacing w:line="360" w:lineRule="auto"/>
+              <w:jc w:val="center"/>
+              <w:rPr>
+                <w:rFonts w:hint="default"/>
+                <w:b/>
+                <w:bCs/>
+                <w:sz w:val="26"/>
+                <w:szCs w:val="26"/>
+                <w:lang w:val="en-US"/>
+              </w:rPr>
+            </w:pPr>
+            <w:r>
+              <w:rPr>
+                <w:b/>
+                <w:bCs/>
+                <w:sz w:val="26"/>
+                <w:szCs w:val="26"/>
+              </w:rPr>
+              <w:t>Bảng 1.1:</w:t>
+            </w:r>
+            <w:r>
+              <w:rPr>
+                <w:rFonts w:hint="default"/>
+                <w:b/>
+                <w:bCs/>
+                <w:sz w:val="26"/>
+                <w:szCs w:val="26"/>
+                <w:lang w:val="en-US"/>
+              </w:rPr>
+              <w:t xml:space="preserve"> S</w:t>
+            </w:r>
+            <w:r>
+              <w:rPr>
+                <w:b/>
+                <w:bCs/>
+                <w:sz w:val="26"/>
+                <w:szCs w:val="26"/>
+              </w:rPr>
+              <w:t xml:space="preserve">o sánh các ứng </w:t>
+            </w:r>
+            <w:bookmarkStart w:id="161" w:name="_GoBack"/>
+            <w:bookmarkEnd w:id="161"/>
+            <w:r>
+              <w:rPr>
+                <w:b/>
+                <w:bCs/>
+                <w:sz w:val="26"/>
+                <w:szCs w:val="26"/>
+              </w:rPr>
+              <w:t>dụng học tập</w:t>
+            </w:r>
+            <w:r>
+              <w:rPr>
+                <w:rFonts w:hint="default"/>
+                <w:b/>
+                <w:bCs/>
+                <w:sz w:val="26"/>
+                <w:szCs w:val="26"/>
+                <w:lang w:val="en-US"/>
+              </w:rPr>
+              <w:t xml:space="preserve"> có</w:t>
+            </w:r>
+            <w:r>
+              <w:rPr>
+                <w:b/>
+                <w:bCs/>
+                <w:sz w:val="26"/>
+                <w:szCs w:val="26"/>
+              </w:rPr>
+              <w:t xml:space="preserve"> liên quan</w:t>
+            </w:r>
+          </w:p>
+        </w:tc>
+      </w:tr>
       <w:tr>
         <w:tblPrEx>
           <w:tblBorders>
@@ -10236,6 +10621,9 @@
         <w:tc>
           <w:tcPr>
             <w:tcW w:w="626" w:type="pct"/>
+            <w:tcBorders>
+              <w:top w:val="single" w:color="auto" w:sz="4" w:space="0"/>
+            </w:tcBorders>
           </w:tcPr>
           <w:p>
             <w:pPr>
@@ -10262,6 +10650,9 @@
         <w:tc>
           <w:tcPr>
             <w:tcW w:w="881" w:type="pct"/>
+            <w:tcBorders>
+              <w:top w:val="single" w:color="auto" w:sz="4" w:space="0"/>
+            </w:tcBorders>
           </w:tcPr>
           <w:p>
             <w:pPr>
@@ -10281,33 +10672,16 @@
                 <w:sz w:val="26"/>
                 <w:szCs w:val="26"/>
               </w:rPr>
-              <w:t>Duolingo [</w:t>
-            </w:r>
-            <w:r>
-              <w:rPr>
-                <w:rFonts w:hint="default"/>
-                <w:b/>
-                <w:bCs/>
-                <w:sz w:val="26"/>
-                <w:szCs w:val="26"/>
-                <w:lang w:val="en-US"/>
-              </w:rPr>
-              <w:t>6</w:t>
-            </w:r>
-            <w:r>
-              <w:rPr>
-                <w:b/>
-                <w:bCs/>
-                <w:sz w:val="26"/>
-                <w:szCs w:val="26"/>
-              </w:rPr>
-              <w:t>]</w:t>
+              <w:t>Duolingo</w:t>
             </w:r>
           </w:p>
         </w:tc>
         <w:tc>
           <w:tcPr>
             <w:tcW w:w="1014" w:type="pct"/>
+            <w:tcBorders>
+              <w:top w:val="single" w:color="auto" w:sz="4" w:space="0"/>
+            </w:tcBorders>
           </w:tcPr>
           <w:p>
             <w:pPr>
@@ -10328,53 +10702,15 @@
                 <w:szCs w:val="26"/>
               </w:rPr>
               <w:t>Memrise</w:t>
-            </w:r>
-          </w:p>
-          <w:p>
-            <w:pPr>
-              <w:spacing w:line="360" w:lineRule="auto"/>
-              <w:jc w:val="left"/>
-              <w:rPr>
-                <w:b/>
-                <w:bCs/>
-                <w:sz w:val="26"/>
-                <w:szCs w:val="26"/>
-              </w:rPr>
-            </w:pPr>
-            <w:r>
-              <w:rPr>
-                <w:b/>
-                <w:bCs/>
-                <w:sz w:val="26"/>
-                <w:szCs w:val="26"/>
-              </w:rPr>
-              <w:t>[</w:t>
-            </w:r>
-            <w:r>
-              <w:rPr>
-                <w:rFonts w:hint="default"/>
-                <w:b/>
-                <w:bCs/>
-                <w:sz w:val="26"/>
-                <w:szCs w:val="26"/>
-                <w:lang w:val="en-US"/>
-              </w:rPr>
-              <w:t>7</w:t>
-            </w:r>
-            <w:r>
-              <w:rPr>
-                <w:b/>
-                <w:bCs/>
-                <w:sz w:val="26"/>
-                <w:szCs w:val="26"/>
-              </w:rPr>
-              <w:t>]</w:t>
             </w:r>
           </w:p>
         </w:tc>
         <w:tc>
           <w:tcPr>
             <w:tcW w:w="748" w:type="pct"/>
+            <w:tcBorders>
+              <w:top w:val="single" w:color="auto" w:sz="4" w:space="0"/>
+            </w:tcBorders>
           </w:tcPr>
           <w:p>
             <w:pPr>
@@ -10394,33 +10730,16 @@
                 <w:sz w:val="26"/>
                 <w:szCs w:val="26"/>
               </w:rPr>
-              <w:t>ELSA Speak [</w:t>
-            </w:r>
-            <w:r>
-              <w:rPr>
-                <w:rFonts w:hint="default"/>
-                <w:b/>
-                <w:bCs/>
-                <w:sz w:val="26"/>
-                <w:szCs w:val="26"/>
-                <w:lang w:val="en-US"/>
-              </w:rPr>
-              <w:t>12</w:t>
-            </w:r>
-            <w:r>
-              <w:rPr>
-                <w:b/>
-                <w:bCs/>
-                <w:sz w:val="26"/>
-                <w:szCs w:val="26"/>
-              </w:rPr>
-              <w:t>]</w:t>
+              <w:t xml:space="preserve">ELSA Speak </w:t>
             </w:r>
           </w:p>
         </w:tc>
         <w:tc>
           <w:tcPr>
             <w:tcW w:w="826" w:type="pct"/>
+            <w:tcBorders>
+              <w:top w:val="single" w:color="auto" w:sz="4" w:space="0"/>
+            </w:tcBorders>
           </w:tcPr>
           <w:p>
             <w:pPr>
@@ -10440,33 +10759,16 @@
                 <w:sz w:val="26"/>
                 <w:szCs w:val="26"/>
               </w:rPr>
-              <w:t>Google Lens [</w:t>
-            </w:r>
-            <w:r>
-              <w:rPr>
-                <w:rFonts w:hint="default"/>
-                <w:b/>
-                <w:bCs/>
-                <w:sz w:val="26"/>
-                <w:szCs w:val="26"/>
-                <w:lang w:val="en-US"/>
-              </w:rPr>
-              <w:t>5</w:t>
-            </w:r>
-            <w:r>
-              <w:rPr>
-                <w:b/>
-                <w:bCs/>
-                <w:sz w:val="26"/>
-                <w:szCs w:val="26"/>
-              </w:rPr>
-              <w:t>]</w:t>
+              <w:t>Google Lens</w:t>
             </w:r>
           </w:p>
         </w:tc>
         <w:tc>
           <w:tcPr>
             <w:tcW w:w="903" w:type="pct"/>
+            <w:tcBorders>
+              <w:top w:val="single" w:color="auto" w:sz="4" w:space="0"/>
+            </w:tcBorders>
           </w:tcPr>
           <w:p>
             <w:pPr>
@@ -11373,11 +11675,11 @@
           <w:szCs w:val="26"/>
         </w:rPr>
       </w:pPr>
-      <w:bookmarkStart w:id="70" w:name="_Toc164957345"/>
-      <w:bookmarkStart w:id="71" w:name="_Toc164957124"/>
-      <w:bookmarkStart w:id="72" w:name="_Toc164957266"/>
-      <w:bookmarkStart w:id="73" w:name="_Toc164957617"/>
-      <w:bookmarkStart w:id="74" w:name="_Toc164955391"/>
+      <w:bookmarkStart w:id="70" w:name="_Toc164957124"/>
+      <w:bookmarkStart w:id="71" w:name="_Toc164957617"/>
+      <w:bookmarkStart w:id="72" w:name="_Toc164955391"/>
+      <w:bookmarkStart w:id="73" w:name="_Toc164957266"/>
+      <w:bookmarkStart w:id="74" w:name="_Toc164957345"/>
       <w:r>
         <w:rPr>
           <w:rFonts w:hint="default"/>
@@ -11491,12 +11793,12 @@
           <w:szCs w:val="26"/>
         </w:rPr>
       </w:pPr>
-      <w:bookmarkStart w:id="76" w:name="_Toc164955392"/>
-      <w:bookmarkStart w:id="77" w:name="_Toc164957346"/>
+      <w:bookmarkStart w:id="76" w:name="_Toc164957346"/>
+      <w:bookmarkStart w:id="77" w:name="_Toc164957267"/>
       <w:bookmarkStart w:id="78" w:name="_Toc164957125"/>
-      <w:bookmarkStart w:id="79" w:name="_Toc164954906"/>
-      <w:bookmarkStart w:id="80" w:name="_Toc164957267"/>
-      <w:bookmarkStart w:id="81" w:name="_Toc164957618"/>
+      <w:bookmarkStart w:id="79" w:name="_Toc164955392"/>
+      <w:bookmarkStart w:id="80" w:name="_Toc164957618"/>
+      <w:bookmarkStart w:id="81" w:name="_Toc164954906"/>
       <w:r>
         <w:rPr>
           <w:sz w:val="26"/>
@@ -11651,13 +11953,13 @@
           <w:sz w:val="26"/>
         </w:rPr>
       </w:pPr>
-      <w:bookmarkStart w:id="83" w:name="_Toc164957126"/>
-      <w:bookmarkStart w:id="84" w:name="_Toc27352"/>
-      <w:bookmarkStart w:id="85" w:name="_Toc164957347"/>
-      <w:bookmarkStart w:id="86" w:name="_Toc164955393"/>
+      <w:bookmarkStart w:id="83" w:name="_Toc27352"/>
+      <w:bookmarkStart w:id="84" w:name="_Toc164957347"/>
+      <w:bookmarkStart w:id="85" w:name="_Toc164954907"/>
+      <w:bookmarkStart w:id="86" w:name="_Toc164957268"/>
       <w:bookmarkStart w:id="87" w:name="_Toc164957619"/>
-      <w:bookmarkStart w:id="88" w:name="_Toc164954907"/>
-      <w:bookmarkStart w:id="89" w:name="_Toc164957268"/>
+      <w:bookmarkStart w:id="88" w:name="_Toc164955393"/>
+      <w:bookmarkStart w:id="89" w:name="_Toc164957126"/>
       <w:r>
         <w:rPr>
           <w:sz w:val="26"/>
@@ -11991,9 +12293,9 @@
       <w:bookmarkStart w:id="91" w:name="_Toc164957620"/>
       <w:bookmarkStart w:id="92" w:name="_Toc26681"/>
       <w:bookmarkStart w:id="93" w:name="_Toc164957269"/>
-      <w:bookmarkStart w:id="94" w:name="_Toc164957348"/>
-      <w:bookmarkStart w:id="95" w:name="_Toc164957127"/>
-      <w:bookmarkStart w:id="96" w:name="_Toc164955394"/>
+      <w:bookmarkStart w:id="94" w:name="_Toc164957127"/>
+      <w:bookmarkStart w:id="95" w:name="_Toc164955394"/>
+      <w:bookmarkStart w:id="96" w:name="_Toc164957348"/>
       <w:r>
         <w:rPr>
           <w:sz w:val="26"/>
@@ -12051,11 +12353,11 @@
         </w:rPr>
       </w:pPr>
       <w:bookmarkStart w:id="97" w:name="_Toc164957128"/>
-      <w:bookmarkStart w:id="98" w:name="_Toc164957621"/>
-      <w:bookmarkStart w:id="99" w:name="_Toc164957349"/>
+      <w:bookmarkStart w:id="98" w:name="_Toc164957349"/>
+      <w:bookmarkStart w:id="99" w:name="_Toc164955395"/>
       <w:bookmarkStart w:id="100" w:name="_Toc164957270"/>
       <w:bookmarkStart w:id="101" w:name="_Toc164954909"/>
-      <w:bookmarkStart w:id="102" w:name="_Toc164955395"/>
+      <w:bookmarkStart w:id="102" w:name="_Toc164957621"/>
       <w:r>
         <w:rPr>
           <w:sz w:val="26"/>
@@ -13274,6 +13576,12 @@
             <w:insideH w:val="single" w:color="auto" w:sz="4" w:space="0"/>
             <w:insideV w:val="single" w:color="auto" w:sz="4" w:space="0"/>
           </w:tblBorders>
+          <w:tblCellMar>
+            <w:top w:w="0" w:type="dxa"/>
+            <w:left w:w="108" w:type="dxa"/>
+            <w:bottom w:w="0" w:type="dxa"/>
+            <w:right w:w="108" w:type="dxa"/>
+          </w:tblCellMar>
         </w:tblPrEx>
         <w:tc>
           <w:tcPr>
@@ -13438,12 +13746,12 @@
           <w:szCs w:val="26"/>
         </w:rPr>
       </w:pPr>
-      <w:bookmarkStart w:id="105" w:name="_Toc164957272"/>
-      <w:bookmarkStart w:id="106" w:name="_Toc164957351"/>
-      <w:bookmarkStart w:id="107" w:name="_Toc164955397"/>
-      <w:bookmarkStart w:id="108" w:name="_Toc164957623"/>
-      <w:bookmarkStart w:id="109" w:name="_Toc164954911"/>
-      <w:bookmarkStart w:id="110" w:name="_Toc164957130"/>
+      <w:bookmarkStart w:id="105" w:name="_Toc164957351"/>
+      <w:bookmarkStart w:id="106" w:name="_Toc164957130"/>
+      <w:bookmarkStart w:id="107" w:name="_Toc164957272"/>
+      <w:bookmarkStart w:id="108" w:name="_Toc164955397"/>
+      <w:bookmarkStart w:id="109" w:name="_Toc164957623"/>
+      <w:bookmarkStart w:id="110" w:name="_Toc164954911"/>
       <w:bookmarkStart w:id="111" w:name="_Toc4532"/>
       <w:r>
         <w:rPr>
@@ -16129,17 +16437,7 @@
           <w:sz w:val="26"/>
           <w:szCs w:val="26"/>
         </w:rPr>
-        <w:t xml:space="preserve"> dễ nhớ tăng 0,15; khoảng ôn lần đầu là một ngày, lần tiếp theo là sáu ngày</w:t>
-      </w:r>
-      <w:bookmarkStart w:id="161" w:name="_GoBack"/>
-      <w:bookmarkEnd w:id="161"/>
-      <w:r>
-        <w:rPr>
-          <w:rFonts w:hint="eastAsia"/>
-          <w:sz w:val="26"/>
-          <w:szCs w:val="26"/>
-        </w:rPr>
-        <w:t xml:space="preserve"> và những lần sau được tính từ khoảng ôn trước nhân với hệ số dễ nhớ.</w:t>
+        <w:t xml:space="preserve"> dễ nhớ tăng 0,15; khoảng ôn lần đầu là một ngày, lần tiếp theo là sáu ngày và những lần sau được tính từ khoảng ôn trước nhân với hệ số dễ nhớ.</w:t>
       </w:r>
     </w:p>
     <w:p>
@@ -16436,7 +16734,6 @@
           <w:szCs w:val="26"/>
         </w:rPr>
         <w:sectPr>
-          <w:headerReference r:id="rId6" w:type="default"/>
           <w:pgSz w:w="11906" w:h="16838"/>
           <w:pgMar w:top="1701" w:right="1138" w:bottom="1701" w:left="1985" w:header="709" w:footer="709" w:gutter="0"/>
           <w:cols w:space="708" w:num="1"/>
@@ -16444,11 +16741,11 @@
         </w:sectPr>
       </w:pPr>
       <w:bookmarkStart w:id="115" w:name="_Toc164957131"/>
-      <w:bookmarkStart w:id="116" w:name="_Toc164957273"/>
-      <w:bookmarkStart w:id="117" w:name="_Toc164957624"/>
-      <w:bookmarkStart w:id="118" w:name="_Toc164957352"/>
+      <w:bookmarkStart w:id="116" w:name="_Toc164957624"/>
+      <w:bookmarkStart w:id="117" w:name="_Toc164954912"/>
+      <w:bookmarkStart w:id="118" w:name="_Toc164957273"/>
       <w:bookmarkStart w:id="119" w:name="_Toc164955398"/>
-      <w:bookmarkStart w:id="120" w:name="_Toc164954912"/>
+      <w:bookmarkStart w:id="120" w:name="_Toc164957352"/>
       <w:r>
         <w:rPr>
           <w:sz w:val="26"/>
@@ -19915,12 +20212,12 @@
           <w:rFonts w:hint="default"/>
         </w:rPr>
       </w:pPr>
-      <w:bookmarkStart w:id="126" w:name="_Toc164957274"/>
-      <w:bookmarkStart w:id="127" w:name="_Toc164957353"/>
+      <w:bookmarkStart w:id="126" w:name="_Toc164957132"/>
+      <w:bookmarkStart w:id="127" w:name="_Toc164957625"/>
       <w:bookmarkStart w:id="128" w:name="_Toc164955399"/>
-      <w:bookmarkStart w:id="129" w:name="_Toc164957625"/>
-      <w:bookmarkStart w:id="130" w:name="_Toc164954913"/>
-      <w:bookmarkStart w:id="131" w:name="_Toc164957132"/>
+      <w:bookmarkStart w:id="129" w:name="_Toc164954913"/>
+      <w:bookmarkStart w:id="130" w:name="_Toc164957353"/>
+      <w:bookmarkStart w:id="131" w:name="_Toc164957274"/>
     </w:p>
     <w:p>
       <w:pPr>
@@ -19981,13 +20278,13 @@
         <w:spacing w:line="360" w:lineRule="auto"/>
         <w:jc w:val="both"/>
       </w:pPr>
-      <w:bookmarkStart w:id="133" w:name="_Toc164957354"/>
-      <w:bookmarkStart w:id="134" w:name="_Toc164957133"/>
+      <w:bookmarkStart w:id="133" w:name="_Toc164955400"/>
+      <w:bookmarkStart w:id="134" w:name="_Toc164957626"/>
       <w:bookmarkStart w:id="135" w:name="_Toc164954914"/>
-      <w:bookmarkStart w:id="136" w:name="_Toc164955400"/>
+      <w:bookmarkStart w:id="136" w:name="_Toc164957354"/>
       <w:bookmarkStart w:id="137" w:name="_Toc164957275"/>
-      <w:bookmarkStart w:id="138" w:name="_Toc164957626"/>
-      <w:bookmarkStart w:id="139" w:name="_Toc31957"/>
+      <w:bookmarkStart w:id="138" w:name="_Toc31957"/>
+      <w:bookmarkStart w:id="139" w:name="_Toc164957133"/>
       <w:r>
         <w:t>KẾT QUẢ</w:t>
       </w:r>
@@ -20196,9 +20493,9 @@
         <w:t xml:space="preserve"> </w:t>
       </w:r>
       <w:bookmarkStart w:id="143" w:name="_Toc164957627"/>
-      <w:bookmarkStart w:id="144" w:name="_Toc20875"/>
-      <w:bookmarkStart w:id="145" w:name="_Toc164957276"/>
-      <w:bookmarkStart w:id="146" w:name="_Toc164957355"/>
+      <w:bookmarkStart w:id="144" w:name="_Toc164957276"/>
+      <w:bookmarkStart w:id="145" w:name="_Toc164957355"/>
+      <w:bookmarkStart w:id="146" w:name="_Toc20875"/>
       <w:r>
         <w:rPr>
           <w:rFonts w:cs="Times New Roman"/>
@@ -20332,9 +20629,9 @@
         </w:rPr>
         <w:t xml:space="preserve"> </w:t>
       </w:r>
-      <w:bookmarkStart w:id="147" w:name="_Toc14473"/>
-      <w:bookmarkStart w:id="148" w:name="_Toc164957628"/>
-      <w:bookmarkStart w:id="149" w:name="_Toc164957356"/>
+      <w:bookmarkStart w:id="147" w:name="_Toc164957356"/>
+      <w:bookmarkStart w:id="148" w:name="_Toc14473"/>
+      <w:bookmarkStart w:id="149" w:name="_Toc164957628"/>
       <w:r>
         <w:rPr>
           <w:rStyle w:val="39"/>
@@ -22233,11 +22530,11 @@
         </w:numPr>
         <w:jc w:val="both"/>
       </w:pPr>
-      <w:bookmarkStart w:id="150" w:name="_Toc164955402"/>
-      <w:bookmarkStart w:id="151" w:name="_Toc164954916"/>
+      <w:bookmarkStart w:id="150" w:name="_Toc164954916"/>
+      <w:bookmarkStart w:id="151" w:name="_Toc164955402"/>
       <w:bookmarkStart w:id="152" w:name="_Toc164957135"/>
-      <w:bookmarkStart w:id="153" w:name="_Toc9560"/>
-      <w:bookmarkStart w:id="154" w:name="_Toc164957629"/>
+      <w:bookmarkStart w:id="153" w:name="_Toc164957629"/>
+      <w:bookmarkStart w:id="154" w:name="_Toc9560"/>
       <w:r>
         <w:t>PHỤ LỤC (nếu có)</w:t>
       </w:r>
@@ -25516,6 +25813,7 @@
     <customSectPr/>
     <customSectPr/>
     <customSectPr/>
+    <customSectPr/>
   </customSectProps>
   <customShpExts>
     <customShpInfo spid="_x0000_s1026" textRotate="1"/>

</xml_diff>

<commit_message>
docs: add final thesis document for graduation project
</commit_message>
<xml_diff>
--- a/Document/22130016_TieuLuanTN_KCNTT_NLU.docx
+++ b/Document/22130016_TieuLuanTN_KCNTT_NLU.docx
@@ -17597,7 +17597,6 @@
             <w:insideH w:val="none" w:color="auto" w:sz="0" w:space="0"/>
             <w:insideV w:val="none" w:color="auto" w:sz="0" w:space="0"/>
           </w:tblBorders>
-          <w:shd w:val="clear"/>
           <w:tblCellMar>
             <w:top w:w="15" w:type="dxa"/>
             <w:left w:w="15" w:type="dxa"/>
@@ -18477,6 +18476,7 @@
             <w:insideH w:val="none" w:color="auto" w:sz="0" w:space="0"/>
             <w:insideV w:val="none" w:color="auto" w:sz="0" w:space="0"/>
           </w:tblBorders>
+          <w:shd w:val="clear"/>
           <w:tblCellMar>
             <w:top w:w="15" w:type="dxa"/>
             <w:left w:w="15" w:type="dxa"/>
@@ -18586,6 +18586,7 @@
             <w:insideH w:val="none" w:color="auto" w:sz="0" w:space="0"/>
             <w:insideV w:val="none" w:color="auto" w:sz="0" w:space="0"/>
           </w:tblBorders>
+          <w:shd w:val="clear"/>
           <w:tblCellMar>
             <w:top w:w="15" w:type="dxa"/>
             <w:left w:w="15" w:type="dxa"/>
@@ -19355,6 +19356,7 @@
             <w:insideH w:val="none" w:color="auto" w:sz="0" w:space="0"/>
             <w:insideV w:val="none" w:color="auto" w:sz="0" w:space="0"/>
           </w:tblBorders>
+          <w:shd w:val="clear"/>
           <w:tblCellMar>
             <w:top w:w="15" w:type="dxa"/>
             <w:left w:w="15" w:type="dxa"/>
@@ -19867,6 +19869,79 @@
             <w:insideH w:val="none" w:color="auto" w:sz="0" w:space="0"/>
             <w:insideV w:val="none" w:color="auto" w:sz="0" w:space="0"/>
           </w:tblBorders>
+          <w:tblCellMar>
+            <w:top w:w="15" w:type="dxa"/>
+            <w:left w:w="15" w:type="dxa"/>
+            <w:bottom w:w="15" w:type="dxa"/>
+            <w:right w:w="15" w:type="dxa"/>
+          </w:tblCellMar>
+        </w:tblPrEx>
+        <w:trPr>
+          <w:tblCellSpacing w:w="15" w:type="dxa"/>
+        </w:trPr>
+        <w:tc>
+          <w:tcPr>
+            <w:tcW w:w="0" w:type="auto"/>
+            <w:shd w:val="clear"/>
+            <w:vAlign w:val="center"/>
+          </w:tcPr>
+          <w:p>
+            <w:pPr>
+              <w:keepNext w:val="0"/>
+              <w:keepLines w:val="0"/>
+              <w:widowControl/>
+              <w:suppressLineNumbers w:val="0"/>
+              <w:jc w:val="left"/>
+            </w:pPr>
+            <w:r>
+              <w:rPr>
+                <w:rFonts w:ascii="SimSun" w:hAnsi="SimSun" w:eastAsia="SimSun" w:cs="SimSun"/>
+                <w:kern w:val="0"/>
+                <w:sz w:val="24"/>
+                <w:szCs w:val="24"/>
+                <w:lang w:val="en-US" w:eastAsia="zh-CN" w:bidi="ar"/>
+              </w:rPr>
+              <w:t>PK03</w:t>
+            </w:r>
+          </w:p>
+        </w:tc>
+        <w:tc>
+          <w:tcPr>
+            <w:tcW w:w="0" w:type="auto"/>
+            <w:shd w:val="clear"/>
+            <w:vAlign w:val="center"/>
+          </w:tcPr>
+          <w:p>
+            <w:pPr>
+              <w:keepNext w:val="0"/>
+              <w:keepLines w:val="0"/>
+              <w:widowControl/>
+              <w:suppressLineNumbers w:val="0"/>
+              <w:jc w:val="left"/>
+            </w:pPr>
+            <w:r>
+              <w:rPr>
+                <w:rFonts w:ascii="SimSun" w:hAnsi="SimSun" w:eastAsia="SimSun" w:cs="SimSun"/>
+                <w:kern w:val="0"/>
+                <w:sz w:val="24"/>
+                <w:szCs w:val="24"/>
+                <w:lang w:val="en-US" w:eastAsia="zh-CN" w:bidi="ar"/>
+              </w:rPr>
+              <w:t>Tài khoản bị khóa phải bị từ chối ở yêu cầu tiếp theo</w:t>
+            </w:r>
+          </w:p>
+        </w:tc>
+      </w:tr>
+      <w:tr>
+        <w:tblPrEx>
+          <w:tblBorders>
+            <w:top w:val="none" w:color="auto" w:sz="0" w:space="0"/>
+            <w:left w:val="none" w:color="auto" w:sz="0" w:space="0"/>
+            <w:bottom w:val="none" w:color="auto" w:sz="0" w:space="0"/>
+            <w:right w:val="none" w:color="auto" w:sz="0" w:space="0"/>
+            <w:insideH w:val="none" w:color="auto" w:sz="0" w:space="0"/>
+            <w:insideV w:val="none" w:color="auto" w:sz="0" w:space="0"/>
+          </w:tblBorders>
           <w:shd w:val="clear"/>
           <w:tblCellMar>
             <w:top w:w="15" w:type="dxa"/>
@@ -19900,7 +19975,7 @@
                 <w:szCs w:val="24"/>
                 <w:lang w:val="en-US" w:eastAsia="zh-CN" w:bidi="ar"/>
               </w:rPr>
-              <w:t>PK03</w:t>
+              <w:t>PK04</w:t>
             </w:r>
           </w:p>
         </w:tc>
@@ -19926,7 +20001,7 @@
                 <w:szCs w:val="24"/>
                 <w:lang w:val="en-US" w:eastAsia="zh-CN" w:bidi="ar"/>
               </w:rPr>
-              <w:t>Tài khoản bị khóa phải bị từ chối ở yêu cầu tiếp theo</w:t>
+              <w:t>Tập nhãn của mô hình và cơ sở dữ liệu phải đồng nhất và đủ 365 nhãn</w:t>
             </w:r>
           </w:p>
         </w:tc>
@@ -19941,6 +20016,7 @@
             <w:insideH w:val="none" w:color="auto" w:sz="0" w:space="0"/>
             <w:insideV w:val="none" w:color="auto" w:sz="0" w:space="0"/>
           </w:tblBorders>
+          <w:shd w:val="clear"/>
           <w:tblCellMar>
             <w:top w:w="15" w:type="dxa"/>
             <w:left w:w="15" w:type="dxa"/>
@@ -19973,7 +20049,7 @@
                 <w:szCs w:val="24"/>
                 <w:lang w:val="en-US" w:eastAsia="zh-CN" w:bidi="ar"/>
               </w:rPr>
-              <w:t>PK04</w:t>
+              <w:t>PK05</w:t>
             </w:r>
           </w:p>
         </w:tc>
@@ -19999,7 +20075,7 @@
                 <w:szCs w:val="24"/>
                 <w:lang w:val="en-US" w:eastAsia="zh-CN" w:bidi="ar"/>
               </w:rPr>
-              <w:t>Tập nhãn của mô hình và cơ sở dữ liệu phải đồng nhất và đủ 365 nhãn</w:t>
+              <w:t>Một người dùng và một mục từ chỉ được có tối đa một thẻ ghi nhớ</w:t>
             </w:r>
           </w:p>
         </w:tc>
@@ -20014,6 +20090,7 @@
             <w:insideH w:val="none" w:color="auto" w:sz="0" w:space="0"/>
             <w:insideV w:val="none" w:color="auto" w:sz="0" w:space="0"/>
           </w:tblBorders>
+          <w:shd w:val="clear"/>
           <w:tblCellMar>
             <w:top w:w="15" w:type="dxa"/>
             <w:left w:w="15" w:type="dxa"/>
@@ -20046,79 +20123,6 @@
                 <w:szCs w:val="24"/>
                 <w:lang w:val="en-US" w:eastAsia="zh-CN" w:bidi="ar"/>
               </w:rPr>
-              <w:t>PK05</w:t>
-            </w:r>
-          </w:p>
-        </w:tc>
-        <w:tc>
-          <w:tcPr>
-            <w:tcW w:w="0" w:type="auto"/>
-            <w:shd w:val="clear"/>
-            <w:vAlign w:val="center"/>
-          </w:tcPr>
-          <w:p>
-            <w:pPr>
-              <w:keepNext w:val="0"/>
-              <w:keepLines w:val="0"/>
-              <w:widowControl/>
-              <w:suppressLineNumbers w:val="0"/>
-              <w:jc w:val="left"/>
-            </w:pPr>
-            <w:r>
-              <w:rPr>
-                <w:rFonts w:ascii="SimSun" w:hAnsi="SimSun" w:eastAsia="SimSun" w:cs="SimSun"/>
-                <w:kern w:val="0"/>
-                <w:sz w:val="24"/>
-                <w:szCs w:val="24"/>
-                <w:lang w:val="en-US" w:eastAsia="zh-CN" w:bidi="ar"/>
-              </w:rPr>
-              <w:t>Một người dùng và một mục từ chỉ được có tối đa một thẻ ghi nhớ</w:t>
-            </w:r>
-          </w:p>
-        </w:tc>
-      </w:tr>
-      <w:tr>
-        <w:tblPrEx>
-          <w:tblBorders>
-            <w:top w:val="none" w:color="auto" w:sz="0" w:space="0"/>
-            <w:left w:val="none" w:color="auto" w:sz="0" w:space="0"/>
-            <w:bottom w:val="none" w:color="auto" w:sz="0" w:space="0"/>
-            <w:right w:val="none" w:color="auto" w:sz="0" w:space="0"/>
-            <w:insideH w:val="none" w:color="auto" w:sz="0" w:space="0"/>
-            <w:insideV w:val="none" w:color="auto" w:sz="0" w:space="0"/>
-          </w:tblBorders>
-          <w:tblCellMar>
-            <w:top w:w="15" w:type="dxa"/>
-            <w:left w:w="15" w:type="dxa"/>
-            <w:bottom w:w="15" w:type="dxa"/>
-            <w:right w:w="15" w:type="dxa"/>
-          </w:tblCellMar>
-        </w:tblPrEx>
-        <w:trPr>
-          <w:tblCellSpacing w:w="15" w:type="dxa"/>
-        </w:trPr>
-        <w:tc>
-          <w:tcPr>
-            <w:tcW w:w="0" w:type="auto"/>
-            <w:shd w:val="clear"/>
-            <w:vAlign w:val="center"/>
-          </w:tcPr>
-          <w:p>
-            <w:pPr>
-              <w:keepNext w:val="0"/>
-              <w:keepLines w:val="0"/>
-              <w:widowControl/>
-              <w:suppressLineNumbers w:val="0"/>
-              <w:jc w:val="left"/>
-            </w:pPr>
-            <w:r>
-              <w:rPr>
-                <w:rFonts w:ascii="SimSun" w:hAnsi="SimSun" w:eastAsia="SimSun" w:cs="SimSun"/>
-                <w:kern w:val="0"/>
-                <w:sz w:val="24"/>
-                <w:szCs w:val="24"/>
-                <w:lang w:val="en-US" w:eastAsia="zh-CN" w:bidi="ar"/>
-              </w:rPr>
               <w:t>PK06</w:t>
             </w:r>
           </w:p>
@@ -20160,6 +20164,7 @@
             <w:insideH w:val="none" w:color="auto" w:sz="0" w:space="0"/>
             <w:insideV w:val="none" w:color="auto" w:sz="0" w:space="0"/>
           </w:tblBorders>
+          <w:shd w:val="clear"/>
           <w:tblCellMar>
             <w:top w:w="15" w:type="dxa"/>
             <w:left w:w="15" w:type="dxa"/>
@@ -20307,6 +20312,7 @@
             <w:insideH w:val="none" w:color="auto" w:sz="0" w:space="0"/>
             <w:insideV w:val="none" w:color="auto" w:sz="0" w:space="0"/>
           </w:tblBorders>
+          <w:shd w:val="clear"/>
           <w:tblCellMar>
             <w:top w:w="15" w:type="dxa"/>
             <w:left w:w="15" w:type="dxa"/>
@@ -20380,6 +20386,7 @@
             <w:insideH w:val="none" w:color="auto" w:sz="0" w:space="0"/>
             <w:insideV w:val="none" w:color="auto" w:sz="0" w:space="0"/>
           </w:tblBorders>
+          <w:shd w:val="clear"/>
           <w:tblCellMar>
             <w:top w:w="15" w:type="dxa"/>
             <w:left w:w="15" w:type="dxa"/>
@@ -20453,7 +20460,6 @@
             <w:insideH w:val="none" w:color="auto" w:sz="0" w:space="0"/>
             <w:insideV w:val="none" w:color="auto" w:sz="0" w:space="0"/>
           </w:tblBorders>
-          <w:shd w:val="clear"/>
           <w:tblCellMar>
             <w:top w:w="15" w:type="dxa"/>
             <w:left w:w="15" w:type="dxa"/>
@@ -22413,8 +22419,6 @@
       <w:r>
         <w:t>ần lượt là chiều rộng và chiều cao thực tế của ảnh sau khi được thu phóng để hiển thị.</w:t>
       </w:r>
-      <w:bookmarkStart w:id="130" w:name="_GoBack"/>
-      <w:bookmarkEnd w:id="130"/>
     </w:p>
     <w:p>
       <w:pPr>
@@ -22822,6 +22826,150 @@
     </w:p>
     <w:p>
       <w:pPr>
+        <w:rPr>
+          <w:rFonts w:hint="default"/>
+        </w:rPr>
+      </w:pPr>
+      <w:r>
+        <w:rPr>
+          <w:rFonts w:hint="eastAsia"/>
+        </w:rPr>
+        <w:t xml:space="preserve">Trong đó, </w:t>
+      </w:r>
+      <m:oMath>
+        <m:sSub>
+          <m:sSubPr>
+            <m:ctrlPr>
+              <w:rPr>
+                <w:rFonts w:hint="default" w:ascii="Cambria Math" w:hAnsi="Cambria Math"/>
+                <w:sz w:val="24"/>
+              </w:rPr>
+            </m:ctrlPr>
+          </m:sSubPr>
+          <m:e>
+            <m:r>
+              <m:rPr/>
+              <w:rPr>
+                <w:rFonts w:hint="default" w:ascii="Cambria Math" w:hAnsi="Cambria Math"/>
+                <w:sz w:val="24"/>
+              </w:rPr>
+              <m:t>O</m:t>
+            </m:r>
+            <m:ctrlPr>
+              <w:rPr>
+                <w:rFonts w:ascii="Cambria Math" w:hAnsi="Cambria Math"/>
+                <w:sz w:val="24"/>
+              </w:rPr>
+            </m:ctrlPr>
+          </m:e>
+          <m:sub>
+            <m:r>
+              <m:rPr/>
+              <w:rPr>
+                <w:rFonts w:hint="default" w:ascii="Cambria Math" w:hAnsi="Cambria Math"/>
+                <w:sz w:val="24"/>
+              </w:rPr>
+              <m:t>x</m:t>
+            </m:r>
+            <m:ctrlPr>
+              <w:rPr>
+                <w:rFonts w:ascii="Cambria Math" w:hAnsi="Cambria Math"/>
+                <w:sz w:val="24"/>
+              </w:rPr>
+            </m:ctrlPr>
+          </m:sub>
+        </m:sSub>
+      </m:oMath>
+      <w:r>
+        <w:rPr>
+          <w:rFonts w:hint="default" w:hAnsi="Cambria Math"/>
+          <w:i w:val="0"/>
+          <w:sz w:val="24"/>
+          <w:lang w:val="en-US"/>
+        </w:rPr>
+        <w:t xml:space="preserve"> </w:t>
+      </w:r>
+      <w:r>
+        <w:rPr>
+          <w:rFonts w:hint="eastAsia"/>
+        </w:rPr>
+        <w:t xml:space="preserve">là khoảng lệch theo chiều ngang và </w:t>
+      </w:r>
+      <m:oMath>
+        <m:sSub>
+          <m:sSubPr>
+            <m:ctrlPr>
+              <w:rPr>
+                <w:rFonts w:hint="default" w:ascii="Cambria Math" w:hAnsi="Cambria Math"/>
+                <w:sz w:val="24"/>
+              </w:rPr>
+            </m:ctrlPr>
+          </m:sSubPr>
+          <m:e>
+            <m:r>
+              <m:rPr/>
+              <w:rPr>
+                <w:rFonts w:hint="default" w:ascii="Cambria Math" w:hAnsi="Cambria Math"/>
+                <w:sz w:val="24"/>
+              </w:rPr>
+              <m:t>O</m:t>
+            </m:r>
+            <m:ctrlPr>
+              <w:rPr>
+                <w:rFonts w:ascii="Cambria Math" w:hAnsi="Cambria Math"/>
+                <w:sz w:val="24"/>
+              </w:rPr>
+            </m:ctrlPr>
+          </m:e>
+          <m:sub>
+            <m:r>
+              <m:rPr/>
+              <w:rPr>
+                <w:rFonts w:hint="default" w:ascii="Cambria Math" w:hAnsi="Cambria Math"/>
+                <w:sz w:val="24"/>
+              </w:rPr>
+              <m:t>y</m:t>
+            </m:r>
+            <m:ctrlPr>
+              <w:rPr>
+                <w:rFonts w:ascii="Cambria Math" w:hAnsi="Cambria Math"/>
+                <w:sz w:val="24"/>
+              </w:rPr>
+            </m:ctrlPr>
+          </m:sub>
+        </m:sSub>
+      </m:oMath>
+      <w:r>
+        <w:rPr>
+          <w:rFonts w:hint="default" w:hAnsi="Cambria Math"/>
+          <w:i w:val="0"/>
+          <w:sz w:val="24"/>
+          <w:lang w:val="en-US"/>
+        </w:rPr>
+        <w:t xml:space="preserve"> </w:t>
+      </w:r>
+      <w:r>
+        <w:rPr>
+          <w:rFonts w:hint="eastAsia"/>
+        </w:rPr>
+        <w:t xml:space="preserve">là khoảng lệch theo chiều dọc giữa </w:t>
+      </w:r>
+      <w:r>
+        <w:rPr>
+          <w:rFonts w:hint="default"/>
+          <w:lang w:val="en-US"/>
+        </w:rPr>
+        <w:t>ả</w:t>
+      </w:r>
+      <w:r>
+        <w:rPr>
+          <w:rFonts w:hint="eastAsia"/>
+        </w:rPr>
+        <w:t>nh sau thu phóng với vùng hiển thị.</w:t>
+      </w:r>
+    </w:p>
+    <w:p>
+      <w:pPr>
         <w:pStyle w:val="26"/>
         <w:keepNext w:val="0"/>
         <w:keepLines w:val="0"/>
@@ -22832,6 +22980,207 @@
       </w:pPr>
       <w:r>
         <w:t>Điểm nằm chính giữa ảnh gốc vì vậy cũng nằm chính giữa vùng hiển thị. Trường hợp này cho thấy cùng một công thức có thể xử lý cả ảnh ngang và ảnh dọc mà không cần viết hai thuật toán khác nhau.</w:t>
+      </w:r>
+    </w:p>
+    <w:p>
+      <w:r>
+        <w:t xml:space="preserve">Với một điểm có tọa độ </w:t>
+      </w:r>
+      <m:oMath>
+        <m:r>
+          <m:rPr/>
+          <w:rPr>
+            <w:rFonts w:hint="default" w:ascii="Cambria Math" w:hAnsi="Cambria Math"/>
+            <w:sz w:val="24"/>
+          </w:rPr>
+          <m:t>(x,y)</m:t>
+        </m:r>
+      </m:oMath>
+      <w:r>
+        <w:t xml:space="preserve"> trên ảnh gốc, tọa độ tương ứng trên vùng hiển thị được xác định:</w:t>
+      </w:r>
+    </w:p>
+    <w:p>
+      <w:pPr>
+        <m:rPr/>
+        <w:rPr>
+          <w:rFonts w:hint="default" w:hAnsi="Cambria Math" w:eastAsia="Times New Roman"/>
+          <w:i w:val="0"/>
+          <w:sz w:val="24"/>
+        </w:rPr>
+      </w:pPr>
+      <m:oMathPara>
+        <m:oMath>
+          <m:r>
+            <m:rPr/>
+            <w:rPr>
+              <w:rFonts w:hint="default" w:ascii="Cambria Math" w:hAnsi="Cambria Math" w:eastAsia="Times New Roman"/>
+              <w:sz w:val="24"/>
+            </w:rPr>
+            <m:t>x'=</m:t>
+          </m:r>
+          <m:sSub>
+            <m:sSubPr>
+              <m:ctrlPr>
+                <w:rPr>
+                  <w:rFonts w:hint="default" w:ascii="Cambria Math" w:hAnsi="Cambria Math" w:eastAsia="Times New Roman"/>
+                  <w:sz w:val="24"/>
+                </w:rPr>
+              </m:ctrlPr>
+            </m:sSubPr>
+            <m:e>
+              <m:r>
+                <m:rPr/>
+                <w:rPr>
+                  <w:rFonts w:hint="default" w:ascii="Cambria Math" w:hAnsi="Cambria Math" w:eastAsia="Times New Roman"/>
+                  <w:sz w:val="24"/>
+                </w:rPr>
+                <m:t>O</m:t>
+              </m:r>
+              <m:ctrlPr>
+                <w:rPr>
+                  <w:rFonts w:ascii="Cambria Math" w:hAnsi="Cambria Math" w:eastAsia="Times New Roman"/>
+                  <w:sz w:val="24"/>
+                </w:rPr>
+              </m:ctrlPr>
+            </m:e>
+            <m:sub>
+              <m:r>
+                <m:rPr/>
+                <w:rPr>
+                  <w:rFonts w:hint="default" w:ascii="Cambria Math" w:hAnsi="Cambria Math" w:eastAsia="Times New Roman"/>
+                  <w:sz w:val="24"/>
+                </w:rPr>
+                <m:t>x</m:t>
+              </m:r>
+              <m:ctrlPr>
+                <w:rPr>
+                  <w:rFonts w:ascii="Cambria Math" w:hAnsi="Cambria Math" w:eastAsia="Times New Roman"/>
+                  <w:sz w:val="24"/>
+                </w:rPr>
+              </m:ctrlPr>
+            </m:sub>
+          </m:sSub>
+          <m:r>
+            <m:rPr/>
+            <w:rPr>
+              <w:rFonts w:hint="default" w:ascii="Cambria Math" w:hAnsi="Cambria Math" w:eastAsia="Times New Roman"/>
+              <w:sz w:val="24"/>
+            </w:rPr>
+            <m:t>+x×S</m:t>
+          </m:r>
+        </m:oMath>
+      </m:oMathPara>
+    </w:p>
+    <w:p>
+      <w:pPr>
+        <m:rPr/>
+        <w:rPr>
+          <w:rFonts w:hint="default"/>
+          <w:lang w:val="en-US" w:eastAsia="zh-CN"/>
+        </w:rPr>
+      </w:pPr>
+      <w:r>
+        <m:rPr/>
+        <w:rPr>
+          <w:rFonts w:hint="default"/>
+          <w:lang w:val="en-US" w:eastAsia="zh-CN"/>
+        </w:rPr>
+        <w:t xml:space="preserve">Và </w:t>
+      </w:r>
+    </w:p>
+    <w:p>
+      <w:pPr>
+        <m:rPr/>
+        <w:rPr>
+          <w:rFonts w:hint="default" w:hAnsi="Cambria Math" w:eastAsia="Times New Roman"/>
+          <w:i w:val="0"/>
+          <w:sz w:val="24"/>
+        </w:rPr>
+      </w:pPr>
+      <m:oMathPara>
+        <m:oMath>
+          <m:r>
+            <m:rPr/>
+            <w:rPr>
+              <w:rFonts w:hint="default" w:ascii="Cambria Math" w:hAnsi="Cambria Math" w:eastAsia="Times New Roman"/>
+              <w:sz w:val="24"/>
+            </w:rPr>
+            <m:t>y'=</m:t>
+          </m:r>
+          <m:sSub>
+            <m:sSubPr>
+              <m:ctrlPr>
+                <w:rPr>
+                  <w:rFonts w:hint="default" w:ascii="Cambria Math" w:hAnsi="Cambria Math" w:eastAsia="Times New Roman"/>
+                  <w:sz w:val="24"/>
+                </w:rPr>
+              </m:ctrlPr>
+            </m:sSubPr>
+            <m:e>
+              <m:r>
+                <m:rPr/>
+                <w:rPr>
+                  <w:rFonts w:hint="default" w:ascii="Cambria Math" w:hAnsi="Cambria Math" w:eastAsia="Times New Roman"/>
+                  <w:sz w:val="24"/>
+                </w:rPr>
+                <m:t>O</m:t>
+              </m:r>
+              <m:ctrlPr>
+                <w:rPr>
+                  <w:rFonts w:ascii="Cambria Math" w:hAnsi="Cambria Math" w:eastAsia="Times New Roman"/>
+                  <w:sz w:val="24"/>
+                </w:rPr>
+              </m:ctrlPr>
+            </m:e>
+            <m:sub>
+              <m:r>
+                <m:rPr/>
+                <w:rPr>
+                  <w:rFonts w:hint="default" w:ascii="Cambria Math" w:hAnsi="Cambria Math" w:eastAsia="Times New Roman"/>
+                  <w:sz w:val="24"/>
+                </w:rPr>
+                <m:t>y</m:t>
+              </m:r>
+              <m:ctrlPr>
+                <w:rPr>
+                  <w:rFonts w:ascii="Cambria Math" w:hAnsi="Cambria Math" w:eastAsia="Times New Roman"/>
+                  <w:sz w:val="24"/>
+                </w:rPr>
+              </m:ctrlPr>
+            </m:sub>
+          </m:sSub>
+          <m:r>
+            <m:rPr/>
+            <w:rPr>
+              <w:rFonts w:hint="default" w:ascii="Cambria Math" w:hAnsi="Cambria Math" w:eastAsia="Times New Roman"/>
+              <w:sz w:val="24"/>
+            </w:rPr>
+            <m:t>+y×S</m:t>
+          </m:r>
+        </m:oMath>
+      </m:oMathPara>
+    </w:p>
+    <w:p>
+      <w:pPr>
+        <m:rPr/>
+        <w:rPr>
+          <w:rFonts w:hint="default" w:hAnsi="Cambria Math" w:eastAsia="Times New Roman"/>
+          <w:i w:val="0"/>
+          <w:sz w:val="24"/>
+        </w:rPr>
+      </w:pPr>
+    </w:p>
+    <w:p>
+      <w:pPr>
+        <m:rPr/>
+        <w:rPr>
+          <w:rFonts w:hint="default"/>
+          <w:lang w:val="en-US" w:eastAsia="zh-CN"/>
+        </w:rPr>
+      </w:pPr>
+      <w:r>
+        <w:t>Cùng phép biến đổi được áp dụng cho hai góc của mỗi khung bao để xác định vị trí hiển thị của toàn bộ khung.</w:t>
       </w:r>
     </w:p>
     <w:p>
@@ -22913,23 +23262,239 @@
       </w:r>
     </w:p>
     <w:p>
-      <w:pPr>
-        <w:keepNext w:val="0"/>
-        <w:keepLines w:val="0"/>
-        <w:widowControl/>
-        <w:suppressLineNumbers w:val="0"/>
-        <w:jc w:val="left"/>
-      </w:pPr>
-      <w:r>
-        <w:rPr>
-          <w:rFonts w:ascii="SimSun" w:hAnsi="SimSun" w:eastAsia="SimSun" w:cs="SimSun"/>
-          <w:kern w:val="0"/>
+      <w:r>
+        <w:t xml:space="preserve">Gọi </w:t>
+      </w:r>
+      <m:oMath>
+        <m:sSub>
+          <m:sSubPr>
+            <m:ctrlPr>
+              <w:rPr>
+                <w:rFonts w:hint="default" w:ascii="Cambria Math" w:hAnsi="Cambria Math"/>
+                <w:sz w:val="24"/>
+              </w:rPr>
+            </m:ctrlPr>
+          </m:sSubPr>
+          <m:e>
+            <m:r>
+              <m:rPr/>
+              <w:rPr>
+                <w:rFonts w:hint="default" w:ascii="Cambria Math" w:hAnsi="Cambria Math"/>
+                <w:sz w:val="24"/>
+              </w:rPr>
+              <m:t>T</m:t>
+            </m:r>
+            <m:ctrlPr>
+              <w:rPr>
+                <w:rFonts w:ascii="Cambria Math" w:hAnsi="Cambria Math"/>
+                <w:sz w:val="24"/>
+              </w:rPr>
+            </m:ctrlPr>
+          </m:e>
+          <m:sub>
+            <m:r>
+              <m:rPr/>
+              <w:rPr>
+                <w:rFonts w:hint="default" w:ascii="Cambria Math" w:hAnsi="Cambria Math"/>
+                <w:sz w:val="24"/>
+              </w:rPr>
+              <m:t>o</m:t>
+            </m:r>
+            <m:ctrlPr>
+              <w:rPr>
+                <w:rFonts w:ascii="Cambria Math" w:hAnsi="Cambria Math"/>
+                <w:sz w:val="24"/>
+              </w:rPr>
+            </m:ctrlPr>
+          </m:sub>
+        </m:sSub>
+      </m:oMath>
+      <w:r>
+        <w:rPr>
+          <w:rFonts w:hint="default" w:hAnsi="Cambria Math"/>
+          <w:i w:val="0"/>
+          <w:sz w:val="24"/>
+          <w:lang w:val="en-US"/>
+        </w:rPr>
+        <w:t xml:space="preserve"> </w:t>
+      </w:r>
+      <w:r>
+        <w:t xml:space="preserve">là thời điểm thẻ được lên lịch ôn và </w:t>
+      </w:r>
+      <m:oMath>
+        <m:sSub>
+          <m:sSubPr>
+            <m:ctrlPr>
+              <w:rPr>
+                <w:rFonts w:hint="default" w:ascii="Cambria Math" w:hAnsi="Cambria Math"/>
+                <w:sz w:val="24"/>
+              </w:rPr>
+            </m:ctrlPr>
+          </m:sSubPr>
+          <m:e>
+            <m:r>
+              <m:rPr/>
+              <w:rPr>
+                <w:rFonts w:hint="default" w:ascii="Cambria Math" w:hAnsi="Cambria Math"/>
+                <w:sz w:val="24"/>
+              </w:rPr>
+              <m:t>T</m:t>
+            </m:r>
+            <m:ctrlPr>
+              <w:rPr>
+                <w:rFonts w:ascii="Cambria Math" w:hAnsi="Cambria Math"/>
+                <w:sz w:val="24"/>
+              </w:rPr>
+            </m:ctrlPr>
+          </m:e>
+          <m:sub>
+            <m:r>
+              <m:rPr/>
+              <w:rPr>
+                <w:rFonts w:hint="default" w:ascii="Cambria Math" w:hAnsi="Cambria Math"/>
+                <w:sz w:val="24"/>
+              </w:rPr>
+              <m:t>h</m:t>
+            </m:r>
+            <m:ctrlPr>
+              <w:rPr>
+                <w:rFonts w:ascii="Cambria Math" w:hAnsi="Cambria Math"/>
+                <w:sz w:val="24"/>
+              </w:rPr>
+            </m:ctrlPr>
+          </m:sub>
+        </m:sSub>
+      </m:oMath>
+      <w:r>
+        <w:rPr>
+          <w:rFonts w:hint="default" w:hAnsi="Cambria Math"/>
+          <w:i w:val="0"/>
+          <w:sz w:val="24"/>
+          <w:lang w:val="en-US"/>
+        </w:rPr>
+        <w:t xml:space="preserve"> </w:t>
+      </w:r>
+      <w:r>
+        <w:t>là thời điểm hiện tại. Một thẻ được đưa vào danh sách cần ôn khi:</w:t>
+      </w:r>
+    </w:p>
+    <w:p>
+      <w:pPr>
+        <w:rPr>
+          <w:rFonts w:hint="default" w:hAnsi="Cambria Math" w:eastAsia="Times New Roman" w:cs="Times New Roman"/>
+          <w:i w:val="0"/>
           <w:sz w:val="24"/>
           <w:szCs w:val="24"/>
-          <w:lang w:val="en-US" w:eastAsia="zh-CN" w:bidi="ar"/>
-        </w:rPr>
-        <w:t xml:space="preserve">To^n​≤Thiện tại​ </w:t>
-      </w:r>
+          <w:lang w:val="zh-CN" w:eastAsia="zh-CN" w:bidi="ar-SA"/>
+        </w:rPr>
+      </w:pPr>
+      <m:oMathPara>
+        <m:oMath>
+          <m:sSub>
+            <m:sSubPr>
+              <m:ctrlPr>
+                <w:rPr>
+                  <w:rFonts w:hint="default" w:ascii="Cambria Math" w:hAnsi="Cambria Math" w:eastAsia="Times New Roman"/>
+                  <w:sz w:val="26"/>
+                  <w:szCs w:val="26"/>
+                </w:rPr>
+              </m:ctrlPr>
+            </m:sSubPr>
+            <m:e>
+              <m:r>
+                <m:rPr/>
+                <w:rPr>
+                  <w:rFonts w:hint="default" w:ascii="Cambria Math" w:hAnsi="Cambria Math" w:eastAsia="Times New Roman"/>
+                  <w:sz w:val="26"/>
+                  <w:szCs w:val="26"/>
+                </w:rPr>
+                <m:t>T</m:t>
+              </m:r>
+              <m:ctrlPr>
+                <w:rPr>
+                  <w:rFonts w:ascii="Cambria Math" w:hAnsi="Cambria Math" w:eastAsia="Times New Roman"/>
+                  <w:sz w:val="26"/>
+                  <w:szCs w:val="26"/>
+                </w:rPr>
+              </m:ctrlPr>
+            </m:e>
+            <m:sub>
+              <m:r>
+                <m:rPr/>
+                <w:rPr>
+                  <w:rFonts w:hint="default" w:ascii="Cambria Math" w:hAnsi="Cambria Math" w:eastAsia="Times New Roman"/>
+                  <w:sz w:val="26"/>
+                  <w:szCs w:val="26"/>
+                </w:rPr>
+                <m:t>o</m:t>
+              </m:r>
+              <m:ctrlPr>
+                <w:rPr>
+                  <w:rFonts w:ascii="Cambria Math" w:hAnsi="Cambria Math" w:eastAsia="Times New Roman"/>
+                  <w:sz w:val="26"/>
+                  <w:szCs w:val="26"/>
+                </w:rPr>
+              </m:ctrlPr>
+            </m:sub>
+          </m:sSub>
+          <m:r>
+            <m:rPr/>
+            <w:rPr>
+              <w:rFonts w:hint="default" w:ascii="Cambria Math" w:hAnsi="Cambria Math" w:eastAsia="Times New Roman"/>
+              <w:sz w:val="26"/>
+              <w:szCs w:val="26"/>
+            </w:rPr>
+            <m:t>≤</m:t>
+          </m:r>
+          <m:sSub>
+            <m:sSubPr>
+              <m:ctrlPr>
+                <w:rPr>
+                  <w:rFonts w:hint="default" w:ascii="Cambria Math" w:hAnsi="Cambria Math" w:eastAsia="Times New Roman"/>
+                  <w:sz w:val="26"/>
+                  <w:szCs w:val="26"/>
+                </w:rPr>
+              </m:ctrlPr>
+            </m:sSubPr>
+            <m:e>
+              <m:r>
+                <m:rPr/>
+                <w:rPr>
+                  <w:rFonts w:hint="default" w:ascii="Cambria Math" w:hAnsi="Cambria Math" w:eastAsia="Times New Roman"/>
+                  <w:sz w:val="26"/>
+                  <w:szCs w:val="26"/>
+                </w:rPr>
+                <m:t>T</m:t>
+              </m:r>
+              <m:ctrlPr>
+                <w:rPr>
+                  <w:rFonts w:ascii="Cambria Math" w:hAnsi="Cambria Math" w:eastAsia="Times New Roman"/>
+                  <w:sz w:val="26"/>
+                  <w:szCs w:val="26"/>
+                </w:rPr>
+              </m:ctrlPr>
+            </m:e>
+            <m:sub>
+              <m:r>
+                <m:rPr/>
+                <w:rPr>
+                  <w:rFonts w:hint="default" w:ascii="Cambria Math" w:hAnsi="Cambria Math" w:eastAsia="Times New Roman"/>
+                  <w:sz w:val="26"/>
+                  <w:szCs w:val="26"/>
+                </w:rPr>
+                <m:t>h</m:t>
+              </m:r>
+              <m:ctrlPr>
+                <w:rPr>
+                  <w:rFonts w:ascii="Cambria Math" w:hAnsi="Cambria Math" w:eastAsia="Times New Roman"/>
+                  <w:sz w:val="26"/>
+                  <w:szCs w:val="26"/>
+                </w:rPr>
+              </m:ctrlPr>
+            </m:sub>
+          </m:sSub>
+        </m:oMath>
+      </m:oMathPara>
     </w:p>
     <w:p>
       <w:pPr>
@@ -23250,34 +23815,42 @@
         <w:keepLines w:val="0"/>
         <w:widowControl/>
         <w:suppressLineNumbers w:val="0"/>
-      </w:pPr>
-      <w:r>
-        <w:t xml:space="preserve">Các giải pháp trên hoàn thành phần thiết kế từ yêu cầu đến kiến trúc, dữ liệu và các quy trình nghiệp vụ chính. </w:t>
-      </w:r>
-      <w:r>
-        <w:rPr>
-          <w:rStyle w:val="27"/>
-        </w:rPr>
-        <w:t>Chương 4 hiện thực hóa giải pháp đã đề xuất, mô tả môi trường triển khai, cách xây dựng từng thành phần và kết quả kiểm thử, đánh giá toàn hệ thống.</w:t>
-      </w:r>
-    </w:p>
-    <w:p>
-      <w:pPr>
-        <w:spacing w:line="360" w:lineRule="auto"/>
-        <w:jc w:val="both"/>
         <w:rPr>
           <w:rFonts w:hint="default"/>
           <w:sz w:val="26"/>
           <w:szCs w:val="26"/>
         </w:rPr>
       </w:pPr>
+      <w:r>
+        <w:t xml:space="preserve">Các giải pháp trên hoàn thành phần thiết kế từ yêu cầu đến kiến trúc, dữ liệu và các quy trình nghiệp vụ chính. </w:t>
+      </w:r>
+      <w:r>
+        <w:rPr>
+          <w:rStyle w:val="27"/>
+        </w:rPr>
+        <w:t>Chương 4 hiện thực hóa giải pháp đã đề xuất, mô tả môi trường triển khai, cách xây dựng từng thành phần và kết quả kiểm thử, đánh giá toàn hệ thống.</w:t>
+      </w:r>
     </w:p>
     <w:p>
       <w:pPr>
         <w:pStyle w:val="2"/>
         <w:bidi w:val="0"/>
+        <w:sectPr>
+          <w:pgSz w:w="11906" w:h="16838"/>
+          <w:pgMar w:top="1701" w:right="1138" w:bottom="1701" w:left="1985" w:header="709" w:footer="709" w:gutter="0"/>
+          <w:cols w:space="708" w:num="1"/>
+          <w:docGrid w:linePitch="360" w:charSpace="0"/>
+        </w:sectPr>
       </w:pPr>
       <w:bookmarkStart w:id="104" w:name="_Toc23136"/>
+    </w:p>
+    <w:p>
+      <w:pPr>
+        <w:pStyle w:val="2"/>
+        <w:bidi w:val="0"/>
+      </w:pPr>
+      <w:bookmarkStart w:id="130" w:name="_GoBack"/>
+      <w:bookmarkEnd w:id="130"/>
       <w:r>
         <w:t>HIỆN THỰC GIẢI PHÁP</w:t>
       </w:r>
@@ -23552,7 +24125,6 @@
             <w:insideH w:val="none" w:color="auto" w:sz="0" w:space="0"/>
             <w:insideV w:val="none" w:color="auto" w:sz="0" w:space="0"/>
           </w:tblBorders>
-          <w:shd w:val="clear"/>
           <w:tblCellMar>
             <w:top w:w="15" w:type="dxa"/>
             <w:left w:w="15" w:type="dxa"/>
@@ -23752,7 +24324,6 @@
             <w:insideH w:val="none" w:color="auto" w:sz="0" w:space="0"/>
             <w:insideV w:val="none" w:color="auto" w:sz="0" w:space="0"/>
           </w:tblBorders>
-          <w:shd w:val="clear"/>
           <w:tblCellMar>
             <w:top w:w="15" w:type="dxa"/>
             <w:left w:w="15" w:type="dxa"/>
@@ -23952,7 +24523,6 @@
             <w:insideH w:val="none" w:color="auto" w:sz="0" w:space="0"/>
             <w:insideV w:val="none" w:color="auto" w:sz="0" w:space="0"/>
           </w:tblBorders>
-          <w:shd w:val="clear"/>
           <w:tblCellMar>
             <w:top w:w="15" w:type="dxa"/>
             <w:left w:w="15" w:type="dxa"/>
@@ -25313,6 +25883,7 @@
             <w:insideH w:val="none" w:color="auto" w:sz="0" w:space="0"/>
             <w:insideV w:val="none" w:color="auto" w:sz="0" w:space="0"/>
           </w:tblBorders>
+          <w:shd w:val="clear"/>
           <w:tblCellMar>
             <w:top w:w="15" w:type="dxa"/>
             <w:left w:w="15" w:type="dxa"/>
@@ -25547,7 +26118,6 @@
             <w:insideH w:val="none" w:color="auto" w:sz="0" w:space="0"/>
             <w:insideV w:val="none" w:color="auto" w:sz="0" w:space="0"/>
           </w:tblBorders>
-          <w:shd w:val="clear"/>
           <w:tblCellMar>
             <w:top w:w="15" w:type="dxa"/>
             <w:left w:w="15" w:type="dxa"/>
@@ -25769,7 +26339,6 @@
             <w:insideH w:val="none" w:color="auto" w:sz="0" w:space="0"/>
             <w:insideV w:val="none" w:color="auto" w:sz="0" w:space="0"/>
           </w:tblBorders>
-          <w:shd w:val="clear"/>
           <w:tblCellMar>
             <w:top w:w="15" w:type="dxa"/>
             <w:left w:w="15" w:type="dxa"/>
@@ -27066,7 +27635,6 @@
             <w:insideH w:val="none" w:color="auto" w:sz="0" w:space="0"/>
             <w:insideV w:val="none" w:color="auto" w:sz="0" w:space="0"/>
           </w:tblBorders>
-          <w:shd w:val="clear"/>
           <w:tblCellMar>
             <w:top w:w="15" w:type="dxa"/>
             <w:left w:w="15" w:type="dxa"/>
@@ -27166,7 +27734,6 @@
             <w:insideH w:val="none" w:color="auto" w:sz="0" w:space="0"/>
             <w:insideV w:val="none" w:color="auto" w:sz="0" w:space="0"/>
           </w:tblBorders>
-          <w:shd w:val="clear"/>
           <w:tblCellMar>
             <w:top w:w="15" w:type="dxa"/>
             <w:left w:w="15" w:type="dxa"/>
@@ -27266,7 +27833,6 @@
             <w:insideH w:val="none" w:color="auto" w:sz="0" w:space="0"/>
             <w:insideV w:val="none" w:color="auto" w:sz="0" w:space="0"/>
           </w:tblBorders>
-          <w:shd w:val="clear"/>
           <w:tblCellMar>
             <w:top w:w="15" w:type="dxa"/>
             <w:left w:w="15" w:type="dxa"/>
@@ -28958,6 +29524,7 @@
             <w:insideH w:val="none" w:color="auto" w:sz="0" w:space="0"/>
             <w:insideV w:val="none" w:color="auto" w:sz="0" w:space="0"/>
           </w:tblBorders>
+          <w:shd w:val="clear"/>
           <w:tblCellMar>
             <w:top w:w="15" w:type="dxa"/>
             <w:left w:w="15" w:type="dxa"/>
@@ -29157,6 +29724,7 @@
             <w:insideH w:val="none" w:color="auto" w:sz="0" w:space="0"/>
             <w:insideV w:val="none" w:color="auto" w:sz="0" w:space="0"/>
           </w:tblBorders>
+          <w:shd w:val="clear"/>
           <w:tblCellMar>
             <w:top w:w="15" w:type="dxa"/>
             <w:left w:w="15" w:type="dxa"/>
@@ -30354,7 +30922,6 @@
             <w:insideH w:val="none" w:color="auto" w:sz="0" w:space="0"/>
             <w:insideV w:val="none" w:color="auto" w:sz="0" w:space="0"/>
           </w:tblBorders>
-          <w:shd w:val="clear"/>
           <w:tblCellMar>
             <w:top w:w="15" w:type="dxa"/>
             <w:left w:w="15" w:type="dxa"/>
@@ -30440,6 +31007,157 @@
                 <w:lang w:val="en-US" w:eastAsia="zh-CN" w:bidi="ar"/>
               </w:rPr>
               <w:t>Yêu cầu tiếp theo nhận lỗi khóa</w:t>
+            </w:r>
+          </w:p>
+        </w:tc>
+        <w:tc>
+          <w:tcPr>
+            <w:tcW w:w="0" w:type="auto"/>
+            <w:shd w:val="clear"/>
+            <w:vAlign w:val="center"/>
+          </w:tcPr>
+          <w:p>
+            <w:pPr>
+              <w:keepNext w:val="0"/>
+              <w:keepLines w:val="0"/>
+              <w:widowControl/>
+              <w:suppressLineNumbers w:val="0"/>
+              <w:jc w:val="left"/>
+            </w:pPr>
+            <w:r>
+              <w:rPr>
+                <w:rFonts w:ascii="SimSun" w:hAnsi="SimSun" w:eastAsia="SimSun" w:cs="SimSun"/>
+                <w:kern w:val="0"/>
+                <w:sz w:val="24"/>
+                <w:szCs w:val="24"/>
+                <w:lang w:val="en-US" w:eastAsia="zh-CN" w:bidi="ar"/>
+              </w:rPr>
+              <w:t>[ ]</w:t>
+            </w:r>
+          </w:p>
+        </w:tc>
+        <w:tc>
+          <w:tcPr>
+            <w:tcW w:w="0" w:type="auto"/>
+            <w:shd w:val="clear"/>
+            <w:vAlign w:val="center"/>
+          </w:tcPr>
+          <w:p>
+            <w:pPr>
+              <w:keepNext w:val="0"/>
+              <w:keepLines w:val="0"/>
+              <w:widowControl/>
+              <w:suppressLineNumbers w:val="0"/>
+              <w:jc w:val="left"/>
+            </w:pPr>
+            <w:r>
+              <w:rPr>
+                <w:rFonts w:ascii="SimSun" w:hAnsi="SimSun" w:eastAsia="SimSun" w:cs="SimSun"/>
+                <w:kern w:val="0"/>
+                <w:sz w:val="24"/>
+                <w:szCs w:val="24"/>
+                <w:lang w:val="en-US" w:eastAsia="zh-CN" w:bidi="ar"/>
+              </w:rPr>
+              <w:t>[ ]</w:t>
+            </w:r>
+          </w:p>
+        </w:tc>
+      </w:tr>
+      <w:tr>
+        <w:tblPrEx>
+          <w:tblBorders>
+            <w:top w:val="none" w:color="auto" w:sz="0" w:space="0"/>
+            <w:left w:val="none" w:color="auto" w:sz="0" w:space="0"/>
+            <w:bottom w:val="none" w:color="auto" w:sz="0" w:space="0"/>
+            <w:right w:val="none" w:color="auto" w:sz="0" w:space="0"/>
+            <w:insideH w:val="none" w:color="auto" w:sz="0" w:space="0"/>
+            <w:insideV w:val="none" w:color="auto" w:sz="0" w:space="0"/>
+          </w:tblBorders>
+          <w:tblCellMar>
+            <w:top w:w="15" w:type="dxa"/>
+            <w:left w:w="15" w:type="dxa"/>
+            <w:bottom w:w="15" w:type="dxa"/>
+            <w:right w:w="15" w:type="dxa"/>
+          </w:tblCellMar>
+        </w:tblPrEx>
+        <w:trPr>
+          <w:tblCellSpacing w:w="15" w:type="dxa"/>
+        </w:trPr>
+        <w:tc>
+          <w:tcPr>
+            <w:tcW w:w="0" w:type="auto"/>
+            <w:shd w:val="clear"/>
+            <w:vAlign w:val="center"/>
+          </w:tcPr>
+          <w:p>
+            <w:pPr>
+              <w:keepNext w:val="0"/>
+              <w:keepLines w:val="0"/>
+              <w:widowControl/>
+              <w:suppressLineNumbers w:val="0"/>
+              <w:jc w:val="left"/>
+            </w:pPr>
+            <w:r>
+              <w:rPr>
+                <w:rFonts w:ascii="SimSun" w:hAnsi="SimSun" w:eastAsia="SimSun" w:cs="SimSun"/>
+                <w:kern w:val="0"/>
+                <w:sz w:val="24"/>
+                <w:szCs w:val="24"/>
+                <w:lang w:val="en-US" w:eastAsia="zh-CN" w:bidi="ar"/>
+              </w:rPr>
+              <w:t>KT04</w:t>
+            </w:r>
+          </w:p>
+        </w:tc>
+        <w:tc>
+          <w:tcPr>
+            <w:tcW w:w="0" w:type="auto"/>
+            <w:shd w:val="clear"/>
+            <w:vAlign w:val="center"/>
+          </w:tcPr>
+          <w:p>
+            <w:pPr>
+              <w:keepNext w:val="0"/>
+              <w:keepLines w:val="0"/>
+              <w:widowControl/>
+              <w:suppressLineNumbers w:val="0"/>
+              <w:jc w:val="left"/>
+            </w:pPr>
+            <w:r>
+              <w:rPr>
+                <w:rFonts w:ascii="SimSun" w:hAnsi="SimSun" w:eastAsia="SimSun" w:cs="SimSun"/>
+                <w:kern w:val="0"/>
+                <w:sz w:val="24"/>
+                <w:szCs w:val="24"/>
+                <w:lang w:val="en-US" w:eastAsia="zh-CN" w:bidi="ar"/>
+              </w:rPr>
+              <w:t>Chụp và chọn ảnh</w:t>
+            </w:r>
+          </w:p>
+        </w:tc>
+        <w:tc>
+          <w:tcPr>
+            <w:tcW w:w="0" w:type="auto"/>
+            <w:shd w:val="clear"/>
+            <w:vAlign w:val="center"/>
+          </w:tcPr>
+          <w:p>
+            <w:pPr>
+              <w:keepNext w:val="0"/>
+              <w:keepLines w:val="0"/>
+              <w:widowControl/>
+              <w:suppressLineNumbers w:val="0"/>
+              <w:jc w:val="left"/>
+            </w:pPr>
+            <w:r>
+              <w:rPr>
+                <w:rFonts w:ascii="SimSun" w:hAnsi="SimSun" w:eastAsia="SimSun" w:cs="SimSun"/>
+                <w:kern w:val="0"/>
+                <w:sz w:val="24"/>
+                <w:szCs w:val="24"/>
+                <w:lang w:val="en-US" w:eastAsia="zh-CN" w:bidi="ar"/>
+              </w:rPr>
+              <w:t>Ảnh được nhận thành công</w:t>
             </w:r>
           </w:p>
         </w:tc>
@@ -30539,7 +31257,7 @@
                 <w:szCs w:val="24"/>
                 <w:lang w:val="en-US" w:eastAsia="zh-CN" w:bidi="ar"/>
               </w:rPr>
-              <w:t>KT04</w:t>
+              <w:t>KT05</w:t>
             </w:r>
           </w:p>
         </w:tc>
@@ -30565,7 +31283,7 @@
                 <w:szCs w:val="24"/>
                 <w:lang w:val="en-US" w:eastAsia="zh-CN" w:bidi="ar"/>
               </w:rPr>
-              <w:t>Chụp và chọn ảnh</w:t>
+              <w:t>Ảnh nhiều vật thể</w:t>
             </w:r>
           </w:p>
         </w:tc>
@@ -30591,7 +31309,7 @@
                 <w:szCs w:val="24"/>
                 <w:lang w:val="en-US" w:eastAsia="zh-CN" w:bidi="ar"/>
               </w:rPr>
-              <w:t>Ảnh được nhận thành công</w:t>
+              <w:t>Hiển thị nhiều khung đúng vị trí</w:t>
             </w:r>
           </w:p>
         </w:tc>
@@ -30691,7 +31409,7 @@
                 <w:szCs w:val="24"/>
                 <w:lang w:val="en-US" w:eastAsia="zh-CN" w:bidi="ar"/>
               </w:rPr>
-              <w:t>KT05</w:t>
+              <w:t>KT06</w:t>
             </w:r>
           </w:p>
         </w:tc>
@@ -30717,7 +31435,7 @@
                 <w:szCs w:val="24"/>
                 <w:lang w:val="en-US" w:eastAsia="zh-CN" w:bidi="ar"/>
               </w:rPr>
-              <w:t>Ảnh nhiều vật thể</w:t>
+              <w:t>Chọn hai vật cùng nhãn</w:t>
             </w:r>
           </w:p>
         </w:tc>
@@ -30743,7 +31461,7 @@
                 <w:szCs w:val="24"/>
                 <w:lang w:val="en-US" w:eastAsia="zh-CN" w:bidi="ar"/>
               </w:rPr>
-              <w:t>Hiển thị nhiều khung đúng vị trí</w:t>
+              <w:t>Mỗi khung được chọn độc lập</w:t>
             </w:r>
           </w:p>
         </w:tc>
@@ -30843,7 +31561,7 @@
                 <w:szCs w:val="24"/>
                 <w:lang w:val="en-US" w:eastAsia="zh-CN" w:bidi="ar"/>
               </w:rPr>
-              <w:t>KT06</w:t>
+              <w:t>KT07</w:t>
             </w:r>
           </w:p>
         </w:tc>
@@ -30869,7 +31587,7 @@
                 <w:szCs w:val="24"/>
                 <w:lang w:val="en-US" w:eastAsia="zh-CN" w:bidi="ar"/>
               </w:rPr>
-              <w:t>Chọn hai vật cùng nhãn</w:t>
+              <w:t>Tắt FastAPI</w:t>
             </w:r>
           </w:p>
         </w:tc>
@@ -30895,7 +31613,7 @@
                 <w:szCs w:val="24"/>
                 <w:lang w:val="en-US" w:eastAsia="zh-CN" w:bidi="ar"/>
               </w:rPr>
-              <w:t>Mỗi khung được chọn độc lập</w:t>
+              <w:t>App báo lỗi, không bị dừng</w:t>
             </w:r>
           </w:p>
         </w:tc>
@@ -30995,7 +31713,7 @@
                 <w:szCs w:val="24"/>
                 <w:lang w:val="en-US" w:eastAsia="zh-CN" w:bidi="ar"/>
               </w:rPr>
-              <w:t>KT07</w:t>
+              <w:t>KT08</w:t>
             </w:r>
           </w:p>
         </w:tc>
@@ -31021,7 +31739,7 @@
                 <w:szCs w:val="24"/>
                 <w:lang w:val="en-US" w:eastAsia="zh-CN" w:bidi="ar"/>
               </w:rPr>
-              <w:t>Tắt FastAPI</w:t>
+              <w:t>Kiểm tra 365 nhãn</w:t>
             </w:r>
           </w:p>
         </w:tc>
@@ -31047,7 +31765,7 @@
                 <w:szCs w:val="24"/>
                 <w:lang w:val="en-US" w:eastAsia="zh-CN" w:bidi="ar"/>
               </w:rPr>
-              <w:t>App báo lỗi, không bị dừng</w:t>
+              <w:t>Hai tập hoàn toàn bằng nhau</w:t>
             </w:r>
           </w:p>
         </w:tc>
@@ -31147,7 +31865,7 @@
                 <w:szCs w:val="24"/>
                 <w:lang w:val="en-US" w:eastAsia="zh-CN" w:bidi="ar"/>
               </w:rPr>
-              <w:t>KT08</w:t>
+              <w:t>KT09</w:t>
             </w:r>
           </w:p>
         </w:tc>
@@ -31173,7 +31891,7 @@
                 <w:szCs w:val="24"/>
                 <w:lang w:val="en-US" w:eastAsia="zh-CN" w:bidi="ar"/>
               </w:rPr>
-              <w:t>Kiểm tra 365 nhãn</w:t>
+              <w:t>Lưu cùng một từ hai lần</w:t>
             </w:r>
           </w:p>
         </w:tc>
@@ -31199,7 +31917,158 @@
                 <w:szCs w:val="24"/>
                 <w:lang w:val="en-US" w:eastAsia="zh-CN" w:bidi="ar"/>
               </w:rPr>
-              <w:t>Hai tập hoàn toàn bằng nhau</w:t>
+              <w:t>Chỉ có một thẻ</w:t>
+            </w:r>
+          </w:p>
+        </w:tc>
+        <w:tc>
+          <w:tcPr>
+            <w:tcW w:w="0" w:type="auto"/>
+            <w:shd w:val="clear"/>
+            <w:vAlign w:val="center"/>
+          </w:tcPr>
+          <w:p>
+            <w:pPr>
+              <w:keepNext w:val="0"/>
+              <w:keepLines w:val="0"/>
+              <w:widowControl/>
+              <w:suppressLineNumbers w:val="0"/>
+              <w:jc w:val="left"/>
+            </w:pPr>
+            <w:r>
+              <w:rPr>
+                <w:rFonts w:ascii="SimSun" w:hAnsi="SimSun" w:eastAsia="SimSun" w:cs="SimSun"/>
+                <w:kern w:val="0"/>
+                <w:sz w:val="24"/>
+                <w:szCs w:val="24"/>
+                <w:lang w:val="en-US" w:eastAsia="zh-CN" w:bidi="ar"/>
+              </w:rPr>
+              <w:t>[ ]</w:t>
+            </w:r>
+          </w:p>
+        </w:tc>
+        <w:tc>
+          <w:tcPr>
+            <w:tcW w:w="0" w:type="auto"/>
+            <w:shd w:val="clear"/>
+            <w:vAlign w:val="center"/>
+          </w:tcPr>
+          <w:p>
+            <w:pPr>
+              <w:keepNext w:val="0"/>
+              <w:keepLines w:val="0"/>
+              <w:widowControl/>
+              <w:suppressLineNumbers w:val="0"/>
+              <w:jc w:val="left"/>
+            </w:pPr>
+            <w:r>
+              <w:rPr>
+                <w:rFonts w:ascii="SimSun" w:hAnsi="SimSun" w:eastAsia="SimSun" w:cs="SimSun"/>
+                <w:kern w:val="0"/>
+                <w:sz w:val="24"/>
+                <w:szCs w:val="24"/>
+                <w:lang w:val="en-US" w:eastAsia="zh-CN" w:bidi="ar"/>
+              </w:rPr>
+              <w:t>[ ]</w:t>
+            </w:r>
+          </w:p>
+        </w:tc>
+      </w:tr>
+      <w:tr>
+        <w:tblPrEx>
+          <w:tblBorders>
+            <w:top w:val="none" w:color="auto" w:sz="0" w:space="0"/>
+            <w:left w:val="none" w:color="auto" w:sz="0" w:space="0"/>
+            <w:bottom w:val="none" w:color="auto" w:sz="0" w:space="0"/>
+            <w:right w:val="none" w:color="auto" w:sz="0" w:space="0"/>
+            <w:insideH w:val="none" w:color="auto" w:sz="0" w:space="0"/>
+            <w:insideV w:val="none" w:color="auto" w:sz="0" w:space="0"/>
+          </w:tblBorders>
+          <w:tblCellMar>
+            <w:top w:w="15" w:type="dxa"/>
+            <w:left w:w="15" w:type="dxa"/>
+            <w:bottom w:w="15" w:type="dxa"/>
+            <w:right w:w="15" w:type="dxa"/>
+          </w:tblCellMar>
+        </w:tblPrEx>
+        <w:trPr>
+          <w:tblCellSpacing w:w="15" w:type="dxa"/>
+        </w:trPr>
+        <w:tc>
+          <w:tcPr>
+            <w:tcW w:w="0" w:type="auto"/>
+            <w:shd w:val="clear"/>
+            <w:vAlign w:val="center"/>
+          </w:tcPr>
+          <w:p>
+            <w:pPr>
+              <w:keepNext w:val="0"/>
+              <w:keepLines w:val="0"/>
+              <w:widowControl/>
+              <w:suppressLineNumbers w:val="0"/>
+              <w:jc w:val="left"/>
+            </w:pPr>
+            <w:r>
+              <w:rPr>
+                <w:rFonts w:ascii="SimSun" w:hAnsi="SimSun" w:eastAsia="SimSun" w:cs="SimSun"/>
+                <w:kern w:val="0"/>
+                <w:sz w:val="24"/>
+                <w:szCs w:val="24"/>
+                <w:lang w:val="en-US" w:eastAsia="zh-CN" w:bidi="ar"/>
+              </w:rPr>
+              <w:t>KT10</w:t>
+            </w:r>
+          </w:p>
+        </w:tc>
+        <w:tc>
+          <w:tcPr>
+            <w:tcW w:w="0" w:type="auto"/>
+            <w:shd w:val="clear"/>
+            <w:vAlign w:val="center"/>
+          </w:tcPr>
+          <w:p>
+            <w:pPr>
+              <w:keepNext w:val="0"/>
+              <w:keepLines w:val="0"/>
+              <w:widowControl/>
+              <w:suppressLineNumbers w:val="0"/>
+              <w:jc w:val="left"/>
+            </w:pPr>
+            <w:r>
+              <w:rPr>
+                <w:rFonts w:ascii="SimSun" w:hAnsi="SimSun" w:eastAsia="SimSun" w:cs="SimSun"/>
+                <w:kern w:val="0"/>
+                <w:sz w:val="24"/>
+                <w:szCs w:val="24"/>
+                <w:lang w:val="en-US" w:eastAsia="zh-CN" w:bidi="ar"/>
+              </w:rPr>
+              <w:t>Mở Ôn tập hôm nay</w:t>
+            </w:r>
+          </w:p>
+        </w:tc>
+        <w:tc>
+          <w:tcPr>
+            <w:tcW w:w="0" w:type="auto"/>
+            <w:shd w:val="clear"/>
+            <w:vAlign w:val="center"/>
+          </w:tcPr>
+          <w:p>
+            <w:pPr>
+              <w:keepNext w:val="0"/>
+              <w:keepLines w:val="0"/>
+              <w:widowControl/>
+              <w:suppressLineNumbers w:val="0"/>
+              <w:jc w:val="left"/>
+            </w:pPr>
+            <w:r>
+              <w:rPr>
+                <w:rFonts w:ascii="SimSun" w:hAnsi="SimSun" w:eastAsia="SimSun" w:cs="SimSun"/>
+                <w:kern w:val="0"/>
+                <w:sz w:val="24"/>
+                <w:szCs w:val="24"/>
+                <w:lang w:val="en-US" w:eastAsia="zh-CN" w:bidi="ar"/>
+              </w:rPr>
+              <w:t>Chỉ lấy thẻ đã đến hạn</w:t>
             </w:r>
           </w:p>
         </w:tc>
@@ -31299,7 +32168,7 @@
                 <w:szCs w:val="24"/>
                 <w:lang w:val="en-US" w:eastAsia="zh-CN" w:bidi="ar"/>
               </w:rPr>
-              <w:t>KT09</w:t>
+              <w:t>KT11</w:t>
             </w:r>
           </w:p>
         </w:tc>
@@ -31325,7 +32194,7 @@
                 <w:szCs w:val="24"/>
                 <w:lang w:val="en-US" w:eastAsia="zh-CN" w:bidi="ar"/>
               </w:rPr>
-              <w:t>Lưu cùng một từ hai lần</w:t>
+              <w:t>Ba mức phản hồi</w:t>
             </w:r>
           </w:p>
         </w:tc>
@@ -31351,7 +32220,309 @@
                 <w:szCs w:val="24"/>
                 <w:lang w:val="en-US" w:eastAsia="zh-CN" w:bidi="ar"/>
               </w:rPr>
-              <w:t>Chỉ có một thẻ</w:t>
+              <w:t>Lịch ôn cập nhật theo quy tắc</w:t>
+            </w:r>
+          </w:p>
+        </w:tc>
+        <w:tc>
+          <w:tcPr>
+            <w:tcW w:w="0" w:type="auto"/>
+            <w:shd w:val="clear"/>
+            <w:vAlign w:val="center"/>
+          </w:tcPr>
+          <w:p>
+            <w:pPr>
+              <w:keepNext w:val="0"/>
+              <w:keepLines w:val="0"/>
+              <w:widowControl/>
+              <w:suppressLineNumbers w:val="0"/>
+              <w:jc w:val="left"/>
+            </w:pPr>
+            <w:r>
+              <w:rPr>
+                <w:rFonts w:ascii="SimSun" w:hAnsi="SimSun" w:eastAsia="SimSun" w:cs="SimSun"/>
+                <w:kern w:val="0"/>
+                <w:sz w:val="24"/>
+                <w:szCs w:val="24"/>
+                <w:lang w:val="en-US" w:eastAsia="zh-CN" w:bidi="ar"/>
+              </w:rPr>
+              <w:t>[ ]</w:t>
+            </w:r>
+          </w:p>
+        </w:tc>
+        <w:tc>
+          <w:tcPr>
+            <w:tcW w:w="0" w:type="auto"/>
+            <w:shd w:val="clear"/>
+            <w:vAlign w:val="center"/>
+          </w:tcPr>
+          <w:p>
+            <w:pPr>
+              <w:keepNext w:val="0"/>
+              <w:keepLines w:val="0"/>
+              <w:widowControl/>
+              <w:suppressLineNumbers w:val="0"/>
+              <w:jc w:val="left"/>
+            </w:pPr>
+            <w:r>
+              <w:rPr>
+                <w:rFonts w:ascii="SimSun" w:hAnsi="SimSun" w:eastAsia="SimSun" w:cs="SimSun"/>
+                <w:kern w:val="0"/>
+                <w:sz w:val="24"/>
+                <w:szCs w:val="24"/>
+                <w:lang w:val="en-US" w:eastAsia="zh-CN" w:bidi="ar"/>
+              </w:rPr>
+              <w:t>[ ]</w:t>
+            </w:r>
+          </w:p>
+        </w:tc>
+      </w:tr>
+      <w:tr>
+        <w:tblPrEx>
+          <w:tblBorders>
+            <w:top w:val="none" w:color="auto" w:sz="0" w:space="0"/>
+            <w:left w:val="none" w:color="auto" w:sz="0" w:space="0"/>
+            <w:bottom w:val="none" w:color="auto" w:sz="0" w:space="0"/>
+            <w:right w:val="none" w:color="auto" w:sz="0" w:space="0"/>
+            <w:insideH w:val="none" w:color="auto" w:sz="0" w:space="0"/>
+            <w:insideV w:val="none" w:color="auto" w:sz="0" w:space="0"/>
+          </w:tblBorders>
+          <w:tblCellMar>
+            <w:top w:w="15" w:type="dxa"/>
+            <w:left w:w="15" w:type="dxa"/>
+            <w:bottom w:w="15" w:type="dxa"/>
+            <w:right w:w="15" w:type="dxa"/>
+          </w:tblCellMar>
+        </w:tblPrEx>
+        <w:trPr>
+          <w:tblCellSpacing w:w="15" w:type="dxa"/>
+        </w:trPr>
+        <w:tc>
+          <w:tcPr>
+            <w:tcW w:w="0" w:type="auto"/>
+            <w:shd w:val="clear"/>
+            <w:vAlign w:val="center"/>
+          </w:tcPr>
+          <w:p>
+            <w:pPr>
+              <w:keepNext w:val="0"/>
+              <w:keepLines w:val="0"/>
+              <w:widowControl/>
+              <w:suppressLineNumbers w:val="0"/>
+              <w:jc w:val="left"/>
+            </w:pPr>
+            <w:r>
+              <w:rPr>
+                <w:rFonts w:ascii="SimSun" w:hAnsi="SimSun" w:eastAsia="SimSun" w:cs="SimSun"/>
+                <w:kern w:val="0"/>
+                <w:sz w:val="24"/>
+                <w:szCs w:val="24"/>
+                <w:lang w:val="en-US" w:eastAsia="zh-CN" w:bidi="ar"/>
+              </w:rPr>
+              <w:t>KT12</w:t>
+            </w:r>
+          </w:p>
+        </w:tc>
+        <w:tc>
+          <w:tcPr>
+            <w:tcW w:w="0" w:type="auto"/>
+            <w:shd w:val="clear"/>
+            <w:vAlign w:val="center"/>
+          </w:tcPr>
+          <w:p>
+            <w:pPr>
+              <w:keepNext w:val="0"/>
+              <w:keepLines w:val="0"/>
+              <w:widowControl/>
+              <w:suppressLineNumbers w:val="0"/>
+              <w:jc w:val="left"/>
+            </w:pPr>
+            <w:r>
+              <w:rPr>
+                <w:rFonts w:ascii="SimSun" w:hAnsi="SimSun" w:eastAsia="SimSun" w:cs="SimSun"/>
+                <w:kern w:val="0"/>
+                <w:sz w:val="24"/>
+                <w:szCs w:val="24"/>
+                <w:lang w:val="en-US" w:eastAsia="zh-CN" w:bidi="ar"/>
+              </w:rPr>
+              <w:t>Làm bài kiểm tra</w:t>
+            </w:r>
+          </w:p>
+        </w:tc>
+        <w:tc>
+          <w:tcPr>
+            <w:tcW w:w="0" w:type="auto"/>
+            <w:shd w:val="clear"/>
+            <w:vAlign w:val="center"/>
+          </w:tcPr>
+          <w:p>
+            <w:pPr>
+              <w:keepNext w:val="0"/>
+              <w:keepLines w:val="0"/>
+              <w:widowControl/>
+              <w:suppressLineNumbers w:val="0"/>
+              <w:jc w:val="left"/>
+            </w:pPr>
+            <w:r>
+              <w:rPr>
+                <w:rFonts w:ascii="SimSun" w:hAnsi="SimSun" w:eastAsia="SimSun" w:cs="SimSun"/>
+                <w:kern w:val="0"/>
+                <w:sz w:val="24"/>
+                <w:szCs w:val="24"/>
+                <w:lang w:val="en-US" w:eastAsia="zh-CN" w:bidi="ar"/>
+              </w:rPr>
+              <w:t>Câu hỏi chỉ từ bài đang học</w:t>
+            </w:r>
+          </w:p>
+        </w:tc>
+        <w:tc>
+          <w:tcPr>
+            <w:tcW w:w="0" w:type="auto"/>
+            <w:shd w:val="clear"/>
+            <w:vAlign w:val="center"/>
+          </w:tcPr>
+          <w:p>
+            <w:pPr>
+              <w:keepNext w:val="0"/>
+              <w:keepLines w:val="0"/>
+              <w:widowControl/>
+              <w:suppressLineNumbers w:val="0"/>
+              <w:jc w:val="left"/>
+            </w:pPr>
+            <w:r>
+              <w:rPr>
+                <w:rFonts w:ascii="SimSun" w:hAnsi="SimSun" w:eastAsia="SimSun" w:cs="SimSun"/>
+                <w:kern w:val="0"/>
+                <w:sz w:val="24"/>
+                <w:szCs w:val="24"/>
+                <w:lang w:val="en-US" w:eastAsia="zh-CN" w:bidi="ar"/>
+              </w:rPr>
+              <w:t>[ ]</w:t>
+            </w:r>
+          </w:p>
+        </w:tc>
+        <w:tc>
+          <w:tcPr>
+            <w:tcW w:w="0" w:type="auto"/>
+            <w:shd w:val="clear"/>
+            <w:vAlign w:val="center"/>
+          </w:tcPr>
+          <w:p>
+            <w:pPr>
+              <w:keepNext w:val="0"/>
+              <w:keepLines w:val="0"/>
+              <w:widowControl/>
+              <w:suppressLineNumbers w:val="0"/>
+              <w:jc w:val="left"/>
+            </w:pPr>
+            <w:r>
+              <w:rPr>
+                <w:rFonts w:ascii="SimSun" w:hAnsi="SimSun" w:eastAsia="SimSun" w:cs="SimSun"/>
+                <w:kern w:val="0"/>
+                <w:sz w:val="24"/>
+                <w:szCs w:val="24"/>
+                <w:lang w:val="en-US" w:eastAsia="zh-CN" w:bidi="ar"/>
+              </w:rPr>
+              <w:t>[ ]</w:t>
+            </w:r>
+          </w:p>
+        </w:tc>
+      </w:tr>
+      <w:tr>
+        <w:tblPrEx>
+          <w:tblBorders>
+            <w:top w:val="none" w:color="auto" w:sz="0" w:space="0"/>
+            <w:left w:val="none" w:color="auto" w:sz="0" w:space="0"/>
+            <w:bottom w:val="none" w:color="auto" w:sz="0" w:space="0"/>
+            <w:right w:val="none" w:color="auto" w:sz="0" w:space="0"/>
+            <w:insideH w:val="none" w:color="auto" w:sz="0" w:space="0"/>
+            <w:insideV w:val="none" w:color="auto" w:sz="0" w:space="0"/>
+          </w:tblBorders>
+          <w:tblCellMar>
+            <w:top w:w="15" w:type="dxa"/>
+            <w:left w:w="15" w:type="dxa"/>
+            <w:bottom w:w="15" w:type="dxa"/>
+            <w:right w:w="15" w:type="dxa"/>
+          </w:tblCellMar>
+        </w:tblPrEx>
+        <w:trPr>
+          <w:tblCellSpacing w:w="15" w:type="dxa"/>
+        </w:trPr>
+        <w:tc>
+          <w:tcPr>
+            <w:tcW w:w="0" w:type="auto"/>
+            <w:shd w:val="clear"/>
+            <w:vAlign w:val="center"/>
+          </w:tcPr>
+          <w:p>
+            <w:pPr>
+              <w:keepNext w:val="0"/>
+              <w:keepLines w:val="0"/>
+              <w:widowControl/>
+              <w:suppressLineNumbers w:val="0"/>
+              <w:jc w:val="left"/>
+            </w:pPr>
+            <w:r>
+              <w:rPr>
+                <w:rFonts w:ascii="SimSun" w:hAnsi="SimSun" w:eastAsia="SimSun" w:cs="SimSun"/>
+                <w:kern w:val="0"/>
+                <w:sz w:val="24"/>
+                <w:szCs w:val="24"/>
+                <w:lang w:val="en-US" w:eastAsia="zh-CN" w:bidi="ar"/>
+              </w:rPr>
+              <w:t>KT13</w:t>
+            </w:r>
+          </w:p>
+        </w:tc>
+        <w:tc>
+          <w:tcPr>
+            <w:tcW w:w="0" w:type="auto"/>
+            <w:shd w:val="clear"/>
+            <w:vAlign w:val="center"/>
+          </w:tcPr>
+          <w:p>
+            <w:pPr>
+              <w:keepNext w:val="0"/>
+              <w:keepLines w:val="0"/>
+              <w:widowControl/>
+              <w:suppressLineNumbers w:val="0"/>
+              <w:jc w:val="left"/>
+            </w:pPr>
+            <w:r>
+              <w:rPr>
+                <w:rFonts w:ascii="SimSun" w:hAnsi="SimSun" w:eastAsia="SimSun" w:cs="SimSun"/>
+                <w:kern w:val="0"/>
+                <w:sz w:val="24"/>
+                <w:szCs w:val="24"/>
+                <w:lang w:val="en-US" w:eastAsia="zh-CN" w:bidi="ar"/>
+              </w:rPr>
+              <w:t>Lưu kết quả bài</w:t>
+            </w:r>
+          </w:p>
+        </w:tc>
+        <w:tc>
+          <w:tcPr>
+            <w:tcW w:w="0" w:type="auto"/>
+            <w:shd w:val="clear"/>
+            <w:vAlign w:val="center"/>
+          </w:tcPr>
+          <w:p>
+            <w:pPr>
+              <w:keepNext w:val="0"/>
+              <w:keepLines w:val="0"/>
+              <w:widowControl/>
+              <w:suppressLineNumbers w:val="0"/>
+              <w:jc w:val="left"/>
+            </w:pPr>
+            <w:r>
+              <w:rPr>
+                <w:rFonts w:ascii="SimSun" w:hAnsi="SimSun" w:eastAsia="SimSun" w:cs="SimSun"/>
+                <w:kern w:val="0"/>
+                <w:sz w:val="24"/>
+                <w:szCs w:val="24"/>
+                <w:lang w:val="en-US" w:eastAsia="zh-CN" w:bidi="ar"/>
+              </w:rPr>
+              <w:t>Tiến độ đúng người và đúng bài</w:t>
             </w:r>
           </w:p>
         </w:tc>
@@ -31451,7 +32622,7 @@
                 <w:szCs w:val="24"/>
                 <w:lang w:val="en-US" w:eastAsia="zh-CN" w:bidi="ar"/>
               </w:rPr>
-              <w:t>KT10</w:t>
+              <w:t>KT14</w:t>
             </w:r>
           </w:p>
         </w:tc>
@@ -31477,7 +32648,7 @@
                 <w:szCs w:val="24"/>
                 <w:lang w:val="en-US" w:eastAsia="zh-CN" w:bidi="ar"/>
               </w:rPr>
-              <w:t>Mở Ôn tập hôm nay</w:t>
+              <w:t>Bật thông báo</w:t>
             </w:r>
           </w:p>
         </w:tc>
@@ -31503,7 +32674,7 @@
                 <w:szCs w:val="24"/>
                 <w:lang w:val="en-US" w:eastAsia="zh-CN" w:bidi="ar"/>
               </w:rPr>
-              <w:t>Chỉ lấy thẻ đã đến hạn</w:t>
+              <w:t>Thiết bị nhận thông báo thật</w:t>
             </w:r>
           </w:p>
         </w:tc>
@@ -31570,615 +32741,6 @@
             <w:insideH w:val="none" w:color="auto" w:sz="0" w:space="0"/>
             <w:insideV w:val="none" w:color="auto" w:sz="0" w:space="0"/>
           </w:tblBorders>
-          <w:shd w:val="clear"/>
-          <w:tblCellMar>
-            <w:top w:w="15" w:type="dxa"/>
-            <w:left w:w="15" w:type="dxa"/>
-            <w:bottom w:w="15" w:type="dxa"/>
-            <w:right w:w="15" w:type="dxa"/>
-          </w:tblCellMar>
-        </w:tblPrEx>
-        <w:trPr>
-          <w:tblCellSpacing w:w="15" w:type="dxa"/>
-        </w:trPr>
-        <w:tc>
-          <w:tcPr>
-            <w:tcW w:w="0" w:type="auto"/>
-            <w:shd w:val="clear"/>
-            <w:vAlign w:val="center"/>
-          </w:tcPr>
-          <w:p>
-            <w:pPr>
-              <w:keepNext w:val="0"/>
-              <w:keepLines w:val="0"/>
-              <w:widowControl/>
-              <w:suppressLineNumbers w:val="0"/>
-              <w:jc w:val="left"/>
-            </w:pPr>
-            <w:r>
-              <w:rPr>
-                <w:rFonts w:ascii="SimSun" w:hAnsi="SimSun" w:eastAsia="SimSun" w:cs="SimSun"/>
-                <w:kern w:val="0"/>
-                <w:sz w:val="24"/>
-                <w:szCs w:val="24"/>
-                <w:lang w:val="en-US" w:eastAsia="zh-CN" w:bidi="ar"/>
-              </w:rPr>
-              <w:t>KT11</w:t>
-            </w:r>
-          </w:p>
-        </w:tc>
-        <w:tc>
-          <w:tcPr>
-            <w:tcW w:w="0" w:type="auto"/>
-            <w:shd w:val="clear"/>
-            <w:vAlign w:val="center"/>
-          </w:tcPr>
-          <w:p>
-            <w:pPr>
-              <w:keepNext w:val="0"/>
-              <w:keepLines w:val="0"/>
-              <w:widowControl/>
-              <w:suppressLineNumbers w:val="0"/>
-              <w:jc w:val="left"/>
-            </w:pPr>
-            <w:r>
-              <w:rPr>
-                <w:rFonts w:ascii="SimSun" w:hAnsi="SimSun" w:eastAsia="SimSun" w:cs="SimSun"/>
-                <w:kern w:val="0"/>
-                <w:sz w:val="24"/>
-                <w:szCs w:val="24"/>
-                <w:lang w:val="en-US" w:eastAsia="zh-CN" w:bidi="ar"/>
-              </w:rPr>
-              <w:t>Ba mức phản hồi</w:t>
-            </w:r>
-          </w:p>
-        </w:tc>
-        <w:tc>
-          <w:tcPr>
-            <w:tcW w:w="0" w:type="auto"/>
-            <w:shd w:val="clear"/>
-            <w:vAlign w:val="center"/>
-          </w:tcPr>
-          <w:p>
-            <w:pPr>
-              <w:keepNext w:val="0"/>
-              <w:keepLines w:val="0"/>
-              <w:widowControl/>
-              <w:suppressLineNumbers w:val="0"/>
-              <w:jc w:val="left"/>
-            </w:pPr>
-            <w:r>
-              <w:rPr>
-                <w:rFonts w:ascii="SimSun" w:hAnsi="SimSun" w:eastAsia="SimSun" w:cs="SimSun"/>
-                <w:kern w:val="0"/>
-                <w:sz w:val="24"/>
-                <w:szCs w:val="24"/>
-                <w:lang w:val="en-US" w:eastAsia="zh-CN" w:bidi="ar"/>
-              </w:rPr>
-              <w:t>Lịch ôn cập nhật theo quy tắc</w:t>
-            </w:r>
-          </w:p>
-        </w:tc>
-        <w:tc>
-          <w:tcPr>
-            <w:tcW w:w="0" w:type="auto"/>
-            <w:shd w:val="clear"/>
-            <w:vAlign w:val="center"/>
-          </w:tcPr>
-          <w:p>
-            <w:pPr>
-              <w:keepNext w:val="0"/>
-              <w:keepLines w:val="0"/>
-              <w:widowControl/>
-              <w:suppressLineNumbers w:val="0"/>
-              <w:jc w:val="left"/>
-            </w:pPr>
-            <w:r>
-              <w:rPr>
-                <w:rFonts w:ascii="SimSun" w:hAnsi="SimSun" w:eastAsia="SimSun" w:cs="SimSun"/>
-                <w:kern w:val="0"/>
-                <w:sz w:val="24"/>
-                <w:szCs w:val="24"/>
-                <w:lang w:val="en-US" w:eastAsia="zh-CN" w:bidi="ar"/>
-              </w:rPr>
-              <w:t>[ ]</w:t>
-            </w:r>
-          </w:p>
-        </w:tc>
-        <w:tc>
-          <w:tcPr>
-            <w:tcW w:w="0" w:type="auto"/>
-            <w:shd w:val="clear"/>
-            <w:vAlign w:val="center"/>
-          </w:tcPr>
-          <w:p>
-            <w:pPr>
-              <w:keepNext w:val="0"/>
-              <w:keepLines w:val="0"/>
-              <w:widowControl/>
-              <w:suppressLineNumbers w:val="0"/>
-              <w:jc w:val="left"/>
-            </w:pPr>
-            <w:r>
-              <w:rPr>
-                <w:rFonts w:ascii="SimSun" w:hAnsi="SimSun" w:eastAsia="SimSun" w:cs="SimSun"/>
-                <w:kern w:val="0"/>
-                <w:sz w:val="24"/>
-                <w:szCs w:val="24"/>
-                <w:lang w:val="en-US" w:eastAsia="zh-CN" w:bidi="ar"/>
-              </w:rPr>
-              <w:t>[ ]</w:t>
-            </w:r>
-          </w:p>
-        </w:tc>
-      </w:tr>
-      <w:tr>
-        <w:tblPrEx>
-          <w:tblBorders>
-            <w:top w:val="none" w:color="auto" w:sz="0" w:space="0"/>
-            <w:left w:val="none" w:color="auto" w:sz="0" w:space="0"/>
-            <w:bottom w:val="none" w:color="auto" w:sz="0" w:space="0"/>
-            <w:right w:val="none" w:color="auto" w:sz="0" w:space="0"/>
-            <w:insideH w:val="none" w:color="auto" w:sz="0" w:space="0"/>
-            <w:insideV w:val="none" w:color="auto" w:sz="0" w:space="0"/>
-          </w:tblBorders>
-          <w:shd w:val="clear"/>
-          <w:tblCellMar>
-            <w:top w:w="15" w:type="dxa"/>
-            <w:left w:w="15" w:type="dxa"/>
-            <w:bottom w:w="15" w:type="dxa"/>
-            <w:right w:w="15" w:type="dxa"/>
-          </w:tblCellMar>
-        </w:tblPrEx>
-        <w:trPr>
-          <w:tblCellSpacing w:w="15" w:type="dxa"/>
-        </w:trPr>
-        <w:tc>
-          <w:tcPr>
-            <w:tcW w:w="0" w:type="auto"/>
-            <w:shd w:val="clear"/>
-            <w:vAlign w:val="center"/>
-          </w:tcPr>
-          <w:p>
-            <w:pPr>
-              <w:keepNext w:val="0"/>
-              <w:keepLines w:val="0"/>
-              <w:widowControl/>
-              <w:suppressLineNumbers w:val="0"/>
-              <w:jc w:val="left"/>
-            </w:pPr>
-            <w:r>
-              <w:rPr>
-                <w:rFonts w:ascii="SimSun" w:hAnsi="SimSun" w:eastAsia="SimSun" w:cs="SimSun"/>
-                <w:kern w:val="0"/>
-                <w:sz w:val="24"/>
-                <w:szCs w:val="24"/>
-                <w:lang w:val="en-US" w:eastAsia="zh-CN" w:bidi="ar"/>
-              </w:rPr>
-              <w:t>KT12</w:t>
-            </w:r>
-          </w:p>
-        </w:tc>
-        <w:tc>
-          <w:tcPr>
-            <w:tcW w:w="0" w:type="auto"/>
-            <w:shd w:val="clear"/>
-            <w:vAlign w:val="center"/>
-          </w:tcPr>
-          <w:p>
-            <w:pPr>
-              <w:keepNext w:val="0"/>
-              <w:keepLines w:val="0"/>
-              <w:widowControl/>
-              <w:suppressLineNumbers w:val="0"/>
-              <w:jc w:val="left"/>
-            </w:pPr>
-            <w:r>
-              <w:rPr>
-                <w:rFonts w:ascii="SimSun" w:hAnsi="SimSun" w:eastAsia="SimSun" w:cs="SimSun"/>
-                <w:kern w:val="0"/>
-                <w:sz w:val="24"/>
-                <w:szCs w:val="24"/>
-                <w:lang w:val="en-US" w:eastAsia="zh-CN" w:bidi="ar"/>
-              </w:rPr>
-              <w:t>Làm bài kiểm tra</w:t>
-            </w:r>
-          </w:p>
-        </w:tc>
-        <w:tc>
-          <w:tcPr>
-            <w:tcW w:w="0" w:type="auto"/>
-            <w:shd w:val="clear"/>
-            <w:vAlign w:val="center"/>
-          </w:tcPr>
-          <w:p>
-            <w:pPr>
-              <w:keepNext w:val="0"/>
-              <w:keepLines w:val="0"/>
-              <w:widowControl/>
-              <w:suppressLineNumbers w:val="0"/>
-              <w:jc w:val="left"/>
-            </w:pPr>
-            <w:r>
-              <w:rPr>
-                <w:rFonts w:ascii="SimSun" w:hAnsi="SimSun" w:eastAsia="SimSun" w:cs="SimSun"/>
-                <w:kern w:val="0"/>
-                <w:sz w:val="24"/>
-                <w:szCs w:val="24"/>
-                <w:lang w:val="en-US" w:eastAsia="zh-CN" w:bidi="ar"/>
-              </w:rPr>
-              <w:t>Câu hỏi chỉ từ bài đang học</w:t>
-            </w:r>
-          </w:p>
-        </w:tc>
-        <w:tc>
-          <w:tcPr>
-            <w:tcW w:w="0" w:type="auto"/>
-            <w:shd w:val="clear"/>
-            <w:vAlign w:val="center"/>
-          </w:tcPr>
-          <w:p>
-            <w:pPr>
-              <w:keepNext w:val="0"/>
-              <w:keepLines w:val="0"/>
-              <w:widowControl/>
-              <w:suppressLineNumbers w:val="0"/>
-              <w:jc w:val="left"/>
-            </w:pPr>
-            <w:r>
-              <w:rPr>
-                <w:rFonts w:ascii="SimSun" w:hAnsi="SimSun" w:eastAsia="SimSun" w:cs="SimSun"/>
-                <w:kern w:val="0"/>
-                <w:sz w:val="24"/>
-                <w:szCs w:val="24"/>
-                <w:lang w:val="en-US" w:eastAsia="zh-CN" w:bidi="ar"/>
-              </w:rPr>
-              <w:t>[ ]</w:t>
-            </w:r>
-          </w:p>
-        </w:tc>
-        <w:tc>
-          <w:tcPr>
-            <w:tcW w:w="0" w:type="auto"/>
-            <w:shd w:val="clear"/>
-            <w:vAlign w:val="center"/>
-          </w:tcPr>
-          <w:p>
-            <w:pPr>
-              <w:keepNext w:val="0"/>
-              <w:keepLines w:val="0"/>
-              <w:widowControl/>
-              <w:suppressLineNumbers w:val="0"/>
-              <w:jc w:val="left"/>
-            </w:pPr>
-            <w:r>
-              <w:rPr>
-                <w:rFonts w:ascii="SimSun" w:hAnsi="SimSun" w:eastAsia="SimSun" w:cs="SimSun"/>
-                <w:kern w:val="0"/>
-                <w:sz w:val="24"/>
-                <w:szCs w:val="24"/>
-                <w:lang w:val="en-US" w:eastAsia="zh-CN" w:bidi="ar"/>
-              </w:rPr>
-              <w:t>[ ]</w:t>
-            </w:r>
-          </w:p>
-        </w:tc>
-      </w:tr>
-      <w:tr>
-        <w:tblPrEx>
-          <w:tblBorders>
-            <w:top w:val="none" w:color="auto" w:sz="0" w:space="0"/>
-            <w:left w:val="none" w:color="auto" w:sz="0" w:space="0"/>
-            <w:bottom w:val="none" w:color="auto" w:sz="0" w:space="0"/>
-            <w:right w:val="none" w:color="auto" w:sz="0" w:space="0"/>
-            <w:insideH w:val="none" w:color="auto" w:sz="0" w:space="0"/>
-            <w:insideV w:val="none" w:color="auto" w:sz="0" w:space="0"/>
-          </w:tblBorders>
-          <w:shd w:val="clear"/>
-          <w:tblCellMar>
-            <w:top w:w="15" w:type="dxa"/>
-            <w:left w:w="15" w:type="dxa"/>
-            <w:bottom w:w="15" w:type="dxa"/>
-            <w:right w:w="15" w:type="dxa"/>
-          </w:tblCellMar>
-        </w:tblPrEx>
-        <w:trPr>
-          <w:tblCellSpacing w:w="15" w:type="dxa"/>
-        </w:trPr>
-        <w:tc>
-          <w:tcPr>
-            <w:tcW w:w="0" w:type="auto"/>
-            <w:shd w:val="clear"/>
-            <w:vAlign w:val="center"/>
-          </w:tcPr>
-          <w:p>
-            <w:pPr>
-              <w:keepNext w:val="0"/>
-              <w:keepLines w:val="0"/>
-              <w:widowControl/>
-              <w:suppressLineNumbers w:val="0"/>
-              <w:jc w:val="left"/>
-            </w:pPr>
-            <w:r>
-              <w:rPr>
-                <w:rFonts w:ascii="SimSun" w:hAnsi="SimSun" w:eastAsia="SimSun" w:cs="SimSun"/>
-                <w:kern w:val="0"/>
-                <w:sz w:val="24"/>
-                <w:szCs w:val="24"/>
-                <w:lang w:val="en-US" w:eastAsia="zh-CN" w:bidi="ar"/>
-              </w:rPr>
-              <w:t>KT13</w:t>
-            </w:r>
-          </w:p>
-        </w:tc>
-        <w:tc>
-          <w:tcPr>
-            <w:tcW w:w="0" w:type="auto"/>
-            <w:shd w:val="clear"/>
-            <w:vAlign w:val="center"/>
-          </w:tcPr>
-          <w:p>
-            <w:pPr>
-              <w:keepNext w:val="0"/>
-              <w:keepLines w:val="0"/>
-              <w:widowControl/>
-              <w:suppressLineNumbers w:val="0"/>
-              <w:jc w:val="left"/>
-            </w:pPr>
-            <w:r>
-              <w:rPr>
-                <w:rFonts w:ascii="SimSun" w:hAnsi="SimSun" w:eastAsia="SimSun" w:cs="SimSun"/>
-                <w:kern w:val="0"/>
-                <w:sz w:val="24"/>
-                <w:szCs w:val="24"/>
-                <w:lang w:val="en-US" w:eastAsia="zh-CN" w:bidi="ar"/>
-              </w:rPr>
-              <w:t>Lưu kết quả bài</w:t>
-            </w:r>
-          </w:p>
-        </w:tc>
-        <w:tc>
-          <w:tcPr>
-            <w:tcW w:w="0" w:type="auto"/>
-            <w:shd w:val="clear"/>
-            <w:vAlign w:val="center"/>
-          </w:tcPr>
-          <w:p>
-            <w:pPr>
-              <w:keepNext w:val="0"/>
-              <w:keepLines w:val="0"/>
-              <w:widowControl/>
-              <w:suppressLineNumbers w:val="0"/>
-              <w:jc w:val="left"/>
-            </w:pPr>
-            <w:r>
-              <w:rPr>
-                <w:rFonts w:ascii="SimSun" w:hAnsi="SimSun" w:eastAsia="SimSun" w:cs="SimSun"/>
-                <w:kern w:val="0"/>
-                <w:sz w:val="24"/>
-                <w:szCs w:val="24"/>
-                <w:lang w:val="en-US" w:eastAsia="zh-CN" w:bidi="ar"/>
-              </w:rPr>
-              <w:t>Tiến độ đúng người và đúng bài</w:t>
-            </w:r>
-          </w:p>
-        </w:tc>
-        <w:tc>
-          <w:tcPr>
-            <w:tcW w:w="0" w:type="auto"/>
-            <w:shd w:val="clear"/>
-            <w:vAlign w:val="center"/>
-          </w:tcPr>
-          <w:p>
-            <w:pPr>
-              <w:keepNext w:val="0"/>
-              <w:keepLines w:val="0"/>
-              <w:widowControl/>
-              <w:suppressLineNumbers w:val="0"/>
-              <w:jc w:val="left"/>
-            </w:pPr>
-            <w:r>
-              <w:rPr>
-                <w:rFonts w:ascii="SimSun" w:hAnsi="SimSun" w:eastAsia="SimSun" w:cs="SimSun"/>
-                <w:kern w:val="0"/>
-                <w:sz w:val="24"/>
-                <w:szCs w:val="24"/>
-                <w:lang w:val="en-US" w:eastAsia="zh-CN" w:bidi="ar"/>
-              </w:rPr>
-              <w:t>[ ]</w:t>
-            </w:r>
-          </w:p>
-        </w:tc>
-        <w:tc>
-          <w:tcPr>
-            <w:tcW w:w="0" w:type="auto"/>
-            <w:shd w:val="clear"/>
-            <w:vAlign w:val="center"/>
-          </w:tcPr>
-          <w:p>
-            <w:pPr>
-              <w:keepNext w:val="0"/>
-              <w:keepLines w:val="0"/>
-              <w:widowControl/>
-              <w:suppressLineNumbers w:val="0"/>
-              <w:jc w:val="left"/>
-            </w:pPr>
-            <w:r>
-              <w:rPr>
-                <w:rFonts w:ascii="SimSun" w:hAnsi="SimSun" w:eastAsia="SimSun" w:cs="SimSun"/>
-                <w:kern w:val="0"/>
-                <w:sz w:val="24"/>
-                <w:szCs w:val="24"/>
-                <w:lang w:val="en-US" w:eastAsia="zh-CN" w:bidi="ar"/>
-              </w:rPr>
-              <w:t>[ ]</w:t>
-            </w:r>
-          </w:p>
-        </w:tc>
-      </w:tr>
-      <w:tr>
-        <w:tblPrEx>
-          <w:tblBorders>
-            <w:top w:val="none" w:color="auto" w:sz="0" w:space="0"/>
-            <w:left w:val="none" w:color="auto" w:sz="0" w:space="0"/>
-            <w:bottom w:val="none" w:color="auto" w:sz="0" w:space="0"/>
-            <w:right w:val="none" w:color="auto" w:sz="0" w:space="0"/>
-            <w:insideH w:val="none" w:color="auto" w:sz="0" w:space="0"/>
-            <w:insideV w:val="none" w:color="auto" w:sz="0" w:space="0"/>
-          </w:tblBorders>
-          <w:shd w:val="clear"/>
-          <w:tblCellMar>
-            <w:top w:w="15" w:type="dxa"/>
-            <w:left w:w="15" w:type="dxa"/>
-            <w:bottom w:w="15" w:type="dxa"/>
-            <w:right w:w="15" w:type="dxa"/>
-          </w:tblCellMar>
-        </w:tblPrEx>
-        <w:trPr>
-          <w:tblCellSpacing w:w="15" w:type="dxa"/>
-        </w:trPr>
-        <w:tc>
-          <w:tcPr>
-            <w:tcW w:w="0" w:type="auto"/>
-            <w:shd w:val="clear"/>
-            <w:vAlign w:val="center"/>
-          </w:tcPr>
-          <w:p>
-            <w:pPr>
-              <w:keepNext w:val="0"/>
-              <w:keepLines w:val="0"/>
-              <w:widowControl/>
-              <w:suppressLineNumbers w:val="0"/>
-              <w:jc w:val="left"/>
-            </w:pPr>
-            <w:r>
-              <w:rPr>
-                <w:rFonts w:ascii="SimSun" w:hAnsi="SimSun" w:eastAsia="SimSun" w:cs="SimSun"/>
-                <w:kern w:val="0"/>
-                <w:sz w:val="24"/>
-                <w:szCs w:val="24"/>
-                <w:lang w:val="en-US" w:eastAsia="zh-CN" w:bidi="ar"/>
-              </w:rPr>
-              <w:t>KT14</w:t>
-            </w:r>
-          </w:p>
-        </w:tc>
-        <w:tc>
-          <w:tcPr>
-            <w:tcW w:w="0" w:type="auto"/>
-            <w:shd w:val="clear"/>
-            <w:vAlign w:val="center"/>
-          </w:tcPr>
-          <w:p>
-            <w:pPr>
-              <w:keepNext w:val="0"/>
-              <w:keepLines w:val="0"/>
-              <w:widowControl/>
-              <w:suppressLineNumbers w:val="0"/>
-              <w:jc w:val="left"/>
-            </w:pPr>
-            <w:r>
-              <w:rPr>
-                <w:rFonts w:ascii="SimSun" w:hAnsi="SimSun" w:eastAsia="SimSun" w:cs="SimSun"/>
-                <w:kern w:val="0"/>
-                <w:sz w:val="24"/>
-                <w:szCs w:val="24"/>
-                <w:lang w:val="en-US" w:eastAsia="zh-CN" w:bidi="ar"/>
-              </w:rPr>
-              <w:t>Bật thông báo</w:t>
-            </w:r>
-          </w:p>
-        </w:tc>
-        <w:tc>
-          <w:tcPr>
-            <w:tcW w:w="0" w:type="auto"/>
-            <w:shd w:val="clear"/>
-            <w:vAlign w:val="center"/>
-          </w:tcPr>
-          <w:p>
-            <w:pPr>
-              <w:keepNext w:val="0"/>
-              <w:keepLines w:val="0"/>
-              <w:widowControl/>
-              <w:suppressLineNumbers w:val="0"/>
-              <w:jc w:val="left"/>
-            </w:pPr>
-            <w:r>
-              <w:rPr>
-                <w:rFonts w:ascii="SimSun" w:hAnsi="SimSun" w:eastAsia="SimSun" w:cs="SimSun"/>
-                <w:kern w:val="0"/>
-                <w:sz w:val="24"/>
-                <w:szCs w:val="24"/>
-                <w:lang w:val="en-US" w:eastAsia="zh-CN" w:bidi="ar"/>
-              </w:rPr>
-              <w:t>Thiết bị nhận thông báo thật</w:t>
-            </w:r>
-          </w:p>
-        </w:tc>
-        <w:tc>
-          <w:tcPr>
-            <w:tcW w:w="0" w:type="auto"/>
-            <w:shd w:val="clear"/>
-            <w:vAlign w:val="center"/>
-          </w:tcPr>
-          <w:p>
-            <w:pPr>
-              <w:keepNext w:val="0"/>
-              <w:keepLines w:val="0"/>
-              <w:widowControl/>
-              <w:suppressLineNumbers w:val="0"/>
-              <w:jc w:val="left"/>
-            </w:pPr>
-            <w:r>
-              <w:rPr>
-                <w:rFonts w:ascii="SimSun" w:hAnsi="SimSun" w:eastAsia="SimSun" w:cs="SimSun"/>
-                <w:kern w:val="0"/>
-                <w:sz w:val="24"/>
-                <w:szCs w:val="24"/>
-                <w:lang w:val="en-US" w:eastAsia="zh-CN" w:bidi="ar"/>
-              </w:rPr>
-              <w:t>[ ]</w:t>
-            </w:r>
-          </w:p>
-        </w:tc>
-        <w:tc>
-          <w:tcPr>
-            <w:tcW w:w="0" w:type="auto"/>
-            <w:shd w:val="clear"/>
-            <w:vAlign w:val="center"/>
-          </w:tcPr>
-          <w:p>
-            <w:pPr>
-              <w:keepNext w:val="0"/>
-              <w:keepLines w:val="0"/>
-              <w:widowControl/>
-              <w:suppressLineNumbers w:val="0"/>
-              <w:jc w:val="left"/>
-            </w:pPr>
-            <w:r>
-              <w:rPr>
-                <w:rFonts w:ascii="SimSun" w:hAnsi="SimSun" w:eastAsia="SimSun" w:cs="SimSun"/>
-                <w:kern w:val="0"/>
-                <w:sz w:val="24"/>
-                <w:szCs w:val="24"/>
-                <w:lang w:val="en-US" w:eastAsia="zh-CN" w:bidi="ar"/>
-              </w:rPr>
-              <w:t>[ ]</w:t>
-            </w:r>
-          </w:p>
-        </w:tc>
-      </w:tr>
-      <w:tr>
-        <w:tblPrEx>
-          <w:tblBorders>
-            <w:top w:val="none" w:color="auto" w:sz="0" w:space="0"/>
-            <w:left w:val="none" w:color="auto" w:sz="0" w:space="0"/>
-            <w:bottom w:val="none" w:color="auto" w:sz="0" w:space="0"/>
-            <w:right w:val="none" w:color="auto" w:sz="0" w:space="0"/>
-            <w:insideH w:val="none" w:color="auto" w:sz="0" w:space="0"/>
-            <w:insideV w:val="none" w:color="auto" w:sz="0" w:space="0"/>
-          </w:tblBorders>
-          <w:shd w:val="clear"/>
           <w:tblCellMar>
             <w:top w:w="15" w:type="dxa"/>
             <w:left w:w="15" w:type="dxa"/>
@@ -36803,6 +37365,7 @@
     <customSectPr/>
     <customSectPr/>
     <customSectPr/>
+    <customSectPr/>
   </customSectProps>
   <customShpExts>
     <customShpInfo spid="_x0000_s1026" textRotate="1"/>

</xml_diff>

<commit_message>
feat: add graduation thesis document to project repository
</commit_message>
<xml_diff>
--- a/Document/22130016_TieuLuanTN_KCNTT_NLU.docx
+++ b/Document/22130016_TieuLuanTN_KCNTT_NLU.docx
@@ -11,9 +11,9 @@
           <w:rFonts w:cs="VNI-Times"/>
         </w:rPr>
       </w:pPr>
-      <w:bookmarkStart w:id="0" w:name="_Toc70411976"/>
-      <w:bookmarkStart w:id="1" w:name="_Toc70412708"/>
-      <w:bookmarkStart w:id="2" w:name="_Toc70428247"/>
+      <w:bookmarkStart w:id="0" w:name="_Toc70428247"/>
+      <w:bookmarkStart w:id="1" w:name="_Toc70411976"/>
+      <w:bookmarkStart w:id="2" w:name="_Toc70412708"/>
       <w:bookmarkStart w:id="3" w:name="_Toc70428308"/>
       <w:bookmarkStart w:id="4" w:name="_Toc7878438"/>
     </w:p>
@@ -104,8 +104,8 @@
                                 <w:bCs/>
                               </w:rPr>
                             </w:pPr>
-                            <w:bookmarkStart w:id="144" w:name="_Toc164954895"/>
-                            <w:bookmarkStart w:id="145" w:name="_Toc164954528"/>
+                            <w:bookmarkStart w:id="144" w:name="_Toc164954528"/>
+                            <w:bookmarkStart w:id="145" w:name="_Toc164954895"/>
                             <w:r>
                               <w:rPr>
                                 <w:b/>
@@ -134,8 +134,8 @@
                                 <w:szCs w:val="44"/>
                               </w:rPr>
                             </w:pPr>
-                            <w:bookmarkStart w:id="146" w:name="_Toc164954529"/>
-                            <w:bookmarkStart w:id="147" w:name="_Toc164954896"/>
+                            <w:bookmarkStart w:id="146" w:name="_Toc164954896"/>
+                            <w:bookmarkStart w:id="147" w:name="_Toc164954529"/>
                             <w:r>
                               <w:rPr>
                                 <w:b/>
@@ -158,8 +158,8 @@
                                 <w:szCs w:val="44"/>
                               </w:rPr>
                             </w:pPr>
-                            <w:bookmarkStart w:id="148" w:name="_Toc164954897"/>
-                            <w:bookmarkStart w:id="149" w:name="_Toc164954530"/>
+                            <w:bookmarkStart w:id="148" w:name="_Toc164954530"/>
+                            <w:bookmarkStart w:id="149" w:name="_Toc164954897"/>
                             <w:r>
                               <w:rPr>
                                 <w:b/>
@@ -1227,8 +1227,8 @@
                           <w:bCs/>
                         </w:rPr>
                       </w:pPr>
-                      <w:bookmarkStart w:id="144" w:name="_Toc164954895"/>
-                      <w:bookmarkStart w:id="145" w:name="_Toc164954528"/>
+                      <w:bookmarkStart w:id="144" w:name="_Toc164954528"/>
+                      <w:bookmarkStart w:id="145" w:name="_Toc164954895"/>
                       <w:r>
                         <w:rPr>
                           <w:b/>
@@ -1257,8 +1257,8 @@
                           <w:szCs w:val="44"/>
                         </w:rPr>
                       </w:pPr>
-                      <w:bookmarkStart w:id="146" w:name="_Toc164954529"/>
-                      <w:bookmarkStart w:id="147" w:name="_Toc164954896"/>
+                      <w:bookmarkStart w:id="146" w:name="_Toc164954896"/>
+                      <w:bookmarkStart w:id="147" w:name="_Toc164954529"/>
                       <w:r>
                         <w:rPr>
                           <w:b/>
@@ -1281,8 +1281,8 @@
                           <w:szCs w:val="44"/>
                         </w:rPr>
                       </w:pPr>
-                      <w:bookmarkStart w:id="148" w:name="_Toc164954897"/>
-                      <w:bookmarkStart w:id="149" w:name="_Toc164954530"/>
+                      <w:bookmarkStart w:id="148" w:name="_Toc164954530"/>
+                      <w:bookmarkStart w:id="149" w:name="_Toc164954897"/>
                       <w:r>
                         <w:rPr>
                           <w:b/>
@@ -6769,11 +6769,11 @@
         <w:spacing w:line="360" w:lineRule="auto"/>
         <w:outlineLvl w:val="0"/>
       </w:pPr>
-      <w:bookmarkStart w:id="5" w:name="_Toc164957113"/>
-      <w:bookmarkStart w:id="6" w:name="_Toc164957606"/>
+      <w:bookmarkStart w:id="5" w:name="_Toc164957606"/>
+      <w:bookmarkStart w:id="6" w:name="_Toc164957113"/>
       <w:bookmarkStart w:id="7" w:name="_Toc164957334"/>
-      <w:bookmarkStart w:id="8" w:name="_Toc164957255"/>
-      <w:bookmarkStart w:id="9" w:name="_Toc6580"/>
+      <w:bookmarkStart w:id="8" w:name="_Toc6580"/>
+      <w:bookmarkStart w:id="9" w:name="_Toc164957255"/>
       <w:r>
         <w:t>DANH SÁCH CHỮ VIẾT TẮT</w:t>
       </w:r>
@@ -8072,10 +8072,10 @@
         <w:outlineLvl w:val="0"/>
       </w:pPr>
       <w:bookmarkStart w:id="10" w:name="_Toc164957335"/>
-      <w:bookmarkStart w:id="11" w:name="_Toc164957114"/>
-      <w:bookmarkStart w:id="12" w:name="_Toc164957607"/>
-      <w:bookmarkStart w:id="13" w:name="_Toc164957256"/>
-      <w:bookmarkStart w:id="14" w:name="_Toc15454"/>
+      <w:bookmarkStart w:id="11" w:name="_Toc15454"/>
+      <w:bookmarkStart w:id="12" w:name="_Toc164957114"/>
+      <w:bookmarkStart w:id="13" w:name="_Toc164957607"/>
+      <w:bookmarkStart w:id="14" w:name="_Toc164957256"/>
       <w:r>
         <w:t>DANH MỤC HÌNH ẢNH</w:t>
       </w:r>
@@ -8827,11 +8827,11 @@
         </w:rPr>
         <w:br w:type="page"/>
       </w:r>
-      <w:bookmarkStart w:id="15" w:name="_Toc164957115"/>
-      <w:bookmarkStart w:id="16" w:name="_Toc164957608"/>
-      <w:bookmarkStart w:id="17" w:name="_Toc164957257"/>
-      <w:bookmarkStart w:id="18" w:name="_Toc164957336"/>
-      <w:bookmarkStart w:id="19" w:name="_Toc18971"/>
+      <w:bookmarkStart w:id="15" w:name="_Toc164957608"/>
+      <w:bookmarkStart w:id="16" w:name="_Toc18971"/>
+      <w:bookmarkStart w:id="17" w:name="_Toc164957115"/>
+      <w:bookmarkStart w:id="18" w:name="_Toc164957257"/>
+      <w:bookmarkStart w:id="19" w:name="_Toc164957336"/>
       <w:r>
         <w:rPr>
           <w:bCs/>
@@ -9727,11 +9727,11 @@
           <w:bCs/>
         </w:rPr>
       </w:pPr>
-      <w:bookmarkStart w:id="20" w:name="_Toc164957258"/>
-      <w:bookmarkStart w:id="21" w:name="_Toc164957337"/>
+      <w:bookmarkStart w:id="20" w:name="_Toc164957337"/>
+      <w:bookmarkStart w:id="21" w:name="_Toc164957609"/>
       <w:bookmarkStart w:id="22" w:name="_Toc164957116"/>
-      <w:bookmarkStart w:id="23" w:name="_Toc164957609"/>
-      <w:bookmarkStart w:id="24" w:name="_Toc14183"/>
+      <w:bookmarkStart w:id="23" w:name="_Toc14183"/>
+      <w:bookmarkStart w:id="24" w:name="_Toc164957258"/>
       <w:r>
         <w:rPr>
           <w:iCs/>
@@ -11000,13 +11000,7 @@
         <w:rPr>
           <w:lang w:val="vi-VN"/>
         </w:rPr>
-        <w:t xml:space="preserve"> </w:t>
-      </w:r>
-      <w:r>
-        <w:rPr>
-          <w:lang w:val="vi-VN"/>
-        </w:rPr>
-        <w:t xml:space="preserve"> </w:t>
+        <w:t xml:space="preserve">  </w:t>
       </w:r>
       <w:r>
         <w:rPr>
@@ -12146,8 +12140,6 @@
         </w:sectPr>
       </w:pPr>
       <w:bookmarkStart w:id="25" w:name="_Toc164957117"/>
-      <w:bookmarkStart w:id="150" w:name="_GoBack"/>
-      <w:bookmarkEnd w:id="150"/>
     </w:p>
     <w:bookmarkEnd w:id="25"/>
     <w:p>
@@ -12157,16 +12149,16 @@
         <w:jc w:val="center"/>
         <w:outlineLvl w:val="0"/>
       </w:pPr>
-      <w:bookmarkStart w:id="26" w:name="_Toc164957610"/>
-      <w:bookmarkStart w:id="27" w:name="_Toc164957338"/>
-      <w:bookmarkStart w:id="28" w:name="_Toc164957259"/>
-      <w:bookmarkStart w:id="29" w:name="_Toc1261"/>
-      <w:bookmarkStart w:id="30" w:name="_Toc164954905"/>
-      <w:bookmarkStart w:id="31" w:name="_Toc164957121"/>
-      <w:bookmarkStart w:id="32" w:name="_Toc164955388"/>
-      <w:bookmarkStart w:id="33" w:name="_Toc164957342"/>
+      <w:bookmarkStart w:id="26" w:name="_Toc1261"/>
+      <w:bookmarkStart w:id="27" w:name="_Toc164957610"/>
+      <w:bookmarkStart w:id="28" w:name="_Toc164957338"/>
+      <w:bookmarkStart w:id="29" w:name="_Toc164957259"/>
+      <w:bookmarkStart w:id="30" w:name="_Toc164957614"/>
+      <w:bookmarkStart w:id="31" w:name="_Toc164955388"/>
+      <w:bookmarkStart w:id="32" w:name="_Toc164957342"/>
+      <w:bookmarkStart w:id="33" w:name="_Toc164957121"/>
       <w:bookmarkStart w:id="34" w:name="_Toc164957263"/>
-      <w:bookmarkStart w:id="35" w:name="_Toc164957614"/>
+      <w:bookmarkStart w:id="35" w:name="_Toc164954905"/>
       <w:r>
         <w:t>MỞ ĐẦU</w:t>
       </w:r>
@@ -12192,12 +12184,12 @@
         </w:rPr>
         <w:t xml:space="preserve"> </w:t>
       </w:r>
-      <w:bookmarkStart w:id="37" w:name="_Toc164957339"/>
-      <w:bookmarkStart w:id="38" w:name="_Toc164957611"/>
-      <w:bookmarkStart w:id="39" w:name="_Toc164957260"/>
-      <w:bookmarkStart w:id="40" w:name="_Toc164955385"/>
-      <w:bookmarkStart w:id="41" w:name="_Toc164957118"/>
-      <w:bookmarkStart w:id="42" w:name="_Toc4424"/>
+      <w:bookmarkStart w:id="37" w:name="_Toc164957118"/>
+      <w:bookmarkStart w:id="38" w:name="_Toc164957339"/>
+      <w:bookmarkStart w:id="39" w:name="_Toc164955385"/>
+      <w:bookmarkStart w:id="40" w:name="_Toc4424"/>
+      <w:bookmarkStart w:id="41" w:name="_Toc164957611"/>
+      <w:bookmarkStart w:id="42" w:name="_Toc164957260"/>
       <w:r>
         <w:t>LÝ DO CHỌN ĐỀ TÀI</w:t>
       </w:r>
@@ -12208,12 +12200,12 @@
       <w:bookmarkEnd w:id="40"/>
       <w:bookmarkEnd w:id="41"/>
       <w:bookmarkEnd w:id="42"/>
-      <w:bookmarkStart w:id="43" w:name="_Toc164957340"/>
-      <w:bookmarkStart w:id="44" w:name="_Toc164957119"/>
-      <w:bookmarkStart w:id="45" w:name="_Toc164957261"/>
-      <w:bookmarkStart w:id="46" w:name="_Toc164955386"/>
-      <w:bookmarkStart w:id="47" w:name="_Toc164957612"/>
-      <w:bookmarkStart w:id="48" w:name="_Toc164954903"/>
+      <w:bookmarkStart w:id="43" w:name="_Toc164955386"/>
+      <w:bookmarkStart w:id="44" w:name="_Toc164957340"/>
+      <w:bookmarkStart w:id="45" w:name="_Toc164957612"/>
+      <w:bookmarkStart w:id="46" w:name="_Toc164957119"/>
+      <w:bookmarkStart w:id="47" w:name="_Toc164954903"/>
+      <w:bookmarkStart w:id="48" w:name="_Toc164957261"/>
     </w:p>
     <w:p>
       <w:pPr>
@@ -12886,13 +12878,13 @@
           <w:sz w:val="26"/>
         </w:rPr>
       </w:pPr>
-      <w:bookmarkStart w:id="50" w:name="_Toc164955387"/>
-      <w:bookmarkStart w:id="51" w:name="_Toc164957613"/>
-      <w:bookmarkStart w:id="52" w:name="_Toc164957120"/>
-      <w:bookmarkStart w:id="53" w:name="_Toc164957341"/>
-      <w:bookmarkStart w:id="54" w:name="_Toc164957262"/>
-      <w:bookmarkStart w:id="55" w:name="_Toc164954904"/>
-      <w:bookmarkStart w:id="56" w:name="_Toc29136"/>
+      <w:bookmarkStart w:id="50" w:name="_Toc29136"/>
+      <w:bookmarkStart w:id="51" w:name="_Toc164957341"/>
+      <w:bookmarkStart w:id="52" w:name="_Toc164955387"/>
+      <w:bookmarkStart w:id="53" w:name="_Toc164957613"/>
+      <w:bookmarkStart w:id="54" w:name="_Toc164954904"/>
+      <w:bookmarkStart w:id="55" w:name="_Toc164957120"/>
+      <w:bookmarkStart w:id="56" w:name="_Toc164957262"/>
       <w:r>
         <w:rPr>
           <w:sz w:val="26"/>
@@ -13172,12 +13164,12 @@
         <w:spacing w:line="360" w:lineRule="auto"/>
         <w:jc w:val="both"/>
       </w:pPr>
-      <w:bookmarkStart w:id="58" w:name="_Toc164957615"/>
-      <w:bookmarkStart w:id="59" w:name="_Toc164957122"/>
-      <w:bookmarkStart w:id="60" w:name="_Toc164955389"/>
-      <w:bookmarkStart w:id="61" w:name="_Toc164957264"/>
-      <w:bookmarkStart w:id="62" w:name="_Toc164957343"/>
-      <w:bookmarkStart w:id="63" w:name="_Toc29385"/>
+      <w:bookmarkStart w:id="58" w:name="_Toc164957122"/>
+      <w:bookmarkStart w:id="59" w:name="_Toc164957343"/>
+      <w:bookmarkStart w:id="60" w:name="_Toc164957264"/>
+      <w:bookmarkStart w:id="61" w:name="_Toc164957615"/>
+      <w:bookmarkStart w:id="62" w:name="_Toc29385"/>
+      <w:bookmarkStart w:id="63" w:name="_Toc164955389"/>
       <w:r>
         <w:rPr>
           <w:sz w:val="26"/>
@@ -13190,11 +13182,11 @@
       <w:bookmarkEnd w:id="61"/>
       <w:bookmarkEnd w:id="62"/>
       <w:bookmarkEnd w:id="63"/>
-      <w:bookmarkStart w:id="64" w:name="_Toc164957123"/>
-      <w:bookmarkStart w:id="65" w:name="_Toc164957265"/>
-      <w:bookmarkStart w:id="66" w:name="_Toc164957344"/>
-      <w:bookmarkStart w:id="67" w:name="_Toc164955390"/>
-      <w:bookmarkStart w:id="68" w:name="_Toc164957616"/>
+      <w:bookmarkStart w:id="64" w:name="_Toc164957616"/>
+      <w:bookmarkStart w:id="65" w:name="_Toc164957123"/>
+      <w:bookmarkStart w:id="66" w:name="_Toc164955390"/>
+      <w:bookmarkStart w:id="67" w:name="_Toc164957344"/>
+      <w:bookmarkStart w:id="68" w:name="_Toc164957265"/>
     </w:p>
     <w:p>
       <w:pPr>
@@ -14976,10 +14968,10 @@
         </w:rPr>
       </w:pPr>
       <w:bookmarkStart w:id="71" w:name="_Toc164957266"/>
-      <w:bookmarkStart w:id="72" w:name="_Toc164957345"/>
-      <w:bookmarkStart w:id="73" w:name="_Toc164955391"/>
-      <w:bookmarkStart w:id="74" w:name="_Toc164957617"/>
-      <w:bookmarkStart w:id="75" w:name="_Toc164957124"/>
+      <w:bookmarkStart w:id="72" w:name="_Toc164955391"/>
+      <w:bookmarkStart w:id="73" w:name="_Toc164957617"/>
+      <w:bookmarkStart w:id="74" w:name="_Toc164957124"/>
+      <w:bookmarkStart w:id="75" w:name="_Toc164957345"/>
       <w:r>
         <w:rPr>
           <w:sz w:val="26"/>
@@ -15120,12 +15112,12 @@
           <w:szCs w:val="26"/>
         </w:rPr>
       </w:pPr>
-      <w:bookmarkStart w:id="77" w:name="_Toc164954906"/>
-      <w:bookmarkStart w:id="78" w:name="_Toc164957267"/>
-      <w:bookmarkStart w:id="79" w:name="_Toc164957125"/>
-      <w:bookmarkStart w:id="80" w:name="_Toc164957618"/>
-      <w:bookmarkStart w:id="81" w:name="_Toc164957346"/>
-      <w:bookmarkStart w:id="82" w:name="_Toc164955392"/>
+      <w:bookmarkStart w:id="77" w:name="_Toc164957267"/>
+      <w:bookmarkStart w:id="78" w:name="_Toc164957125"/>
+      <w:bookmarkStart w:id="79" w:name="_Toc164957346"/>
+      <w:bookmarkStart w:id="80" w:name="_Toc164955392"/>
+      <w:bookmarkStart w:id="81" w:name="_Toc164954906"/>
+      <w:bookmarkStart w:id="82" w:name="_Toc164957618"/>
       <w:r>
         <w:rPr>
           <w:sz w:val="26"/>
@@ -15330,13 +15322,13 @@
           <w:sz w:val="26"/>
         </w:rPr>
       </w:pPr>
-      <w:bookmarkStart w:id="84" w:name="_Toc164954907"/>
-      <w:bookmarkStart w:id="85" w:name="_Toc164957347"/>
-      <w:bookmarkStart w:id="86" w:name="_Toc164957268"/>
-      <w:bookmarkStart w:id="87" w:name="_Toc164957126"/>
-      <w:bookmarkStart w:id="88" w:name="_Toc164955393"/>
-      <w:bookmarkStart w:id="89" w:name="_Toc164957619"/>
-      <w:bookmarkStart w:id="90" w:name="_Toc26509"/>
+      <w:bookmarkStart w:id="84" w:name="_Toc164957619"/>
+      <w:bookmarkStart w:id="85" w:name="_Toc164957268"/>
+      <w:bookmarkStart w:id="86" w:name="_Toc164954907"/>
+      <w:bookmarkStart w:id="87" w:name="_Toc26509"/>
+      <w:bookmarkStart w:id="88" w:name="_Toc164957347"/>
+      <w:bookmarkStart w:id="89" w:name="_Toc164955393"/>
+      <w:bookmarkStart w:id="90" w:name="_Toc164957126"/>
       <w:r>
         <w:rPr>
           <w:sz w:val="26"/>
@@ -16936,7 +16928,23 @@
           <w:sz w:val="26"/>
           <w:szCs w:val="26"/>
         </w:rPr>
-        <w:t>Objects365 là bộ dữ liệu quy mô lớn dành cho bài toán phát hiện vật thể, được giới thiệu tại Hội nghị Quốc tế về Thị giác Máy tính năm 2019 [14]. Bộ dữ liệu gồm 365 nhóm đối tượng thuộc nhiều bối cảnh khác nhau, chẳng hạn con người, động vật, phương tiện, đồ dùng gia đình, thiết bị điện tử, thực phẩm và vật dụng học tập.</w:t>
+        <w:t>Objects365 là bộ dữ liệu quy mô lớn dành cho bài toán phát hiện vật thể, được giới thiệu tại Hội nghị Quốc tế về Thị giác Máy tính năm 2019 [</w:t>
+      </w:r>
+      <w:r>
+        <w:rPr>
+          <w:rFonts w:hint="default"/>
+          <w:sz w:val="26"/>
+          <w:szCs w:val="26"/>
+          <w:lang w:val="en-US"/>
+        </w:rPr>
+        <w:t>9</w:t>
+      </w:r>
+      <w:r>
+        <w:rPr>
+          <w:sz w:val="26"/>
+          <w:szCs w:val="26"/>
+        </w:rPr>
+        <w:t>]. Bộ dữ liệu gồm 365 nhóm đối tượng thuộc nhiều bối cảnh khác nhau, chẳng hạn con người, động vật, phương tiện, đồ dùng gia đình, thiết bị điện tử, thực phẩm và vật dụng học tập.</w:t>
       </w:r>
     </w:p>
     <w:p>
@@ -18690,12 +18698,12 @@
         <w:pStyle w:val="4"/>
         <w:bidi w:val="0"/>
       </w:pPr>
-      <w:bookmarkStart w:id="93" w:name="_Toc164957270"/>
-      <w:bookmarkStart w:id="94" w:name="_Toc164954909"/>
-      <w:bookmarkStart w:id="95" w:name="_Toc164955395"/>
-      <w:bookmarkStart w:id="96" w:name="_Toc164957349"/>
+      <w:bookmarkStart w:id="93" w:name="_Toc164957128"/>
+      <w:bookmarkStart w:id="94" w:name="_Toc164955395"/>
+      <w:bookmarkStart w:id="95" w:name="_Toc164957349"/>
+      <w:bookmarkStart w:id="96" w:name="_Toc164957270"/>
       <w:bookmarkStart w:id="97" w:name="_Toc164957621"/>
-      <w:bookmarkStart w:id="98" w:name="_Toc164957128"/>
+      <w:bookmarkStart w:id="98" w:name="_Toc164954909"/>
       <w:r>
         <w:t>Định hướng giải pháp</w:t>
       </w:r>
@@ -18977,16 +18985,7 @@
           <w:szCs w:val="26"/>
           <w:lang w:val="en-US" w:eastAsia="zh-CN"/>
         </w:rPr>
-        <w:t>ài học</w:t>
-      </w:r>
-      <w:r>
-        <w:rPr>
-          <w:rFonts w:hint="default"/>
-          <w:sz w:val="26"/>
-          <w:szCs w:val="26"/>
-          <w:lang w:val="en-US" w:eastAsia="zh-CN"/>
-        </w:rPr>
-        <w:t xml:space="preserve">→Bài </w:t>
+        <w:t xml:space="preserve">ài học→Bài </w:t>
       </w:r>
       <w:r>
         <w:rPr>
@@ -19359,7 +19358,24 @@
         <w:bidi w:val="0"/>
       </w:pPr>
       <w:r>
-        <w:t>Phương pháp đánh giá mô hình</w:t>
+        <w:t>Phương pháp</w:t>
+      </w:r>
+      <w:r>
+        <w:rPr>
+          <w:rFonts w:hint="default"/>
+          <w:lang w:val="en-US"/>
+        </w:rPr>
+        <w:t xml:space="preserve"> kiểm chứng</w:t>
+      </w:r>
+      <w:r>
+        <w:t xml:space="preserve"> mô hình</w:t>
+      </w:r>
+      <w:r>
+        <w:rPr>
+          <w:rFonts w:hint="default"/>
+          <w:lang w:val="en-US"/>
+        </w:rPr>
+        <w:t xml:space="preserve"> trong hệ thống</w:t>
       </w:r>
     </w:p>
     <w:p>
@@ -19537,16 +19553,17 @@
           <w:sz w:val="26"/>
           <w:szCs w:val="26"/>
         </w:rPr>
-        <w:t>Đánh giá mô hình chỉ trả lời mô hình nhìn ảnh tốt đến đâu. Để đánh giá sản phẩm, đề tài cần thêm kiểm thử chức năng nhằm xác nhận dữ liệu và các luồng nghiệp vụ hoạt động đúng.</w:t>
-      </w:r>
-    </w:p>
-    <w:p>
-      <w:pPr>
-        <w:spacing w:line="360" w:lineRule="auto"/>
-        <w:jc w:val="both"/>
-        <w:rPr>
-          <w:sz w:val="26"/>
-          <w:szCs w:val="26"/>
+        <w:t>Việc kiểm chứng mô-đun nhận diện xác nhận mô hình được triển khai và tích hợp đúng trong hệ thống. Để đánh giá sản phẩm ở cấp độ hoàn chỉnh, đề tài tiếp tục thực hiện kiểm thử chức năng nhằm xác nhận dữ liệu và các luồng nghiệp vụ hoạt động theo đúng yêu cầu đã xác định.</w:t>
+      </w:r>
+    </w:p>
+    <w:p>
+      <w:pPr>
+        <w:spacing w:line="360" w:lineRule="auto"/>
+        <w:jc w:val="both"/>
+        <w:rPr>
+          <w:rFonts w:ascii="SimSun" w:hAnsi="SimSun" w:eastAsia="SimSun" w:cs="SimSun"/>
+          <w:sz w:val="24"/>
+          <w:szCs w:val="24"/>
         </w:rPr>
       </w:pPr>
     </w:p>
@@ -23187,7 +23204,9 @@
         </w:tblBorders>
         <w:tblLayout w:type="autofit"/>
         <w:tblCellMar>
+          <w:top w:w="0" w:type="dxa"/>
           <w:left w:w="108" w:type="dxa"/>
+          <w:bottom w:w="0" w:type="dxa"/>
           <w:right w:w="108" w:type="dxa"/>
         </w:tblCellMar>
       </w:tblPr>
@@ -23205,7 +23224,9 @@
             <w:insideV w:val="single" w:color="auto" w:sz="4" w:space="0"/>
           </w:tblBorders>
           <w:tblCellMar>
+            <w:top w:w="0" w:type="dxa"/>
             <w:left w:w="108" w:type="dxa"/>
+            <w:bottom w:w="0" w:type="dxa"/>
             <w:right w:w="108" w:type="dxa"/>
           </w:tblCellMar>
         </w:tblPrEx>
@@ -23848,7 +23869,9 @@
         </w:tblBorders>
         <w:tblLayout w:type="autofit"/>
         <w:tblCellMar>
+          <w:top w:w="0" w:type="dxa"/>
           <w:left w:w="108" w:type="dxa"/>
+          <w:bottom w:w="0" w:type="dxa"/>
           <w:right w:w="108" w:type="dxa"/>
         </w:tblCellMar>
       </w:tblPr>
@@ -23866,7 +23889,9 @@
             <w:insideV w:val="single" w:color="auto" w:sz="4" w:space="0"/>
           </w:tblBorders>
           <w:tblCellMar>
+            <w:top w:w="0" w:type="dxa"/>
             <w:left w:w="108" w:type="dxa"/>
+            <w:bottom w:w="0" w:type="dxa"/>
             <w:right w:w="108" w:type="dxa"/>
           </w:tblCellMar>
         </w:tblPrEx>
@@ -24328,7 +24353,9 @@
         </w:tblBorders>
         <w:tblLayout w:type="autofit"/>
         <w:tblCellMar>
+          <w:top w:w="0" w:type="dxa"/>
           <w:left w:w="108" w:type="dxa"/>
+          <w:bottom w:w="0" w:type="dxa"/>
           <w:right w:w="108" w:type="dxa"/>
         </w:tblCellMar>
       </w:tblPr>
@@ -24346,7 +24373,9 @@
             <w:insideV w:val="single" w:color="auto" w:sz="4" w:space="0"/>
           </w:tblBorders>
           <w:tblCellMar>
+            <w:top w:w="0" w:type="dxa"/>
             <w:left w:w="108" w:type="dxa"/>
+            <w:bottom w:w="0" w:type="dxa"/>
             <w:right w:w="108" w:type="dxa"/>
           </w:tblCellMar>
         </w:tblPrEx>
@@ -28173,14 +28202,6 @@
       </w:tblGrid>
       <w:tr>
         <w:tblPrEx>
-          <w:tblBorders>
-            <w:top w:val="single" w:color="auto" w:sz="4" w:space="0"/>
-            <w:left w:val="single" w:color="auto" w:sz="4" w:space="0"/>
-            <w:bottom w:val="single" w:color="auto" w:sz="4" w:space="0"/>
-            <w:right w:val="single" w:color="auto" w:sz="4" w:space="0"/>
-            <w:insideH w:val="single" w:color="auto" w:sz="4" w:space="0"/>
-            <w:insideV w:val="single" w:color="auto" w:sz="4" w:space="0"/>
-          </w:tblBorders>
           <w:tblCellMar>
             <w:top w:w="0" w:type="dxa"/>
             <w:left w:w="108" w:type="dxa"/>
@@ -30918,10 +30939,39 @@
     </w:tbl>
     <w:p>
       <w:pPr>
+        <w:spacing w:line="360" w:lineRule="auto"/>
+        <w:jc w:val="both"/>
+        <w:rPr>
+          <w:sz w:val="26"/>
+          <w:szCs w:val="26"/>
+        </w:rPr>
+      </w:pPr>
+      <w:bookmarkStart w:id="118" w:name="_Toc18671"/>
+    </w:p>
+    <w:p>
+      <w:pPr>
+        <w:spacing w:line="360" w:lineRule="auto"/>
+        <w:jc w:val="both"/>
+        <w:rPr>
+          <w:sz w:val="26"/>
+          <w:szCs w:val="26"/>
+        </w:rPr>
+      </w:pPr>
+      <w:bookmarkStart w:id="150" w:name="_GoBack"/>
+      <w:bookmarkEnd w:id="150"/>
+      <w:r>
+        <w:rPr>
+          <w:sz w:val="26"/>
+          <w:szCs w:val="26"/>
+        </w:rPr>
+        <w:t>Các giá trị 12 MB, 5 giây và 45 giây là tham số vận hành của hệ thống, không phải kết quả thực nghiệm. Giới hạn dung lượng được sử dụng để từ chối những yêu cầu ảnh có kích thước quá lớn, trong khi thời gian chờ kết nối và thời gian chờ phản hồi giúp máy chủ không duy trì vô hạn một yêu cầu khi dịch vụ nhận diện gặp sự cố. Tương tự, mức tin cậy 0,25 là cấu hình hiện tại của sản phẩm và không được luận văn diễn giải là ngưỡng tối ưu về độ chính xác.</w:t>
+      </w:r>
+    </w:p>
+    <w:p>
+      <w:pPr>
         <w:pStyle w:val="3"/>
         <w:bidi w:val="0"/>
       </w:pPr>
-      <w:bookmarkStart w:id="118" w:name="_Toc18671"/>
       <w:r>
         <w:t>Mô tả chương trình</w:t>
       </w:r>
@@ -31684,7 +31734,9 @@
         </w:tblBorders>
         <w:tblLayout w:type="autofit"/>
         <w:tblCellMar>
+          <w:top w:w="0" w:type="dxa"/>
           <w:left w:w="108" w:type="dxa"/>
+          <w:bottom w:w="0" w:type="dxa"/>
           <w:right w:w="108" w:type="dxa"/>
         </w:tblCellMar>
       </w:tblPr>
@@ -31704,7 +31756,9 @@
             <w:insideV w:val="none" w:color="auto" w:sz="0" w:space="0"/>
           </w:tblBorders>
           <w:tblCellMar>
+            <w:top w:w="0" w:type="dxa"/>
             <w:left w:w="108" w:type="dxa"/>
+            <w:bottom w:w="0" w:type="dxa"/>
             <w:right w:w="108" w:type="dxa"/>
           </w:tblCellMar>
         </w:tblPrEx>
@@ -32103,7 +32157,9 @@
         </w:tblBorders>
         <w:tblLayout w:type="autofit"/>
         <w:tblCellMar>
+          <w:top w:w="0" w:type="dxa"/>
           <w:left w:w="108" w:type="dxa"/>
+          <w:bottom w:w="0" w:type="dxa"/>
           <w:right w:w="108" w:type="dxa"/>
         </w:tblCellMar>
       </w:tblPr>
@@ -32122,7 +32178,9 @@
             <w:insideV w:val="none" w:color="auto" w:sz="0" w:space="0"/>
           </w:tblBorders>
           <w:tblCellMar>
+            <w:top w:w="0" w:type="dxa"/>
             <w:left w:w="108" w:type="dxa"/>
+            <w:bottom w:w="0" w:type="dxa"/>
             <w:right w:w="108" w:type="dxa"/>
           </w:tblCellMar>
         </w:tblPrEx>
@@ -32471,7 +32529,9 @@
         </w:tblBorders>
         <w:tblLayout w:type="autofit"/>
         <w:tblCellMar>
+          <w:top w:w="0" w:type="dxa"/>
           <w:left w:w="108" w:type="dxa"/>
+          <w:bottom w:w="0" w:type="dxa"/>
           <w:right w:w="108" w:type="dxa"/>
         </w:tblCellMar>
       </w:tblPr>
@@ -32490,7 +32550,9 @@
             <w:insideV w:val="single" w:color="auto" w:sz="4" w:space="0"/>
           </w:tblBorders>
           <w:tblCellMar>
+            <w:top w:w="0" w:type="dxa"/>
             <w:left w:w="108" w:type="dxa"/>
+            <w:bottom w:w="0" w:type="dxa"/>
             <w:right w:w="108" w:type="dxa"/>
           </w:tblCellMar>
         </w:tblPrEx>
@@ -32861,7 +32923,9 @@
         </w:tblBorders>
         <w:tblLayout w:type="autofit"/>
         <w:tblCellMar>
+          <w:top w:w="0" w:type="dxa"/>
           <w:left w:w="108" w:type="dxa"/>
+          <w:bottom w:w="0" w:type="dxa"/>
           <w:right w:w="108" w:type="dxa"/>
         </w:tblCellMar>
       </w:tblPr>
@@ -32880,7 +32944,9 @@
             <w:insideV w:val="single" w:color="auto" w:sz="4" w:space="0"/>
           </w:tblBorders>
           <w:tblCellMar>
+            <w:top w:w="0" w:type="dxa"/>
             <w:left w:w="108" w:type="dxa"/>
+            <w:bottom w:w="0" w:type="dxa"/>
             <w:right w:w="108" w:type="dxa"/>
           </w:tblCellMar>
         </w:tblPrEx>
@@ -34306,14 +34372,6 @@
       </w:tblGrid>
       <w:tr>
         <w:tblPrEx>
-          <w:tblBorders>
-            <w:top w:val="single" w:color="auto" w:sz="4" w:space="0"/>
-            <w:left w:val="single" w:color="auto" w:sz="4" w:space="0"/>
-            <w:bottom w:val="single" w:color="auto" w:sz="4" w:space="0"/>
-            <w:right w:val="single" w:color="auto" w:sz="4" w:space="0"/>
-            <w:insideH w:val="single" w:color="auto" w:sz="4" w:space="0"/>
-            <w:insideV w:val="single" w:color="auto" w:sz="4" w:space="0"/>
-          </w:tblBorders>
           <w:tblCellMar>
             <w:top w:w="0" w:type="dxa"/>
             <w:left w:w="108" w:type="dxa"/>
@@ -37276,16 +37334,17 @@
           <w:sz w:val="26"/>
           <w:szCs w:val="26"/>
         </w:rPr>
-        <w:t>Kiểm thử chức năng cho thấy phần lớn các yêu cầu chính của hệ thống đã được xác minh, bao gồm xác thực, phân quyền, nhận diện nhiều vật thể, biến đổi khung bao, ánh xạ dữ liệu, thẻ ghi nhớ, ôn tập, bài học và quản trị. Chức năng thông báo là trường hợp chưa được kiểm chứng trực tiếp trên thiết bị trong phiên bản báo cáo.</w:t>
-      </w:r>
-    </w:p>
-    <w:p>
-      <w:pPr>
-        <w:spacing w:line="360" w:lineRule="auto"/>
-        <w:jc w:val="both"/>
-        <w:rPr>
-          <w:sz w:val="26"/>
-          <w:szCs w:val="26"/>
+        <w:t>Kiểm thử chức năng cho thấy các yêu cầu chính của hệ thống đã được xác minh trong môi trường thử nghiệm, bao gồm xác thực, phân quyền, nhận diện nhiều vật thể, biến đổi khung bao, ánh xạ dữ liệu, thẻ ghi nhớ, ôn tập, bài học, thông báo cục bộ và quản trị. Kết quả cho thấy các thành phần không chỉ hoạt động riêng lẻ mà còn phối hợp để duy trì chu trình từ nhận diện vật thể đến tiếp nhận và ôn tập từ vựng.</w:t>
+      </w:r>
+    </w:p>
+    <w:p>
+      <w:pPr>
+        <w:spacing w:line="360" w:lineRule="auto"/>
+        <w:jc w:val="both"/>
+        <w:rPr>
+          <w:rFonts w:ascii="SimSun" w:hAnsi="SimSun" w:eastAsia="SimSun" w:cs="SimSun"/>
+          <w:sz w:val="24"/>
+          <w:szCs w:val="24"/>
         </w:rPr>
       </w:pPr>
     </w:p>
@@ -37341,12 +37400,12 @@
           <w:lang w:val="vi-VN"/>
         </w:rPr>
       </w:pPr>
-      <w:bookmarkStart w:id="128" w:name="_Toc164957132"/>
-      <w:bookmarkStart w:id="129" w:name="_Toc164957625"/>
-      <w:bookmarkStart w:id="130" w:name="_Toc164955399"/>
-      <w:bookmarkStart w:id="131" w:name="_Toc164957353"/>
-      <w:bookmarkStart w:id="132" w:name="_Toc164957274"/>
-      <w:bookmarkStart w:id="133" w:name="_Toc164954913"/>
+      <w:bookmarkStart w:id="128" w:name="_Toc164957625"/>
+      <w:bookmarkStart w:id="129" w:name="_Toc164957353"/>
+      <w:bookmarkStart w:id="130" w:name="_Toc164957274"/>
+      <w:bookmarkStart w:id="131" w:name="_Toc164954913"/>
+      <w:bookmarkStart w:id="132" w:name="_Toc164955399"/>
+      <w:bookmarkStart w:id="133" w:name="_Toc164957132"/>
     </w:p>
     <w:p>
       <w:pPr>
@@ -37392,12 +37451,12 @@
         <w:spacing w:line="360" w:lineRule="auto"/>
         <w:jc w:val="both"/>
       </w:pPr>
-      <w:bookmarkStart w:id="135" w:name="_Toc164957354"/>
-      <w:bookmarkStart w:id="136" w:name="_Toc164955400"/>
-      <w:bookmarkStart w:id="137" w:name="_Toc164957626"/>
-      <w:bookmarkStart w:id="138" w:name="_Toc164954914"/>
-      <w:bookmarkStart w:id="139" w:name="_Toc164957275"/>
-      <w:bookmarkStart w:id="140" w:name="_Toc164957133"/>
+      <w:bookmarkStart w:id="135" w:name="_Toc164957626"/>
+      <w:bookmarkStart w:id="136" w:name="_Toc164954914"/>
+      <w:bookmarkStart w:id="137" w:name="_Toc164957354"/>
+      <w:bookmarkStart w:id="138" w:name="_Toc164957275"/>
+      <w:bookmarkStart w:id="139" w:name="_Toc164957133"/>
+      <w:bookmarkStart w:id="140" w:name="_Toc164955400"/>
       <w:bookmarkStart w:id="141" w:name="_Toc3502"/>
       <w:r>
         <w:t>KẾT QUẢ</w:t>
@@ -38980,7 +39039,22 @@
         <w:widowControl/>
         <w:suppressLineNumbers w:val="0"/>
         <w:rPr>
-          <w:szCs w:val="26"/>
+          <w:rStyle w:val="19"/>
+        </w:rPr>
+      </w:pPr>
+      <w:r>
+        <w:t xml:space="preserve">[25] Supabase, </w:t>
+      </w:r>
+      <w:r>
+        <w:rPr>
+          <w:rStyle w:val="19"/>
+        </w:rPr>
+        <w:t>Storage – Supabase Docs</w:t>
+      </w:r>
+    </w:p>
+    <w:p>
+      <w:pPr>
+        <w:rPr>
           <w:lang w:val="fr-FR"/>
         </w:rPr>
         <w:sectPr>
@@ -38992,13 +39066,7 @@
         </w:sectPr>
       </w:pPr>
       <w:r>
-        <w:t xml:space="preserve">[25] Supabase, </w:t>
-      </w:r>
-      <w:r>
-        <w:rPr>
-          <w:rStyle w:val="19"/>
-        </w:rPr>
-        <w:t>Storage – Supabase Docs</w:t>
+        <w:t>[26] Memrise, “Learn a language with Memrise,” trang web chính thức của Memrise, truy cập ngày 25/08/2026.</w:t>
       </w:r>
     </w:p>
     <w:p>

</xml_diff>